<commit_message>
Mejora 1/4: SHAP real (TreeExplainer) en vez de feature importance básico - resumen global y explicación individual por caso
</commit_message>
<xml_diff>
--- a/reporte/Reporte_Tecnico_Prototipo_CGR_1.8.2.docx
+++ b/reporte/Reporte_Tecnico_Prototipo_CGR_1.8.2.docx
@@ -707,7 +707,7 @@
         <w:spacing w:after="100" w:before="200"/>
       </w:pPr>
       <w:r>
-        <w:t xml:space="preserve">3.1. Interpretabilidad para auditores</w:t>
+        <w:t xml:space="preserve">3.1. Interpretabilidad para auditores (SHAP)</w:t>
       </w:r>
     </w:p>
     <w:p>
@@ -719,7 +719,7 @@
           <w:sz w:val="22"/>
           <w:szCs w:val="22"/>
         </w:rPr>
-        <w:t xml:space="preserve">El checklist de aceptación del TDR (Anexo 3, ítem 5) exige artefactos de explicabilidad tipo "caja blanca". Se generó la importancia de variables del modelo, que confirma que las señales más fuertes son el número de contratos ganados, la concentración en un solo tipo de objeto contractual y el monto total acumulado — variables directamente interpretables y auditables por un no especialista en ciencia de datos.</w:t>
+        <w:t xml:space="preserve">El checklist de aceptación del TDR (Anexo 3, ítem 5) exige artefactos de explicabilidad tipo "caja blanca" — específicamente valores SHAP, LIME o Feature Importance. Se implementaron valores SHAP (TreeExplainer) sobre el modelo, que ofrecen dos niveles de explicación: (1) un resumen global de cómo cada variable empuja el riesgo hacia arriba o hacia abajo en todo el conjunto de datos, y (2) una explicación individual por caso, que es lo que un auditor necesita para sustentar un hallazgo puntual ante un proveedor específico.</w:t>
       </w:r>
     </w:p>
     <w:p>
@@ -730,7 +730,7 @@
       <w:r>
         <w:drawing>
           <wp:inline distT="0" distB="0" distL="0" distR="0">
-            <wp:extent cx="4381500" cy="2743200"/>
+            <wp:extent cx="4381500" cy="3009900"/>
             <wp:effectExtent t="0" r="0" b="0" l="0"/>
             <wp:docPr id="1" name="" descr="" title=""/>
             <wp:cNvGraphicFramePr>
@@ -755,7 +755,7 @@
                   <pic:spPr bwMode="auto">
                     <a:xfrm>
                       <a:off x="0" y="0"/>
-                      <a:ext cx="4381500" cy="2743200"/>
+                      <a:ext cx="4381500" cy="3009900"/>
                     </a:xfrm>
                     <a:prstGeom prst="rect">
                       <a:avLst/>
@@ -781,1014 +781,7 @@
           <w:sz w:val="18"/>
           <w:szCs w:val="18"/>
         </w:rPr>
-        <w:t xml:space="preserve">Figura 3. Importancia de variables del modelo de favoritismo (artefacto de explicabilidad).</w:t>
-      </w:r>
-    </w:p>
-    <w:p>
-      <w:pPr>
-        <w:pStyle w:val="Heading2"/>
-        <w:spacing w:after="100" w:before="200"/>
-      </w:pPr>
-      <w:r>
-        <w:t xml:space="preserve">3.2. Top de pares proveedor-entidad por riesgo</w:t>
-      </w:r>
-    </w:p>
-    <w:tbl>
-      <w:tblPr>
-        <w:tblW w:type="dxa" w:w="9800"/>
-        <w:tblBorders>
-          <w:top w:val="single" w:color="auto" w:sz="4"/>
-          <w:left w:val="single" w:color="auto" w:sz="4"/>
-          <w:bottom w:val="single" w:color="auto" w:sz="4"/>
-          <w:right w:val="single" w:color="auto" w:sz="4"/>
-          <w:insideH w:val="single" w:color="auto" w:sz="4"/>
-          <w:insideV w:val="single" w:color="auto" w:sz="4"/>
-        </w:tblBorders>
-      </w:tblPr>
-      <w:tblGrid>
-        <w:gridCol w:w="2000"/>
-        <w:gridCol w:w="1800"/>
-        <w:gridCol w:w="1800"/>
-        <w:gridCol w:w="2600"/>
-        <w:gridCol w:w="1600"/>
-      </w:tblGrid>
-      <w:tr>
-        <w:tc>
-          <w:tcPr>
-            <w:tcW w:type="dxa" w:w="2000"/>
-            <w:shd w:fill="1F4E79" w:val="clear"/>
-            <w:tcMar>
-              <w:top w:type="dxa" w:w="60"/>
-              <w:left w:type="dxa" w:w="100"/>
-              <w:bottom w:type="dxa" w:w="60"/>
-              <w:right w:type="dxa" w:w="100"/>
-            </w:tcMar>
-            <w:vAlign w:val="center"/>
-          </w:tcPr>
-          <w:p>
-            <w:pPr>
-              <w:jc w:val="left"/>
-            </w:pPr>
-            <w:r>
-              <w:rPr>
-                <w:b/>
-                <w:bCs/>
-                <w:color w:val="FFFFFF"/>
-                <w:sz w:val="20"/>
-                <w:szCs w:val="20"/>
-              </w:rPr>
-              <w:t xml:space="preserve">Proveedor</w:t>
-            </w:r>
-          </w:p>
-        </w:tc>
-        <w:tc>
-          <w:tcPr>
-            <w:tcW w:type="dxa" w:w="1800"/>
-            <w:shd w:fill="1F4E79" w:val="clear"/>
-            <w:tcMar>
-              <w:top w:type="dxa" w:w="60"/>
-              <w:left w:type="dxa" w:w="100"/>
-              <w:bottom w:type="dxa" w:w="60"/>
-              <w:right w:type="dxa" w:w="100"/>
-            </w:tcMar>
-            <w:vAlign w:val="center"/>
-          </w:tcPr>
-          <w:p>
-            <w:pPr>
-              <w:jc w:val="left"/>
-            </w:pPr>
-            <w:r>
-              <w:rPr>
-                <w:b/>
-                <w:bCs/>
-                <w:color w:val="FFFFFF"/>
-                <w:sz w:val="20"/>
-                <w:szCs w:val="20"/>
-              </w:rPr>
-              <w:t xml:space="preserve">Entidad</w:t>
-            </w:r>
-          </w:p>
-        </w:tc>
-        <w:tc>
-          <w:tcPr>
-            <w:tcW w:type="dxa" w:w="1800"/>
-            <w:shd w:fill="1F4E79" w:val="clear"/>
-            <w:tcMar>
-              <w:top w:type="dxa" w:w="60"/>
-              <w:left w:type="dxa" w:w="100"/>
-              <w:bottom w:type="dxa" w:w="60"/>
-              <w:right w:type="dxa" w:w="100"/>
-            </w:tcMar>
-            <w:vAlign w:val="center"/>
-          </w:tcPr>
-          <w:p>
-            <w:pPr>
-              <w:jc w:val="left"/>
-            </w:pPr>
-            <w:r>
-              <w:rPr>
-                <w:b/>
-                <w:bCs/>
-                <w:color w:val="FFFFFF"/>
-                <w:sz w:val="20"/>
-                <w:szCs w:val="20"/>
-              </w:rPr>
-              <w:t xml:space="preserve">N° contratos</w:t>
-            </w:r>
-          </w:p>
-        </w:tc>
-        <w:tc>
-          <w:tcPr>
-            <w:tcW w:type="dxa" w:w="2600"/>
-            <w:shd w:fill="1F4E79" w:val="clear"/>
-            <w:tcMar>
-              <w:top w:type="dxa" w:w="60"/>
-              <w:left w:type="dxa" w:w="100"/>
-              <w:bottom w:type="dxa" w:w="60"/>
-              <w:right w:type="dxa" w:w="100"/>
-            </w:tcMar>
-            <w:vAlign w:val="center"/>
-          </w:tcPr>
-          <w:p>
-            <w:pPr>
-              <w:jc w:val="left"/>
-            </w:pPr>
-            <w:r>
-              <w:rPr>
-                <w:b/>
-                <w:bCs/>
-                <w:color w:val="FFFFFF"/>
-                <w:sz w:val="20"/>
-                <w:szCs w:val="20"/>
-              </w:rPr>
-              <w:t xml:space="preserve">% modalidad no competitiva</w:t>
-            </w:r>
-          </w:p>
-        </w:tc>
-        <w:tc>
-          <w:tcPr>
-            <w:tcW w:type="dxa" w:w="1600"/>
-            <w:shd w:fill="1F4E79" w:val="clear"/>
-            <w:tcMar>
-              <w:top w:type="dxa" w:w="60"/>
-              <w:left w:type="dxa" w:w="100"/>
-              <w:bottom w:type="dxa" w:w="60"/>
-              <w:right w:type="dxa" w:w="100"/>
-            </w:tcMar>
-            <w:vAlign w:val="center"/>
-          </w:tcPr>
-          <w:p>
-            <w:pPr>
-              <w:jc w:val="left"/>
-            </w:pPr>
-            <w:r>
-              <w:rPr>
-                <w:b/>
-                <w:bCs/>
-                <w:color w:val="FFFFFF"/>
-                <w:sz w:val="20"/>
-                <w:szCs w:val="20"/>
-              </w:rPr>
-              <w:t xml:space="preserve">Score de riesgo</w:t>
-            </w:r>
-          </w:p>
-        </w:tc>
-      </w:tr>
-      <w:tr>
-        <w:tc>
-          <w:tcPr>
-            <w:tcW w:type="dxa" w:w="2000"/>
-            <w:tcMar>
-              <w:top w:type="dxa" w:w="60"/>
-              <w:left w:type="dxa" w:w="100"/>
-              <w:bottom w:type="dxa" w:w="60"/>
-              <w:right w:type="dxa" w:w="100"/>
-            </w:tcMar>
-            <w:vAlign w:val="center"/>
-          </w:tcPr>
-          <w:p>
-            <w:pPr>
-              <w:jc w:val="left"/>
-            </w:pPr>
-            <w:r>
-              <w:rPr>
-                <w:b w:val="false"/>
-                <w:bCs w:val="false"/>
-                <w:color w:val="000000"/>
-                <w:sz w:val="20"/>
-                <w:szCs w:val="20"/>
-              </w:rPr>
-              <w:t xml:space="preserve">P0168</w:t>
-            </w:r>
-          </w:p>
-        </w:tc>
-        <w:tc>
-          <w:tcPr>
-            <w:tcW w:type="dxa" w:w="1800"/>
-            <w:tcMar>
-              <w:top w:type="dxa" w:w="60"/>
-              <w:left w:type="dxa" w:w="100"/>
-              <w:bottom w:type="dxa" w:w="60"/>
-              <w:right w:type="dxa" w:w="100"/>
-            </w:tcMar>
-            <w:vAlign w:val="center"/>
-          </w:tcPr>
-          <w:p>
-            <w:pPr>
-              <w:jc w:val="center"/>
-            </w:pPr>
-            <w:r>
-              <w:rPr>
-                <w:b w:val="false"/>
-                <w:bCs w:val="false"/>
-                <w:color w:val="000000"/>
-                <w:sz w:val="20"/>
-                <w:szCs w:val="20"/>
-              </w:rPr>
-              <w:t xml:space="preserve">E17</w:t>
-            </w:r>
-          </w:p>
-        </w:tc>
-        <w:tc>
-          <w:tcPr>
-            <w:tcW w:type="dxa" w:w="1800"/>
-            <w:tcMar>
-              <w:top w:type="dxa" w:w="60"/>
-              <w:left w:type="dxa" w:w="100"/>
-              <w:bottom w:type="dxa" w:w="60"/>
-              <w:right w:type="dxa" w:w="100"/>
-            </w:tcMar>
-            <w:vAlign w:val="center"/>
-          </w:tcPr>
-          <w:p>
-            <w:pPr>
-              <w:jc w:val="center"/>
-            </w:pPr>
-            <w:r>
-              <w:rPr>
-                <w:b w:val="false"/>
-                <w:bCs w:val="false"/>
-                <w:color w:val="000000"/>
-                <w:sz w:val="20"/>
-                <w:szCs w:val="20"/>
-              </w:rPr>
-              <w:t xml:space="preserve">12</w:t>
-            </w:r>
-          </w:p>
-        </w:tc>
-        <w:tc>
-          <w:tcPr>
-            <w:tcW w:type="dxa" w:w="2600"/>
-            <w:tcMar>
-              <w:top w:type="dxa" w:w="60"/>
-              <w:left w:type="dxa" w:w="100"/>
-              <w:bottom w:type="dxa" w:w="60"/>
-              <w:right w:type="dxa" w:w="100"/>
-            </w:tcMar>
-            <w:vAlign w:val="center"/>
-          </w:tcPr>
-          <w:p>
-            <w:pPr>
-              <w:jc w:val="center"/>
-            </w:pPr>
-            <w:r>
-              <w:rPr>
-                <w:b w:val="false"/>
-                <w:bCs w:val="false"/>
-                <w:color w:val="000000"/>
-                <w:sz w:val="20"/>
-                <w:szCs w:val="20"/>
-              </w:rPr>
-              <w:t xml:space="preserve">91.7%</w:t>
-            </w:r>
-          </w:p>
-        </w:tc>
-        <w:tc>
-          <w:tcPr>
-            <w:tcW w:type="dxa" w:w="1600"/>
-            <w:tcMar>
-              <w:top w:type="dxa" w:w="60"/>
-              <w:left w:type="dxa" w:w="100"/>
-              <w:bottom w:type="dxa" w:w="60"/>
-              <w:right w:type="dxa" w:w="100"/>
-            </w:tcMar>
-            <w:vAlign w:val="center"/>
-          </w:tcPr>
-          <w:p>
-            <w:pPr>
-              <w:jc w:val="center"/>
-            </w:pPr>
-            <w:r>
-              <w:rPr>
-                <w:b w:val="false"/>
-                <w:bCs w:val="false"/>
-                <w:color w:val="000000"/>
-                <w:sz w:val="20"/>
-                <w:szCs w:val="20"/>
-              </w:rPr>
-              <w:t xml:space="preserve">0.997</w:t>
-            </w:r>
-          </w:p>
-        </w:tc>
-      </w:tr>
-      <w:tr>
-        <w:tc>
-          <w:tcPr>
-            <w:tcW w:type="dxa" w:w="2000"/>
-            <w:tcMar>
-              <w:top w:type="dxa" w:w="60"/>
-              <w:left w:type="dxa" w:w="100"/>
-              <w:bottom w:type="dxa" w:w="60"/>
-              <w:right w:type="dxa" w:w="100"/>
-            </w:tcMar>
-            <w:vAlign w:val="center"/>
-          </w:tcPr>
-          <w:p>
-            <w:pPr>
-              <w:jc w:val="left"/>
-            </w:pPr>
-            <w:r>
-              <w:rPr>
-                <w:b w:val="false"/>
-                <w:bCs w:val="false"/>
-                <w:color w:val="000000"/>
-                <w:sz w:val="20"/>
-                <w:szCs w:val="20"/>
-              </w:rPr>
-              <w:t xml:space="preserve">P0000</w:t>
-            </w:r>
-          </w:p>
-        </w:tc>
-        <w:tc>
-          <w:tcPr>
-            <w:tcW w:type="dxa" w:w="1800"/>
-            <w:tcMar>
-              <w:top w:type="dxa" w:w="60"/>
-              <w:left w:type="dxa" w:w="100"/>
-              <w:bottom w:type="dxa" w:w="60"/>
-              <w:right w:type="dxa" w:w="100"/>
-            </w:tcMar>
-            <w:vAlign w:val="center"/>
-          </w:tcPr>
-          <w:p>
-            <w:pPr>
-              <w:jc w:val="center"/>
-            </w:pPr>
-            <w:r>
-              <w:rPr>
-                <w:b w:val="false"/>
-                <w:bCs w:val="false"/>
-                <w:color w:val="000000"/>
-                <w:sz w:val="20"/>
-                <w:szCs w:val="20"/>
-              </w:rPr>
-              <w:t xml:space="preserve">E15</w:t>
-            </w:r>
-          </w:p>
-        </w:tc>
-        <w:tc>
-          <w:tcPr>
-            <w:tcW w:type="dxa" w:w="1800"/>
-            <w:tcMar>
-              <w:top w:type="dxa" w:w="60"/>
-              <w:left w:type="dxa" w:w="100"/>
-              <w:bottom w:type="dxa" w:w="60"/>
-              <w:right w:type="dxa" w:w="100"/>
-            </w:tcMar>
-            <w:vAlign w:val="center"/>
-          </w:tcPr>
-          <w:p>
-            <w:pPr>
-              <w:jc w:val="center"/>
-            </w:pPr>
-            <w:r>
-              <w:rPr>
-                <w:b w:val="false"/>
-                <w:bCs w:val="false"/>
-                <w:color w:val="000000"/>
-                <w:sz w:val="20"/>
-                <w:szCs w:val="20"/>
-              </w:rPr>
-              <w:t xml:space="preserve">11</w:t>
-            </w:r>
-          </w:p>
-        </w:tc>
-        <w:tc>
-          <w:tcPr>
-            <w:tcW w:type="dxa" w:w="2600"/>
-            <w:tcMar>
-              <w:top w:type="dxa" w:w="60"/>
-              <w:left w:type="dxa" w:w="100"/>
-              <w:bottom w:type="dxa" w:w="60"/>
-              <w:right w:type="dxa" w:w="100"/>
-            </w:tcMar>
-            <w:vAlign w:val="center"/>
-          </w:tcPr>
-          <w:p>
-            <w:pPr>
-              <w:jc w:val="center"/>
-            </w:pPr>
-            <w:r>
-              <w:rPr>
-                <w:b w:val="false"/>
-                <w:bCs w:val="false"/>
-                <w:color w:val="000000"/>
-                <w:sz w:val="20"/>
-                <w:szCs w:val="20"/>
-              </w:rPr>
-              <w:t xml:space="preserve">100.0%</w:t>
-            </w:r>
-          </w:p>
-        </w:tc>
-        <w:tc>
-          <w:tcPr>
-            <w:tcW w:type="dxa" w:w="1600"/>
-            <w:tcMar>
-              <w:top w:type="dxa" w:w="60"/>
-              <w:left w:type="dxa" w:w="100"/>
-              <w:bottom w:type="dxa" w:w="60"/>
-              <w:right w:type="dxa" w:w="100"/>
-            </w:tcMar>
-            <w:vAlign w:val="center"/>
-          </w:tcPr>
-          <w:p>
-            <w:pPr>
-              <w:jc w:val="center"/>
-            </w:pPr>
-            <w:r>
-              <w:rPr>
-                <w:b w:val="false"/>
-                <w:bCs w:val="false"/>
-                <w:color w:val="000000"/>
-                <w:sz w:val="20"/>
-                <w:szCs w:val="20"/>
-              </w:rPr>
-              <w:t xml:space="preserve">0.970</w:t>
-            </w:r>
-          </w:p>
-        </w:tc>
-      </w:tr>
-      <w:tr>
-        <w:tc>
-          <w:tcPr>
-            <w:tcW w:type="dxa" w:w="2000"/>
-            <w:tcMar>
-              <w:top w:type="dxa" w:w="60"/>
-              <w:left w:type="dxa" w:w="100"/>
-              <w:bottom w:type="dxa" w:w="60"/>
-              <w:right w:type="dxa" w:w="100"/>
-            </w:tcMar>
-            <w:vAlign w:val="center"/>
-          </w:tcPr>
-          <w:p>
-            <w:pPr>
-              <w:jc w:val="left"/>
-            </w:pPr>
-            <w:r>
-              <w:rPr>
-                <w:b w:val="false"/>
-                <w:bCs w:val="false"/>
-                <w:color w:val="000000"/>
-                <w:sz w:val="20"/>
-                <w:szCs w:val="20"/>
-              </w:rPr>
-              <w:t xml:space="preserve">P0051</w:t>
-            </w:r>
-          </w:p>
-        </w:tc>
-        <w:tc>
-          <w:tcPr>
-            <w:tcW w:type="dxa" w:w="1800"/>
-            <w:tcMar>
-              <w:top w:type="dxa" w:w="60"/>
-              <w:left w:type="dxa" w:w="100"/>
-              <w:bottom w:type="dxa" w:w="60"/>
-              <w:right w:type="dxa" w:w="100"/>
-            </w:tcMar>
-            <w:vAlign w:val="center"/>
-          </w:tcPr>
-          <w:p>
-            <w:pPr>
-              <w:jc w:val="center"/>
-            </w:pPr>
-            <w:r>
-              <w:rPr>
-                <w:b w:val="false"/>
-                <w:bCs w:val="false"/>
-                <w:color w:val="000000"/>
-                <w:sz w:val="20"/>
-                <w:szCs w:val="20"/>
-              </w:rPr>
-              <w:t xml:space="preserve">E08</w:t>
-            </w:r>
-          </w:p>
-        </w:tc>
-        <w:tc>
-          <w:tcPr>
-            <w:tcW w:type="dxa" w:w="1800"/>
-            <w:tcMar>
-              <w:top w:type="dxa" w:w="60"/>
-              <w:left w:type="dxa" w:w="100"/>
-              <w:bottom w:type="dxa" w:w="60"/>
-              <w:right w:type="dxa" w:w="100"/>
-            </w:tcMar>
-            <w:vAlign w:val="center"/>
-          </w:tcPr>
-          <w:p>
-            <w:pPr>
-              <w:jc w:val="center"/>
-            </w:pPr>
-            <w:r>
-              <w:rPr>
-                <w:b w:val="false"/>
-                <w:bCs w:val="false"/>
-                <w:color w:val="000000"/>
-                <w:sz w:val="20"/>
-                <w:szCs w:val="20"/>
-              </w:rPr>
-              <w:t xml:space="preserve">16</w:t>
-            </w:r>
-          </w:p>
-        </w:tc>
-        <w:tc>
-          <w:tcPr>
-            <w:tcW w:type="dxa" w:w="2600"/>
-            <w:tcMar>
-              <w:top w:type="dxa" w:w="60"/>
-              <w:left w:type="dxa" w:w="100"/>
-              <w:bottom w:type="dxa" w:w="60"/>
-              <w:right w:type="dxa" w:w="100"/>
-            </w:tcMar>
-            <w:vAlign w:val="center"/>
-          </w:tcPr>
-          <w:p>
-            <w:pPr>
-              <w:jc w:val="center"/>
-            </w:pPr>
-            <w:r>
-              <w:rPr>
-                <w:b w:val="false"/>
-                <w:bCs w:val="false"/>
-                <w:color w:val="000000"/>
-                <w:sz w:val="20"/>
-                <w:szCs w:val="20"/>
-              </w:rPr>
-              <w:t xml:space="preserve">93.8%</w:t>
-            </w:r>
-          </w:p>
-        </w:tc>
-        <w:tc>
-          <w:tcPr>
-            <w:tcW w:type="dxa" w:w="1600"/>
-            <w:tcMar>
-              <w:top w:type="dxa" w:w="60"/>
-              <w:left w:type="dxa" w:w="100"/>
-              <w:bottom w:type="dxa" w:w="60"/>
-              <w:right w:type="dxa" w:w="100"/>
-            </w:tcMar>
-            <w:vAlign w:val="center"/>
-          </w:tcPr>
-          <w:p>
-            <w:pPr>
-              <w:jc w:val="center"/>
-            </w:pPr>
-            <w:r>
-              <w:rPr>
-                <w:b w:val="false"/>
-                <w:bCs w:val="false"/>
-                <w:color w:val="000000"/>
-                <w:sz w:val="20"/>
-                <w:szCs w:val="20"/>
-              </w:rPr>
-              <w:t xml:space="preserve">0.963</w:t>
-            </w:r>
-          </w:p>
-        </w:tc>
-      </w:tr>
-      <w:tr>
-        <w:tc>
-          <w:tcPr>
-            <w:tcW w:type="dxa" w:w="2000"/>
-            <w:tcMar>
-              <w:top w:type="dxa" w:w="60"/>
-              <w:left w:type="dxa" w:w="100"/>
-              <w:bottom w:type="dxa" w:w="60"/>
-              <w:right w:type="dxa" w:w="100"/>
-            </w:tcMar>
-            <w:vAlign w:val="center"/>
-          </w:tcPr>
-          <w:p>
-            <w:pPr>
-              <w:jc w:val="left"/>
-            </w:pPr>
-            <w:r>
-              <w:rPr>
-                <w:b w:val="false"/>
-                <w:bCs w:val="false"/>
-                <w:color w:val="000000"/>
-                <w:sz w:val="20"/>
-                <w:szCs w:val="20"/>
-              </w:rPr>
-              <w:t xml:space="preserve">P0138</w:t>
-            </w:r>
-          </w:p>
-        </w:tc>
-        <w:tc>
-          <w:tcPr>
-            <w:tcW w:type="dxa" w:w="1800"/>
-            <w:tcMar>
-              <w:top w:type="dxa" w:w="60"/>
-              <w:left w:type="dxa" w:w="100"/>
-              <w:bottom w:type="dxa" w:w="60"/>
-              <w:right w:type="dxa" w:w="100"/>
-            </w:tcMar>
-            <w:vAlign w:val="center"/>
-          </w:tcPr>
-          <w:p>
-            <w:pPr>
-              <w:jc w:val="center"/>
-            </w:pPr>
-            <w:r>
-              <w:rPr>
-                <w:b w:val="false"/>
-                <w:bCs w:val="false"/>
-                <w:color w:val="000000"/>
-                <w:sz w:val="20"/>
-                <w:szCs w:val="20"/>
-              </w:rPr>
-              <w:t xml:space="preserve">E00</w:t>
-            </w:r>
-          </w:p>
-        </w:tc>
-        <w:tc>
-          <w:tcPr>
-            <w:tcW w:type="dxa" w:w="1800"/>
-            <w:tcMar>
-              <w:top w:type="dxa" w:w="60"/>
-              <w:left w:type="dxa" w:w="100"/>
-              <w:bottom w:type="dxa" w:w="60"/>
-              <w:right w:type="dxa" w:w="100"/>
-            </w:tcMar>
-            <w:vAlign w:val="center"/>
-          </w:tcPr>
-          <w:p>
-            <w:pPr>
-              <w:jc w:val="center"/>
-            </w:pPr>
-            <w:r>
-              <w:rPr>
-                <w:b w:val="false"/>
-                <w:bCs w:val="false"/>
-                <w:color w:val="000000"/>
-                <w:sz w:val="20"/>
-                <w:szCs w:val="20"/>
-              </w:rPr>
-              <w:t xml:space="preserve">14</w:t>
-            </w:r>
-          </w:p>
-        </w:tc>
-        <w:tc>
-          <w:tcPr>
-            <w:tcW w:type="dxa" w:w="2600"/>
-            <w:tcMar>
-              <w:top w:type="dxa" w:w="60"/>
-              <w:left w:type="dxa" w:w="100"/>
-              <w:bottom w:type="dxa" w:w="60"/>
-              <w:right w:type="dxa" w:w="100"/>
-            </w:tcMar>
-            <w:vAlign w:val="center"/>
-          </w:tcPr>
-          <w:p>
-            <w:pPr>
-              <w:jc w:val="center"/>
-            </w:pPr>
-            <w:r>
-              <w:rPr>
-                <w:b w:val="false"/>
-                <w:bCs w:val="false"/>
-                <w:color w:val="000000"/>
-                <w:sz w:val="20"/>
-                <w:szCs w:val="20"/>
-              </w:rPr>
-              <w:t xml:space="preserve">100.0%</w:t>
-            </w:r>
-          </w:p>
-        </w:tc>
-        <w:tc>
-          <w:tcPr>
-            <w:tcW w:type="dxa" w:w="1600"/>
-            <w:tcMar>
-              <w:top w:type="dxa" w:w="60"/>
-              <w:left w:type="dxa" w:w="100"/>
-              <w:bottom w:type="dxa" w:w="60"/>
-              <w:right w:type="dxa" w:w="100"/>
-            </w:tcMar>
-            <w:vAlign w:val="center"/>
-          </w:tcPr>
-          <w:p>
-            <w:pPr>
-              <w:jc w:val="center"/>
-            </w:pPr>
-            <w:r>
-              <w:rPr>
-                <w:b w:val="false"/>
-                <w:bCs w:val="false"/>
-                <w:color w:val="000000"/>
-                <w:sz w:val="20"/>
-                <w:szCs w:val="20"/>
-              </w:rPr>
-              <w:t xml:space="preserve">0.957</w:t>
-            </w:r>
-          </w:p>
-        </w:tc>
-      </w:tr>
-      <w:tr>
-        <w:tc>
-          <w:tcPr>
-            <w:tcW w:type="dxa" w:w="2000"/>
-            <w:tcMar>
-              <w:top w:type="dxa" w:w="60"/>
-              <w:left w:type="dxa" w:w="100"/>
-              <w:bottom w:type="dxa" w:w="60"/>
-              <w:right w:type="dxa" w:w="100"/>
-            </w:tcMar>
-            <w:vAlign w:val="center"/>
-          </w:tcPr>
-          <w:p>
-            <w:pPr>
-              <w:jc w:val="left"/>
-            </w:pPr>
-            <w:r>
-              <w:rPr>
-                <w:b w:val="false"/>
-                <w:bCs w:val="false"/>
-                <w:color w:val="000000"/>
-                <w:sz w:val="20"/>
-                <w:szCs w:val="20"/>
-              </w:rPr>
-              <w:t xml:space="preserve">P0049</w:t>
-            </w:r>
-          </w:p>
-        </w:tc>
-        <w:tc>
-          <w:tcPr>
-            <w:tcW w:type="dxa" w:w="1800"/>
-            <w:tcMar>
-              <w:top w:type="dxa" w:w="60"/>
-              <w:left w:type="dxa" w:w="100"/>
-              <w:bottom w:type="dxa" w:w="60"/>
-              <w:right w:type="dxa" w:w="100"/>
-            </w:tcMar>
-            <w:vAlign w:val="center"/>
-          </w:tcPr>
-          <w:p>
-            <w:pPr>
-              <w:jc w:val="center"/>
-            </w:pPr>
-            <w:r>
-              <w:rPr>
-                <w:b w:val="false"/>
-                <w:bCs w:val="false"/>
-                <w:color w:val="000000"/>
-                <w:sz w:val="20"/>
-                <w:szCs w:val="20"/>
-              </w:rPr>
-              <w:t xml:space="preserve">E16</w:t>
-            </w:r>
-          </w:p>
-        </w:tc>
-        <w:tc>
-          <w:tcPr>
-            <w:tcW w:type="dxa" w:w="1800"/>
-            <w:tcMar>
-              <w:top w:type="dxa" w:w="60"/>
-              <w:left w:type="dxa" w:w="100"/>
-              <w:bottom w:type="dxa" w:w="60"/>
-              <w:right w:type="dxa" w:w="100"/>
-            </w:tcMar>
-            <w:vAlign w:val="center"/>
-          </w:tcPr>
-          <w:p>
-            <w:pPr>
-              <w:jc w:val="center"/>
-            </w:pPr>
-            <w:r>
-              <w:rPr>
-                <w:b w:val="false"/>
-                <w:bCs w:val="false"/>
-                <w:color w:val="000000"/>
-                <w:sz w:val="20"/>
-                <w:szCs w:val="20"/>
-              </w:rPr>
-              <w:t xml:space="preserve">15</w:t>
-            </w:r>
-          </w:p>
-        </w:tc>
-        <w:tc>
-          <w:tcPr>
-            <w:tcW w:type="dxa" w:w="2600"/>
-            <w:tcMar>
-              <w:top w:type="dxa" w:w="60"/>
-              <w:left w:type="dxa" w:w="100"/>
-              <w:bottom w:type="dxa" w:w="60"/>
-              <w:right w:type="dxa" w:w="100"/>
-            </w:tcMar>
-            <w:vAlign w:val="center"/>
-          </w:tcPr>
-          <w:p>
-            <w:pPr>
-              <w:jc w:val="center"/>
-            </w:pPr>
-            <w:r>
-              <w:rPr>
-                <w:b w:val="false"/>
-                <w:bCs w:val="false"/>
-                <w:color w:val="000000"/>
-                <w:sz w:val="20"/>
-                <w:szCs w:val="20"/>
-              </w:rPr>
-              <w:t xml:space="preserve">93.3%</w:t>
-            </w:r>
-          </w:p>
-        </w:tc>
-        <w:tc>
-          <w:tcPr>
-            <w:tcW w:type="dxa" w:w="1600"/>
-            <w:tcMar>
-              <w:top w:type="dxa" w:w="60"/>
-              <w:left w:type="dxa" w:w="100"/>
-              <w:bottom w:type="dxa" w:w="60"/>
-              <w:right w:type="dxa" w:w="100"/>
-            </w:tcMar>
-            <w:vAlign w:val="center"/>
-          </w:tcPr>
-          <w:p>
-            <w:pPr>
-              <w:jc w:val="center"/>
-            </w:pPr>
-            <w:r>
-              <w:rPr>
-                <w:b w:val="false"/>
-                <w:bCs w:val="false"/>
-                <w:color w:val="000000"/>
-                <w:sz w:val="20"/>
-                <w:szCs w:val="20"/>
-              </w:rPr>
-              <w:t xml:space="preserve">0.923</w:t>
-            </w:r>
-          </w:p>
-        </w:tc>
-      </w:tr>
-      <w:tr>
-        <w:tc>
-          <w:tcPr>
-            <w:tcW w:type="dxa" w:w="2000"/>
-            <w:tcMar>
-              <w:top w:type="dxa" w:w="60"/>
-              <w:left w:type="dxa" w:w="100"/>
-              <w:bottom w:type="dxa" w:w="60"/>
-              <w:right w:type="dxa" w:w="100"/>
-            </w:tcMar>
-            <w:vAlign w:val="center"/>
-          </w:tcPr>
-          <w:p>
-            <w:pPr>
-              <w:jc w:val="left"/>
-            </w:pPr>
-            <w:r>
-              <w:rPr>
-                <w:b w:val="false"/>
-                <w:bCs w:val="false"/>
-                <w:color w:val="000000"/>
-                <w:sz w:val="20"/>
-                <w:szCs w:val="20"/>
-              </w:rPr>
-              <w:t xml:space="preserve">P0154</w:t>
-            </w:r>
-          </w:p>
-        </w:tc>
-        <w:tc>
-          <w:tcPr>
-            <w:tcW w:type="dxa" w:w="1800"/>
-            <w:tcMar>
-              <w:top w:type="dxa" w:w="60"/>
-              <w:left w:type="dxa" w:w="100"/>
-              <w:bottom w:type="dxa" w:w="60"/>
-              <w:right w:type="dxa" w:w="100"/>
-            </w:tcMar>
-            <w:vAlign w:val="center"/>
-          </w:tcPr>
-          <w:p>
-            <w:pPr>
-              <w:jc w:val="center"/>
-            </w:pPr>
-            <w:r>
-              <w:rPr>
-                <w:b w:val="false"/>
-                <w:bCs w:val="false"/>
-                <w:color w:val="000000"/>
-                <w:sz w:val="20"/>
-                <w:szCs w:val="20"/>
-              </w:rPr>
-              <w:t xml:space="preserve">E16</w:t>
-            </w:r>
-          </w:p>
-        </w:tc>
-        <w:tc>
-          <w:tcPr>
-            <w:tcW w:type="dxa" w:w="1800"/>
-            <w:tcMar>
-              <w:top w:type="dxa" w:w="60"/>
-              <w:left w:type="dxa" w:w="100"/>
-              <w:bottom w:type="dxa" w:w="60"/>
-              <w:right w:type="dxa" w:w="100"/>
-            </w:tcMar>
-            <w:vAlign w:val="center"/>
-          </w:tcPr>
-          <w:p>
-            <w:pPr>
-              <w:jc w:val="center"/>
-            </w:pPr>
-            <w:r>
-              <w:rPr>
-                <w:b w:val="false"/>
-                <w:bCs w:val="false"/>
-                <w:color w:val="000000"/>
-                <w:sz w:val="20"/>
-                <w:szCs w:val="20"/>
-              </w:rPr>
-              <w:t xml:space="preserve">11</w:t>
-            </w:r>
-          </w:p>
-        </w:tc>
-        <w:tc>
-          <w:tcPr>
-            <w:tcW w:type="dxa" w:w="2600"/>
-            <w:tcMar>
-              <w:top w:type="dxa" w:w="60"/>
-              <w:left w:type="dxa" w:w="100"/>
-              <w:bottom w:type="dxa" w:w="60"/>
-              <w:right w:type="dxa" w:w="100"/>
-            </w:tcMar>
-            <w:vAlign w:val="center"/>
-          </w:tcPr>
-          <w:p>
-            <w:pPr>
-              <w:jc w:val="center"/>
-            </w:pPr>
-            <w:r>
-              <w:rPr>
-                <w:b w:val="false"/>
-                <w:bCs w:val="false"/>
-                <w:color w:val="000000"/>
-                <w:sz w:val="20"/>
-                <w:szCs w:val="20"/>
-              </w:rPr>
-              <w:t xml:space="preserve">100.0%</w:t>
-            </w:r>
-          </w:p>
-        </w:tc>
-        <w:tc>
-          <w:tcPr>
-            <w:tcW w:type="dxa" w:w="1600"/>
-            <w:tcMar>
-              <w:top w:type="dxa" w:w="60"/>
-              <w:left w:type="dxa" w:w="100"/>
-              <w:bottom w:type="dxa" w:w="60"/>
-              <w:right w:type="dxa" w:w="100"/>
-            </w:tcMar>
-            <w:vAlign w:val="center"/>
-          </w:tcPr>
-          <w:p>
-            <w:pPr>
-              <w:jc w:val="center"/>
-            </w:pPr>
-            <w:r>
-              <w:rPr>
-                <w:b w:val="false"/>
-                <w:bCs w:val="false"/>
-                <w:color w:val="000000"/>
-                <w:sz w:val="20"/>
-                <w:szCs w:val="20"/>
-              </w:rPr>
-              <w:t xml:space="preserve">0.843</w:t>
-            </w:r>
-          </w:p>
-        </w:tc>
-      </w:tr>
-    </w:tbl>
-    <w:p>
-      <w:r>
-        <w:br w:type="page"/>
-      </w:r>
-    </w:p>
-    <w:p>
-      <w:pPr>
-        <w:pStyle w:val="Heading1"/>
-        <w:spacing w:after="150" w:before="300"/>
-      </w:pPr>
-      <w:r>
-        <w:t xml:space="preserve">4. Modelo de Detección de Fraccionamiento</w:t>
+        <w:t xml:space="preserve">Figura 3. Impacto SHAP por variable — vista global (rojo = valor alto de la variable).</w:t>
       </w:r>
     </w:p>
     <w:p>
@@ -1800,494 +793,7 @@
           <w:sz w:val="22"/>
           <w:szCs w:val="22"/>
         </w:rPr>
-        <w:t xml:space="preserve">Se construyeron 149 grupos proveedor-entidad-objeto con 2 o más contratos, y se calcularon variables de ventana temporal (máximo de contratos en ventanas móviles de 15 días, porcentaje de montos justo por debajo del umbral legal de Adjudicación Simplificada). Se compararon dos enfoques: un modelo no supervisado de detección de anomalías (Isolation Forest) y una regla explícita basada en el umbral normativo vigente.</w:t>
-      </w:r>
-    </w:p>
-    <w:tbl>
-      <w:tblPr>
-        <w:tblW w:type="dxa" w:w="9800"/>
-        <w:tblBorders>
-          <w:top w:val="single" w:color="auto" w:sz="4"/>
-          <w:left w:val="single" w:color="auto" w:sz="4"/>
-          <w:bottom w:val="single" w:color="auto" w:sz="4"/>
-          <w:right w:val="single" w:color="auto" w:sz="4"/>
-          <w:insideH w:val="single" w:color="auto" w:sz="4"/>
-          <w:insideV w:val="single" w:color="auto" w:sz="4"/>
-        </w:tblBorders>
-      </w:tblPr>
-      <w:tblGrid>
-        <w:gridCol w:w="3600"/>
-        <w:gridCol w:w="2200"/>
-        <w:gridCol w:w="2000"/>
-        <w:gridCol w:w="2000"/>
-      </w:tblGrid>
-      <w:tr>
-        <w:tc>
-          <w:tcPr>
-            <w:tcW w:type="dxa" w:w="3600"/>
-            <w:shd w:fill="1F4E79" w:val="clear"/>
-            <w:tcMar>
-              <w:top w:type="dxa" w:w="60"/>
-              <w:left w:type="dxa" w:w="100"/>
-              <w:bottom w:type="dxa" w:w="60"/>
-              <w:right w:type="dxa" w:w="100"/>
-            </w:tcMar>
-            <w:vAlign w:val="center"/>
-          </w:tcPr>
-          <w:p>
-            <w:pPr>
-              <w:jc w:val="left"/>
-            </w:pPr>
-            <w:r>
-              <w:rPr>
-                <w:b/>
-                <w:bCs/>
-                <w:color w:val="FFFFFF"/>
-                <w:sz w:val="20"/>
-                <w:szCs w:val="20"/>
-              </w:rPr>
-              <w:t xml:space="preserve">Enfoque</w:t>
-            </w:r>
-          </w:p>
-        </w:tc>
-        <w:tc>
-          <w:tcPr>
-            <w:tcW w:type="dxa" w:w="2200"/>
-            <w:shd w:fill="1F4E79" w:val="clear"/>
-            <w:tcMar>
-              <w:top w:type="dxa" w:w="60"/>
-              <w:left w:type="dxa" w:w="100"/>
-              <w:bottom w:type="dxa" w:w="60"/>
-              <w:right w:type="dxa" w:w="100"/>
-            </w:tcMar>
-            <w:vAlign w:val="center"/>
-          </w:tcPr>
-          <w:p>
-            <w:pPr>
-              <w:jc w:val="left"/>
-            </w:pPr>
-            <w:r>
-              <w:rPr>
-                <w:b/>
-                <w:bCs/>
-                <w:color w:val="FFFFFF"/>
-                <w:sz w:val="20"/>
-                <w:szCs w:val="20"/>
-              </w:rPr>
-              <w:t xml:space="preserve">Grupos marcados</w:t>
-            </w:r>
-          </w:p>
-        </w:tc>
-        <w:tc>
-          <w:tcPr>
-            <w:tcW w:type="dxa" w:w="2000"/>
-            <w:shd w:fill="1F4E79" w:val="clear"/>
-            <w:tcMar>
-              <w:top w:type="dxa" w:w="60"/>
-              <w:left w:type="dxa" w:w="100"/>
-              <w:bottom w:type="dxa" w:w="60"/>
-              <w:right w:type="dxa" w:w="100"/>
-            </w:tcMar>
-            <w:vAlign w:val="center"/>
-          </w:tcPr>
-          <w:p>
-            <w:pPr>
-              <w:jc w:val="left"/>
-            </w:pPr>
-            <w:r>
-              <w:rPr>
-                <w:b/>
-                <w:bCs/>
-                <w:color w:val="FFFFFF"/>
-                <w:sz w:val="20"/>
-                <w:szCs w:val="20"/>
-              </w:rPr>
-              <w:t xml:space="preserve">Aciertos reales</w:t>
-            </w:r>
-          </w:p>
-        </w:tc>
-        <w:tc>
-          <w:tcPr>
-            <w:tcW w:type="dxa" w:w="2000"/>
-            <w:shd w:fill="1F4E79" w:val="clear"/>
-            <w:tcMar>
-              <w:top w:type="dxa" w:w="60"/>
-              <w:left w:type="dxa" w:w="100"/>
-              <w:bottom w:type="dxa" w:w="60"/>
-              <w:right w:type="dxa" w:w="100"/>
-            </w:tcMar>
-            <w:vAlign w:val="center"/>
-          </w:tcPr>
-          <w:p>
-            <w:pPr>
-              <w:jc w:val="left"/>
-            </w:pPr>
-            <w:r>
-              <w:rPr>
-                <w:b/>
-                <w:bCs/>
-                <w:color w:val="FFFFFF"/>
-                <w:sz w:val="20"/>
-                <w:szCs w:val="20"/>
-              </w:rPr>
-              <w:t xml:space="preserve">Precisión</w:t>
-            </w:r>
-          </w:p>
-        </w:tc>
-      </w:tr>
-      <w:tr>
-        <w:tc>
-          <w:tcPr>
-            <w:tcW w:type="dxa" w:w="3600"/>
-            <w:tcMar>
-              <w:top w:type="dxa" w:w="60"/>
-              <w:left w:type="dxa" w:w="100"/>
-              <w:bottom w:type="dxa" w:w="60"/>
-              <w:right w:type="dxa" w:w="100"/>
-            </w:tcMar>
-            <w:vAlign w:val="center"/>
-          </w:tcPr>
-          <w:p>
-            <w:pPr>
-              <w:jc w:val="left"/>
-            </w:pPr>
-            <w:r>
-              <w:rPr>
-                <w:b w:val="false"/>
-                <w:bCs w:val="false"/>
-                <w:color w:val="000000"/>
-                <w:sz w:val="20"/>
-                <w:szCs w:val="20"/>
-              </w:rPr>
-              <w:t xml:space="preserve">Isolation Forest (solo)</w:t>
-            </w:r>
-          </w:p>
-        </w:tc>
-        <w:tc>
-          <w:tcPr>
-            <w:tcW w:type="dxa" w:w="2200"/>
-            <w:tcMar>
-              <w:top w:type="dxa" w:w="60"/>
-              <w:left w:type="dxa" w:w="100"/>
-              <w:bottom w:type="dxa" w:w="60"/>
-              <w:right w:type="dxa" w:w="100"/>
-            </w:tcMar>
-            <w:vAlign w:val="center"/>
-          </w:tcPr>
-          <w:p>
-            <w:pPr>
-              <w:jc w:val="center"/>
-            </w:pPr>
-            <w:r>
-              <w:rPr>
-                <w:b w:val="false"/>
-                <w:bCs w:val="false"/>
-                <w:color w:val="000000"/>
-                <w:sz w:val="20"/>
-                <w:szCs w:val="20"/>
-              </w:rPr>
-              <w:t xml:space="preserve">8</w:t>
-            </w:r>
-          </w:p>
-        </w:tc>
-        <w:tc>
-          <w:tcPr>
-            <w:tcW w:type="dxa" w:w="2000"/>
-            <w:tcMar>
-              <w:top w:type="dxa" w:w="60"/>
-              <w:left w:type="dxa" w:w="100"/>
-              <w:bottom w:type="dxa" w:w="60"/>
-              <w:right w:type="dxa" w:w="100"/>
-            </w:tcMar>
-            <w:vAlign w:val="center"/>
-          </w:tcPr>
-          <w:p>
-            <w:pPr>
-              <w:jc w:val="center"/>
-            </w:pPr>
-            <w:r>
-              <w:rPr>
-                <w:b w:val="false"/>
-                <w:bCs w:val="false"/>
-                <w:color w:val="000000"/>
-                <w:sz w:val="20"/>
-                <w:szCs w:val="20"/>
-              </w:rPr>
-              <w:t xml:space="preserve">3</w:t>
-            </w:r>
-          </w:p>
-        </w:tc>
-        <w:tc>
-          <w:tcPr>
-            <w:tcW w:type="dxa" w:w="2000"/>
-            <w:tcMar>
-              <w:top w:type="dxa" w:w="60"/>
-              <w:left w:type="dxa" w:w="100"/>
-              <w:bottom w:type="dxa" w:w="60"/>
-              <w:right w:type="dxa" w:w="100"/>
-            </w:tcMar>
-            <w:vAlign w:val="center"/>
-          </w:tcPr>
-          <w:p>
-            <w:pPr>
-              <w:jc w:val="center"/>
-            </w:pPr>
-            <w:r>
-              <w:rPr>
-                <w:b w:val="false"/>
-                <w:bCs w:val="false"/>
-                <w:color w:val="000000"/>
-                <w:sz w:val="20"/>
-                <w:szCs w:val="20"/>
-              </w:rPr>
-              <w:t xml:space="preserve">37.5%</w:t>
-            </w:r>
-          </w:p>
-        </w:tc>
-      </w:tr>
-      <w:tr>
-        <w:tc>
-          <w:tcPr>
-            <w:tcW w:type="dxa" w:w="3600"/>
-            <w:tcMar>
-              <w:top w:type="dxa" w:w="60"/>
-              <w:left w:type="dxa" w:w="100"/>
-              <w:bottom w:type="dxa" w:w="60"/>
-              <w:right w:type="dxa" w:w="100"/>
-            </w:tcMar>
-            <w:vAlign w:val="center"/>
-          </w:tcPr>
-          <w:p>
-            <w:pPr>
-              <w:jc w:val="left"/>
-            </w:pPr>
-            <w:r>
-              <w:rPr>
-                <w:b w:val="false"/>
-                <w:bCs w:val="false"/>
-                <w:color w:val="000000"/>
-                <w:sz w:val="20"/>
-                <w:szCs w:val="20"/>
-              </w:rPr>
-              <w:t xml:space="preserve">Regla interpretable (umbral legal)</w:t>
-            </w:r>
-          </w:p>
-        </w:tc>
-        <w:tc>
-          <w:tcPr>
-            <w:tcW w:type="dxa" w:w="2200"/>
-            <w:tcMar>
-              <w:top w:type="dxa" w:w="60"/>
-              <w:left w:type="dxa" w:w="100"/>
-              <w:bottom w:type="dxa" w:w="60"/>
-              <w:right w:type="dxa" w:w="100"/>
-            </w:tcMar>
-            <w:vAlign w:val="center"/>
-          </w:tcPr>
-          <w:p>
-            <w:pPr>
-              <w:jc w:val="center"/>
-            </w:pPr>
-            <w:r>
-              <w:rPr>
-                <w:b w:val="false"/>
-                <w:bCs w:val="false"/>
-                <w:color w:val="000000"/>
-                <w:sz w:val="20"/>
-                <w:szCs w:val="20"/>
-              </w:rPr>
-              <w:t xml:space="preserve">7</w:t>
-            </w:r>
-          </w:p>
-        </w:tc>
-        <w:tc>
-          <w:tcPr>
-            <w:tcW w:type="dxa" w:w="2000"/>
-            <w:tcMar>
-              <w:top w:type="dxa" w:w="60"/>
-              <w:left w:type="dxa" w:w="100"/>
-              <w:bottom w:type="dxa" w:w="60"/>
-              <w:right w:type="dxa" w:w="100"/>
-            </w:tcMar>
-            <w:vAlign w:val="center"/>
-          </w:tcPr>
-          <w:p>
-            <w:pPr>
-              <w:jc w:val="center"/>
-            </w:pPr>
-            <w:r>
-              <w:rPr>
-                <w:b w:val="false"/>
-                <w:bCs w:val="false"/>
-                <w:color w:val="000000"/>
-                <w:sz w:val="20"/>
-                <w:szCs w:val="20"/>
-              </w:rPr>
-              <w:t xml:space="preserve">7</w:t>
-            </w:r>
-          </w:p>
-        </w:tc>
-        <w:tc>
-          <w:tcPr>
-            <w:tcW w:type="dxa" w:w="2000"/>
-            <w:tcMar>
-              <w:top w:type="dxa" w:w="60"/>
-              <w:left w:type="dxa" w:w="100"/>
-              <w:bottom w:type="dxa" w:w="60"/>
-              <w:right w:type="dxa" w:w="100"/>
-            </w:tcMar>
-            <w:vAlign w:val="center"/>
-          </w:tcPr>
-          <w:p>
-            <w:pPr>
-              <w:jc w:val="center"/>
-            </w:pPr>
-            <w:r>
-              <w:rPr>
-                <w:b w:val="false"/>
-                <w:bCs w:val="false"/>
-                <w:color w:val="000000"/>
-                <w:sz w:val="20"/>
-                <w:szCs w:val="20"/>
-              </w:rPr>
-              <w:t xml:space="preserve">100.0%</w:t>
-            </w:r>
-          </w:p>
-        </w:tc>
-      </w:tr>
-      <w:tr>
-        <w:tc>
-          <w:tcPr>
-            <w:tcW w:type="dxa" w:w="3600"/>
-            <w:tcMar>
-              <w:top w:type="dxa" w:w="60"/>
-              <w:left w:type="dxa" w:w="100"/>
-              <w:bottom w:type="dxa" w:w="60"/>
-              <w:right w:type="dxa" w:w="100"/>
-            </w:tcMar>
-            <w:vAlign w:val="center"/>
-          </w:tcPr>
-          <w:p>
-            <w:pPr>
-              <w:jc w:val="left"/>
-            </w:pPr>
-            <w:r>
-              <w:rPr>
-                <w:b w:val="false"/>
-                <w:bCs w:val="false"/>
-                <w:color w:val="000000"/>
-                <w:sz w:val="20"/>
-                <w:szCs w:val="20"/>
-              </w:rPr>
-              <w:t xml:space="preserve">Combinado (modelo Y regla)</w:t>
-            </w:r>
-          </w:p>
-        </w:tc>
-        <w:tc>
-          <w:tcPr>
-            <w:tcW w:type="dxa" w:w="2200"/>
-            <w:tcMar>
-              <w:top w:type="dxa" w:w="60"/>
-              <w:left w:type="dxa" w:w="100"/>
-              <w:bottom w:type="dxa" w:w="60"/>
-              <w:right w:type="dxa" w:w="100"/>
-            </w:tcMar>
-            <w:vAlign w:val="center"/>
-          </w:tcPr>
-          <w:p>
-            <w:pPr>
-              <w:jc w:val="center"/>
-            </w:pPr>
-            <w:r>
-              <w:rPr>
-                <w:b w:val="false"/>
-                <w:bCs w:val="false"/>
-                <w:color w:val="000000"/>
-                <w:sz w:val="20"/>
-                <w:szCs w:val="20"/>
-              </w:rPr>
-              <w:t xml:space="preserve">2</w:t>
-            </w:r>
-          </w:p>
-        </w:tc>
-        <w:tc>
-          <w:tcPr>
-            <w:tcW w:type="dxa" w:w="2000"/>
-            <w:tcMar>
-              <w:top w:type="dxa" w:w="60"/>
-              <w:left w:type="dxa" w:w="100"/>
-              <w:bottom w:type="dxa" w:w="60"/>
-              <w:right w:type="dxa" w:w="100"/>
-            </w:tcMar>
-            <w:vAlign w:val="center"/>
-          </w:tcPr>
-          <w:p>
-            <w:pPr>
-              <w:jc w:val="center"/>
-            </w:pPr>
-            <w:r>
-              <w:rPr>
-                <w:b w:val="false"/>
-                <w:bCs w:val="false"/>
-                <w:color w:val="000000"/>
-                <w:sz w:val="20"/>
-                <w:szCs w:val="20"/>
-              </w:rPr>
-              <w:t xml:space="preserve">2</w:t>
-            </w:r>
-          </w:p>
-        </w:tc>
-        <w:tc>
-          <w:tcPr>
-            <w:tcW w:type="dxa" w:w="2000"/>
-            <w:tcMar>
-              <w:top w:type="dxa" w:w="60"/>
-              <w:left w:type="dxa" w:w="100"/>
-              <w:bottom w:type="dxa" w:w="60"/>
-              <w:right w:type="dxa" w:w="100"/>
-            </w:tcMar>
-            <w:vAlign w:val="center"/>
-          </w:tcPr>
-          <w:p>
-            <w:pPr>
-              <w:jc w:val="center"/>
-            </w:pPr>
-            <w:r>
-              <w:rPr>
-                <w:b w:val="false"/>
-                <w:bCs w:val="false"/>
-                <w:color w:val="000000"/>
-                <w:sz w:val="20"/>
-                <w:szCs w:val="20"/>
-              </w:rPr>
-              <w:t xml:space="preserve">100.0%</w:t>
-            </w:r>
-          </w:p>
-        </w:tc>
-      </w:tr>
-    </w:tbl>
-    <w:p>
-      <w:pPr>
-        <w:spacing w:after="160"/>
-      </w:pPr>
-      <w:r>
-        <w:rPr>
-          <w:sz w:val="4"/>
-          <w:szCs w:val="4"/>
-        </w:rPr>
-        <w:t xml:space="preserve"/>
-      </w:r>
-    </w:p>
-    <w:p>
-      <w:pPr>
-        <w:spacing w:after="160"/>
-      </w:pPr>
-      <w:r>
-        <w:rPr>
-          <w:sz w:val="22"/>
-          <w:szCs w:val="22"/>
-        </w:rPr>
-        <w:t xml:space="preserve">Hallazgo relevante: el modelo puramente estadístico, sin contexto normativo, detecta solo una fracción de los casos reales. Al incorporar la regla de negocio derivada directamente de la Ley de Contrataciones del Estado (umbral de Adjudicación Simplificada), la precisión sube a 100%. Esto confirma que el valor de este módulo no está solo en el algoritmo, sino en traducir correctamente la normativa de contrataciones públicas a reglas computables — un trabajo de dominio que un consultor conocedor del marco legal peruano puede hacer sin necesitar infraestructura de big data desde el primer día.</w:t>
+        <w:t xml:space="preserve">La Figura 4 muestra la explicación individual del caso de mayor riesgo real (proveedor P0000 en la entidad E15): el modelo parte de un riesgo base de 0.48 y lo eleva a 0.97 principalmente por el número de contratos ganados (+0.14), la concentración en un solo tipo de objeto contractual (+0.11) y el monto total acumulado (+0.11). Esta desagregación es la que un auditor puede citar directamente en un informe de hallazgo.</w:t>
       </w:r>
     </w:p>
     <w:p>
@@ -2298,7 +804,7 @@
       <w:r>
         <w:drawing>
           <wp:inline distT="0" distB="0" distL="0" distR="0">
-            <wp:extent cx="4381500" cy="2743200"/>
+            <wp:extent cx="4381500" cy="3238500"/>
             <wp:effectExtent t="0" r="0" b="0" l="0"/>
             <wp:docPr id="1" name="" descr="" title=""/>
             <wp:cNvGraphicFramePr>
@@ -2323,6 +829,1574 @@
                   <pic:spPr bwMode="auto">
                     <a:xfrm>
                       <a:off x="0" y="0"/>
+                      <a:ext cx="4381500" cy="3238500"/>
+                    </a:xfrm>
+                    <a:prstGeom prst="rect">
+                      <a:avLst/>
+                    </a:prstGeom>
+                  </pic:spPr>
+                </pic:pic>
+              </a:graphicData>
+            </a:graphic>
+          </wp:inline>
+        </w:drawing>
+      </w:r>
+    </w:p>
+    <w:p>
+      <w:pPr>
+        <w:spacing w:after="200" w:before="60"/>
+        <w:jc w:val="center"/>
+      </w:pPr>
+      <w:r>
+        <w:rPr>
+          <w:i/>
+          <w:iCs/>
+          <w:color w:val="666666"/>
+          <w:sz w:val="18"/>
+          <w:szCs w:val="18"/>
+        </w:rPr>
+        <w:t xml:space="preserve">Figura 4. Explicación SHAP individual del caso de mayor riesgo (proveedor P0000, entidad E15).</w:t>
+      </w:r>
+    </w:p>
+    <w:p>
+      <w:pPr>
+        <w:pStyle w:val="Heading2"/>
+        <w:spacing w:after="100" w:before="200"/>
+      </w:pPr>
+      <w:r>
+        <w:t xml:space="preserve">3.2. Top de pares proveedor-entidad por riesgo</w:t>
+      </w:r>
+    </w:p>
+    <w:tbl>
+      <w:tblPr>
+        <w:tblW w:type="dxa" w:w="9800"/>
+        <w:tblBorders>
+          <w:top w:val="single" w:color="auto" w:sz="4"/>
+          <w:left w:val="single" w:color="auto" w:sz="4"/>
+          <w:bottom w:val="single" w:color="auto" w:sz="4"/>
+          <w:right w:val="single" w:color="auto" w:sz="4"/>
+          <w:insideH w:val="single" w:color="auto" w:sz="4"/>
+          <w:insideV w:val="single" w:color="auto" w:sz="4"/>
+        </w:tblBorders>
+      </w:tblPr>
+      <w:tblGrid>
+        <w:gridCol w:w="2000"/>
+        <w:gridCol w:w="1800"/>
+        <w:gridCol w:w="1800"/>
+        <w:gridCol w:w="2600"/>
+        <w:gridCol w:w="1600"/>
+      </w:tblGrid>
+      <w:tr>
+        <w:tc>
+          <w:tcPr>
+            <w:tcW w:type="dxa" w:w="2000"/>
+            <w:shd w:fill="1F4E79" w:val="clear"/>
+            <w:tcMar>
+              <w:top w:type="dxa" w:w="60"/>
+              <w:left w:type="dxa" w:w="100"/>
+              <w:bottom w:type="dxa" w:w="60"/>
+              <w:right w:type="dxa" w:w="100"/>
+            </w:tcMar>
+            <w:vAlign w:val="center"/>
+          </w:tcPr>
+          <w:p>
+            <w:pPr>
+              <w:jc w:val="left"/>
+            </w:pPr>
+            <w:r>
+              <w:rPr>
+                <w:b/>
+                <w:bCs/>
+                <w:color w:val="FFFFFF"/>
+                <w:sz w:val="20"/>
+                <w:szCs w:val="20"/>
+              </w:rPr>
+              <w:t xml:space="preserve">Proveedor</w:t>
+            </w:r>
+          </w:p>
+        </w:tc>
+        <w:tc>
+          <w:tcPr>
+            <w:tcW w:type="dxa" w:w="1800"/>
+            <w:shd w:fill="1F4E79" w:val="clear"/>
+            <w:tcMar>
+              <w:top w:type="dxa" w:w="60"/>
+              <w:left w:type="dxa" w:w="100"/>
+              <w:bottom w:type="dxa" w:w="60"/>
+              <w:right w:type="dxa" w:w="100"/>
+            </w:tcMar>
+            <w:vAlign w:val="center"/>
+          </w:tcPr>
+          <w:p>
+            <w:pPr>
+              <w:jc w:val="left"/>
+            </w:pPr>
+            <w:r>
+              <w:rPr>
+                <w:b/>
+                <w:bCs/>
+                <w:color w:val="FFFFFF"/>
+                <w:sz w:val="20"/>
+                <w:szCs w:val="20"/>
+              </w:rPr>
+              <w:t xml:space="preserve">Entidad</w:t>
+            </w:r>
+          </w:p>
+        </w:tc>
+        <w:tc>
+          <w:tcPr>
+            <w:tcW w:type="dxa" w:w="1800"/>
+            <w:shd w:fill="1F4E79" w:val="clear"/>
+            <w:tcMar>
+              <w:top w:type="dxa" w:w="60"/>
+              <w:left w:type="dxa" w:w="100"/>
+              <w:bottom w:type="dxa" w:w="60"/>
+              <w:right w:type="dxa" w:w="100"/>
+            </w:tcMar>
+            <w:vAlign w:val="center"/>
+          </w:tcPr>
+          <w:p>
+            <w:pPr>
+              <w:jc w:val="left"/>
+            </w:pPr>
+            <w:r>
+              <w:rPr>
+                <w:b/>
+                <w:bCs/>
+                <w:color w:val="FFFFFF"/>
+                <w:sz w:val="20"/>
+                <w:szCs w:val="20"/>
+              </w:rPr>
+              <w:t xml:space="preserve">N° contratos</w:t>
+            </w:r>
+          </w:p>
+        </w:tc>
+        <w:tc>
+          <w:tcPr>
+            <w:tcW w:type="dxa" w:w="2600"/>
+            <w:shd w:fill="1F4E79" w:val="clear"/>
+            <w:tcMar>
+              <w:top w:type="dxa" w:w="60"/>
+              <w:left w:type="dxa" w:w="100"/>
+              <w:bottom w:type="dxa" w:w="60"/>
+              <w:right w:type="dxa" w:w="100"/>
+            </w:tcMar>
+            <w:vAlign w:val="center"/>
+          </w:tcPr>
+          <w:p>
+            <w:pPr>
+              <w:jc w:val="left"/>
+            </w:pPr>
+            <w:r>
+              <w:rPr>
+                <w:b/>
+                <w:bCs/>
+                <w:color w:val="FFFFFF"/>
+                <w:sz w:val="20"/>
+                <w:szCs w:val="20"/>
+              </w:rPr>
+              <w:t xml:space="preserve">% modalidad no competitiva</w:t>
+            </w:r>
+          </w:p>
+        </w:tc>
+        <w:tc>
+          <w:tcPr>
+            <w:tcW w:type="dxa" w:w="1600"/>
+            <w:shd w:fill="1F4E79" w:val="clear"/>
+            <w:tcMar>
+              <w:top w:type="dxa" w:w="60"/>
+              <w:left w:type="dxa" w:w="100"/>
+              <w:bottom w:type="dxa" w:w="60"/>
+              <w:right w:type="dxa" w:w="100"/>
+            </w:tcMar>
+            <w:vAlign w:val="center"/>
+          </w:tcPr>
+          <w:p>
+            <w:pPr>
+              <w:jc w:val="left"/>
+            </w:pPr>
+            <w:r>
+              <w:rPr>
+                <w:b/>
+                <w:bCs/>
+                <w:color w:val="FFFFFF"/>
+                <w:sz w:val="20"/>
+                <w:szCs w:val="20"/>
+              </w:rPr>
+              <w:t xml:space="preserve">Score de riesgo</w:t>
+            </w:r>
+          </w:p>
+        </w:tc>
+      </w:tr>
+      <w:tr>
+        <w:tc>
+          <w:tcPr>
+            <w:tcW w:type="dxa" w:w="2000"/>
+            <w:tcMar>
+              <w:top w:type="dxa" w:w="60"/>
+              <w:left w:type="dxa" w:w="100"/>
+              <w:bottom w:type="dxa" w:w="60"/>
+              <w:right w:type="dxa" w:w="100"/>
+            </w:tcMar>
+            <w:vAlign w:val="center"/>
+          </w:tcPr>
+          <w:p>
+            <w:pPr>
+              <w:jc w:val="left"/>
+            </w:pPr>
+            <w:r>
+              <w:rPr>
+                <w:b w:val="false"/>
+                <w:bCs w:val="false"/>
+                <w:color w:val="000000"/>
+                <w:sz w:val="20"/>
+                <w:szCs w:val="20"/>
+              </w:rPr>
+              <w:t xml:space="preserve">P0168</w:t>
+            </w:r>
+          </w:p>
+        </w:tc>
+        <w:tc>
+          <w:tcPr>
+            <w:tcW w:type="dxa" w:w="1800"/>
+            <w:tcMar>
+              <w:top w:type="dxa" w:w="60"/>
+              <w:left w:type="dxa" w:w="100"/>
+              <w:bottom w:type="dxa" w:w="60"/>
+              <w:right w:type="dxa" w:w="100"/>
+            </w:tcMar>
+            <w:vAlign w:val="center"/>
+          </w:tcPr>
+          <w:p>
+            <w:pPr>
+              <w:jc w:val="center"/>
+            </w:pPr>
+            <w:r>
+              <w:rPr>
+                <w:b w:val="false"/>
+                <w:bCs w:val="false"/>
+                <w:color w:val="000000"/>
+                <w:sz w:val="20"/>
+                <w:szCs w:val="20"/>
+              </w:rPr>
+              <w:t xml:space="preserve">E17</w:t>
+            </w:r>
+          </w:p>
+        </w:tc>
+        <w:tc>
+          <w:tcPr>
+            <w:tcW w:type="dxa" w:w="1800"/>
+            <w:tcMar>
+              <w:top w:type="dxa" w:w="60"/>
+              <w:left w:type="dxa" w:w="100"/>
+              <w:bottom w:type="dxa" w:w="60"/>
+              <w:right w:type="dxa" w:w="100"/>
+            </w:tcMar>
+            <w:vAlign w:val="center"/>
+          </w:tcPr>
+          <w:p>
+            <w:pPr>
+              <w:jc w:val="center"/>
+            </w:pPr>
+            <w:r>
+              <w:rPr>
+                <w:b w:val="false"/>
+                <w:bCs w:val="false"/>
+                <w:color w:val="000000"/>
+                <w:sz w:val="20"/>
+                <w:szCs w:val="20"/>
+              </w:rPr>
+              <w:t xml:space="preserve">12</w:t>
+            </w:r>
+          </w:p>
+        </w:tc>
+        <w:tc>
+          <w:tcPr>
+            <w:tcW w:type="dxa" w:w="2600"/>
+            <w:tcMar>
+              <w:top w:type="dxa" w:w="60"/>
+              <w:left w:type="dxa" w:w="100"/>
+              <w:bottom w:type="dxa" w:w="60"/>
+              <w:right w:type="dxa" w:w="100"/>
+            </w:tcMar>
+            <w:vAlign w:val="center"/>
+          </w:tcPr>
+          <w:p>
+            <w:pPr>
+              <w:jc w:val="center"/>
+            </w:pPr>
+            <w:r>
+              <w:rPr>
+                <w:b w:val="false"/>
+                <w:bCs w:val="false"/>
+                <w:color w:val="000000"/>
+                <w:sz w:val="20"/>
+                <w:szCs w:val="20"/>
+              </w:rPr>
+              <w:t xml:space="preserve">91.7%</w:t>
+            </w:r>
+          </w:p>
+        </w:tc>
+        <w:tc>
+          <w:tcPr>
+            <w:tcW w:type="dxa" w:w="1600"/>
+            <w:tcMar>
+              <w:top w:type="dxa" w:w="60"/>
+              <w:left w:type="dxa" w:w="100"/>
+              <w:bottom w:type="dxa" w:w="60"/>
+              <w:right w:type="dxa" w:w="100"/>
+            </w:tcMar>
+            <w:vAlign w:val="center"/>
+          </w:tcPr>
+          <w:p>
+            <w:pPr>
+              <w:jc w:val="center"/>
+            </w:pPr>
+            <w:r>
+              <w:rPr>
+                <w:b w:val="false"/>
+                <w:bCs w:val="false"/>
+                <w:color w:val="000000"/>
+                <w:sz w:val="20"/>
+                <w:szCs w:val="20"/>
+              </w:rPr>
+              <w:t xml:space="preserve">0.997</w:t>
+            </w:r>
+          </w:p>
+        </w:tc>
+      </w:tr>
+      <w:tr>
+        <w:tc>
+          <w:tcPr>
+            <w:tcW w:type="dxa" w:w="2000"/>
+            <w:tcMar>
+              <w:top w:type="dxa" w:w="60"/>
+              <w:left w:type="dxa" w:w="100"/>
+              <w:bottom w:type="dxa" w:w="60"/>
+              <w:right w:type="dxa" w:w="100"/>
+            </w:tcMar>
+            <w:vAlign w:val="center"/>
+          </w:tcPr>
+          <w:p>
+            <w:pPr>
+              <w:jc w:val="left"/>
+            </w:pPr>
+            <w:r>
+              <w:rPr>
+                <w:b w:val="false"/>
+                <w:bCs w:val="false"/>
+                <w:color w:val="000000"/>
+                <w:sz w:val="20"/>
+                <w:szCs w:val="20"/>
+              </w:rPr>
+              <w:t xml:space="preserve">P0000</w:t>
+            </w:r>
+          </w:p>
+        </w:tc>
+        <w:tc>
+          <w:tcPr>
+            <w:tcW w:type="dxa" w:w="1800"/>
+            <w:tcMar>
+              <w:top w:type="dxa" w:w="60"/>
+              <w:left w:type="dxa" w:w="100"/>
+              <w:bottom w:type="dxa" w:w="60"/>
+              <w:right w:type="dxa" w:w="100"/>
+            </w:tcMar>
+            <w:vAlign w:val="center"/>
+          </w:tcPr>
+          <w:p>
+            <w:pPr>
+              <w:jc w:val="center"/>
+            </w:pPr>
+            <w:r>
+              <w:rPr>
+                <w:b w:val="false"/>
+                <w:bCs w:val="false"/>
+                <w:color w:val="000000"/>
+                <w:sz w:val="20"/>
+                <w:szCs w:val="20"/>
+              </w:rPr>
+              <w:t xml:space="preserve">E15</w:t>
+            </w:r>
+          </w:p>
+        </w:tc>
+        <w:tc>
+          <w:tcPr>
+            <w:tcW w:type="dxa" w:w="1800"/>
+            <w:tcMar>
+              <w:top w:type="dxa" w:w="60"/>
+              <w:left w:type="dxa" w:w="100"/>
+              <w:bottom w:type="dxa" w:w="60"/>
+              <w:right w:type="dxa" w:w="100"/>
+            </w:tcMar>
+            <w:vAlign w:val="center"/>
+          </w:tcPr>
+          <w:p>
+            <w:pPr>
+              <w:jc w:val="center"/>
+            </w:pPr>
+            <w:r>
+              <w:rPr>
+                <w:b w:val="false"/>
+                <w:bCs w:val="false"/>
+                <w:color w:val="000000"/>
+                <w:sz w:val="20"/>
+                <w:szCs w:val="20"/>
+              </w:rPr>
+              <w:t xml:space="preserve">11</w:t>
+            </w:r>
+          </w:p>
+        </w:tc>
+        <w:tc>
+          <w:tcPr>
+            <w:tcW w:type="dxa" w:w="2600"/>
+            <w:tcMar>
+              <w:top w:type="dxa" w:w="60"/>
+              <w:left w:type="dxa" w:w="100"/>
+              <w:bottom w:type="dxa" w:w="60"/>
+              <w:right w:type="dxa" w:w="100"/>
+            </w:tcMar>
+            <w:vAlign w:val="center"/>
+          </w:tcPr>
+          <w:p>
+            <w:pPr>
+              <w:jc w:val="center"/>
+            </w:pPr>
+            <w:r>
+              <w:rPr>
+                <w:b w:val="false"/>
+                <w:bCs w:val="false"/>
+                <w:color w:val="000000"/>
+                <w:sz w:val="20"/>
+                <w:szCs w:val="20"/>
+              </w:rPr>
+              <w:t xml:space="preserve">100.0%</w:t>
+            </w:r>
+          </w:p>
+        </w:tc>
+        <w:tc>
+          <w:tcPr>
+            <w:tcW w:type="dxa" w:w="1600"/>
+            <w:tcMar>
+              <w:top w:type="dxa" w:w="60"/>
+              <w:left w:type="dxa" w:w="100"/>
+              <w:bottom w:type="dxa" w:w="60"/>
+              <w:right w:type="dxa" w:w="100"/>
+            </w:tcMar>
+            <w:vAlign w:val="center"/>
+          </w:tcPr>
+          <w:p>
+            <w:pPr>
+              <w:jc w:val="center"/>
+            </w:pPr>
+            <w:r>
+              <w:rPr>
+                <w:b w:val="false"/>
+                <w:bCs w:val="false"/>
+                <w:color w:val="000000"/>
+                <w:sz w:val="20"/>
+                <w:szCs w:val="20"/>
+              </w:rPr>
+              <w:t xml:space="preserve">0.970</w:t>
+            </w:r>
+          </w:p>
+        </w:tc>
+      </w:tr>
+      <w:tr>
+        <w:tc>
+          <w:tcPr>
+            <w:tcW w:type="dxa" w:w="2000"/>
+            <w:tcMar>
+              <w:top w:type="dxa" w:w="60"/>
+              <w:left w:type="dxa" w:w="100"/>
+              <w:bottom w:type="dxa" w:w="60"/>
+              <w:right w:type="dxa" w:w="100"/>
+            </w:tcMar>
+            <w:vAlign w:val="center"/>
+          </w:tcPr>
+          <w:p>
+            <w:pPr>
+              <w:jc w:val="left"/>
+            </w:pPr>
+            <w:r>
+              <w:rPr>
+                <w:b w:val="false"/>
+                <w:bCs w:val="false"/>
+                <w:color w:val="000000"/>
+                <w:sz w:val="20"/>
+                <w:szCs w:val="20"/>
+              </w:rPr>
+              <w:t xml:space="preserve">P0051</w:t>
+            </w:r>
+          </w:p>
+        </w:tc>
+        <w:tc>
+          <w:tcPr>
+            <w:tcW w:type="dxa" w:w="1800"/>
+            <w:tcMar>
+              <w:top w:type="dxa" w:w="60"/>
+              <w:left w:type="dxa" w:w="100"/>
+              <w:bottom w:type="dxa" w:w="60"/>
+              <w:right w:type="dxa" w:w="100"/>
+            </w:tcMar>
+            <w:vAlign w:val="center"/>
+          </w:tcPr>
+          <w:p>
+            <w:pPr>
+              <w:jc w:val="center"/>
+            </w:pPr>
+            <w:r>
+              <w:rPr>
+                <w:b w:val="false"/>
+                <w:bCs w:val="false"/>
+                <w:color w:val="000000"/>
+                <w:sz w:val="20"/>
+                <w:szCs w:val="20"/>
+              </w:rPr>
+              <w:t xml:space="preserve">E08</w:t>
+            </w:r>
+          </w:p>
+        </w:tc>
+        <w:tc>
+          <w:tcPr>
+            <w:tcW w:type="dxa" w:w="1800"/>
+            <w:tcMar>
+              <w:top w:type="dxa" w:w="60"/>
+              <w:left w:type="dxa" w:w="100"/>
+              <w:bottom w:type="dxa" w:w="60"/>
+              <w:right w:type="dxa" w:w="100"/>
+            </w:tcMar>
+            <w:vAlign w:val="center"/>
+          </w:tcPr>
+          <w:p>
+            <w:pPr>
+              <w:jc w:val="center"/>
+            </w:pPr>
+            <w:r>
+              <w:rPr>
+                <w:b w:val="false"/>
+                <w:bCs w:val="false"/>
+                <w:color w:val="000000"/>
+                <w:sz w:val="20"/>
+                <w:szCs w:val="20"/>
+              </w:rPr>
+              <w:t xml:space="preserve">16</w:t>
+            </w:r>
+          </w:p>
+        </w:tc>
+        <w:tc>
+          <w:tcPr>
+            <w:tcW w:type="dxa" w:w="2600"/>
+            <w:tcMar>
+              <w:top w:type="dxa" w:w="60"/>
+              <w:left w:type="dxa" w:w="100"/>
+              <w:bottom w:type="dxa" w:w="60"/>
+              <w:right w:type="dxa" w:w="100"/>
+            </w:tcMar>
+            <w:vAlign w:val="center"/>
+          </w:tcPr>
+          <w:p>
+            <w:pPr>
+              <w:jc w:val="center"/>
+            </w:pPr>
+            <w:r>
+              <w:rPr>
+                <w:b w:val="false"/>
+                <w:bCs w:val="false"/>
+                <w:color w:val="000000"/>
+                <w:sz w:val="20"/>
+                <w:szCs w:val="20"/>
+              </w:rPr>
+              <w:t xml:space="preserve">93.8%</w:t>
+            </w:r>
+          </w:p>
+        </w:tc>
+        <w:tc>
+          <w:tcPr>
+            <w:tcW w:type="dxa" w:w="1600"/>
+            <w:tcMar>
+              <w:top w:type="dxa" w:w="60"/>
+              <w:left w:type="dxa" w:w="100"/>
+              <w:bottom w:type="dxa" w:w="60"/>
+              <w:right w:type="dxa" w:w="100"/>
+            </w:tcMar>
+            <w:vAlign w:val="center"/>
+          </w:tcPr>
+          <w:p>
+            <w:pPr>
+              <w:jc w:val="center"/>
+            </w:pPr>
+            <w:r>
+              <w:rPr>
+                <w:b w:val="false"/>
+                <w:bCs w:val="false"/>
+                <w:color w:val="000000"/>
+                <w:sz w:val="20"/>
+                <w:szCs w:val="20"/>
+              </w:rPr>
+              <w:t xml:space="preserve">0.963</w:t>
+            </w:r>
+          </w:p>
+        </w:tc>
+      </w:tr>
+      <w:tr>
+        <w:tc>
+          <w:tcPr>
+            <w:tcW w:type="dxa" w:w="2000"/>
+            <w:tcMar>
+              <w:top w:type="dxa" w:w="60"/>
+              <w:left w:type="dxa" w:w="100"/>
+              <w:bottom w:type="dxa" w:w="60"/>
+              <w:right w:type="dxa" w:w="100"/>
+            </w:tcMar>
+            <w:vAlign w:val="center"/>
+          </w:tcPr>
+          <w:p>
+            <w:pPr>
+              <w:jc w:val="left"/>
+            </w:pPr>
+            <w:r>
+              <w:rPr>
+                <w:b w:val="false"/>
+                <w:bCs w:val="false"/>
+                <w:color w:val="000000"/>
+                <w:sz w:val="20"/>
+                <w:szCs w:val="20"/>
+              </w:rPr>
+              <w:t xml:space="preserve">P0138</w:t>
+            </w:r>
+          </w:p>
+        </w:tc>
+        <w:tc>
+          <w:tcPr>
+            <w:tcW w:type="dxa" w:w="1800"/>
+            <w:tcMar>
+              <w:top w:type="dxa" w:w="60"/>
+              <w:left w:type="dxa" w:w="100"/>
+              <w:bottom w:type="dxa" w:w="60"/>
+              <w:right w:type="dxa" w:w="100"/>
+            </w:tcMar>
+            <w:vAlign w:val="center"/>
+          </w:tcPr>
+          <w:p>
+            <w:pPr>
+              <w:jc w:val="center"/>
+            </w:pPr>
+            <w:r>
+              <w:rPr>
+                <w:b w:val="false"/>
+                <w:bCs w:val="false"/>
+                <w:color w:val="000000"/>
+                <w:sz w:val="20"/>
+                <w:szCs w:val="20"/>
+              </w:rPr>
+              <w:t xml:space="preserve">E00</w:t>
+            </w:r>
+          </w:p>
+        </w:tc>
+        <w:tc>
+          <w:tcPr>
+            <w:tcW w:type="dxa" w:w="1800"/>
+            <w:tcMar>
+              <w:top w:type="dxa" w:w="60"/>
+              <w:left w:type="dxa" w:w="100"/>
+              <w:bottom w:type="dxa" w:w="60"/>
+              <w:right w:type="dxa" w:w="100"/>
+            </w:tcMar>
+            <w:vAlign w:val="center"/>
+          </w:tcPr>
+          <w:p>
+            <w:pPr>
+              <w:jc w:val="center"/>
+            </w:pPr>
+            <w:r>
+              <w:rPr>
+                <w:b w:val="false"/>
+                <w:bCs w:val="false"/>
+                <w:color w:val="000000"/>
+                <w:sz w:val="20"/>
+                <w:szCs w:val="20"/>
+              </w:rPr>
+              <w:t xml:space="preserve">14</w:t>
+            </w:r>
+          </w:p>
+        </w:tc>
+        <w:tc>
+          <w:tcPr>
+            <w:tcW w:type="dxa" w:w="2600"/>
+            <w:tcMar>
+              <w:top w:type="dxa" w:w="60"/>
+              <w:left w:type="dxa" w:w="100"/>
+              <w:bottom w:type="dxa" w:w="60"/>
+              <w:right w:type="dxa" w:w="100"/>
+            </w:tcMar>
+            <w:vAlign w:val="center"/>
+          </w:tcPr>
+          <w:p>
+            <w:pPr>
+              <w:jc w:val="center"/>
+            </w:pPr>
+            <w:r>
+              <w:rPr>
+                <w:b w:val="false"/>
+                <w:bCs w:val="false"/>
+                <w:color w:val="000000"/>
+                <w:sz w:val="20"/>
+                <w:szCs w:val="20"/>
+              </w:rPr>
+              <w:t xml:space="preserve">100.0%</w:t>
+            </w:r>
+          </w:p>
+        </w:tc>
+        <w:tc>
+          <w:tcPr>
+            <w:tcW w:type="dxa" w:w="1600"/>
+            <w:tcMar>
+              <w:top w:type="dxa" w:w="60"/>
+              <w:left w:type="dxa" w:w="100"/>
+              <w:bottom w:type="dxa" w:w="60"/>
+              <w:right w:type="dxa" w:w="100"/>
+            </w:tcMar>
+            <w:vAlign w:val="center"/>
+          </w:tcPr>
+          <w:p>
+            <w:pPr>
+              <w:jc w:val="center"/>
+            </w:pPr>
+            <w:r>
+              <w:rPr>
+                <w:b w:val="false"/>
+                <w:bCs w:val="false"/>
+                <w:color w:val="000000"/>
+                <w:sz w:val="20"/>
+                <w:szCs w:val="20"/>
+              </w:rPr>
+              <w:t xml:space="preserve">0.957</w:t>
+            </w:r>
+          </w:p>
+        </w:tc>
+      </w:tr>
+      <w:tr>
+        <w:tc>
+          <w:tcPr>
+            <w:tcW w:type="dxa" w:w="2000"/>
+            <w:tcMar>
+              <w:top w:type="dxa" w:w="60"/>
+              <w:left w:type="dxa" w:w="100"/>
+              <w:bottom w:type="dxa" w:w="60"/>
+              <w:right w:type="dxa" w:w="100"/>
+            </w:tcMar>
+            <w:vAlign w:val="center"/>
+          </w:tcPr>
+          <w:p>
+            <w:pPr>
+              <w:jc w:val="left"/>
+            </w:pPr>
+            <w:r>
+              <w:rPr>
+                <w:b w:val="false"/>
+                <w:bCs w:val="false"/>
+                <w:color w:val="000000"/>
+                <w:sz w:val="20"/>
+                <w:szCs w:val="20"/>
+              </w:rPr>
+              <w:t xml:space="preserve">P0049</w:t>
+            </w:r>
+          </w:p>
+        </w:tc>
+        <w:tc>
+          <w:tcPr>
+            <w:tcW w:type="dxa" w:w="1800"/>
+            <w:tcMar>
+              <w:top w:type="dxa" w:w="60"/>
+              <w:left w:type="dxa" w:w="100"/>
+              <w:bottom w:type="dxa" w:w="60"/>
+              <w:right w:type="dxa" w:w="100"/>
+            </w:tcMar>
+            <w:vAlign w:val="center"/>
+          </w:tcPr>
+          <w:p>
+            <w:pPr>
+              <w:jc w:val="center"/>
+            </w:pPr>
+            <w:r>
+              <w:rPr>
+                <w:b w:val="false"/>
+                <w:bCs w:val="false"/>
+                <w:color w:val="000000"/>
+                <w:sz w:val="20"/>
+                <w:szCs w:val="20"/>
+              </w:rPr>
+              <w:t xml:space="preserve">E16</w:t>
+            </w:r>
+          </w:p>
+        </w:tc>
+        <w:tc>
+          <w:tcPr>
+            <w:tcW w:type="dxa" w:w="1800"/>
+            <w:tcMar>
+              <w:top w:type="dxa" w:w="60"/>
+              <w:left w:type="dxa" w:w="100"/>
+              <w:bottom w:type="dxa" w:w="60"/>
+              <w:right w:type="dxa" w:w="100"/>
+            </w:tcMar>
+            <w:vAlign w:val="center"/>
+          </w:tcPr>
+          <w:p>
+            <w:pPr>
+              <w:jc w:val="center"/>
+            </w:pPr>
+            <w:r>
+              <w:rPr>
+                <w:b w:val="false"/>
+                <w:bCs w:val="false"/>
+                <w:color w:val="000000"/>
+                <w:sz w:val="20"/>
+                <w:szCs w:val="20"/>
+              </w:rPr>
+              <w:t xml:space="preserve">15</w:t>
+            </w:r>
+          </w:p>
+        </w:tc>
+        <w:tc>
+          <w:tcPr>
+            <w:tcW w:type="dxa" w:w="2600"/>
+            <w:tcMar>
+              <w:top w:type="dxa" w:w="60"/>
+              <w:left w:type="dxa" w:w="100"/>
+              <w:bottom w:type="dxa" w:w="60"/>
+              <w:right w:type="dxa" w:w="100"/>
+            </w:tcMar>
+            <w:vAlign w:val="center"/>
+          </w:tcPr>
+          <w:p>
+            <w:pPr>
+              <w:jc w:val="center"/>
+            </w:pPr>
+            <w:r>
+              <w:rPr>
+                <w:b w:val="false"/>
+                <w:bCs w:val="false"/>
+                <w:color w:val="000000"/>
+                <w:sz w:val="20"/>
+                <w:szCs w:val="20"/>
+              </w:rPr>
+              <w:t xml:space="preserve">93.3%</w:t>
+            </w:r>
+          </w:p>
+        </w:tc>
+        <w:tc>
+          <w:tcPr>
+            <w:tcW w:type="dxa" w:w="1600"/>
+            <w:tcMar>
+              <w:top w:type="dxa" w:w="60"/>
+              <w:left w:type="dxa" w:w="100"/>
+              <w:bottom w:type="dxa" w:w="60"/>
+              <w:right w:type="dxa" w:w="100"/>
+            </w:tcMar>
+            <w:vAlign w:val="center"/>
+          </w:tcPr>
+          <w:p>
+            <w:pPr>
+              <w:jc w:val="center"/>
+            </w:pPr>
+            <w:r>
+              <w:rPr>
+                <w:b w:val="false"/>
+                <w:bCs w:val="false"/>
+                <w:color w:val="000000"/>
+                <w:sz w:val="20"/>
+                <w:szCs w:val="20"/>
+              </w:rPr>
+              <w:t xml:space="preserve">0.923</w:t>
+            </w:r>
+          </w:p>
+        </w:tc>
+      </w:tr>
+      <w:tr>
+        <w:tc>
+          <w:tcPr>
+            <w:tcW w:type="dxa" w:w="2000"/>
+            <w:tcMar>
+              <w:top w:type="dxa" w:w="60"/>
+              <w:left w:type="dxa" w:w="100"/>
+              <w:bottom w:type="dxa" w:w="60"/>
+              <w:right w:type="dxa" w:w="100"/>
+            </w:tcMar>
+            <w:vAlign w:val="center"/>
+          </w:tcPr>
+          <w:p>
+            <w:pPr>
+              <w:jc w:val="left"/>
+            </w:pPr>
+            <w:r>
+              <w:rPr>
+                <w:b w:val="false"/>
+                <w:bCs w:val="false"/>
+                <w:color w:val="000000"/>
+                <w:sz w:val="20"/>
+                <w:szCs w:val="20"/>
+              </w:rPr>
+              <w:t xml:space="preserve">P0154</w:t>
+            </w:r>
+          </w:p>
+        </w:tc>
+        <w:tc>
+          <w:tcPr>
+            <w:tcW w:type="dxa" w:w="1800"/>
+            <w:tcMar>
+              <w:top w:type="dxa" w:w="60"/>
+              <w:left w:type="dxa" w:w="100"/>
+              <w:bottom w:type="dxa" w:w="60"/>
+              <w:right w:type="dxa" w:w="100"/>
+            </w:tcMar>
+            <w:vAlign w:val="center"/>
+          </w:tcPr>
+          <w:p>
+            <w:pPr>
+              <w:jc w:val="center"/>
+            </w:pPr>
+            <w:r>
+              <w:rPr>
+                <w:b w:val="false"/>
+                <w:bCs w:val="false"/>
+                <w:color w:val="000000"/>
+                <w:sz w:val="20"/>
+                <w:szCs w:val="20"/>
+              </w:rPr>
+              <w:t xml:space="preserve">E16</w:t>
+            </w:r>
+          </w:p>
+        </w:tc>
+        <w:tc>
+          <w:tcPr>
+            <w:tcW w:type="dxa" w:w="1800"/>
+            <w:tcMar>
+              <w:top w:type="dxa" w:w="60"/>
+              <w:left w:type="dxa" w:w="100"/>
+              <w:bottom w:type="dxa" w:w="60"/>
+              <w:right w:type="dxa" w:w="100"/>
+            </w:tcMar>
+            <w:vAlign w:val="center"/>
+          </w:tcPr>
+          <w:p>
+            <w:pPr>
+              <w:jc w:val="center"/>
+            </w:pPr>
+            <w:r>
+              <w:rPr>
+                <w:b w:val="false"/>
+                <w:bCs w:val="false"/>
+                <w:color w:val="000000"/>
+                <w:sz w:val="20"/>
+                <w:szCs w:val="20"/>
+              </w:rPr>
+              <w:t xml:space="preserve">11</w:t>
+            </w:r>
+          </w:p>
+        </w:tc>
+        <w:tc>
+          <w:tcPr>
+            <w:tcW w:type="dxa" w:w="2600"/>
+            <w:tcMar>
+              <w:top w:type="dxa" w:w="60"/>
+              <w:left w:type="dxa" w:w="100"/>
+              <w:bottom w:type="dxa" w:w="60"/>
+              <w:right w:type="dxa" w:w="100"/>
+            </w:tcMar>
+            <w:vAlign w:val="center"/>
+          </w:tcPr>
+          <w:p>
+            <w:pPr>
+              <w:jc w:val="center"/>
+            </w:pPr>
+            <w:r>
+              <w:rPr>
+                <w:b w:val="false"/>
+                <w:bCs w:val="false"/>
+                <w:color w:val="000000"/>
+                <w:sz w:val="20"/>
+                <w:szCs w:val="20"/>
+              </w:rPr>
+              <w:t xml:space="preserve">100.0%</w:t>
+            </w:r>
+          </w:p>
+        </w:tc>
+        <w:tc>
+          <w:tcPr>
+            <w:tcW w:type="dxa" w:w="1600"/>
+            <w:tcMar>
+              <w:top w:type="dxa" w:w="60"/>
+              <w:left w:type="dxa" w:w="100"/>
+              <w:bottom w:type="dxa" w:w="60"/>
+              <w:right w:type="dxa" w:w="100"/>
+            </w:tcMar>
+            <w:vAlign w:val="center"/>
+          </w:tcPr>
+          <w:p>
+            <w:pPr>
+              <w:jc w:val="center"/>
+            </w:pPr>
+            <w:r>
+              <w:rPr>
+                <w:b w:val="false"/>
+                <w:bCs w:val="false"/>
+                <w:color w:val="000000"/>
+                <w:sz w:val="20"/>
+                <w:szCs w:val="20"/>
+              </w:rPr>
+              <w:t xml:space="preserve">0.843</w:t>
+            </w:r>
+          </w:p>
+        </w:tc>
+      </w:tr>
+    </w:tbl>
+    <w:p>
+      <w:r>
+        <w:br w:type="page"/>
+      </w:r>
+    </w:p>
+    <w:p>
+      <w:pPr>
+        <w:pStyle w:val="Heading1"/>
+        <w:spacing w:after="150" w:before="300"/>
+      </w:pPr>
+      <w:r>
+        <w:t xml:space="preserve">4. Modelo de Detección de Fraccionamiento</w:t>
+      </w:r>
+    </w:p>
+    <w:p>
+      <w:pPr>
+        <w:spacing w:after="160"/>
+      </w:pPr>
+      <w:r>
+        <w:rPr>
+          <w:sz w:val="22"/>
+          <w:szCs w:val="22"/>
+        </w:rPr>
+        <w:t xml:space="preserve">Se construyeron 149 grupos proveedor-entidad-objeto con 2 o más contratos, y se calcularon variables de ventana temporal (máximo de contratos en ventanas móviles de 15 días, porcentaje de montos justo por debajo del umbral legal de Adjudicación Simplificada). Se compararon dos enfoques: un modelo no supervisado de detección de anomalías (Isolation Forest) y una regla explícita basada en el umbral normativo vigente.</w:t>
+      </w:r>
+    </w:p>
+    <w:tbl>
+      <w:tblPr>
+        <w:tblW w:type="dxa" w:w="9800"/>
+        <w:tblBorders>
+          <w:top w:val="single" w:color="auto" w:sz="4"/>
+          <w:left w:val="single" w:color="auto" w:sz="4"/>
+          <w:bottom w:val="single" w:color="auto" w:sz="4"/>
+          <w:right w:val="single" w:color="auto" w:sz="4"/>
+          <w:insideH w:val="single" w:color="auto" w:sz="4"/>
+          <w:insideV w:val="single" w:color="auto" w:sz="4"/>
+        </w:tblBorders>
+      </w:tblPr>
+      <w:tblGrid>
+        <w:gridCol w:w="3600"/>
+        <w:gridCol w:w="2200"/>
+        <w:gridCol w:w="2000"/>
+        <w:gridCol w:w="2000"/>
+      </w:tblGrid>
+      <w:tr>
+        <w:tc>
+          <w:tcPr>
+            <w:tcW w:type="dxa" w:w="3600"/>
+            <w:shd w:fill="1F4E79" w:val="clear"/>
+            <w:tcMar>
+              <w:top w:type="dxa" w:w="60"/>
+              <w:left w:type="dxa" w:w="100"/>
+              <w:bottom w:type="dxa" w:w="60"/>
+              <w:right w:type="dxa" w:w="100"/>
+            </w:tcMar>
+            <w:vAlign w:val="center"/>
+          </w:tcPr>
+          <w:p>
+            <w:pPr>
+              <w:jc w:val="left"/>
+            </w:pPr>
+            <w:r>
+              <w:rPr>
+                <w:b/>
+                <w:bCs/>
+                <w:color w:val="FFFFFF"/>
+                <w:sz w:val="20"/>
+                <w:szCs w:val="20"/>
+              </w:rPr>
+              <w:t xml:space="preserve">Enfoque</w:t>
+            </w:r>
+          </w:p>
+        </w:tc>
+        <w:tc>
+          <w:tcPr>
+            <w:tcW w:type="dxa" w:w="2200"/>
+            <w:shd w:fill="1F4E79" w:val="clear"/>
+            <w:tcMar>
+              <w:top w:type="dxa" w:w="60"/>
+              <w:left w:type="dxa" w:w="100"/>
+              <w:bottom w:type="dxa" w:w="60"/>
+              <w:right w:type="dxa" w:w="100"/>
+            </w:tcMar>
+            <w:vAlign w:val="center"/>
+          </w:tcPr>
+          <w:p>
+            <w:pPr>
+              <w:jc w:val="left"/>
+            </w:pPr>
+            <w:r>
+              <w:rPr>
+                <w:b/>
+                <w:bCs/>
+                <w:color w:val="FFFFFF"/>
+                <w:sz w:val="20"/>
+                <w:szCs w:val="20"/>
+              </w:rPr>
+              <w:t xml:space="preserve">Grupos marcados</w:t>
+            </w:r>
+          </w:p>
+        </w:tc>
+        <w:tc>
+          <w:tcPr>
+            <w:tcW w:type="dxa" w:w="2000"/>
+            <w:shd w:fill="1F4E79" w:val="clear"/>
+            <w:tcMar>
+              <w:top w:type="dxa" w:w="60"/>
+              <w:left w:type="dxa" w:w="100"/>
+              <w:bottom w:type="dxa" w:w="60"/>
+              <w:right w:type="dxa" w:w="100"/>
+            </w:tcMar>
+            <w:vAlign w:val="center"/>
+          </w:tcPr>
+          <w:p>
+            <w:pPr>
+              <w:jc w:val="left"/>
+            </w:pPr>
+            <w:r>
+              <w:rPr>
+                <w:b/>
+                <w:bCs/>
+                <w:color w:val="FFFFFF"/>
+                <w:sz w:val="20"/>
+                <w:szCs w:val="20"/>
+              </w:rPr>
+              <w:t xml:space="preserve">Aciertos reales</w:t>
+            </w:r>
+          </w:p>
+        </w:tc>
+        <w:tc>
+          <w:tcPr>
+            <w:tcW w:type="dxa" w:w="2000"/>
+            <w:shd w:fill="1F4E79" w:val="clear"/>
+            <w:tcMar>
+              <w:top w:type="dxa" w:w="60"/>
+              <w:left w:type="dxa" w:w="100"/>
+              <w:bottom w:type="dxa" w:w="60"/>
+              <w:right w:type="dxa" w:w="100"/>
+            </w:tcMar>
+            <w:vAlign w:val="center"/>
+          </w:tcPr>
+          <w:p>
+            <w:pPr>
+              <w:jc w:val="left"/>
+            </w:pPr>
+            <w:r>
+              <w:rPr>
+                <w:b/>
+                <w:bCs/>
+                <w:color w:val="FFFFFF"/>
+                <w:sz w:val="20"/>
+                <w:szCs w:val="20"/>
+              </w:rPr>
+              <w:t xml:space="preserve">Precisión</w:t>
+            </w:r>
+          </w:p>
+        </w:tc>
+      </w:tr>
+      <w:tr>
+        <w:tc>
+          <w:tcPr>
+            <w:tcW w:type="dxa" w:w="3600"/>
+            <w:tcMar>
+              <w:top w:type="dxa" w:w="60"/>
+              <w:left w:type="dxa" w:w="100"/>
+              <w:bottom w:type="dxa" w:w="60"/>
+              <w:right w:type="dxa" w:w="100"/>
+            </w:tcMar>
+            <w:vAlign w:val="center"/>
+          </w:tcPr>
+          <w:p>
+            <w:pPr>
+              <w:jc w:val="left"/>
+            </w:pPr>
+            <w:r>
+              <w:rPr>
+                <w:b w:val="false"/>
+                <w:bCs w:val="false"/>
+                <w:color w:val="000000"/>
+                <w:sz w:val="20"/>
+                <w:szCs w:val="20"/>
+              </w:rPr>
+              <w:t xml:space="preserve">Isolation Forest (solo)</w:t>
+            </w:r>
+          </w:p>
+        </w:tc>
+        <w:tc>
+          <w:tcPr>
+            <w:tcW w:type="dxa" w:w="2200"/>
+            <w:tcMar>
+              <w:top w:type="dxa" w:w="60"/>
+              <w:left w:type="dxa" w:w="100"/>
+              <w:bottom w:type="dxa" w:w="60"/>
+              <w:right w:type="dxa" w:w="100"/>
+            </w:tcMar>
+            <w:vAlign w:val="center"/>
+          </w:tcPr>
+          <w:p>
+            <w:pPr>
+              <w:jc w:val="center"/>
+            </w:pPr>
+            <w:r>
+              <w:rPr>
+                <w:b w:val="false"/>
+                <w:bCs w:val="false"/>
+                <w:color w:val="000000"/>
+                <w:sz w:val="20"/>
+                <w:szCs w:val="20"/>
+              </w:rPr>
+              <w:t xml:space="preserve">8</w:t>
+            </w:r>
+          </w:p>
+        </w:tc>
+        <w:tc>
+          <w:tcPr>
+            <w:tcW w:type="dxa" w:w="2000"/>
+            <w:tcMar>
+              <w:top w:type="dxa" w:w="60"/>
+              <w:left w:type="dxa" w:w="100"/>
+              <w:bottom w:type="dxa" w:w="60"/>
+              <w:right w:type="dxa" w:w="100"/>
+            </w:tcMar>
+            <w:vAlign w:val="center"/>
+          </w:tcPr>
+          <w:p>
+            <w:pPr>
+              <w:jc w:val="center"/>
+            </w:pPr>
+            <w:r>
+              <w:rPr>
+                <w:b w:val="false"/>
+                <w:bCs w:val="false"/>
+                <w:color w:val="000000"/>
+                <w:sz w:val="20"/>
+                <w:szCs w:val="20"/>
+              </w:rPr>
+              <w:t xml:space="preserve">3</w:t>
+            </w:r>
+          </w:p>
+        </w:tc>
+        <w:tc>
+          <w:tcPr>
+            <w:tcW w:type="dxa" w:w="2000"/>
+            <w:tcMar>
+              <w:top w:type="dxa" w:w="60"/>
+              <w:left w:type="dxa" w:w="100"/>
+              <w:bottom w:type="dxa" w:w="60"/>
+              <w:right w:type="dxa" w:w="100"/>
+            </w:tcMar>
+            <w:vAlign w:val="center"/>
+          </w:tcPr>
+          <w:p>
+            <w:pPr>
+              <w:jc w:val="center"/>
+            </w:pPr>
+            <w:r>
+              <w:rPr>
+                <w:b w:val="false"/>
+                <w:bCs w:val="false"/>
+                <w:color w:val="000000"/>
+                <w:sz w:val="20"/>
+                <w:szCs w:val="20"/>
+              </w:rPr>
+              <w:t xml:space="preserve">37.5%</w:t>
+            </w:r>
+          </w:p>
+        </w:tc>
+      </w:tr>
+      <w:tr>
+        <w:tc>
+          <w:tcPr>
+            <w:tcW w:type="dxa" w:w="3600"/>
+            <w:tcMar>
+              <w:top w:type="dxa" w:w="60"/>
+              <w:left w:type="dxa" w:w="100"/>
+              <w:bottom w:type="dxa" w:w="60"/>
+              <w:right w:type="dxa" w:w="100"/>
+            </w:tcMar>
+            <w:vAlign w:val="center"/>
+          </w:tcPr>
+          <w:p>
+            <w:pPr>
+              <w:jc w:val="left"/>
+            </w:pPr>
+            <w:r>
+              <w:rPr>
+                <w:b w:val="false"/>
+                <w:bCs w:val="false"/>
+                <w:color w:val="000000"/>
+                <w:sz w:val="20"/>
+                <w:szCs w:val="20"/>
+              </w:rPr>
+              <w:t xml:space="preserve">Regla interpretable (umbral legal)</w:t>
+            </w:r>
+          </w:p>
+        </w:tc>
+        <w:tc>
+          <w:tcPr>
+            <w:tcW w:type="dxa" w:w="2200"/>
+            <w:tcMar>
+              <w:top w:type="dxa" w:w="60"/>
+              <w:left w:type="dxa" w:w="100"/>
+              <w:bottom w:type="dxa" w:w="60"/>
+              <w:right w:type="dxa" w:w="100"/>
+            </w:tcMar>
+            <w:vAlign w:val="center"/>
+          </w:tcPr>
+          <w:p>
+            <w:pPr>
+              <w:jc w:val="center"/>
+            </w:pPr>
+            <w:r>
+              <w:rPr>
+                <w:b w:val="false"/>
+                <w:bCs w:val="false"/>
+                <w:color w:val="000000"/>
+                <w:sz w:val="20"/>
+                <w:szCs w:val="20"/>
+              </w:rPr>
+              <w:t xml:space="preserve">7</w:t>
+            </w:r>
+          </w:p>
+        </w:tc>
+        <w:tc>
+          <w:tcPr>
+            <w:tcW w:type="dxa" w:w="2000"/>
+            <w:tcMar>
+              <w:top w:type="dxa" w:w="60"/>
+              <w:left w:type="dxa" w:w="100"/>
+              <w:bottom w:type="dxa" w:w="60"/>
+              <w:right w:type="dxa" w:w="100"/>
+            </w:tcMar>
+            <w:vAlign w:val="center"/>
+          </w:tcPr>
+          <w:p>
+            <w:pPr>
+              <w:jc w:val="center"/>
+            </w:pPr>
+            <w:r>
+              <w:rPr>
+                <w:b w:val="false"/>
+                <w:bCs w:val="false"/>
+                <w:color w:val="000000"/>
+                <w:sz w:val="20"/>
+                <w:szCs w:val="20"/>
+              </w:rPr>
+              <w:t xml:space="preserve">7</w:t>
+            </w:r>
+          </w:p>
+        </w:tc>
+        <w:tc>
+          <w:tcPr>
+            <w:tcW w:type="dxa" w:w="2000"/>
+            <w:tcMar>
+              <w:top w:type="dxa" w:w="60"/>
+              <w:left w:type="dxa" w:w="100"/>
+              <w:bottom w:type="dxa" w:w="60"/>
+              <w:right w:type="dxa" w:w="100"/>
+            </w:tcMar>
+            <w:vAlign w:val="center"/>
+          </w:tcPr>
+          <w:p>
+            <w:pPr>
+              <w:jc w:val="center"/>
+            </w:pPr>
+            <w:r>
+              <w:rPr>
+                <w:b w:val="false"/>
+                <w:bCs w:val="false"/>
+                <w:color w:val="000000"/>
+                <w:sz w:val="20"/>
+                <w:szCs w:val="20"/>
+              </w:rPr>
+              <w:t xml:space="preserve">100.0%</w:t>
+            </w:r>
+          </w:p>
+        </w:tc>
+      </w:tr>
+      <w:tr>
+        <w:tc>
+          <w:tcPr>
+            <w:tcW w:type="dxa" w:w="3600"/>
+            <w:tcMar>
+              <w:top w:type="dxa" w:w="60"/>
+              <w:left w:type="dxa" w:w="100"/>
+              <w:bottom w:type="dxa" w:w="60"/>
+              <w:right w:type="dxa" w:w="100"/>
+            </w:tcMar>
+            <w:vAlign w:val="center"/>
+          </w:tcPr>
+          <w:p>
+            <w:pPr>
+              <w:jc w:val="left"/>
+            </w:pPr>
+            <w:r>
+              <w:rPr>
+                <w:b w:val="false"/>
+                <w:bCs w:val="false"/>
+                <w:color w:val="000000"/>
+                <w:sz w:val="20"/>
+                <w:szCs w:val="20"/>
+              </w:rPr>
+              <w:t xml:space="preserve">Combinado (modelo Y regla)</w:t>
+            </w:r>
+          </w:p>
+        </w:tc>
+        <w:tc>
+          <w:tcPr>
+            <w:tcW w:type="dxa" w:w="2200"/>
+            <w:tcMar>
+              <w:top w:type="dxa" w:w="60"/>
+              <w:left w:type="dxa" w:w="100"/>
+              <w:bottom w:type="dxa" w:w="60"/>
+              <w:right w:type="dxa" w:w="100"/>
+            </w:tcMar>
+            <w:vAlign w:val="center"/>
+          </w:tcPr>
+          <w:p>
+            <w:pPr>
+              <w:jc w:val="center"/>
+            </w:pPr>
+            <w:r>
+              <w:rPr>
+                <w:b w:val="false"/>
+                <w:bCs w:val="false"/>
+                <w:color w:val="000000"/>
+                <w:sz w:val="20"/>
+                <w:szCs w:val="20"/>
+              </w:rPr>
+              <w:t xml:space="preserve">2</w:t>
+            </w:r>
+          </w:p>
+        </w:tc>
+        <w:tc>
+          <w:tcPr>
+            <w:tcW w:type="dxa" w:w="2000"/>
+            <w:tcMar>
+              <w:top w:type="dxa" w:w="60"/>
+              <w:left w:type="dxa" w:w="100"/>
+              <w:bottom w:type="dxa" w:w="60"/>
+              <w:right w:type="dxa" w:w="100"/>
+            </w:tcMar>
+            <w:vAlign w:val="center"/>
+          </w:tcPr>
+          <w:p>
+            <w:pPr>
+              <w:jc w:val="center"/>
+            </w:pPr>
+            <w:r>
+              <w:rPr>
+                <w:b w:val="false"/>
+                <w:bCs w:val="false"/>
+                <w:color w:val="000000"/>
+                <w:sz w:val="20"/>
+                <w:szCs w:val="20"/>
+              </w:rPr>
+              <w:t xml:space="preserve">2</w:t>
+            </w:r>
+          </w:p>
+        </w:tc>
+        <w:tc>
+          <w:tcPr>
+            <w:tcW w:type="dxa" w:w="2000"/>
+            <w:tcMar>
+              <w:top w:type="dxa" w:w="60"/>
+              <w:left w:type="dxa" w:w="100"/>
+              <w:bottom w:type="dxa" w:w="60"/>
+              <w:right w:type="dxa" w:w="100"/>
+            </w:tcMar>
+            <w:vAlign w:val="center"/>
+          </w:tcPr>
+          <w:p>
+            <w:pPr>
+              <w:jc w:val="center"/>
+            </w:pPr>
+            <w:r>
+              <w:rPr>
+                <w:b w:val="false"/>
+                <w:bCs w:val="false"/>
+                <w:color w:val="000000"/>
+                <w:sz w:val="20"/>
+                <w:szCs w:val="20"/>
+              </w:rPr>
+              <w:t xml:space="preserve">100.0%</w:t>
+            </w:r>
+          </w:p>
+        </w:tc>
+      </w:tr>
+    </w:tbl>
+    <w:p>
+      <w:pPr>
+        <w:spacing w:after="160"/>
+      </w:pPr>
+      <w:r>
+        <w:rPr>
+          <w:sz w:val="4"/>
+          <w:szCs w:val="4"/>
+        </w:rPr>
+        <w:t xml:space="preserve"/>
+      </w:r>
+    </w:p>
+    <w:p>
+      <w:pPr>
+        <w:spacing w:after="160"/>
+      </w:pPr>
+      <w:r>
+        <w:rPr>
+          <w:sz w:val="22"/>
+          <w:szCs w:val="22"/>
+        </w:rPr>
+        <w:t xml:space="preserve">Hallazgo relevante: el modelo puramente estadístico, sin contexto normativo, detecta solo una fracción de los casos reales. Al incorporar la regla de negocio derivada directamente de la Ley de Contrataciones del Estado (umbral de Adjudicación Simplificada), la precisión sube a 100%. Esto confirma que el valor de este módulo no está solo en el algoritmo, sino en traducir correctamente la normativa de contrataciones públicas a reglas computables — un trabajo de dominio que un consultor conocedor del marco legal peruano puede hacer sin necesitar infraestructura de big data desde el primer día.</w:t>
+      </w:r>
+    </w:p>
+    <w:p>
+      <w:pPr>
+        <w:spacing w:after="100"/>
+        <w:jc w:val="center"/>
+      </w:pPr>
+      <w:r>
+        <w:drawing>
+          <wp:inline distT="0" distB="0" distL="0" distR="0">
+            <wp:extent cx="4381500" cy="2743200"/>
+            <wp:effectExtent t="0" r="0" b="0" l="0"/>
+            <wp:docPr id="1" name="" descr="" title=""/>
+            <wp:cNvGraphicFramePr>
+              <a:graphicFrameLocks xmlns:a="http://schemas.openxmlformats.org/drawingml/2006/main" noChangeAspect="1"/>
+            </wp:cNvGraphicFramePr>
+            <a:graphic xmlns:a="http://schemas.openxmlformats.org/drawingml/2006/main">
+              <a:graphicData uri="http://schemas.openxmlformats.org/drawingml/2006/picture">
+                <pic:pic xmlns:pic="http://schemas.openxmlformats.org/drawingml/2006/picture">
+                  <pic:nvPicPr>
+                    <pic:cNvPr id="0" name="" descr=""/>
+                    <pic:cNvPicPr>
+                      <a:picLocks noChangeAspect="1" noChangeArrowheads="1"/>
+                    </pic:cNvPicPr>
+                  </pic:nvPicPr>
+                  <pic:blipFill>
+                    <a:blip r:embed="rId13" cstate="none"/>
+                    <a:srcRect/>
+                    <a:stretch>
+                      <a:fillRect/>
+                    </a:stretch>
+                  </pic:blipFill>
+                  <pic:spPr bwMode="auto">
+                    <a:xfrm>
+                      <a:off x="0" y="0"/>
                       <a:ext cx="4381500" cy="2743200"/>
                     </a:xfrm>
                     <a:prstGeom prst="rect">
@@ -2349,7 +2423,7 @@
           <w:sz w:val="18"/>
           <w:szCs w:val="18"/>
         </w:rPr>
-        <w:t xml:space="preserve">Figura 4. Casos reales sembrados (rojo) vs. score de anomalía y señales de ventana temporal.</w:t>
+        <w:t xml:space="preserve">Figura 5. Casos reales sembrados (rojo) vs. score de anomalía y señales de ventana temporal.</w:t>
       </w:r>
     </w:p>
     <w:p>

</xml_diff>

<commit_message>
Mejora 2/4: diccionario de datos (29 columnas) + diagrama ER del modelo de datos con linaje, integrados al reporte técnico
</commit_message>
<xml_diff>
--- a/reporte/Reporte_Tecnico_Prototipo_CGR_1.8.2.docx
+++ b/reporte/Reporte_Tecnico_Prototipo_CGR_1.8.2.docx
@@ -3567,7 +3567,2615 @@
         <w:spacing w:after="150" w:before="300"/>
       </w:pPr>
       <w:r>
-        <w:t xml:space="preserve">5. Limitaciones del Prototipo</w:t>
+        <w:t xml:space="preserve">5. Diccionario de Datos y Diagrama del Modelo</w:t>
+      </w:r>
+    </w:p>
+    <w:p>
+      <w:pPr>
+        <w:spacing w:after="160"/>
+      </w:pPr>
+      <w:r>
+        <w:rPr>
+          <w:sz w:val="22"/>
+          <w:szCs w:val="22"/>
+        </w:rPr>
+        <w:t xml:space="preserve">Cubre el numeral 3.2.g del TDR ("Elaborar y mantener actualizado el diccionario y diagrama del modelo de datos") y el ítem 8 del checklist del Anexo 3 (documentación de linaje: rastreo del dato desde la fuente hasta el modelo final).</w:t>
+      </w:r>
+    </w:p>
+    <w:p>
+      <w:pPr>
+        <w:spacing w:after="100"/>
+        <w:jc w:val="center"/>
+      </w:pPr>
+      <w:r>
+        <w:drawing>
+          <wp:inline distT="0" distB="0" distL="0" distR="0">
+            <wp:extent cx="5334000" cy="1381125"/>
+            <wp:effectExtent t="0" r="0" b="0" l="0"/>
+            <wp:docPr id="1" name="" descr="" title=""/>
+            <wp:cNvGraphicFramePr>
+              <a:graphicFrameLocks xmlns:a="http://schemas.openxmlformats.org/drawingml/2006/main" noChangeAspect="1"/>
+            </wp:cNvGraphicFramePr>
+            <a:graphic xmlns:a="http://schemas.openxmlformats.org/drawingml/2006/main">
+              <a:graphicData uri="http://schemas.openxmlformats.org/drawingml/2006/picture">
+                <pic:pic xmlns:pic="http://schemas.openxmlformats.org/drawingml/2006/picture">
+                  <pic:nvPicPr>
+                    <pic:cNvPr id="0" name="" descr=""/>
+                    <pic:cNvPicPr>
+                      <a:picLocks noChangeAspect="1" noChangeArrowheads="1"/>
+                    </pic:cNvPicPr>
+                  </pic:nvPicPr>
+                  <pic:blipFill>
+                    <a:blip r:embed="rId14" cstate="none"/>
+                    <a:srcRect/>
+                    <a:stretch>
+                      <a:fillRect/>
+                    </a:stretch>
+                  </pic:blipFill>
+                  <pic:spPr bwMode="auto">
+                    <a:xfrm>
+                      <a:off x="0" y="0"/>
+                      <a:ext cx="5334000" cy="1381125"/>
+                    </a:xfrm>
+                    <a:prstGeom prst="rect">
+                      <a:avLst/>
+                    </a:prstGeom>
+                  </pic:spPr>
+                </pic:pic>
+              </a:graphicData>
+            </a:graphic>
+          </wp:inline>
+        </w:drawing>
+      </w:r>
+    </w:p>
+    <w:p>
+      <w:pPr>
+        <w:spacing w:after="200" w:before="60"/>
+        <w:jc w:val="center"/>
+      </w:pPr>
+      <w:r>
+        <w:rPr>
+          <w:i/>
+          <w:iCs/>
+          <w:color w:val="666666"/>
+          <w:sz w:val="18"/>
+          <w:szCs w:val="18"/>
+        </w:rPr>
+        <w:t xml:space="preserve">Figura 6. Diagrama del modelo de datos: tablas fuente (SIAF/SEACE simuladas), relaciones y linaje hacia las tablas derivadas de cada modelo.</w:t>
+      </w:r>
+    </w:p>
+    <w:p>
+      <w:pPr>
+        <w:pStyle w:val="Heading2"/>
+        <w:spacing w:after="100" w:before="200"/>
+      </w:pPr>
+      <w:r>
+        <w:t xml:space="preserve">5.1. Diccionario de datos</w:t>
+      </w:r>
+    </w:p>
+    <w:tbl>
+      <w:tblPr>
+        <w:tblW w:type="dxa" w:w="9800"/>
+        <w:tblBorders>
+          <w:top w:val="single" w:color="auto" w:sz="4"/>
+          <w:left w:val="single" w:color="auto" w:sz="4"/>
+          <w:bottom w:val="single" w:color="auto" w:sz="4"/>
+          <w:right w:val="single" w:color="auto" w:sz="4"/>
+          <w:insideH w:val="single" w:color="auto" w:sz="4"/>
+          <w:insideV w:val="single" w:color="auto" w:sz="4"/>
+        </w:tblBorders>
+      </w:tblPr>
+      <w:tblGrid>
+        <w:gridCol w:w="3200"/>
+        <w:gridCol w:w="1500"/>
+        <w:gridCol w:w="5100"/>
+      </w:tblGrid>
+      <w:tr>
+        <w:tc>
+          <w:tcPr>
+            <w:tcW w:type="dxa" w:w="3200"/>
+            <w:shd w:fill="1F4E79" w:val="clear"/>
+            <w:tcMar>
+              <w:top w:type="dxa" w:w="60"/>
+              <w:left w:type="dxa" w:w="100"/>
+              <w:bottom w:type="dxa" w:w="60"/>
+              <w:right w:type="dxa" w:w="100"/>
+            </w:tcMar>
+            <w:vAlign w:val="center"/>
+          </w:tcPr>
+          <w:p>
+            <w:pPr>
+              <w:jc w:val="left"/>
+            </w:pPr>
+            <w:r>
+              <w:rPr>
+                <w:b/>
+                <w:bCs/>
+                <w:color w:val="FFFFFF"/>
+                <w:sz w:val="20"/>
+                <w:szCs w:val="20"/>
+              </w:rPr>
+              <w:t xml:space="preserve">Tabla.Columna</w:t>
+            </w:r>
+          </w:p>
+        </w:tc>
+        <w:tc>
+          <w:tcPr>
+            <w:tcW w:type="dxa" w:w="1500"/>
+            <w:shd w:fill="1F4E79" w:val="clear"/>
+            <w:tcMar>
+              <w:top w:type="dxa" w:w="60"/>
+              <w:left w:type="dxa" w:w="100"/>
+              <w:bottom w:type="dxa" w:w="60"/>
+              <w:right w:type="dxa" w:w="100"/>
+            </w:tcMar>
+            <w:vAlign w:val="center"/>
+          </w:tcPr>
+          <w:p>
+            <w:pPr>
+              <w:jc w:val="left"/>
+            </w:pPr>
+            <w:r>
+              <w:rPr>
+                <w:b/>
+                <w:bCs/>
+                <w:color w:val="FFFFFF"/>
+                <w:sz w:val="20"/>
+                <w:szCs w:val="20"/>
+              </w:rPr>
+              <w:t xml:space="preserve">Tipo</w:t>
+            </w:r>
+          </w:p>
+        </w:tc>
+        <w:tc>
+          <w:tcPr>
+            <w:tcW w:type="dxa" w:w="5100"/>
+            <w:shd w:fill="1F4E79" w:val="clear"/>
+            <w:tcMar>
+              <w:top w:type="dxa" w:w="60"/>
+              <w:left w:type="dxa" w:w="100"/>
+              <w:bottom w:type="dxa" w:w="60"/>
+              <w:right w:type="dxa" w:w="100"/>
+            </w:tcMar>
+            <w:vAlign w:val="center"/>
+          </w:tcPr>
+          <w:p>
+            <w:pPr>
+              <w:jc w:val="left"/>
+            </w:pPr>
+            <w:r>
+              <w:rPr>
+                <w:b/>
+                <w:bCs/>
+                <w:color w:val="FFFFFF"/>
+                <w:sz w:val="20"/>
+                <w:szCs w:val="20"/>
+              </w:rPr>
+              <w:t xml:space="preserve">Descripción</w:t>
+            </w:r>
+          </w:p>
+        </w:tc>
+      </w:tr>
+      <w:tr>
+        <w:tc>
+          <w:tcPr>
+            <w:tcW w:type="dxa" w:w="3200"/>
+            <w:tcMar>
+              <w:top w:type="dxa" w:w="60"/>
+              <w:left w:type="dxa" w:w="100"/>
+              <w:bottom w:type="dxa" w:w="60"/>
+              <w:right w:type="dxa" w:w="100"/>
+            </w:tcMar>
+            <w:vAlign w:val="center"/>
+          </w:tcPr>
+          <w:p>
+            <w:pPr>
+              <w:jc w:val="left"/>
+            </w:pPr>
+            <w:r>
+              <w:rPr>
+                <w:b w:val="false"/>
+                <w:bCs w:val="false"/>
+                <w:color w:val="000000"/>
+                <w:sz w:val="20"/>
+                <w:szCs w:val="20"/>
+              </w:rPr>
+              <w:t xml:space="preserve">contratos_siaf_seace.id_contrato</w:t>
+            </w:r>
+          </w:p>
+        </w:tc>
+        <w:tc>
+          <w:tcPr>
+            <w:tcW w:type="dxa" w:w="1500"/>
+            <w:tcMar>
+              <w:top w:type="dxa" w:w="60"/>
+              <w:left w:type="dxa" w:w="100"/>
+              <w:bottom w:type="dxa" w:w="60"/>
+              <w:right w:type="dxa" w:w="100"/>
+            </w:tcMar>
+            <w:vAlign w:val="center"/>
+          </w:tcPr>
+          <w:p>
+            <w:pPr>
+              <w:jc w:val="center"/>
+            </w:pPr>
+            <w:r>
+              <w:rPr>
+                <w:b w:val="false"/>
+                <w:bCs w:val="false"/>
+                <w:color w:val="000000"/>
+                <w:sz w:val="20"/>
+                <w:szCs w:val="20"/>
+              </w:rPr>
+              <w:t xml:space="preserve">string</w:t>
+            </w:r>
+          </w:p>
+        </w:tc>
+        <w:tc>
+          <w:tcPr>
+            <w:tcW w:type="dxa" w:w="5100"/>
+            <w:tcMar>
+              <w:top w:type="dxa" w:w="60"/>
+              <w:left w:type="dxa" w:w="100"/>
+              <w:bottom w:type="dxa" w:w="60"/>
+              <w:right w:type="dxa" w:w="100"/>
+            </w:tcMar>
+            <w:vAlign w:val="center"/>
+          </w:tcPr>
+          <w:p>
+            <w:pPr>
+              <w:jc w:val="center"/>
+            </w:pPr>
+            <w:r>
+              <w:rPr>
+                <w:b w:val="false"/>
+                <w:bCs w:val="false"/>
+                <w:color w:val="000000"/>
+                <w:sz w:val="20"/>
+                <w:szCs w:val="20"/>
+              </w:rPr>
+              <w:t xml:space="preserve">Identificador único del contrato (simula clave de proceso SEACE).</w:t>
+            </w:r>
+          </w:p>
+        </w:tc>
+      </w:tr>
+      <w:tr>
+        <w:tc>
+          <w:tcPr>
+            <w:tcW w:type="dxa" w:w="3200"/>
+            <w:tcMar>
+              <w:top w:type="dxa" w:w="60"/>
+              <w:left w:type="dxa" w:w="100"/>
+              <w:bottom w:type="dxa" w:w="60"/>
+              <w:right w:type="dxa" w:w="100"/>
+            </w:tcMar>
+            <w:vAlign w:val="center"/>
+          </w:tcPr>
+          <w:p>
+            <w:pPr>
+              <w:jc w:val="left"/>
+            </w:pPr>
+            <w:r>
+              <w:rPr>
+                <w:b w:val="false"/>
+                <w:bCs w:val="false"/>
+                <w:color w:val="000000"/>
+                <w:sz w:val="20"/>
+                <w:szCs w:val="20"/>
+              </w:rPr>
+              <w:t xml:space="preserve">contratos_siaf_seace.id_proveedor</w:t>
+            </w:r>
+          </w:p>
+        </w:tc>
+        <w:tc>
+          <w:tcPr>
+            <w:tcW w:type="dxa" w:w="1500"/>
+            <w:tcMar>
+              <w:top w:type="dxa" w:w="60"/>
+              <w:left w:type="dxa" w:w="100"/>
+              <w:bottom w:type="dxa" w:w="60"/>
+              <w:right w:type="dxa" w:w="100"/>
+            </w:tcMar>
+            <w:vAlign w:val="center"/>
+          </w:tcPr>
+          <w:p>
+            <w:pPr>
+              <w:jc w:val="center"/>
+            </w:pPr>
+            <w:r>
+              <w:rPr>
+                <w:b w:val="false"/>
+                <w:bCs w:val="false"/>
+                <w:color w:val="000000"/>
+                <w:sz w:val="20"/>
+                <w:szCs w:val="20"/>
+              </w:rPr>
+              <w:t xml:space="preserve">string (FK)</w:t>
+            </w:r>
+          </w:p>
+        </w:tc>
+        <w:tc>
+          <w:tcPr>
+            <w:tcW w:type="dxa" w:w="5100"/>
+            <w:tcMar>
+              <w:top w:type="dxa" w:w="60"/>
+              <w:left w:type="dxa" w:w="100"/>
+              <w:bottom w:type="dxa" w:w="60"/>
+              <w:right w:type="dxa" w:w="100"/>
+            </w:tcMar>
+            <w:vAlign w:val="center"/>
+          </w:tcPr>
+          <w:p>
+            <w:pPr>
+              <w:jc w:val="center"/>
+            </w:pPr>
+            <w:r>
+              <w:rPr>
+                <w:b w:val="false"/>
+                <w:bCs w:val="false"/>
+                <w:color w:val="000000"/>
+                <w:sz w:val="20"/>
+                <w:szCs w:val="20"/>
+              </w:rPr>
+              <w:t xml:space="preserve">Referencia al proveedor adjudicado. Llave foránea a proveedores.id_proveedor.</w:t>
+            </w:r>
+          </w:p>
+        </w:tc>
+      </w:tr>
+      <w:tr>
+        <w:tc>
+          <w:tcPr>
+            <w:tcW w:type="dxa" w:w="3200"/>
+            <w:tcMar>
+              <w:top w:type="dxa" w:w="60"/>
+              <w:left w:type="dxa" w:w="100"/>
+              <w:bottom w:type="dxa" w:w="60"/>
+              <w:right w:type="dxa" w:w="100"/>
+            </w:tcMar>
+            <w:vAlign w:val="center"/>
+          </w:tcPr>
+          <w:p>
+            <w:pPr>
+              <w:jc w:val="left"/>
+            </w:pPr>
+            <w:r>
+              <w:rPr>
+                <w:b w:val="false"/>
+                <w:bCs w:val="false"/>
+                <w:color w:val="000000"/>
+                <w:sz w:val="20"/>
+                <w:szCs w:val="20"/>
+              </w:rPr>
+              <w:t xml:space="preserve">contratos_siaf_seace.id_entidad</w:t>
+            </w:r>
+          </w:p>
+        </w:tc>
+        <w:tc>
+          <w:tcPr>
+            <w:tcW w:type="dxa" w:w="1500"/>
+            <w:tcMar>
+              <w:top w:type="dxa" w:w="60"/>
+              <w:left w:type="dxa" w:w="100"/>
+              <w:bottom w:type="dxa" w:w="60"/>
+              <w:right w:type="dxa" w:w="100"/>
+            </w:tcMar>
+            <w:vAlign w:val="center"/>
+          </w:tcPr>
+          <w:p>
+            <w:pPr>
+              <w:jc w:val="center"/>
+            </w:pPr>
+            <w:r>
+              <w:rPr>
+                <w:b w:val="false"/>
+                <w:bCs w:val="false"/>
+                <w:color w:val="000000"/>
+                <w:sz w:val="20"/>
+                <w:szCs w:val="20"/>
+              </w:rPr>
+              <w:t xml:space="preserve">string (FK)</w:t>
+            </w:r>
+          </w:p>
+        </w:tc>
+        <w:tc>
+          <w:tcPr>
+            <w:tcW w:type="dxa" w:w="5100"/>
+            <w:tcMar>
+              <w:top w:type="dxa" w:w="60"/>
+              <w:left w:type="dxa" w:w="100"/>
+              <w:bottom w:type="dxa" w:w="60"/>
+              <w:right w:type="dxa" w:w="100"/>
+            </w:tcMar>
+            <w:vAlign w:val="center"/>
+          </w:tcPr>
+          <w:p>
+            <w:pPr>
+              <w:jc w:val="center"/>
+            </w:pPr>
+            <w:r>
+              <w:rPr>
+                <w:b w:val="false"/>
+                <w:bCs w:val="false"/>
+                <w:color w:val="000000"/>
+                <w:sz w:val="20"/>
+                <w:szCs w:val="20"/>
+              </w:rPr>
+              <w:t xml:space="preserve">Entidad pública contratante. Llave foránea a entidades.id_entidad.</w:t>
+            </w:r>
+          </w:p>
+        </w:tc>
+      </w:tr>
+      <w:tr>
+        <w:tc>
+          <w:tcPr>
+            <w:tcW w:type="dxa" w:w="3200"/>
+            <w:tcMar>
+              <w:top w:type="dxa" w:w="60"/>
+              <w:left w:type="dxa" w:w="100"/>
+              <w:bottom w:type="dxa" w:w="60"/>
+              <w:right w:type="dxa" w:w="100"/>
+            </w:tcMar>
+            <w:vAlign w:val="center"/>
+          </w:tcPr>
+          <w:p>
+            <w:pPr>
+              <w:jc w:val="left"/>
+            </w:pPr>
+            <w:r>
+              <w:rPr>
+                <w:b w:val="false"/>
+                <w:bCs w:val="false"/>
+                <w:color w:val="000000"/>
+                <w:sz w:val="20"/>
+                <w:szCs w:val="20"/>
+              </w:rPr>
+              <w:t xml:space="preserve">contratos_siaf_seace.id_funcionario</w:t>
+            </w:r>
+          </w:p>
+        </w:tc>
+        <w:tc>
+          <w:tcPr>
+            <w:tcW w:type="dxa" w:w="1500"/>
+            <w:tcMar>
+              <w:top w:type="dxa" w:w="60"/>
+              <w:left w:type="dxa" w:w="100"/>
+              <w:bottom w:type="dxa" w:w="60"/>
+              <w:right w:type="dxa" w:w="100"/>
+            </w:tcMar>
+            <w:vAlign w:val="center"/>
+          </w:tcPr>
+          <w:p>
+            <w:pPr>
+              <w:jc w:val="center"/>
+            </w:pPr>
+            <w:r>
+              <w:rPr>
+                <w:b w:val="false"/>
+                <w:bCs w:val="false"/>
+                <w:color w:val="000000"/>
+                <w:sz w:val="20"/>
+                <w:szCs w:val="20"/>
+              </w:rPr>
+              <w:t xml:space="preserve">string (FK)</w:t>
+            </w:r>
+          </w:p>
+        </w:tc>
+        <w:tc>
+          <w:tcPr>
+            <w:tcW w:type="dxa" w:w="5100"/>
+            <w:tcMar>
+              <w:top w:type="dxa" w:w="60"/>
+              <w:left w:type="dxa" w:w="100"/>
+              <w:bottom w:type="dxa" w:w="60"/>
+              <w:right w:type="dxa" w:w="100"/>
+            </w:tcMar>
+            <w:vAlign w:val="center"/>
+          </w:tcPr>
+          <w:p>
+            <w:pPr>
+              <w:jc w:val="center"/>
+            </w:pPr>
+            <w:r>
+              <w:rPr>
+                <w:b w:val="false"/>
+                <w:bCs w:val="false"/>
+                <w:color w:val="000000"/>
+                <w:sz w:val="20"/>
+                <w:szCs w:val="20"/>
+              </w:rPr>
+              <w:t xml:space="preserve">Funcionario responsable del proceso. Llave foránea a funcionarios.id_funcionario.</w:t>
+            </w:r>
+          </w:p>
+        </w:tc>
+      </w:tr>
+      <w:tr>
+        <w:tc>
+          <w:tcPr>
+            <w:tcW w:type="dxa" w:w="3200"/>
+            <w:tcMar>
+              <w:top w:type="dxa" w:w="60"/>
+              <w:left w:type="dxa" w:w="100"/>
+              <w:bottom w:type="dxa" w:w="60"/>
+              <w:right w:type="dxa" w:w="100"/>
+            </w:tcMar>
+            <w:vAlign w:val="center"/>
+          </w:tcPr>
+          <w:p>
+            <w:pPr>
+              <w:jc w:val="left"/>
+            </w:pPr>
+            <w:r>
+              <w:rPr>
+                <w:b w:val="false"/>
+                <w:bCs w:val="false"/>
+                <w:color w:val="000000"/>
+                <w:sz w:val="20"/>
+                <w:szCs w:val="20"/>
+              </w:rPr>
+              <w:t xml:space="preserve">contratos_siaf_seace.modalidad</w:t>
+            </w:r>
+          </w:p>
+        </w:tc>
+        <w:tc>
+          <w:tcPr>
+            <w:tcW w:type="dxa" w:w="1500"/>
+            <w:tcMar>
+              <w:top w:type="dxa" w:w="60"/>
+              <w:left w:type="dxa" w:w="100"/>
+              <w:bottom w:type="dxa" w:w="60"/>
+              <w:right w:type="dxa" w:w="100"/>
+            </w:tcMar>
+            <w:vAlign w:val="center"/>
+          </w:tcPr>
+          <w:p>
+            <w:pPr>
+              <w:jc w:val="center"/>
+            </w:pPr>
+            <w:r>
+              <w:rPr>
+                <w:b w:val="false"/>
+                <w:bCs w:val="false"/>
+                <w:color w:val="000000"/>
+                <w:sz w:val="20"/>
+                <w:szCs w:val="20"/>
+              </w:rPr>
+              <w:t xml:space="preserve">categórica</w:t>
+            </w:r>
+          </w:p>
+        </w:tc>
+        <w:tc>
+          <w:tcPr>
+            <w:tcW w:type="dxa" w:w="5100"/>
+            <w:tcMar>
+              <w:top w:type="dxa" w:w="60"/>
+              <w:left w:type="dxa" w:w="100"/>
+              <w:bottom w:type="dxa" w:w="60"/>
+              <w:right w:type="dxa" w:w="100"/>
+            </w:tcMar>
+            <w:vAlign w:val="center"/>
+          </w:tcPr>
+          <w:p>
+            <w:pPr>
+              <w:jc w:val="center"/>
+            </w:pPr>
+            <w:r>
+              <w:rPr>
+                <w:b w:val="false"/>
+                <w:bCs w:val="false"/>
+                <w:color w:val="000000"/>
+                <w:sz w:val="20"/>
+                <w:szCs w:val="20"/>
+              </w:rPr>
+              <w:t xml:space="preserve">Modalidad de contratación según la Ley de Contrataciones del Estado.</w:t>
+            </w:r>
+          </w:p>
+        </w:tc>
+      </w:tr>
+      <w:tr>
+        <w:tc>
+          <w:tcPr>
+            <w:tcW w:type="dxa" w:w="3200"/>
+            <w:tcMar>
+              <w:top w:type="dxa" w:w="60"/>
+              <w:left w:type="dxa" w:w="100"/>
+              <w:bottom w:type="dxa" w:w="60"/>
+              <w:right w:type="dxa" w:w="100"/>
+            </w:tcMar>
+            <w:vAlign w:val="center"/>
+          </w:tcPr>
+          <w:p>
+            <w:pPr>
+              <w:jc w:val="left"/>
+            </w:pPr>
+            <w:r>
+              <w:rPr>
+                <w:b w:val="false"/>
+                <w:bCs w:val="false"/>
+                <w:color w:val="000000"/>
+                <w:sz w:val="20"/>
+                <w:szCs w:val="20"/>
+              </w:rPr>
+              <w:t xml:space="preserve">contratos_siaf_seace.objeto</w:t>
+            </w:r>
+          </w:p>
+        </w:tc>
+        <w:tc>
+          <w:tcPr>
+            <w:tcW w:type="dxa" w:w="1500"/>
+            <w:tcMar>
+              <w:top w:type="dxa" w:w="60"/>
+              <w:left w:type="dxa" w:w="100"/>
+              <w:bottom w:type="dxa" w:w="60"/>
+              <w:right w:type="dxa" w:w="100"/>
+            </w:tcMar>
+            <w:vAlign w:val="center"/>
+          </w:tcPr>
+          <w:p>
+            <w:pPr>
+              <w:jc w:val="center"/>
+            </w:pPr>
+            <w:r>
+              <w:rPr>
+                <w:b w:val="false"/>
+                <w:bCs w:val="false"/>
+                <w:color w:val="000000"/>
+                <w:sz w:val="20"/>
+                <w:szCs w:val="20"/>
+              </w:rPr>
+              <w:t xml:space="preserve">categórica</w:t>
+            </w:r>
+          </w:p>
+        </w:tc>
+        <w:tc>
+          <w:tcPr>
+            <w:tcW w:type="dxa" w:w="5100"/>
+            <w:tcMar>
+              <w:top w:type="dxa" w:w="60"/>
+              <w:left w:type="dxa" w:w="100"/>
+              <w:bottom w:type="dxa" w:w="60"/>
+              <w:right w:type="dxa" w:w="100"/>
+            </w:tcMar>
+            <w:vAlign w:val="center"/>
+          </w:tcPr>
+          <w:p>
+            <w:pPr>
+              <w:jc w:val="center"/>
+            </w:pPr>
+            <w:r>
+              <w:rPr>
+                <w:b w:val="false"/>
+                <w:bCs w:val="false"/>
+                <w:color w:val="000000"/>
+                <w:sz w:val="20"/>
+                <w:szCs w:val="20"/>
+              </w:rPr>
+              <w:t xml:space="preserve">Tipo de bien, servicio u obra contratado.</w:t>
+            </w:r>
+          </w:p>
+        </w:tc>
+      </w:tr>
+      <w:tr>
+        <w:tc>
+          <w:tcPr>
+            <w:tcW w:type="dxa" w:w="3200"/>
+            <w:tcMar>
+              <w:top w:type="dxa" w:w="60"/>
+              <w:left w:type="dxa" w:w="100"/>
+              <w:bottom w:type="dxa" w:w="60"/>
+              <w:right w:type="dxa" w:w="100"/>
+            </w:tcMar>
+            <w:vAlign w:val="center"/>
+          </w:tcPr>
+          <w:p>
+            <w:pPr>
+              <w:jc w:val="left"/>
+            </w:pPr>
+            <w:r>
+              <w:rPr>
+                <w:b w:val="false"/>
+                <w:bCs w:val="false"/>
+                <w:color w:val="000000"/>
+                <w:sz w:val="20"/>
+                <w:szCs w:val="20"/>
+              </w:rPr>
+              <w:t xml:space="preserve">contratos_siaf_seace.monto</w:t>
+            </w:r>
+          </w:p>
+        </w:tc>
+        <w:tc>
+          <w:tcPr>
+            <w:tcW w:type="dxa" w:w="1500"/>
+            <w:tcMar>
+              <w:top w:type="dxa" w:w="60"/>
+              <w:left w:type="dxa" w:w="100"/>
+              <w:bottom w:type="dxa" w:w="60"/>
+              <w:right w:type="dxa" w:w="100"/>
+            </w:tcMar>
+            <w:vAlign w:val="center"/>
+          </w:tcPr>
+          <w:p>
+            <w:pPr>
+              <w:jc w:val="center"/>
+            </w:pPr>
+            <w:r>
+              <w:rPr>
+                <w:b w:val="false"/>
+                <w:bCs w:val="false"/>
+                <w:color w:val="000000"/>
+                <w:sz w:val="20"/>
+                <w:szCs w:val="20"/>
+              </w:rPr>
+              <w:t xml:space="preserve">numérico (S/.)</w:t>
+            </w:r>
+          </w:p>
+        </w:tc>
+        <w:tc>
+          <w:tcPr>
+            <w:tcW w:type="dxa" w:w="5100"/>
+            <w:tcMar>
+              <w:top w:type="dxa" w:w="60"/>
+              <w:left w:type="dxa" w:w="100"/>
+              <w:bottom w:type="dxa" w:w="60"/>
+              <w:right w:type="dxa" w:w="100"/>
+            </w:tcMar>
+            <w:vAlign w:val="center"/>
+          </w:tcPr>
+          <w:p>
+            <w:pPr>
+              <w:jc w:val="center"/>
+            </w:pPr>
+            <w:r>
+              <w:rPr>
+                <w:b w:val="false"/>
+                <w:bCs w:val="false"/>
+                <w:color w:val="000000"/>
+                <w:sz w:val="20"/>
+                <w:szCs w:val="20"/>
+              </w:rPr>
+              <w:t xml:space="preserve">Monto contractual en soles.</w:t>
+            </w:r>
+          </w:p>
+        </w:tc>
+      </w:tr>
+      <w:tr>
+        <w:tc>
+          <w:tcPr>
+            <w:tcW w:type="dxa" w:w="3200"/>
+            <w:tcMar>
+              <w:top w:type="dxa" w:w="60"/>
+              <w:left w:type="dxa" w:w="100"/>
+              <w:bottom w:type="dxa" w:w="60"/>
+              <w:right w:type="dxa" w:w="100"/>
+            </w:tcMar>
+            <w:vAlign w:val="center"/>
+          </w:tcPr>
+          <w:p>
+            <w:pPr>
+              <w:jc w:val="left"/>
+            </w:pPr>
+            <w:r>
+              <w:rPr>
+                <w:b w:val="false"/>
+                <w:bCs w:val="false"/>
+                <w:color w:val="000000"/>
+                <w:sz w:val="20"/>
+                <w:szCs w:val="20"/>
+              </w:rPr>
+              <w:t xml:space="preserve">contratos_siaf_seace.fecha_contrato</w:t>
+            </w:r>
+          </w:p>
+        </w:tc>
+        <w:tc>
+          <w:tcPr>
+            <w:tcW w:type="dxa" w:w="1500"/>
+            <w:tcMar>
+              <w:top w:type="dxa" w:w="60"/>
+              <w:left w:type="dxa" w:w="100"/>
+              <w:bottom w:type="dxa" w:w="60"/>
+              <w:right w:type="dxa" w:w="100"/>
+            </w:tcMar>
+            <w:vAlign w:val="center"/>
+          </w:tcPr>
+          <w:p>
+            <w:pPr>
+              <w:jc w:val="center"/>
+            </w:pPr>
+            <w:r>
+              <w:rPr>
+                <w:b w:val="false"/>
+                <w:bCs w:val="false"/>
+                <w:color w:val="000000"/>
+                <w:sz w:val="20"/>
+                <w:szCs w:val="20"/>
+              </w:rPr>
+              <w:t xml:space="preserve">fecha</w:t>
+            </w:r>
+          </w:p>
+        </w:tc>
+        <w:tc>
+          <w:tcPr>
+            <w:tcW w:type="dxa" w:w="5100"/>
+            <w:tcMar>
+              <w:top w:type="dxa" w:w="60"/>
+              <w:left w:type="dxa" w:w="100"/>
+              <w:bottom w:type="dxa" w:w="60"/>
+              <w:right w:type="dxa" w:w="100"/>
+            </w:tcMar>
+            <w:vAlign w:val="center"/>
+          </w:tcPr>
+          <w:p>
+            <w:pPr>
+              <w:jc w:val="center"/>
+            </w:pPr>
+            <w:r>
+              <w:rPr>
+                <w:b w:val="false"/>
+                <w:bCs w:val="false"/>
+                <w:color w:val="000000"/>
+                <w:sz w:val="20"/>
+                <w:szCs w:val="20"/>
+              </w:rPr>
+              <w:t xml:space="preserve">Fecha de suscripción del contrato.</w:t>
+            </w:r>
+          </w:p>
+        </w:tc>
+      </w:tr>
+      <w:tr>
+        <w:tc>
+          <w:tcPr>
+            <w:tcW w:type="dxa" w:w="3200"/>
+            <w:tcMar>
+              <w:top w:type="dxa" w:w="60"/>
+              <w:left w:type="dxa" w:w="100"/>
+              <w:bottom w:type="dxa" w:w="60"/>
+              <w:right w:type="dxa" w:w="100"/>
+            </w:tcMar>
+            <w:vAlign w:val="center"/>
+          </w:tcPr>
+          <w:p>
+            <w:pPr>
+              <w:jc w:val="left"/>
+            </w:pPr>
+            <w:r>
+              <w:rPr>
+                <w:b w:val="false"/>
+                <w:bCs w:val="false"/>
+                <w:color w:val="000000"/>
+                <w:sz w:val="20"/>
+                <w:szCs w:val="20"/>
+              </w:rPr>
+              <w:t xml:space="preserve">contratos_siaf_seace.es_favoritismo_real</w:t>
+            </w:r>
+          </w:p>
+        </w:tc>
+        <w:tc>
+          <w:tcPr>
+            <w:tcW w:type="dxa" w:w="1500"/>
+            <w:tcMar>
+              <w:top w:type="dxa" w:w="60"/>
+              <w:left w:type="dxa" w:w="100"/>
+              <w:bottom w:type="dxa" w:w="60"/>
+              <w:right w:type="dxa" w:w="100"/>
+            </w:tcMar>
+            <w:vAlign w:val="center"/>
+          </w:tcPr>
+          <w:p>
+            <w:pPr>
+              <w:jc w:val="center"/>
+            </w:pPr>
+            <w:r>
+              <w:rPr>
+                <w:b w:val="false"/>
+                <w:bCs w:val="false"/>
+                <w:color w:val="000000"/>
+                <w:sz w:val="20"/>
+                <w:szCs w:val="20"/>
+              </w:rPr>
+              <w:t xml:space="preserve">booleano</w:t>
+            </w:r>
+          </w:p>
+        </w:tc>
+        <w:tc>
+          <w:tcPr>
+            <w:tcW w:type="dxa" w:w="5100"/>
+            <w:tcMar>
+              <w:top w:type="dxa" w:w="60"/>
+              <w:left w:type="dxa" w:w="100"/>
+              <w:bottom w:type="dxa" w:w="60"/>
+              <w:right w:type="dxa" w:w="100"/>
+            </w:tcMar>
+            <w:vAlign w:val="center"/>
+          </w:tcPr>
+          <w:p>
+            <w:pPr>
+              <w:jc w:val="center"/>
+            </w:pPr>
+            <w:r>
+              <w:rPr>
+                <w:b w:val="false"/>
+                <w:bCs w:val="false"/>
+                <w:color w:val="000000"/>
+                <w:sz w:val="20"/>
+                <w:szCs w:val="20"/>
+              </w:rPr>
+              <w:t xml:space="preserve">Etiqueta de validación interna del prototipo (ground truth sintético). No existe en producción.</w:t>
+            </w:r>
+          </w:p>
+        </w:tc>
+      </w:tr>
+      <w:tr>
+        <w:tc>
+          <w:tcPr>
+            <w:tcW w:type="dxa" w:w="3200"/>
+            <w:tcMar>
+              <w:top w:type="dxa" w:w="60"/>
+              <w:left w:type="dxa" w:w="100"/>
+              <w:bottom w:type="dxa" w:w="60"/>
+              <w:right w:type="dxa" w:w="100"/>
+            </w:tcMar>
+            <w:vAlign w:val="center"/>
+          </w:tcPr>
+          <w:p>
+            <w:pPr>
+              <w:jc w:val="left"/>
+            </w:pPr>
+            <w:r>
+              <w:rPr>
+                <w:b w:val="false"/>
+                <w:bCs w:val="false"/>
+                <w:color w:val="000000"/>
+                <w:sz w:val="20"/>
+                <w:szCs w:val="20"/>
+              </w:rPr>
+              <w:t xml:space="preserve">contratos_siaf_seace.es_fraccionamiento_real</w:t>
+            </w:r>
+          </w:p>
+        </w:tc>
+        <w:tc>
+          <w:tcPr>
+            <w:tcW w:type="dxa" w:w="1500"/>
+            <w:tcMar>
+              <w:top w:type="dxa" w:w="60"/>
+              <w:left w:type="dxa" w:w="100"/>
+              <w:bottom w:type="dxa" w:w="60"/>
+              <w:right w:type="dxa" w:w="100"/>
+            </w:tcMar>
+            <w:vAlign w:val="center"/>
+          </w:tcPr>
+          <w:p>
+            <w:pPr>
+              <w:jc w:val="center"/>
+            </w:pPr>
+            <w:r>
+              <w:rPr>
+                <w:b w:val="false"/>
+                <w:bCs w:val="false"/>
+                <w:color w:val="000000"/>
+                <w:sz w:val="20"/>
+                <w:szCs w:val="20"/>
+              </w:rPr>
+              <w:t xml:space="preserve">booleano</w:t>
+            </w:r>
+          </w:p>
+        </w:tc>
+        <w:tc>
+          <w:tcPr>
+            <w:tcW w:type="dxa" w:w="5100"/>
+            <w:tcMar>
+              <w:top w:type="dxa" w:w="60"/>
+              <w:left w:type="dxa" w:w="100"/>
+              <w:bottom w:type="dxa" w:w="60"/>
+              <w:right w:type="dxa" w:w="100"/>
+            </w:tcMar>
+            <w:vAlign w:val="center"/>
+          </w:tcPr>
+          <w:p>
+            <w:pPr>
+              <w:jc w:val="center"/>
+            </w:pPr>
+            <w:r>
+              <w:rPr>
+                <w:b w:val="false"/>
+                <w:bCs w:val="false"/>
+                <w:color w:val="000000"/>
+                <w:sz w:val="20"/>
+                <w:szCs w:val="20"/>
+              </w:rPr>
+              <w:t xml:space="preserve">Etiqueta de validación interna del prototipo (ground truth sintético). No existe en producción.</w:t>
+            </w:r>
+          </w:p>
+        </w:tc>
+      </w:tr>
+      <w:tr>
+        <w:tc>
+          <w:tcPr>
+            <w:tcW w:type="dxa" w:w="3200"/>
+            <w:tcMar>
+              <w:top w:type="dxa" w:w="60"/>
+              <w:left w:type="dxa" w:w="100"/>
+              <w:bottom w:type="dxa" w:w="60"/>
+              <w:right w:type="dxa" w:w="100"/>
+            </w:tcMar>
+            <w:vAlign w:val="center"/>
+          </w:tcPr>
+          <w:p>
+            <w:pPr>
+              <w:jc w:val="left"/>
+            </w:pPr>
+            <w:r>
+              <w:rPr>
+                <w:b w:val="false"/>
+                <w:bCs w:val="false"/>
+                <w:color w:val="000000"/>
+                <w:sz w:val="20"/>
+                <w:szCs w:val="20"/>
+              </w:rPr>
+              <w:t xml:space="preserve">proveedores.id_proveedor</w:t>
+            </w:r>
+          </w:p>
+        </w:tc>
+        <w:tc>
+          <w:tcPr>
+            <w:tcW w:type="dxa" w:w="1500"/>
+            <w:tcMar>
+              <w:top w:type="dxa" w:w="60"/>
+              <w:left w:type="dxa" w:w="100"/>
+              <w:bottom w:type="dxa" w:w="60"/>
+              <w:right w:type="dxa" w:w="100"/>
+            </w:tcMar>
+            <w:vAlign w:val="center"/>
+          </w:tcPr>
+          <w:p>
+            <w:pPr>
+              <w:jc w:val="center"/>
+            </w:pPr>
+            <w:r>
+              <w:rPr>
+                <w:b w:val="false"/>
+                <w:bCs w:val="false"/>
+                <w:color w:val="000000"/>
+                <w:sz w:val="20"/>
+                <w:szCs w:val="20"/>
+              </w:rPr>
+              <w:t xml:space="preserve">string (PK)</w:t>
+            </w:r>
+          </w:p>
+        </w:tc>
+        <w:tc>
+          <w:tcPr>
+            <w:tcW w:type="dxa" w:w="5100"/>
+            <w:tcMar>
+              <w:top w:type="dxa" w:w="60"/>
+              <w:left w:type="dxa" w:w="100"/>
+              <w:bottom w:type="dxa" w:w="60"/>
+              <w:right w:type="dxa" w:w="100"/>
+            </w:tcMar>
+            <w:vAlign w:val="center"/>
+          </w:tcPr>
+          <w:p>
+            <w:pPr>
+              <w:jc w:val="center"/>
+            </w:pPr>
+            <w:r>
+              <w:rPr>
+                <w:b w:val="false"/>
+                <w:bCs w:val="false"/>
+                <w:color w:val="000000"/>
+                <w:sz w:val="20"/>
+                <w:szCs w:val="20"/>
+              </w:rPr>
+              <w:t xml:space="preserve">Identificador único del proveedor.</w:t>
+            </w:r>
+          </w:p>
+        </w:tc>
+      </w:tr>
+      <w:tr>
+        <w:tc>
+          <w:tcPr>
+            <w:tcW w:type="dxa" w:w="3200"/>
+            <w:tcMar>
+              <w:top w:type="dxa" w:w="60"/>
+              <w:left w:type="dxa" w:w="100"/>
+              <w:bottom w:type="dxa" w:w="60"/>
+              <w:right w:type="dxa" w:w="100"/>
+            </w:tcMar>
+            <w:vAlign w:val="center"/>
+          </w:tcPr>
+          <w:p>
+            <w:pPr>
+              <w:jc w:val="left"/>
+            </w:pPr>
+            <w:r>
+              <w:rPr>
+                <w:b w:val="false"/>
+                <w:bCs w:val="false"/>
+                <w:color w:val="000000"/>
+                <w:sz w:val="20"/>
+                <w:szCs w:val="20"/>
+              </w:rPr>
+              <w:t xml:space="preserve">proveedores.ruc</w:t>
+            </w:r>
+          </w:p>
+        </w:tc>
+        <w:tc>
+          <w:tcPr>
+            <w:tcW w:type="dxa" w:w="1500"/>
+            <w:tcMar>
+              <w:top w:type="dxa" w:w="60"/>
+              <w:left w:type="dxa" w:w="100"/>
+              <w:bottom w:type="dxa" w:w="60"/>
+              <w:right w:type="dxa" w:w="100"/>
+            </w:tcMar>
+            <w:vAlign w:val="center"/>
+          </w:tcPr>
+          <w:p>
+            <w:pPr>
+              <w:jc w:val="center"/>
+            </w:pPr>
+            <w:r>
+              <w:rPr>
+                <w:b w:val="false"/>
+                <w:bCs w:val="false"/>
+                <w:color w:val="000000"/>
+                <w:sz w:val="20"/>
+                <w:szCs w:val="20"/>
+              </w:rPr>
+              <w:t xml:space="preserve">string</w:t>
+            </w:r>
+          </w:p>
+        </w:tc>
+        <w:tc>
+          <w:tcPr>
+            <w:tcW w:type="dxa" w:w="5100"/>
+            <w:tcMar>
+              <w:top w:type="dxa" w:w="60"/>
+              <w:left w:type="dxa" w:w="100"/>
+              <w:bottom w:type="dxa" w:w="60"/>
+              <w:right w:type="dxa" w:w="100"/>
+            </w:tcMar>
+            <w:vAlign w:val="center"/>
+          </w:tcPr>
+          <w:p>
+            <w:pPr>
+              <w:jc w:val="center"/>
+            </w:pPr>
+            <w:r>
+              <w:rPr>
+                <w:b w:val="false"/>
+                <w:bCs w:val="false"/>
+                <w:color w:val="000000"/>
+                <w:sz w:val="20"/>
+                <w:szCs w:val="20"/>
+              </w:rPr>
+              <w:t xml:space="preserve">Registro Único de Contribuyente del proveedor.</w:t>
+            </w:r>
+          </w:p>
+        </w:tc>
+      </w:tr>
+      <w:tr>
+        <w:tc>
+          <w:tcPr>
+            <w:tcW w:type="dxa" w:w="3200"/>
+            <w:tcMar>
+              <w:top w:type="dxa" w:w="60"/>
+              <w:left w:type="dxa" w:w="100"/>
+              <w:bottom w:type="dxa" w:w="60"/>
+              <w:right w:type="dxa" w:w="100"/>
+            </w:tcMar>
+            <w:vAlign w:val="center"/>
+          </w:tcPr>
+          <w:p>
+            <w:pPr>
+              <w:jc w:val="left"/>
+            </w:pPr>
+            <w:r>
+              <w:rPr>
+                <w:b w:val="false"/>
+                <w:bCs w:val="false"/>
+                <w:color w:val="000000"/>
+                <w:sz w:val="20"/>
+                <w:szCs w:val="20"/>
+              </w:rPr>
+              <w:t xml:space="preserve">proveedores.razon_social</w:t>
+            </w:r>
+          </w:p>
+        </w:tc>
+        <w:tc>
+          <w:tcPr>
+            <w:tcW w:type="dxa" w:w="1500"/>
+            <w:tcMar>
+              <w:top w:type="dxa" w:w="60"/>
+              <w:left w:type="dxa" w:w="100"/>
+              <w:bottom w:type="dxa" w:w="60"/>
+              <w:right w:type="dxa" w:w="100"/>
+            </w:tcMar>
+            <w:vAlign w:val="center"/>
+          </w:tcPr>
+          <w:p>
+            <w:pPr>
+              <w:jc w:val="center"/>
+            </w:pPr>
+            <w:r>
+              <w:rPr>
+                <w:b w:val="false"/>
+                <w:bCs w:val="false"/>
+                <w:color w:val="000000"/>
+                <w:sz w:val="20"/>
+                <w:szCs w:val="20"/>
+              </w:rPr>
+              <w:t xml:space="preserve">string</w:t>
+            </w:r>
+          </w:p>
+        </w:tc>
+        <w:tc>
+          <w:tcPr>
+            <w:tcW w:type="dxa" w:w="5100"/>
+            <w:tcMar>
+              <w:top w:type="dxa" w:w="60"/>
+              <w:left w:type="dxa" w:w="100"/>
+              <w:bottom w:type="dxa" w:w="60"/>
+              <w:right w:type="dxa" w:w="100"/>
+            </w:tcMar>
+            <w:vAlign w:val="center"/>
+          </w:tcPr>
+          <w:p>
+            <w:pPr>
+              <w:jc w:val="center"/>
+            </w:pPr>
+            <w:r>
+              <w:rPr>
+                <w:b w:val="false"/>
+                <w:bCs w:val="false"/>
+                <w:color w:val="000000"/>
+                <w:sz w:val="20"/>
+                <w:szCs w:val="20"/>
+              </w:rPr>
+              <w:t xml:space="preserve">Razón social del proveedor.</w:t>
+            </w:r>
+          </w:p>
+        </w:tc>
+      </w:tr>
+      <w:tr>
+        <w:tc>
+          <w:tcPr>
+            <w:tcW w:type="dxa" w:w="3200"/>
+            <w:tcMar>
+              <w:top w:type="dxa" w:w="60"/>
+              <w:left w:type="dxa" w:w="100"/>
+              <w:bottom w:type="dxa" w:w="60"/>
+              <w:right w:type="dxa" w:w="100"/>
+            </w:tcMar>
+            <w:vAlign w:val="center"/>
+          </w:tcPr>
+          <w:p>
+            <w:pPr>
+              <w:jc w:val="left"/>
+            </w:pPr>
+            <w:r>
+              <w:rPr>
+                <w:b w:val="false"/>
+                <w:bCs w:val="false"/>
+                <w:color w:val="000000"/>
+                <w:sz w:val="20"/>
+                <w:szCs w:val="20"/>
+              </w:rPr>
+              <w:t xml:space="preserve">entidades.id_entidad</w:t>
+            </w:r>
+          </w:p>
+        </w:tc>
+        <w:tc>
+          <w:tcPr>
+            <w:tcW w:type="dxa" w:w="1500"/>
+            <w:tcMar>
+              <w:top w:type="dxa" w:w="60"/>
+              <w:left w:type="dxa" w:w="100"/>
+              <w:bottom w:type="dxa" w:w="60"/>
+              <w:right w:type="dxa" w:w="100"/>
+            </w:tcMar>
+            <w:vAlign w:val="center"/>
+          </w:tcPr>
+          <w:p>
+            <w:pPr>
+              <w:jc w:val="center"/>
+            </w:pPr>
+            <w:r>
+              <w:rPr>
+                <w:b w:val="false"/>
+                <w:bCs w:val="false"/>
+                <w:color w:val="000000"/>
+                <w:sz w:val="20"/>
+                <w:szCs w:val="20"/>
+              </w:rPr>
+              <w:t xml:space="preserve">string (PK)</w:t>
+            </w:r>
+          </w:p>
+        </w:tc>
+        <w:tc>
+          <w:tcPr>
+            <w:tcW w:type="dxa" w:w="5100"/>
+            <w:tcMar>
+              <w:top w:type="dxa" w:w="60"/>
+              <w:left w:type="dxa" w:w="100"/>
+              <w:bottom w:type="dxa" w:w="60"/>
+              <w:right w:type="dxa" w:w="100"/>
+            </w:tcMar>
+            <w:vAlign w:val="center"/>
+          </w:tcPr>
+          <w:p>
+            <w:pPr>
+              <w:jc w:val="center"/>
+            </w:pPr>
+            <w:r>
+              <w:rPr>
+                <w:b w:val="false"/>
+                <w:bCs w:val="false"/>
+                <w:color w:val="000000"/>
+                <w:sz w:val="20"/>
+                <w:szCs w:val="20"/>
+              </w:rPr>
+              <w:t xml:space="preserve">Identificador único de la entidad pública.</w:t>
+            </w:r>
+          </w:p>
+        </w:tc>
+      </w:tr>
+      <w:tr>
+        <w:tc>
+          <w:tcPr>
+            <w:tcW w:type="dxa" w:w="3200"/>
+            <w:tcMar>
+              <w:top w:type="dxa" w:w="60"/>
+              <w:left w:type="dxa" w:w="100"/>
+              <w:bottom w:type="dxa" w:w="60"/>
+              <w:right w:type="dxa" w:w="100"/>
+            </w:tcMar>
+            <w:vAlign w:val="center"/>
+          </w:tcPr>
+          <w:p>
+            <w:pPr>
+              <w:jc w:val="left"/>
+            </w:pPr>
+            <w:r>
+              <w:rPr>
+                <w:b w:val="false"/>
+                <w:bCs w:val="false"/>
+                <w:color w:val="000000"/>
+                <w:sz w:val="20"/>
+                <w:szCs w:val="20"/>
+              </w:rPr>
+              <w:t xml:space="preserve">entidades.nombre_entidad</w:t>
+            </w:r>
+          </w:p>
+        </w:tc>
+        <w:tc>
+          <w:tcPr>
+            <w:tcW w:type="dxa" w:w="1500"/>
+            <w:tcMar>
+              <w:top w:type="dxa" w:w="60"/>
+              <w:left w:type="dxa" w:w="100"/>
+              <w:bottom w:type="dxa" w:w="60"/>
+              <w:right w:type="dxa" w:w="100"/>
+            </w:tcMar>
+            <w:vAlign w:val="center"/>
+          </w:tcPr>
+          <w:p>
+            <w:pPr>
+              <w:jc w:val="center"/>
+            </w:pPr>
+            <w:r>
+              <w:rPr>
+                <w:b w:val="false"/>
+                <w:bCs w:val="false"/>
+                <w:color w:val="000000"/>
+                <w:sz w:val="20"/>
+                <w:szCs w:val="20"/>
+              </w:rPr>
+              <w:t xml:space="preserve">string</w:t>
+            </w:r>
+          </w:p>
+        </w:tc>
+        <w:tc>
+          <w:tcPr>
+            <w:tcW w:type="dxa" w:w="5100"/>
+            <w:tcMar>
+              <w:top w:type="dxa" w:w="60"/>
+              <w:left w:type="dxa" w:w="100"/>
+              <w:bottom w:type="dxa" w:w="60"/>
+              <w:right w:type="dxa" w:w="100"/>
+            </w:tcMar>
+            <w:vAlign w:val="center"/>
+          </w:tcPr>
+          <w:p>
+            <w:pPr>
+              <w:jc w:val="center"/>
+            </w:pPr>
+            <w:r>
+              <w:rPr>
+                <w:b w:val="false"/>
+                <w:bCs w:val="false"/>
+                <w:color w:val="000000"/>
+                <w:sz w:val="20"/>
+                <w:szCs w:val="20"/>
+              </w:rPr>
+              <w:t xml:space="preserve">Nombre de la entidad pública contratante.</w:t>
+            </w:r>
+          </w:p>
+        </w:tc>
+      </w:tr>
+      <w:tr>
+        <w:tc>
+          <w:tcPr>
+            <w:tcW w:type="dxa" w:w="3200"/>
+            <w:tcMar>
+              <w:top w:type="dxa" w:w="60"/>
+              <w:left w:type="dxa" w:w="100"/>
+              <w:bottom w:type="dxa" w:w="60"/>
+              <w:right w:type="dxa" w:w="100"/>
+            </w:tcMar>
+            <w:vAlign w:val="center"/>
+          </w:tcPr>
+          <w:p>
+            <w:pPr>
+              <w:jc w:val="left"/>
+            </w:pPr>
+            <w:r>
+              <w:rPr>
+                <w:b w:val="false"/>
+                <w:bCs w:val="false"/>
+                <w:color w:val="000000"/>
+                <w:sz w:val="20"/>
+                <w:szCs w:val="20"/>
+              </w:rPr>
+              <w:t xml:space="preserve">funcionarios.id_funcionario</w:t>
+            </w:r>
+          </w:p>
+        </w:tc>
+        <w:tc>
+          <w:tcPr>
+            <w:tcW w:type="dxa" w:w="1500"/>
+            <w:tcMar>
+              <w:top w:type="dxa" w:w="60"/>
+              <w:left w:type="dxa" w:w="100"/>
+              <w:bottom w:type="dxa" w:w="60"/>
+              <w:right w:type="dxa" w:w="100"/>
+            </w:tcMar>
+            <w:vAlign w:val="center"/>
+          </w:tcPr>
+          <w:p>
+            <w:pPr>
+              <w:jc w:val="center"/>
+            </w:pPr>
+            <w:r>
+              <w:rPr>
+                <w:b w:val="false"/>
+                <w:bCs w:val="false"/>
+                <w:color w:val="000000"/>
+                <w:sz w:val="20"/>
+                <w:szCs w:val="20"/>
+              </w:rPr>
+              <w:t xml:space="preserve">string (PK)</w:t>
+            </w:r>
+          </w:p>
+        </w:tc>
+        <w:tc>
+          <w:tcPr>
+            <w:tcW w:type="dxa" w:w="5100"/>
+            <w:tcMar>
+              <w:top w:type="dxa" w:w="60"/>
+              <w:left w:type="dxa" w:w="100"/>
+              <w:bottom w:type="dxa" w:w="60"/>
+              <w:right w:type="dxa" w:w="100"/>
+            </w:tcMar>
+            <w:vAlign w:val="center"/>
+          </w:tcPr>
+          <w:p>
+            <w:pPr>
+              <w:jc w:val="center"/>
+            </w:pPr>
+            <w:r>
+              <w:rPr>
+                <w:b w:val="false"/>
+                <w:bCs w:val="false"/>
+                <w:color w:val="000000"/>
+                <w:sz w:val="20"/>
+                <w:szCs w:val="20"/>
+              </w:rPr>
+              <w:t xml:space="preserve">Identificador único del funcionario.</w:t>
+            </w:r>
+          </w:p>
+        </w:tc>
+      </w:tr>
+      <w:tr>
+        <w:tc>
+          <w:tcPr>
+            <w:tcW w:type="dxa" w:w="3200"/>
+            <w:tcMar>
+              <w:top w:type="dxa" w:w="60"/>
+              <w:left w:type="dxa" w:w="100"/>
+              <w:bottom w:type="dxa" w:w="60"/>
+              <w:right w:type="dxa" w:w="100"/>
+            </w:tcMar>
+            <w:vAlign w:val="center"/>
+          </w:tcPr>
+          <w:p>
+            <w:pPr>
+              <w:jc w:val="left"/>
+            </w:pPr>
+            <w:r>
+              <w:rPr>
+                <w:b w:val="false"/>
+                <w:bCs w:val="false"/>
+                <w:color w:val="000000"/>
+                <w:sz w:val="20"/>
+                <w:szCs w:val="20"/>
+              </w:rPr>
+              <w:t xml:space="preserve">funcionarios.dni_funcionario</w:t>
+            </w:r>
+          </w:p>
+        </w:tc>
+        <w:tc>
+          <w:tcPr>
+            <w:tcW w:type="dxa" w:w="1500"/>
+            <w:tcMar>
+              <w:top w:type="dxa" w:w="60"/>
+              <w:left w:type="dxa" w:w="100"/>
+              <w:bottom w:type="dxa" w:w="60"/>
+              <w:right w:type="dxa" w:w="100"/>
+            </w:tcMar>
+            <w:vAlign w:val="center"/>
+          </w:tcPr>
+          <w:p>
+            <w:pPr>
+              <w:jc w:val="center"/>
+            </w:pPr>
+            <w:r>
+              <w:rPr>
+                <w:b w:val="false"/>
+                <w:bCs w:val="false"/>
+                <w:color w:val="000000"/>
+                <w:sz w:val="20"/>
+                <w:szCs w:val="20"/>
+              </w:rPr>
+              <w:t xml:space="preserve">string</w:t>
+            </w:r>
+          </w:p>
+        </w:tc>
+        <w:tc>
+          <w:tcPr>
+            <w:tcW w:type="dxa" w:w="5100"/>
+            <w:tcMar>
+              <w:top w:type="dxa" w:w="60"/>
+              <w:left w:type="dxa" w:w="100"/>
+              <w:bottom w:type="dxa" w:w="60"/>
+              <w:right w:type="dxa" w:w="100"/>
+            </w:tcMar>
+            <w:vAlign w:val="center"/>
+          </w:tcPr>
+          <w:p>
+            <w:pPr>
+              <w:jc w:val="center"/>
+            </w:pPr>
+            <w:r>
+              <w:rPr>
+                <w:b w:val="false"/>
+                <w:bCs w:val="false"/>
+                <w:color w:val="000000"/>
+                <w:sz w:val="20"/>
+                <w:szCs w:val="20"/>
+              </w:rPr>
+              <w:t xml:space="preserve">DNI del funcionario (para futuro cruce de vínculos, numeral 4.2.4).</w:t>
+            </w:r>
+          </w:p>
+        </w:tc>
+      </w:tr>
+      <w:tr>
+        <w:tc>
+          <w:tcPr>
+            <w:tcW w:type="dxa" w:w="3200"/>
+            <w:tcMar>
+              <w:top w:type="dxa" w:w="60"/>
+              <w:left w:type="dxa" w:w="100"/>
+              <w:bottom w:type="dxa" w:w="60"/>
+              <w:right w:type="dxa" w:w="100"/>
+            </w:tcMar>
+            <w:vAlign w:val="center"/>
+          </w:tcPr>
+          <w:p>
+            <w:pPr>
+              <w:jc w:val="left"/>
+            </w:pPr>
+            <w:r>
+              <w:rPr>
+                <w:b w:val="false"/>
+                <w:bCs w:val="false"/>
+                <w:color w:val="000000"/>
+                <w:sz w:val="20"/>
+                <w:szCs w:val="20"/>
+              </w:rPr>
+              <w:t xml:space="preserve">funcionarios.id_entidad</w:t>
+            </w:r>
+          </w:p>
+        </w:tc>
+        <w:tc>
+          <w:tcPr>
+            <w:tcW w:type="dxa" w:w="1500"/>
+            <w:tcMar>
+              <w:top w:type="dxa" w:w="60"/>
+              <w:left w:type="dxa" w:w="100"/>
+              <w:bottom w:type="dxa" w:w="60"/>
+              <w:right w:type="dxa" w:w="100"/>
+            </w:tcMar>
+            <w:vAlign w:val="center"/>
+          </w:tcPr>
+          <w:p>
+            <w:pPr>
+              <w:jc w:val="center"/>
+            </w:pPr>
+            <w:r>
+              <w:rPr>
+                <w:b w:val="false"/>
+                <w:bCs w:val="false"/>
+                <w:color w:val="000000"/>
+                <w:sz w:val="20"/>
+                <w:szCs w:val="20"/>
+              </w:rPr>
+              <w:t xml:space="preserve">string (FK)</w:t>
+            </w:r>
+          </w:p>
+        </w:tc>
+        <w:tc>
+          <w:tcPr>
+            <w:tcW w:type="dxa" w:w="5100"/>
+            <w:tcMar>
+              <w:top w:type="dxa" w:w="60"/>
+              <w:left w:type="dxa" w:w="100"/>
+              <w:bottom w:type="dxa" w:w="60"/>
+              <w:right w:type="dxa" w:w="100"/>
+            </w:tcMar>
+            <w:vAlign w:val="center"/>
+          </w:tcPr>
+          <w:p>
+            <w:pPr>
+              <w:jc w:val="center"/>
+            </w:pPr>
+            <w:r>
+              <w:rPr>
+                <w:b w:val="false"/>
+                <w:bCs w:val="false"/>
+                <w:color w:val="000000"/>
+                <w:sz w:val="20"/>
+                <w:szCs w:val="20"/>
+              </w:rPr>
+              <w:t xml:space="preserve">Entidad a la que pertenece el funcionario.</w:t>
+            </w:r>
+          </w:p>
+        </w:tc>
+      </w:tr>
+      <w:tr>
+        <w:tc>
+          <w:tcPr>
+            <w:tcW w:type="dxa" w:w="3200"/>
+            <w:tcMar>
+              <w:top w:type="dxa" w:w="60"/>
+              <w:left w:type="dxa" w:w="100"/>
+              <w:bottom w:type="dxa" w:w="60"/>
+              <w:right w:type="dxa" w:w="100"/>
+            </w:tcMar>
+            <w:vAlign w:val="center"/>
+          </w:tcPr>
+          <w:p>
+            <w:pPr>
+              <w:jc w:val="left"/>
+            </w:pPr>
+            <w:r>
+              <w:rPr>
+                <w:b w:val="false"/>
+                <w:bCs w:val="false"/>
+                <w:color w:val="000000"/>
+                <w:sz w:val="20"/>
+                <w:szCs w:val="20"/>
+              </w:rPr>
+              <w:t xml:space="preserve">dataset_favoritismo.id_proveedor / id_entidad</w:t>
+            </w:r>
+          </w:p>
+        </w:tc>
+        <w:tc>
+          <w:tcPr>
+            <w:tcW w:type="dxa" w:w="1500"/>
+            <w:tcMar>
+              <w:top w:type="dxa" w:w="60"/>
+              <w:left w:type="dxa" w:w="100"/>
+              <w:bottom w:type="dxa" w:w="60"/>
+              <w:right w:type="dxa" w:w="100"/>
+            </w:tcMar>
+            <w:vAlign w:val="center"/>
+          </w:tcPr>
+          <w:p>
+            <w:pPr>
+              <w:jc w:val="center"/>
+            </w:pPr>
+            <w:r>
+              <w:rPr>
+                <w:b w:val="false"/>
+                <w:bCs w:val="false"/>
+                <w:color w:val="000000"/>
+                <w:sz w:val="20"/>
+                <w:szCs w:val="20"/>
+              </w:rPr>
+              <w:t xml:space="preserve">string (FK compuesta)</w:t>
+            </w:r>
+          </w:p>
+        </w:tc>
+        <w:tc>
+          <w:tcPr>
+            <w:tcW w:type="dxa" w:w="5100"/>
+            <w:tcMar>
+              <w:top w:type="dxa" w:w="60"/>
+              <w:left w:type="dxa" w:w="100"/>
+              <w:bottom w:type="dxa" w:w="60"/>
+              <w:right w:type="dxa" w:w="100"/>
+            </w:tcMar>
+            <w:vAlign w:val="center"/>
+          </w:tcPr>
+          <w:p>
+            <w:pPr>
+              <w:jc w:val="center"/>
+            </w:pPr>
+            <w:r>
+              <w:rPr>
+                <w:b w:val="false"/>
+                <w:bCs w:val="false"/>
+                <w:color w:val="000000"/>
+                <w:sz w:val="20"/>
+                <w:szCs w:val="20"/>
+              </w:rPr>
+              <w:t xml:space="preserve">Clave del par proveedor-entidad agregado.</w:t>
+            </w:r>
+          </w:p>
+        </w:tc>
+      </w:tr>
+      <w:tr>
+        <w:tc>
+          <w:tcPr>
+            <w:tcW w:type="dxa" w:w="3200"/>
+            <w:tcMar>
+              <w:top w:type="dxa" w:w="60"/>
+              <w:left w:type="dxa" w:w="100"/>
+              <w:bottom w:type="dxa" w:w="60"/>
+              <w:right w:type="dxa" w:w="100"/>
+            </w:tcMar>
+            <w:vAlign w:val="center"/>
+          </w:tcPr>
+          <w:p>
+            <w:pPr>
+              <w:jc w:val="left"/>
+            </w:pPr>
+            <w:r>
+              <w:rPr>
+                <w:b w:val="false"/>
+                <w:bCs w:val="false"/>
+                <w:color w:val="000000"/>
+                <w:sz w:val="20"/>
+                <w:szCs w:val="20"/>
+              </w:rPr>
+              <w:t xml:space="preserve">dataset_favoritismo.n_contratos</w:t>
+            </w:r>
+          </w:p>
+        </w:tc>
+        <w:tc>
+          <w:tcPr>
+            <w:tcW w:type="dxa" w:w="1500"/>
+            <w:tcMar>
+              <w:top w:type="dxa" w:w="60"/>
+              <w:left w:type="dxa" w:w="100"/>
+              <w:bottom w:type="dxa" w:w="60"/>
+              <w:right w:type="dxa" w:w="100"/>
+            </w:tcMar>
+            <w:vAlign w:val="center"/>
+          </w:tcPr>
+          <w:p>
+            <w:pPr>
+              <w:jc w:val="center"/>
+            </w:pPr>
+            <w:r>
+              <w:rPr>
+                <w:b w:val="false"/>
+                <w:bCs w:val="false"/>
+                <w:color w:val="000000"/>
+                <w:sz w:val="20"/>
+                <w:szCs w:val="20"/>
+              </w:rPr>
+              <w:t xml:space="preserve">numérico</w:t>
+            </w:r>
+          </w:p>
+        </w:tc>
+        <w:tc>
+          <w:tcPr>
+            <w:tcW w:type="dxa" w:w="5100"/>
+            <w:tcMar>
+              <w:top w:type="dxa" w:w="60"/>
+              <w:left w:type="dxa" w:w="100"/>
+              <w:bottom w:type="dxa" w:w="60"/>
+              <w:right w:type="dxa" w:w="100"/>
+            </w:tcMar>
+            <w:vAlign w:val="center"/>
+          </w:tcPr>
+          <w:p>
+            <w:pPr>
+              <w:jc w:val="center"/>
+            </w:pPr>
+            <w:r>
+              <w:rPr>
+                <w:b w:val="false"/>
+                <w:bCs w:val="false"/>
+                <w:color w:val="000000"/>
+                <w:sz w:val="20"/>
+                <w:szCs w:val="20"/>
+              </w:rPr>
+              <w:t xml:space="preserve">N° de contratos ganados por el proveedor en la entidad.</w:t>
+            </w:r>
+          </w:p>
+        </w:tc>
+      </w:tr>
+      <w:tr>
+        <w:tc>
+          <w:tcPr>
+            <w:tcW w:type="dxa" w:w="3200"/>
+            <w:tcMar>
+              <w:top w:type="dxa" w:w="60"/>
+              <w:left w:type="dxa" w:w="100"/>
+              <w:bottom w:type="dxa" w:w="60"/>
+              <w:right w:type="dxa" w:w="100"/>
+            </w:tcMar>
+            <w:vAlign w:val="center"/>
+          </w:tcPr>
+          <w:p>
+            <w:pPr>
+              <w:jc w:val="left"/>
+            </w:pPr>
+            <w:r>
+              <w:rPr>
+                <w:b w:val="false"/>
+                <w:bCs w:val="false"/>
+                <w:color w:val="000000"/>
+                <w:sz w:val="20"/>
+                <w:szCs w:val="20"/>
+              </w:rPr>
+              <w:t xml:space="preserve">dataset_favoritismo.monto_total / monto_promedio</w:t>
+            </w:r>
+          </w:p>
+        </w:tc>
+        <w:tc>
+          <w:tcPr>
+            <w:tcW w:type="dxa" w:w="1500"/>
+            <w:tcMar>
+              <w:top w:type="dxa" w:w="60"/>
+              <w:left w:type="dxa" w:w="100"/>
+              <w:bottom w:type="dxa" w:w="60"/>
+              <w:right w:type="dxa" w:w="100"/>
+            </w:tcMar>
+            <w:vAlign w:val="center"/>
+          </w:tcPr>
+          <w:p>
+            <w:pPr>
+              <w:jc w:val="center"/>
+            </w:pPr>
+            <w:r>
+              <w:rPr>
+                <w:b w:val="false"/>
+                <w:bCs w:val="false"/>
+                <w:color w:val="000000"/>
+                <w:sz w:val="20"/>
+                <w:szCs w:val="20"/>
+              </w:rPr>
+              <w:t xml:space="preserve">numérico (S/.)</w:t>
+            </w:r>
+          </w:p>
+        </w:tc>
+        <w:tc>
+          <w:tcPr>
+            <w:tcW w:type="dxa" w:w="5100"/>
+            <w:tcMar>
+              <w:top w:type="dxa" w:w="60"/>
+              <w:left w:type="dxa" w:w="100"/>
+              <w:bottom w:type="dxa" w:w="60"/>
+              <w:right w:type="dxa" w:w="100"/>
+            </w:tcMar>
+            <w:vAlign w:val="center"/>
+          </w:tcPr>
+          <w:p>
+            <w:pPr>
+              <w:jc w:val="center"/>
+            </w:pPr>
+            <w:r>
+              <w:rPr>
+                <w:b w:val="false"/>
+                <w:bCs w:val="false"/>
+                <w:color w:val="000000"/>
+                <w:sz w:val="20"/>
+                <w:szCs w:val="20"/>
+              </w:rPr>
+              <w:t xml:space="preserve">Monto acumulado y promedio de los contratos del par.</w:t>
+            </w:r>
+          </w:p>
+        </w:tc>
+      </w:tr>
+      <w:tr>
+        <w:tc>
+          <w:tcPr>
+            <w:tcW w:type="dxa" w:w="3200"/>
+            <w:tcMar>
+              <w:top w:type="dxa" w:w="60"/>
+              <w:left w:type="dxa" w:w="100"/>
+              <w:bottom w:type="dxa" w:w="60"/>
+              <w:right w:type="dxa" w:w="100"/>
+            </w:tcMar>
+            <w:vAlign w:val="center"/>
+          </w:tcPr>
+          <w:p>
+            <w:pPr>
+              <w:jc w:val="left"/>
+            </w:pPr>
+            <w:r>
+              <w:rPr>
+                <w:b w:val="false"/>
+                <w:bCs w:val="false"/>
+                <w:color w:val="000000"/>
+                <w:sz w:val="20"/>
+                <w:szCs w:val="20"/>
+              </w:rPr>
+              <w:t xml:space="preserve">dataset_favoritismo.pct_no_competitiva</w:t>
+            </w:r>
+          </w:p>
+        </w:tc>
+        <w:tc>
+          <w:tcPr>
+            <w:tcW w:type="dxa" w:w="1500"/>
+            <w:tcMar>
+              <w:top w:type="dxa" w:w="60"/>
+              <w:left w:type="dxa" w:w="100"/>
+              <w:bottom w:type="dxa" w:w="60"/>
+              <w:right w:type="dxa" w:w="100"/>
+            </w:tcMar>
+            <w:vAlign w:val="center"/>
+          </w:tcPr>
+          <w:p>
+            <w:pPr>
+              <w:jc w:val="center"/>
+            </w:pPr>
+            <w:r>
+              <w:rPr>
+                <w:b w:val="false"/>
+                <w:bCs w:val="false"/>
+                <w:color w:val="000000"/>
+                <w:sz w:val="20"/>
+                <w:szCs w:val="20"/>
+              </w:rPr>
+              <w:t xml:space="preserve">numérico [0-1]</w:t>
+            </w:r>
+          </w:p>
+        </w:tc>
+        <w:tc>
+          <w:tcPr>
+            <w:tcW w:type="dxa" w:w="5100"/>
+            <w:tcMar>
+              <w:top w:type="dxa" w:w="60"/>
+              <w:left w:type="dxa" w:w="100"/>
+              <w:bottom w:type="dxa" w:w="60"/>
+              <w:right w:type="dxa" w:w="100"/>
+            </w:tcMar>
+            <w:vAlign w:val="center"/>
+          </w:tcPr>
+          <w:p>
+            <w:pPr>
+              <w:jc w:val="center"/>
+            </w:pPr>
+            <w:r>
+              <w:rPr>
+                <w:b w:val="false"/>
+                <w:bCs w:val="false"/>
+                <w:color w:val="000000"/>
+                <w:sz w:val="20"/>
+                <w:szCs w:val="20"/>
+              </w:rPr>
+              <w:t xml:space="preserve">Proporción de contratos bajo modalidades poco competitivas.</w:t>
+            </w:r>
+          </w:p>
+        </w:tc>
+      </w:tr>
+      <w:tr>
+        <w:tc>
+          <w:tcPr>
+            <w:tcW w:type="dxa" w:w="3200"/>
+            <w:tcMar>
+              <w:top w:type="dxa" w:w="60"/>
+              <w:left w:type="dxa" w:w="100"/>
+              <w:bottom w:type="dxa" w:w="60"/>
+              <w:right w:type="dxa" w:w="100"/>
+            </w:tcMar>
+            <w:vAlign w:val="center"/>
+          </w:tcPr>
+          <w:p>
+            <w:pPr>
+              <w:jc w:val="left"/>
+            </w:pPr>
+            <w:r>
+              <w:rPr>
+                <w:b w:val="false"/>
+                <w:bCs w:val="false"/>
+                <w:color w:val="000000"/>
+                <w:sz w:val="20"/>
+                <w:szCs w:val="20"/>
+              </w:rPr>
+              <w:t xml:space="preserve">dataset_favoritismo.concentracion_objeto</w:t>
+            </w:r>
+          </w:p>
+        </w:tc>
+        <w:tc>
+          <w:tcPr>
+            <w:tcW w:type="dxa" w:w="1500"/>
+            <w:tcMar>
+              <w:top w:type="dxa" w:w="60"/>
+              <w:left w:type="dxa" w:w="100"/>
+              <w:bottom w:type="dxa" w:w="60"/>
+              <w:right w:type="dxa" w:w="100"/>
+            </w:tcMar>
+            <w:vAlign w:val="center"/>
+          </w:tcPr>
+          <w:p>
+            <w:pPr>
+              <w:jc w:val="center"/>
+            </w:pPr>
+            <w:r>
+              <w:rPr>
+                <w:b w:val="false"/>
+                <w:bCs w:val="false"/>
+                <w:color w:val="000000"/>
+                <w:sz w:val="20"/>
+                <w:szCs w:val="20"/>
+              </w:rPr>
+              <w:t xml:space="preserve">numérico [0-1]</w:t>
+            </w:r>
+          </w:p>
+        </w:tc>
+        <w:tc>
+          <w:tcPr>
+            <w:tcW w:type="dxa" w:w="5100"/>
+            <w:tcMar>
+              <w:top w:type="dxa" w:w="60"/>
+              <w:left w:type="dxa" w:w="100"/>
+              <w:bottom w:type="dxa" w:w="60"/>
+              <w:right w:type="dxa" w:w="100"/>
+            </w:tcMar>
+            <w:vAlign w:val="center"/>
+          </w:tcPr>
+          <w:p>
+            <w:pPr>
+              <w:jc w:val="center"/>
+            </w:pPr>
+            <w:r>
+              <w:rPr>
+                <w:b w:val="false"/>
+                <w:bCs w:val="false"/>
+                <w:color w:val="000000"/>
+                <w:sz w:val="20"/>
+                <w:szCs w:val="20"/>
+              </w:rPr>
+              <w:t xml:space="preserve">1 − (objetos distintos / n° contratos). Cercano a 1 = siempre el mismo objeto.</w:t>
+            </w:r>
+          </w:p>
+        </w:tc>
+      </w:tr>
+      <w:tr>
+        <w:tc>
+          <w:tcPr>
+            <w:tcW w:type="dxa" w:w="3200"/>
+            <w:tcMar>
+              <w:top w:type="dxa" w:w="60"/>
+              <w:left w:type="dxa" w:w="100"/>
+              <w:bottom w:type="dxa" w:w="60"/>
+              <w:right w:type="dxa" w:w="100"/>
+            </w:tcMar>
+            <w:vAlign w:val="center"/>
+          </w:tcPr>
+          <w:p>
+            <w:pPr>
+              <w:jc w:val="left"/>
+            </w:pPr>
+            <w:r>
+              <w:rPr>
+                <w:b w:val="false"/>
+                <w:bCs w:val="false"/>
+                <w:color w:val="000000"/>
+                <w:sz w:val="20"/>
+                <w:szCs w:val="20"/>
+              </w:rPr>
+              <w:t xml:space="preserve">dataset_favoritismo.score_riesgo_favoritismo</w:t>
+            </w:r>
+          </w:p>
+        </w:tc>
+        <w:tc>
+          <w:tcPr>
+            <w:tcW w:type="dxa" w:w="1500"/>
+            <w:tcMar>
+              <w:top w:type="dxa" w:w="60"/>
+              <w:left w:type="dxa" w:w="100"/>
+              <w:bottom w:type="dxa" w:w="60"/>
+              <w:right w:type="dxa" w:w="100"/>
+            </w:tcMar>
+            <w:vAlign w:val="center"/>
+          </w:tcPr>
+          <w:p>
+            <w:pPr>
+              <w:jc w:val="center"/>
+            </w:pPr>
+            <w:r>
+              <w:rPr>
+                <w:b w:val="false"/>
+                <w:bCs w:val="false"/>
+                <w:color w:val="000000"/>
+                <w:sz w:val="20"/>
+                <w:szCs w:val="20"/>
+              </w:rPr>
+              <w:t xml:space="preserve">numérico [0-1]</w:t>
+            </w:r>
+          </w:p>
+        </w:tc>
+        <w:tc>
+          <w:tcPr>
+            <w:tcW w:type="dxa" w:w="5100"/>
+            <w:tcMar>
+              <w:top w:type="dxa" w:w="60"/>
+              <w:left w:type="dxa" w:w="100"/>
+              <w:bottom w:type="dxa" w:w="60"/>
+              <w:right w:type="dxa" w:w="100"/>
+            </w:tcMar>
+            <w:vAlign w:val="center"/>
+          </w:tcPr>
+          <w:p>
+            <w:pPr>
+              <w:jc w:val="center"/>
+            </w:pPr>
+            <w:r>
+              <w:rPr>
+                <w:b w:val="false"/>
+                <w:bCs w:val="false"/>
+                <w:color w:val="000000"/>
+                <w:sz w:val="20"/>
+                <w:szCs w:val="20"/>
+              </w:rPr>
+              <w:t xml:space="preserve">Salida del modelo Random Forest — probabilidad estimada de favoritismo.</w:t>
+            </w:r>
+          </w:p>
+        </w:tc>
+      </w:tr>
+      <w:tr>
+        <w:tc>
+          <w:tcPr>
+            <w:tcW w:type="dxa" w:w="3200"/>
+            <w:tcMar>
+              <w:top w:type="dxa" w:w="60"/>
+              <w:left w:type="dxa" w:w="100"/>
+              <w:bottom w:type="dxa" w:w="60"/>
+              <w:right w:type="dxa" w:w="100"/>
+            </w:tcMar>
+            <w:vAlign w:val="center"/>
+          </w:tcPr>
+          <w:p>
+            <w:pPr>
+              <w:jc w:val="left"/>
+            </w:pPr>
+            <w:r>
+              <w:rPr>
+                <w:b w:val="false"/>
+                <w:bCs w:val="false"/>
+                <w:color w:val="000000"/>
+                <w:sz w:val="20"/>
+                <w:szCs w:val="20"/>
+              </w:rPr>
+              <w:t xml:space="preserve">dataset_fraccionamiento.id_proveedor / id_entidad / objeto</w:t>
+            </w:r>
+          </w:p>
+        </w:tc>
+        <w:tc>
+          <w:tcPr>
+            <w:tcW w:type="dxa" w:w="1500"/>
+            <w:tcMar>
+              <w:top w:type="dxa" w:w="60"/>
+              <w:left w:type="dxa" w:w="100"/>
+              <w:bottom w:type="dxa" w:w="60"/>
+              <w:right w:type="dxa" w:w="100"/>
+            </w:tcMar>
+            <w:vAlign w:val="center"/>
+          </w:tcPr>
+          <w:p>
+            <w:pPr>
+              <w:jc w:val="center"/>
+            </w:pPr>
+            <w:r>
+              <w:rPr>
+                <w:b w:val="false"/>
+                <w:bCs w:val="false"/>
+                <w:color w:val="000000"/>
+                <w:sz w:val="20"/>
+                <w:szCs w:val="20"/>
+              </w:rPr>
+              <w:t xml:space="preserve">string (FK compuesta)</w:t>
+            </w:r>
+          </w:p>
+        </w:tc>
+        <w:tc>
+          <w:tcPr>
+            <w:tcW w:type="dxa" w:w="5100"/>
+            <w:tcMar>
+              <w:top w:type="dxa" w:w="60"/>
+              <w:left w:type="dxa" w:w="100"/>
+              <w:bottom w:type="dxa" w:w="60"/>
+              <w:right w:type="dxa" w:w="100"/>
+            </w:tcMar>
+            <w:vAlign w:val="center"/>
+          </w:tcPr>
+          <w:p>
+            <w:pPr>
+              <w:jc w:val="center"/>
+            </w:pPr>
+            <w:r>
+              <w:rPr>
+                <w:b w:val="false"/>
+                <w:bCs w:val="false"/>
+                <w:color w:val="000000"/>
+                <w:sz w:val="20"/>
+                <w:szCs w:val="20"/>
+              </w:rPr>
+              <w:t xml:space="preserve">Clave del grupo proveedor-entidad-objeto.</w:t>
+            </w:r>
+          </w:p>
+        </w:tc>
+      </w:tr>
+      <w:tr>
+        <w:tc>
+          <w:tcPr>
+            <w:tcW w:type="dxa" w:w="3200"/>
+            <w:tcMar>
+              <w:top w:type="dxa" w:w="60"/>
+              <w:left w:type="dxa" w:w="100"/>
+              <w:bottom w:type="dxa" w:w="60"/>
+              <w:right w:type="dxa" w:w="100"/>
+            </w:tcMar>
+            <w:vAlign w:val="center"/>
+          </w:tcPr>
+          <w:p>
+            <w:pPr>
+              <w:jc w:val="left"/>
+            </w:pPr>
+            <w:r>
+              <w:rPr>
+                <w:b w:val="false"/>
+                <w:bCs w:val="false"/>
+                <w:color w:val="000000"/>
+                <w:sz w:val="20"/>
+                <w:szCs w:val="20"/>
+              </w:rPr>
+              <w:t xml:space="preserve">dataset_fraccionamiento.max_contratos_ventana_15d</w:t>
+            </w:r>
+          </w:p>
+        </w:tc>
+        <w:tc>
+          <w:tcPr>
+            <w:tcW w:type="dxa" w:w="1500"/>
+            <w:tcMar>
+              <w:top w:type="dxa" w:w="60"/>
+              <w:left w:type="dxa" w:w="100"/>
+              <w:bottom w:type="dxa" w:w="60"/>
+              <w:right w:type="dxa" w:w="100"/>
+            </w:tcMar>
+            <w:vAlign w:val="center"/>
+          </w:tcPr>
+          <w:p>
+            <w:pPr>
+              <w:jc w:val="center"/>
+            </w:pPr>
+            <w:r>
+              <w:rPr>
+                <w:b w:val="false"/>
+                <w:bCs w:val="false"/>
+                <w:color w:val="000000"/>
+                <w:sz w:val="20"/>
+                <w:szCs w:val="20"/>
+              </w:rPr>
+              <w:t xml:space="preserve">numérico</w:t>
+            </w:r>
+          </w:p>
+        </w:tc>
+        <w:tc>
+          <w:tcPr>
+            <w:tcW w:type="dxa" w:w="5100"/>
+            <w:tcMar>
+              <w:top w:type="dxa" w:w="60"/>
+              <w:left w:type="dxa" w:w="100"/>
+              <w:bottom w:type="dxa" w:w="60"/>
+              <w:right w:type="dxa" w:w="100"/>
+            </w:tcMar>
+            <w:vAlign w:val="center"/>
+          </w:tcPr>
+          <w:p>
+            <w:pPr>
+              <w:jc w:val="center"/>
+            </w:pPr>
+            <w:r>
+              <w:rPr>
+                <w:b w:val="false"/>
+                <w:bCs w:val="false"/>
+                <w:color w:val="000000"/>
+                <w:sz w:val="20"/>
+                <w:szCs w:val="20"/>
+              </w:rPr>
+              <w:t xml:space="preserve">Máximo de contratos del grupo en cualquier ventana móvil de 15 días.</w:t>
+            </w:r>
+          </w:p>
+        </w:tc>
+      </w:tr>
+      <w:tr>
+        <w:tc>
+          <w:tcPr>
+            <w:tcW w:type="dxa" w:w="3200"/>
+            <w:tcMar>
+              <w:top w:type="dxa" w:w="60"/>
+              <w:left w:type="dxa" w:w="100"/>
+              <w:bottom w:type="dxa" w:w="60"/>
+              <w:right w:type="dxa" w:w="100"/>
+            </w:tcMar>
+            <w:vAlign w:val="center"/>
+          </w:tcPr>
+          <w:p>
+            <w:pPr>
+              <w:jc w:val="left"/>
+            </w:pPr>
+            <w:r>
+              <w:rPr>
+                <w:b w:val="false"/>
+                <w:bCs w:val="false"/>
+                <w:color w:val="000000"/>
+                <w:sz w:val="20"/>
+                <w:szCs w:val="20"/>
+              </w:rPr>
+              <w:t xml:space="preserve">dataset_fraccionamiento.pct_montos_bajo_umbral</w:t>
+            </w:r>
+          </w:p>
+        </w:tc>
+        <w:tc>
+          <w:tcPr>
+            <w:tcW w:type="dxa" w:w="1500"/>
+            <w:tcMar>
+              <w:top w:type="dxa" w:w="60"/>
+              <w:left w:type="dxa" w:w="100"/>
+              <w:bottom w:type="dxa" w:w="60"/>
+              <w:right w:type="dxa" w:w="100"/>
+            </w:tcMar>
+            <w:vAlign w:val="center"/>
+          </w:tcPr>
+          <w:p>
+            <w:pPr>
+              <w:jc w:val="center"/>
+            </w:pPr>
+            <w:r>
+              <w:rPr>
+                <w:b w:val="false"/>
+                <w:bCs w:val="false"/>
+                <w:color w:val="000000"/>
+                <w:sz w:val="20"/>
+                <w:szCs w:val="20"/>
+              </w:rPr>
+              <w:t xml:space="preserve">numérico [0-1]</w:t>
+            </w:r>
+          </w:p>
+        </w:tc>
+        <w:tc>
+          <w:tcPr>
+            <w:tcW w:type="dxa" w:w="5100"/>
+            <w:tcMar>
+              <w:top w:type="dxa" w:w="60"/>
+              <w:left w:type="dxa" w:w="100"/>
+              <w:bottom w:type="dxa" w:w="60"/>
+              <w:right w:type="dxa" w:w="100"/>
+            </w:tcMar>
+            <w:vAlign w:val="center"/>
+          </w:tcPr>
+          <w:p>
+            <w:pPr>
+              <w:jc w:val="center"/>
+            </w:pPr>
+            <w:r>
+              <w:rPr>
+                <w:b w:val="false"/>
+                <w:bCs w:val="false"/>
+                <w:color w:val="000000"/>
+                <w:sz w:val="20"/>
+                <w:szCs w:val="20"/>
+              </w:rPr>
+              <w:t xml:space="preserve">Proporción de contratos con monto &lt; 95% del umbral de Adjudicación Simplificada.</w:t>
+            </w:r>
+          </w:p>
+        </w:tc>
+      </w:tr>
+      <w:tr>
+        <w:tc>
+          <w:tcPr>
+            <w:tcW w:type="dxa" w:w="3200"/>
+            <w:tcMar>
+              <w:top w:type="dxa" w:w="60"/>
+              <w:left w:type="dxa" w:w="100"/>
+              <w:bottom w:type="dxa" w:w="60"/>
+              <w:right w:type="dxa" w:w="100"/>
+            </w:tcMar>
+            <w:vAlign w:val="center"/>
+          </w:tcPr>
+          <w:p>
+            <w:pPr>
+              <w:jc w:val="left"/>
+            </w:pPr>
+            <w:r>
+              <w:rPr>
+                <w:b w:val="false"/>
+                <w:bCs w:val="false"/>
+                <w:color w:val="000000"/>
+                <w:sz w:val="20"/>
+                <w:szCs w:val="20"/>
+              </w:rPr>
+              <w:t xml:space="preserve">dataset_fraccionamiento.score_anomalia</w:t>
+            </w:r>
+          </w:p>
+        </w:tc>
+        <w:tc>
+          <w:tcPr>
+            <w:tcW w:type="dxa" w:w="1500"/>
+            <w:tcMar>
+              <w:top w:type="dxa" w:w="60"/>
+              <w:left w:type="dxa" w:w="100"/>
+              <w:bottom w:type="dxa" w:w="60"/>
+              <w:right w:type="dxa" w:w="100"/>
+            </w:tcMar>
+            <w:vAlign w:val="center"/>
+          </w:tcPr>
+          <w:p>
+            <w:pPr>
+              <w:jc w:val="center"/>
+            </w:pPr>
+            <w:r>
+              <w:rPr>
+                <w:b w:val="false"/>
+                <w:bCs w:val="false"/>
+                <w:color w:val="000000"/>
+                <w:sz w:val="20"/>
+                <w:szCs w:val="20"/>
+              </w:rPr>
+              <w:t xml:space="preserve">numérico</w:t>
+            </w:r>
+          </w:p>
+        </w:tc>
+        <w:tc>
+          <w:tcPr>
+            <w:tcW w:type="dxa" w:w="5100"/>
+            <w:tcMar>
+              <w:top w:type="dxa" w:w="60"/>
+              <w:left w:type="dxa" w:w="100"/>
+              <w:bottom w:type="dxa" w:w="60"/>
+              <w:right w:type="dxa" w:w="100"/>
+            </w:tcMar>
+            <w:vAlign w:val="center"/>
+          </w:tcPr>
+          <w:p>
+            <w:pPr>
+              <w:jc w:val="center"/>
+            </w:pPr>
+            <w:r>
+              <w:rPr>
+                <w:b w:val="false"/>
+                <w:bCs w:val="false"/>
+                <w:color w:val="000000"/>
+                <w:sz w:val="20"/>
+                <w:szCs w:val="20"/>
+              </w:rPr>
+              <w:t xml:space="preserve">Salida del modelo Isolation Forest — score de anomalía.</w:t>
+            </w:r>
+          </w:p>
+        </w:tc>
+      </w:tr>
+      <w:tr>
+        <w:tc>
+          <w:tcPr>
+            <w:tcW w:type="dxa" w:w="3200"/>
+            <w:tcMar>
+              <w:top w:type="dxa" w:w="60"/>
+              <w:left w:type="dxa" w:w="100"/>
+              <w:bottom w:type="dxa" w:w="60"/>
+              <w:right w:type="dxa" w:w="100"/>
+            </w:tcMar>
+            <w:vAlign w:val="center"/>
+          </w:tcPr>
+          <w:p>
+            <w:pPr>
+              <w:jc w:val="left"/>
+            </w:pPr>
+            <w:r>
+              <w:rPr>
+                <w:b w:val="false"/>
+                <w:bCs w:val="false"/>
+                <w:color w:val="000000"/>
+                <w:sz w:val="20"/>
+                <w:szCs w:val="20"/>
+              </w:rPr>
+              <w:t xml:space="preserve">dataset_fraccionamiento.cumple_regla_fraccionamiento</w:t>
+            </w:r>
+          </w:p>
+        </w:tc>
+        <w:tc>
+          <w:tcPr>
+            <w:tcW w:type="dxa" w:w="1500"/>
+            <w:tcMar>
+              <w:top w:type="dxa" w:w="60"/>
+              <w:left w:type="dxa" w:w="100"/>
+              <w:bottom w:type="dxa" w:w="60"/>
+              <w:right w:type="dxa" w:w="100"/>
+            </w:tcMar>
+            <w:vAlign w:val="center"/>
+          </w:tcPr>
+          <w:p>
+            <w:pPr>
+              <w:jc w:val="center"/>
+            </w:pPr>
+            <w:r>
+              <w:rPr>
+                <w:b w:val="false"/>
+                <w:bCs w:val="false"/>
+                <w:color w:val="000000"/>
+                <w:sz w:val="20"/>
+                <w:szCs w:val="20"/>
+              </w:rPr>
+              <w:t xml:space="preserve">booleano</w:t>
+            </w:r>
+          </w:p>
+        </w:tc>
+        <w:tc>
+          <w:tcPr>
+            <w:tcW w:type="dxa" w:w="5100"/>
+            <w:tcMar>
+              <w:top w:type="dxa" w:w="60"/>
+              <w:left w:type="dxa" w:w="100"/>
+              <w:bottom w:type="dxa" w:w="60"/>
+              <w:right w:type="dxa" w:w="100"/>
+            </w:tcMar>
+            <w:vAlign w:val="center"/>
+          </w:tcPr>
+          <w:p>
+            <w:pPr>
+              <w:jc w:val="center"/>
+            </w:pPr>
+            <w:r>
+              <w:rPr>
+                <w:b w:val="false"/>
+                <w:bCs w:val="false"/>
+                <w:color w:val="000000"/>
+                <w:sz w:val="20"/>
+                <w:szCs w:val="20"/>
+              </w:rPr>
+              <w:t xml:space="preserve">Regla interpretable: ≥3 contratos en 15 días Y ≥70% de montos bajo el umbral.</w:t>
+            </w:r>
+          </w:p>
+        </w:tc>
+      </w:tr>
+    </w:tbl>
+    <w:p>
+      <w:r>
+        <w:br w:type="page"/>
+      </w:r>
+    </w:p>
+    <w:p>
+      <w:pPr>
+        <w:pStyle w:val="Heading1"/>
+        <w:spacing w:after="150" w:before="300"/>
+      </w:pPr>
+      <w:r>
+        <w:t xml:space="preserve">6. Limitaciones del Prototipo</w:t>
       </w:r>
     </w:p>
     <w:p>
@@ -3644,7 +6252,7 @@
         <w:spacing w:after="150" w:before="300"/>
       </w:pPr>
       <w:r>
-        <w:t xml:space="preserve">6. Ruta de Escalamiento a Producción</w:t>
+        <w:t xml:space="preserve">7. Ruta de Escalamiento a Producción</w:t>
       </w:r>
     </w:p>
     <w:p>
@@ -3750,7 +6358,7 @@
         <w:spacing w:after="150" w:before="300"/>
       </w:pPr>
       <w:r>
-        <w:t xml:space="preserve">7. Conclusión</w:t>
+        <w:t xml:space="preserve">8. Conclusión</w:t>
       </w:r>
     </w:p>
     <w:p>

</xml_diff>

<commit_message>
Mejora 3/4: análisis de grafos proveedor-funcionario (networkx) - detecta 5/5 vínculos impropios sembrados, integrado al reporte
</commit_message>
<xml_diff>
--- a/reporte/Reporte_Tecnico_Prototipo_CGR_1.8.2.docx
+++ b/reporte/Reporte_Tecnico_Prototipo_CGR_1.8.2.docx
@@ -3567,7 +3567,7 @@
         <w:spacing w:after="150" w:before="300"/>
       </w:pPr>
       <w:r>
-        <w:t xml:space="preserve">5. Diccionario de Datos y Diagrama del Modelo</w:t>
+        <w:t xml:space="preserve">5. Evaluación de Vínculos Proveedor–Funcionario (Análisis de Grafos)</w:t>
       </w:r>
     </w:p>
     <w:p>
@@ -3579,7 +3579,274 @@
           <w:sz w:val="22"/>
           <w:szCs w:val="22"/>
         </w:rPr>
-        <w:t xml:space="preserve">Cubre el numeral 3.2.g del TDR ("Elaborar y mantener actualizado el diccionario y diagrama del modelo de datos") y el ítem 8 del checklist del Anexo 3 (documentación de linaje: rastreo del dato desde la fuente hasta el modelo final).</w:t>
+        <w:t xml:space="preserve">Cubre el numeral 4.2.4 del TDR: "Análisis de grafos o redes para mapear y evaluar relaciones entre proveedores y funcionarios (ej. por DNI, RUC, direcciones, teléfonos, etc.)". A diferencia de los modelos de favoritismo y fraccionamiento, que operan solo sobre datos de SIAF/SEACE, este módulo requiere cruzar con una tercera fuente de datos de contacto (típicamente RENIEC/SUNAT/RNP), que aquí se simula, ya que no forma parte de SIAF ni SEACE por sí solos.</w:t>
+      </w:r>
+    </w:p>
+    <w:p>
+      <w:pPr>
+        <w:spacing w:after="160"/>
+      </w:pPr>
+      <w:r>
+        <w:rPr>
+          <w:sz w:val="22"/>
+          <w:szCs w:val="22"/>
+        </w:rPr>
+        <w:t xml:space="preserve">Se construyó un grafo bipartito con los 220 proveedores y 60 funcionarios simulados, con una arista por cada par que tiene al menos un contrato entre sí (3,020 aristas en total). Cada arista se marca automáticamente si el proveedor y el funcionario comparten el mismo número de teléfono o la misma dirección registrada — la señal típica de una empresa fachada controlada por el propio funcionario o un allegado.</w:t>
+      </w:r>
+    </w:p>
+    <w:tbl>
+      <w:tblPr>
+        <w:tblW w:type="dxa" w:w="8800"/>
+        <w:tblBorders>
+          <w:top w:val="single" w:color="auto" w:sz="4"/>
+          <w:left w:val="single" w:color="auto" w:sz="4"/>
+          <w:bottom w:val="single" w:color="auto" w:sz="4"/>
+          <w:right w:val="single" w:color="auto" w:sz="4"/>
+          <w:insideH w:val="single" w:color="auto" w:sz="4"/>
+          <w:insideV w:val="single" w:color="auto" w:sz="4"/>
+        </w:tblBorders>
+      </w:tblPr>
+      <w:tblGrid>
+        <w:gridCol w:w="5500"/>
+        <w:gridCol w:w="3300"/>
+      </w:tblGrid>
+      <w:tr>
+        <w:tc>
+          <w:tcPr>
+            <w:tcW w:type="dxa" w:w="5500"/>
+            <w:shd w:fill="1F4E79" w:val="clear"/>
+            <w:tcMar>
+              <w:top w:type="dxa" w:w="60"/>
+              <w:left w:type="dxa" w:w="100"/>
+              <w:bottom w:type="dxa" w:w="60"/>
+              <w:right w:type="dxa" w:w="100"/>
+            </w:tcMar>
+            <w:vAlign w:val="center"/>
+          </w:tcPr>
+          <w:p>
+            <w:pPr>
+              <w:jc w:val="left"/>
+            </w:pPr>
+            <w:r>
+              <w:rPr>
+                <w:b/>
+                <w:bCs/>
+                <w:color w:val="FFFFFF"/>
+                <w:sz w:val="20"/>
+                <w:szCs w:val="20"/>
+              </w:rPr>
+              <w:t xml:space="preserve">Métrica</w:t>
+            </w:r>
+          </w:p>
+        </w:tc>
+        <w:tc>
+          <w:tcPr>
+            <w:tcW w:type="dxa" w:w="3300"/>
+            <w:shd w:fill="1F4E79" w:val="clear"/>
+            <w:tcMar>
+              <w:top w:type="dxa" w:w="60"/>
+              <w:left w:type="dxa" w:w="100"/>
+              <w:bottom w:type="dxa" w:w="60"/>
+              <w:right w:type="dxa" w:w="100"/>
+            </w:tcMar>
+            <w:vAlign w:val="center"/>
+          </w:tcPr>
+          <w:p>
+            <w:pPr>
+              <w:jc w:val="left"/>
+            </w:pPr>
+            <w:r>
+              <w:rPr>
+                <w:b/>
+                <w:bCs/>
+                <w:color w:val="FFFFFF"/>
+                <w:sz w:val="20"/>
+                <w:szCs w:val="20"/>
+              </w:rPr>
+              <w:t xml:space="preserve">Valor</w:t>
+            </w:r>
+          </w:p>
+        </w:tc>
+      </w:tr>
+      <w:tr>
+        <w:tc>
+          <w:tcPr>
+            <w:tcW w:type="dxa" w:w="5500"/>
+            <w:tcMar>
+              <w:top w:type="dxa" w:w="60"/>
+              <w:left w:type="dxa" w:w="100"/>
+              <w:bottom w:type="dxa" w:w="60"/>
+              <w:right w:type="dxa" w:w="100"/>
+            </w:tcMar>
+            <w:vAlign w:val="center"/>
+          </w:tcPr>
+          <w:p>
+            <w:pPr>
+              <w:jc w:val="left"/>
+            </w:pPr>
+            <w:r>
+              <w:rPr>
+                <w:b w:val="false"/>
+                <w:bCs w:val="false"/>
+                <w:color w:val="000000"/>
+                <w:sz w:val="20"/>
+                <w:szCs w:val="20"/>
+              </w:rPr>
+              <w:t xml:space="preserve">Vínculos impropios sembrados</w:t>
+            </w:r>
+          </w:p>
+        </w:tc>
+        <w:tc>
+          <w:tcPr>
+            <w:tcW w:type="dxa" w:w="3300"/>
+            <w:tcMar>
+              <w:top w:type="dxa" w:w="60"/>
+              <w:left w:type="dxa" w:w="100"/>
+              <w:bottom w:type="dxa" w:w="60"/>
+              <w:right w:type="dxa" w:w="100"/>
+            </w:tcMar>
+            <w:vAlign w:val="center"/>
+          </w:tcPr>
+          <w:p>
+            <w:pPr>
+              <w:jc w:val="center"/>
+            </w:pPr>
+            <w:r>
+              <w:rPr>
+                <w:b w:val="false"/>
+                <w:bCs w:val="false"/>
+                <w:color w:val="000000"/>
+                <w:sz w:val="20"/>
+                <w:szCs w:val="20"/>
+              </w:rPr>
+              <w:t xml:space="preserve">5</w:t>
+            </w:r>
+          </w:p>
+        </w:tc>
+      </w:tr>
+      <w:tr>
+        <w:tc>
+          <w:tcPr>
+            <w:tcW w:type="dxa" w:w="5500"/>
+            <w:tcMar>
+              <w:top w:type="dxa" w:w="60"/>
+              <w:left w:type="dxa" w:w="100"/>
+              <w:bottom w:type="dxa" w:w="60"/>
+              <w:right w:type="dxa" w:w="100"/>
+            </w:tcMar>
+            <w:vAlign w:val="center"/>
+          </w:tcPr>
+          <w:p>
+            <w:pPr>
+              <w:jc w:val="left"/>
+            </w:pPr>
+            <w:r>
+              <w:rPr>
+                <w:b w:val="false"/>
+                <w:bCs w:val="false"/>
+                <w:color w:val="000000"/>
+                <w:sz w:val="20"/>
+                <w:szCs w:val="20"/>
+              </w:rPr>
+              <w:t xml:space="preserve">Aristas marcadas por el algoritmo</w:t>
+            </w:r>
+          </w:p>
+        </w:tc>
+        <w:tc>
+          <w:tcPr>
+            <w:tcW w:type="dxa" w:w="3300"/>
+            <w:tcMar>
+              <w:top w:type="dxa" w:w="60"/>
+              <w:left w:type="dxa" w:w="100"/>
+              <w:bottom w:type="dxa" w:w="60"/>
+              <w:right w:type="dxa" w:w="100"/>
+            </w:tcMar>
+            <w:vAlign w:val="center"/>
+          </w:tcPr>
+          <w:p>
+            <w:pPr>
+              <w:jc w:val="center"/>
+            </w:pPr>
+            <w:r>
+              <w:rPr>
+                <w:b w:val="false"/>
+                <w:bCs w:val="false"/>
+                <w:color w:val="000000"/>
+                <w:sz w:val="20"/>
+                <w:szCs w:val="20"/>
+              </w:rPr>
+              <w:t xml:space="preserve">5</w:t>
+            </w:r>
+          </w:p>
+        </w:tc>
+      </w:tr>
+      <w:tr>
+        <w:tc>
+          <w:tcPr>
+            <w:tcW w:type="dxa" w:w="5500"/>
+            <w:tcMar>
+              <w:top w:type="dxa" w:w="60"/>
+              <w:left w:type="dxa" w:w="100"/>
+              <w:bottom w:type="dxa" w:w="60"/>
+              <w:right w:type="dxa" w:w="100"/>
+            </w:tcMar>
+            <w:vAlign w:val="center"/>
+          </w:tcPr>
+          <w:p>
+            <w:pPr>
+              <w:jc w:val="left"/>
+            </w:pPr>
+            <w:r>
+              <w:rPr>
+                <w:b w:val="false"/>
+                <w:bCs w:val="false"/>
+                <w:color w:val="000000"/>
+                <w:sz w:val="20"/>
+                <w:szCs w:val="20"/>
+              </w:rPr>
+              <w:t xml:space="preserve">Aciertos</w:t>
+            </w:r>
+          </w:p>
+        </w:tc>
+        <w:tc>
+          <w:tcPr>
+            <w:tcW w:type="dxa" w:w="3300"/>
+            <w:tcMar>
+              <w:top w:type="dxa" w:w="60"/>
+              <w:left w:type="dxa" w:w="100"/>
+              <w:bottom w:type="dxa" w:w="60"/>
+              <w:right w:type="dxa" w:w="100"/>
+            </w:tcMar>
+            <w:vAlign w:val="center"/>
+          </w:tcPr>
+          <w:p>
+            <w:pPr>
+              <w:jc w:val="center"/>
+            </w:pPr>
+            <w:r>
+              <w:rPr>
+                <w:b w:val="false"/>
+                <w:bCs w:val="false"/>
+                <w:color w:val="000000"/>
+                <w:sz w:val="20"/>
+                <w:szCs w:val="20"/>
+              </w:rPr>
+              <w:t xml:space="preserve">5 de 5 (100%)</w:t>
+            </w:r>
+          </w:p>
+        </w:tc>
+      </w:tr>
+    </w:tbl>
+    <w:p>
+      <w:pPr>
+        <w:spacing w:after="160"/>
+      </w:pPr>
+      <w:r>
+        <w:rPr>
+          <w:sz w:val="4"/>
+          <w:szCs w:val="4"/>
+        </w:rPr>
+        <w:t xml:space="preserve"/>
       </w:r>
     </w:p>
     <w:p>
@@ -3590,7 +3857,7 @@
       <w:r>
         <w:drawing>
           <wp:inline distT="0" distB="0" distL="0" distR="0">
-            <wp:extent cx="5334000" cy="1381125"/>
+            <wp:extent cx="4572000" cy="3543300"/>
             <wp:effectExtent t="0" r="0" b="0" l="0"/>
             <wp:docPr id="1" name="" descr="" title=""/>
             <wp:cNvGraphicFramePr>
@@ -3615,6 +3882,101 @@
                   <pic:spPr bwMode="auto">
                     <a:xfrm>
                       <a:off x="0" y="0"/>
+                      <a:ext cx="4572000" cy="3543300"/>
+                    </a:xfrm>
+                    <a:prstGeom prst="rect">
+                      <a:avLst/>
+                    </a:prstGeom>
+                  </pic:spPr>
+                </pic:pic>
+              </a:graphicData>
+            </a:graphic>
+          </wp:inline>
+        </w:drawing>
+      </w:r>
+    </w:p>
+    <w:p>
+      <w:pPr>
+        <w:spacing w:after="200" w:before="60"/>
+        <w:jc w:val="center"/>
+      </w:pPr>
+      <w:r>
+        <w:rPr>
+          <w:i/>
+          <w:iCs/>
+          <w:color w:val="666666"/>
+          <w:sz w:val="18"/>
+          <w:szCs w:val="18"/>
+        </w:rPr>
+        <w:t xml:space="preserve">Figura 7. Red proveedor–funcionario; los 5 vínculos sospechosos (líneas rojas) fueron detectados con 100% de precisión sobre una muestra de contexto de relaciones normales.</w:t>
+      </w:r>
+    </w:p>
+    <w:p>
+      <w:pPr>
+        <w:spacing w:after="160"/>
+      </w:pPr>
+      <w:r>
+        <w:rPr>
+          <w:sz w:val="22"/>
+          <w:szCs w:val="22"/>
+        </w:rPr>
+        <w:t xml:space="preserve">Nota: esta señal (coincidencia exacta de teléfono/dirección) es deliberadamente simple y de alta precisión pero baja cobertura — no detecta vínculos encubiertos con datos de contacto distintos (ej. un tercero testaferro). Una versión de producción debería complementarse con análisis de centralidad de red (funcionarios que concentran decisiones sobre pocos proveedores) y con fuzzy matching de direcciones, no solo coincidencia exacta.</w:t>
+      </w:r>
+    </w:p>
+    <w:p>
+      <w:pPr>
+        <w:pStyle w:val="Heading1"/>
+        <w:spacing w:after="150" w:before="300"/>
+      </w:pPr>
+      <w:r>
+        <w:t xml:space="preserve">6. Diccionario de Datos y Diagrama del Modelo</w:t>
+      </w:r>
+    </w:p>
+    <w:p>
+      <w:pPr>
+        <w:spacing w:after="160"/>
+      </w:pPr>
+      <w:r>
+        <w:rPr>
+          <w:sz w:val="22"/>
+          <w:szCs w:val="22"/>
+        </w:rPr>
+        <w:t xml:space="preserve">Cubre el numeral 3.2.g del TDR ("Elaborar y mantener actualizado el diccionario y diagrama del modelo de datos") y el ítem 8 del checklist del Anexo 3 (documentación de linaje: rastreo del dato desde la fuente hasta el modelo final).</w:t>
+      </w:r>
+    </w:p>
+    <w:p>
+      <w:pPr>
+        <w:spacing w:after="100"/>
+        <w:jc w:val="center"/>
+      </w:pPr>
+      <w:r>
+        <w:drawing>
+          <wp:inline distT="0" distB="0" distL="0" distR="0">
+            <wp:extent cx="5334000" cy="1381125"/>
+            <wp:effectExtent t="0" r="0" b="0" l="0"/>
+            <wp:docPr id="1" name="" descr="" title=""/>
+            <wp:cNvGraphicFramePr>
+              <a:graphicFrameLocks xmlns:a="http://schemas.openxmlformats.org/drawingml/2006/main" noChangeAspect="1"/>
+            </wp:cNvGraphicFramePr>
+            <a:graphic xmlns:a="http://schemas.openxmlformats.org/drawingml/2006/main">
+              <a:graphicData uri="http://schemas.openxmlformats.org/drawingml/2006/picture">
+                <pic:pic xmlns:pic="http://schemas.openxmlformats.org/drawingml/2006/picture">
+                  <pic:nvPicPr>
+                    <pic:cNvPr id="0" name="" descr=""/>
+                    <pic:cNvPicPr>
+                      <a:picLocks noChangeAspect="1" noChangeArrowheads="1"/>
+                    </pic:cNvPicPr>
+                  </pic:nvPicPr>
+                  <pic:blipFill>
+                    <a:blip r:embed="rId15" cstate="none"/>
+                    <a:srcRect/>
+                    <a:stretch>
+                      <a:fillRect/>
+                    </a:stretch>
+                  </pic:blipFill>
+                  <pic:spPr bwMode="auto">
+                    <a:xfrm>
+                      <a:off x="0" y="0"/>
                       <a:ext cx="5334000" cy="1381125"/>
                     </a:xfrm>
                     <a:prstGeom prst="rect">
@@ -3641,7 +4003,7 @@
           <w:sz w:val="18"/>
           <w:szCs w:val="18"/>
         </w:rPr>
-        <w:t xml:space="preserve">Figura 6. Diagrama del modelo de datos: tablas fuente (SIAF/SEACE simuladas), relaciones y linaje hacia las tablas derivadas de cada modelo.</w:t>
+        <w:t xml:space="preserve">Figura 8. Diagrama del modelo de datos: tablas fuente (SIAF/SEACE simuladas), relaciones y linaje hacia las tablas derivadas de cada modelo.</w:t>
       </w:r>
     </w:p>
     <w:p>
@@ -3650,7 +4012,7 @@
         <w:spacing w:after="100" w:before="200"/>
       </w:pPr>
       <w:r>
-        <w:t xml:space="preserve">5.1. Diccionario de datos</w:t>
+        <w:t xml:space="preserve">6.1. Diccionario de datos</w:t>
       </w:r>
     </w:p>
     <w:tbl>
@@ -6175,7 +6537,7 @@
         <w:spacing w:after="150" w:before="300"/>
       </w:pPr>
       <w:r>
-        <w:t xml:space="preserve">6. Limitaciones del Prototipo</w:t>
+        <w:t xml:space="preserve">7. Limitaciones del Prototipo</w:t>
       </w:r>
     </w:p>
     <w:p>
@@ -6209,7 +6571,7 @@
           <w:sz w:val="22"/>
           <w:szCs w:val="22"/>
         </w:rPr>
-        <w:t xml:space="preserve">No incluye evaluación de vínculos por grafos (numeral 4.2.4 del TDR: relaciones proveedor-funcionario por DNI, RUC, direcciones, teléfonos), que requiere fuentes adicionales no simuladas aquí.</w:t>
+        <w:t xml:space="preserve">La señal de vínculos (Sección 5) usa coincidencia exacta de teléfono/dirección; en producción requeriría fuzzy matching y cruce con RENIEC/SUNAT real.</w:t>
       </w:r>
     </w:p>
     <w:p>
@@ -6252,7 +6614,7 @@
         <w:spacing w:after="150" w:before="300"/>
       </w:pPr>
       <w:r>
-        <w:t xml:space="preserve">7. Ruta de Escalamiento a Producción</w:t>
+        <w:t xml:space="preserve">8. Ruta de Escalamiento a Producción</w:t>
       </w:r>
     </w:p>
     <w:p>
@@ -6358,7 +6720,7 @@
         <w:spacing w:after="150" w:before="300"/>
       </w:pPr>
       <w:r>
-        <w:t xml:space="preserve">8. Conclusión</w:t>
+        <w:t xml:space="preserve">9. Conclusión</w:t>
       </w:r>
     </w:p>
     <w:p>
@@ -6370,7 +6732,7 @@
           <w:sz w:val="22"/>
           <w:szCs w:val="22"/>
         </w:rPr>
-        <w:t xml:space="preserve">Este prototipo demuestra en código abierto y en un plazo muy corto que los dos casos de uso centrales del TDR —favoritismo y fraccionamiento— son técnicamente alcanzables sin necesidad de comprometer de inmediato una consultoría individual de 180 días y S/. 72,000. El código fuente completo, comentado y versionado está disponible públicamente en el repositorio indicado en la portada, cumpliendo con el espíritu del ítem 6 del checklist de aceptación del Anexo 3 ("código versionado en Git institucional").</w:t>
+        <w:t xml:space="preserve">Este prototipo demuestra en código abierto y en un plazo muy corto que los tres casos de uso priorizados del TDR —favoritismo, fraccionamiento y vínculos proveedor-funcionario— son técnicamente alcanzables sin necesidad de comprometer de inmediato una consultoría individual de 180 días y S/. 72,000. El código fuente completo, comentado y versionado está disponible públicamente en el repositorio indicado en la portada, cumpliendo con el espíritu del ítem 6 del checklist de aceptación del Anexo 3 ("código versionado en Git institucional").</w:t>
       </w:r>
     </w:p>
     <w:sectPr>

</xml_diff>

<commit_message>
Reporte: nueva sección 8 documentando la validación real en Apache Spark MLlib (RandomForest + KMeans), con el hallazgo de que KMeans rindió peor que Isolation Forest
</commit_message>
<xml_diff>
--- a/reporte/Reporte_Tecnico_Prototipo_CGR_1.8.2.docx
+++ b/reporte/Reporte_Tecnico_Prototipo_CGR_1.8.2.docx
@@ -6614,7 +6614,7 @@
         <w:spacing w:after="150" w:before="300"/>
       </w:pPr>
       <w:r>
-        <w:t xml:space="preserve">8. Ruta de Escalamiento a Producción</w:t>
+        <w:t xml:space="preserve">8. Validación en Apache Spark MLlib (Ejecutado)</w:t>
       </w:r>
     </w:p>
     <w:p>
@@ -6626,7 +6626,435 @@
           <w:sz w:val="22"/>
           <w:szCs w:val="22"/>
         </w:rPr>
-        <w:t xml:space="preserve">La lógica de features y modelado de este prototipo es directamente portable a Apache Spark MLlib (pyspark.ml) sobre el Lakehouse Hadoop descrito en el Anexo 2 del TDR: RandomForestClassifier e IsolationForest (o su equivalente con Bucketed Random Projection LSH / KMeans en MLlib) tienen APIs prácticamente idénticas a scikit-learn. El trabajo adicional para producción consiste principalmente en:</w:t>
+        <w:t xml:space="preserve">A diferencia de las secciones anteriores, que describen el prototipo en scikit-learn, esta sección documenta una ejecución real sobre pyspark.ml en modo local (local[*], sin clúster YARN), para cerrar la brecha señalada frente al objetivo específico 3.2.a del TDR ("Diseñar, entrenar y optimizar modelos... utilizando Apache Spark (Spark MLlib)").</w:t>
+      </w:r>
+    </w:p>
+    <w:p>
+      <w:pPr>
+        <w:pStyle w:val="Heading2"/>
+        <w:spacing w:after="100" w:before="200"/>
+      </w:pPr>
+      <w:r>
+        <w:t xml:space="preserve">8.1. Favoritismo — RandomForestClassifier (pyspark.ml)</w:t>
+      </w:r>
+    </w:p>
+    <w:p>
+      <w:pPr>
+        <w:spacing w:after="160"/>
+      </w:pPr>
+      <w:r>
+        <w:rPr>
+          <w:sz w:val="22"/>
+          <w:szCs w:val="22"/>
+        </w:rPr>
+        <w:t xml:space="preserve">Misma arquitectura que la versión scikit-learn (300 árboles, profundidad 6), con ponderación de clases vía columna de pesos (Spark MLlib no tiene class_weight='balanced' nativo). Resultado: los 6 casos reales sembrados aparecen en el top-6 del ranking, igual que en la versión scikit-learn. Sesión Spark completa (arranque + entrenamiento + evaluación): ~50 segundos en modo local — el costo real de portar a Spark es de infraestructura y arranque, no de lógica de modelado.</w:t>
+      </w:r>
+    </w:p>
+    <w:p>
+      <w:pPr>
+        <w:pStyle w:val="Heading2"/>
+        <w:spacing w:after="100" w:before="200"/>
+      </w:pPr>
+      <w:r>
+        <w:t xml:space="preserve">8.2. Fraccionamiento — decisión de arquitectura real: KMeans en vez de Isolation Forest</w:t>
+      </w:r>
+    </w:p>
+    <w:p>
+      <w:pPr>
+        <w:spacing w:after="160"/>
+      </w:pPr>
+      <w:r>
+        <w:rPr>
+          <w:sz w:val="22"/>
+          <w:szCs w:val="22"/>
+        </w:rPr>
+        <w:t xml:space="preserve">Hallazgo de implementación no anticipado: Spark MLlib no incluye Isolation Forest de forma nativa y no existe un paquete confiable en PyPI que lo agregue a pyspark.ml. El numeral 4.2.3 del TDR permite explícitamente "agrupamiento (clustering) o detección de anomalías", por lo que se implementó KMeans (pyspark.ml.clustering) usando la distancia al centroide asignado como score de anomalía — la alternativa nativa correcta dentro de MLlib.</w:t>
+      </w:r>
+    </w:p>
+    <w:tbl>
+      <w:tblPr>
+        <w:tblW w:type="dxa" w:w="10000"/>
+        <w:tblBorders>
+          <w:top w:val="single" w:color="auto" w:sz="4"/>
+          <w:left w:val="single" w:color="auto" w:sz="4"/>
+          <w:bottom w:val="single" w:color="auto" w:sz="4"/>
+          <w:right w:val="single" w:color="auto" w:sz="4"/>
+          <w:insideH w:val="single" w:color="auto" w:sz="4"/>
+          <w:insideV w:val="single" w:color="auto" w:sz="4"/>
+        </w:tblBorders>
+      </w:tblPr>
+      <w:tblGrid>
+        <w:gridCol w:w="4200"/>
+        <w:gridCol w:w="2200"/>
+        <w:gridCol w:w="2000"/>
+        <w:gridCol w:w="1600"/>
+      </w:tblGrid>
+      <w:tr>
+        <w:tc>
+          <w:tcPr>
+            <w:tcW w:type="dxa" w:w="4200"/>
+            <w:shd w:fill="1F4E79" w:val="clear"/>
+            <w:tcMar>
+              <w:top w:type="dxa" w:w="60"/>
+              <w:left w:type="dxa" w:w="100"/>
+              <w:bottom w:type="dxa" w:w="60"/>
+              <w:right w:type="dxa" w:w="100"/>
+            </w:tcMar>
+            <w:vAlign w:val="center"/>
+          </w:tcPr>
+          <w:p>
+            <w:pPr>
+              <w:jc w:val="left"/>
+            </w:pPr>
+            <w:r>
+              <w:rPr>
+                <w:b/>
+                <w:bCs/>
+                <w:color w:val="FFFFFF"/>
+                <w:sz w:val="20"/>
+                <w:szCs w:val="20"/>
+              </w:rPr>
+              <w:t xml:space="preserve">Enfoque (Spark MLlib)</w:t>
+            </w:r>
+          </w:p>
+        </w:tc>
+        <w:tc>
+          <w:tcPr>
+            <w:tcW w:type="dxa" w:w="2200"/>
+            <w:shd w:fill="1F4E79" w:val="clear"/>
+            <w:tcMar>
+              <w:top w:type="dxa" w:w="60"/>
+              <w:left w:type="dxa" w:w="100"/>
+              <w:bottom w:type="dxa" w:w="60"/>
+              <w:right w:type="dxa" w:w="100"/>
+            </w:tcMar>
+            <w:vAlign w:val="center"/>
+          </w:tcPr>
+          <w:p>
+            <w:pPr>
+              <w:jc w:val="left"/>
+            </w:pPr>
+            <w:r>
+              <w:rPr>
+                <w:b/>
+                <w:bCs/>
+                <w:color w:val="FFFFFF"/>
+                <w:sz w:val="20"/>
+                <w:szCs w:val="20"/>
+              </w:rPr>
+              <w:t xml:space="preserve">Grupos marcados</w:t>
+            </w:r>
+          </w:p>
+        </w:tc>
+        <w:tc>
+          <w:tcPr>
+            <w:tcW w:type="dxa" w:w="2000"/>
+            <w:shd w:fill="1F4E79" w:val="clear"/>
+            <w:tcMar>
+              <w:top w:type="dxa" w:w="60"/>
+              <w:left w:type="dxa" w:w="100"/>
+              <w:bottom w:type="dxa" w:w="60"/>
+              <w:right w:type="dxa" w:w="100"/>
+            </w:tcMar>
+            <w:vAlign w:val="center"/>
+          </w:tcPr>
+          <w:p>
+            <w:pPr>
+              <w:jc w:val="left"/>
+            </w:pPr>
+            <w:r>
+              <w:rPr>
+                <w:b/>
+                <w:bCs/>
+                <w:color w:val="FFFFFF"/>
+                <w:sz w:val="20"/>
+                <w:szCs w:val="20"/>
+              </w:rPr>
+              <w:t xml:space="preserve">Aciertos reales</w:t>
+            </w:r>
+          </w:p>
+        </w:tc>
+        <w:tc>
+          <w:tcPr>
+            <w:tcW w:type="dxa" w:w="1600"/>
+            <w:shd w:fill="1F4E79" w:val="clear"/>
+            <w:tcMar>
+              <w:top w:type="dxa" w:w="60"/>
+              <w:left w:type="dxa" w:w="100"/>
+              <w:bottom w:type="dxa" w:w="60"/>
+              <w:right w:type="dxa" w:w="100"/>
+            </w:tcMar>
+            <w:vAlign w:val="center"/>
+          </w:tcPr>
+          <w:p>
+            <w:pPr>
+              <w:jc w:val="left"/>
+            </w:pPr>
+            <w:r>
+              <w:rPr>
+                <w:b/>
+                <w:bCs/>
+                <w:color w:val="FFFFFF"/>
+                <w:sz w:val="20"/>
+                <w:szCs w:val="20"/>
+              </w:rPr>
+              <w:t xml:space="preserve">Precisión</w:t>
+            </w:r>
+          </w:p>
+        </w:tc>
+      </w:tr>
+      <w:tr>
+        <w:tc>
+          <w:tcPr>
+            <w:tcW w:type="dxa" w:w="4200"/>
+            <w:tcMar>
+              <w:top w:type="dxa" w:w="60"/>
+              <w:left w:type="dxa" w:w="100"/>
+              <w:bottom w:type="dxa" w:w="60"/>
+              <w:right w:type="dxa" w:w="100"/>
+            </w:tcMar>
+            <w:vAlign w:val="center"/>
+          </w:tcPr>
+          <w:p>
+            <w:pPr>
+              <w:jc w:val="left"/>
+            </w:pPr>
+            <w:r>
+              <w:rPr>
+                <w:b w:val="false"/>
+                <w:bCs w:val="false"/>
+                <w:color w:val="000000"/>
+                <w:sz w:val="20"/>
+                <w:szCs w:val="20"/>
+              </w:rPr>
+              <w:t xml:space="preserve">KMeans (distancia a centroide, solo)</w:t>
+            </w:r>
+          </w:p>
+        </w:tc>
+        <w:tc>
+          <w:tcPr>
+            <w:tcW w:type="dxa" w:w="2200"/>
+            <w:tcMar>
+              <w:top w:type="dxa" w:w="60"/>
+              <w:left w:type="dxa" w:w="100"/>
+              <w:bottom w:type="dxa" w:w="60"/>
+              <w:right w:type="dxa" w:w="100"/>
+            </w:tcMar>
+            <w:vAlign w:val="center"/>
+          </w:tcPr>
+          <w:p>
+            <w:pPr>
+              <w:jc w:val="center"/>
+            </w:pPr>
+            <w:r>
+              <w:rPr>
+                <w:b w:val="false"/>
+                <w:bCs w:val="false"/>
+                <w:color w:val="000000"/>
+                <w:sz w:val="20"/>
+                <w:szCs w:val="20"/>
+              </w:rPr>
+              <w:t xml:space="preserve">8</w:t>
+            </w:r>
+          </w:p>
+        </w:tc>
+        <w:tc>
+          <w:tcPr>
+            <w:tcW w:type="dxa" w:w="2000"/>
+            <w:tcMar>
+              <w:top w:type="dxa" w:w="60"/>
+              <w:left w:type="dxa" w:w="100"/>
+              <w:bottom w:type="dxa" w:w="60"/>
+              <w:right w:type="dxa" w:w="100"/>
+            </w:tcMar>
+            <w:vAlign w:val="center"/>
+          </w:tcPr>
+          <w:p>
+            <w:pPr>
+              <w:jc w:val="center"/>
+            </w:pPr>
+            <w:r>
+              <w:rPr>
+                <w:b w:val="false"/>
+                <w:bCs w:val="false"/>
+                <w:color w:val="000000"/>
+                <w:sz w:val="20"/>
+                <w:szCs w:val="20"/>
+              </w:rPr>
+              <w:t xml:space="preserve">0</w:t>
+            </w:r>
+          </w:p>
+        </w:tc>
+        <w:tc>
+          <w:tcPr>
+            <w:tcW w:type="dxa" w:w="1600"/>
+            <w:tcMar>
+              <w:top w:type="dxa" w:w="60"/>
+              <w:left w:type="dxa" w:w="100"/>
+              <w:bottom w:type="dxa" w:w="60"/>
+              <w:right w:type="dxa" w:w="100"/>
+            </w:tcMar>
+            <w:vAlign w:val="center"/>
+          </w:tcPr>
+          <w:p>
+            <w:pPr>
+              <w:jc w:val="center"/>
+            </w:pPr>
+            <w:r>
+              <w:rPr>
+                <w:b w:val="false"/>
+                <w:bCs w:val="false"/>
+                <w:color w:val="000000"/>
+                <w:sz w:val="20"/>
+                <w:szCs w:val="20"/>
+              </w:rPr>
+              <w:t xml:space="preserve">0.0%</w:t>
+            </w:r>
+          </w:p>
+        </w:tc>
+      </w:tr>
+      <w:tr>
+        <w:tc>
+          <w:tcPr>
+            <w:tcW w:type="dxa" w:w="4200"/>
+            <w:tcMar>
+              <w:top w:type="dxa" w:w="60"/>
+              <w:left w:type="dxa" w:w="100"/>
+              <w:bottom w:type="dxa" w:w="60"/>
+              <w:right w:type="dxa" w:w="100"/>
+            </w:tcMar>
+            <w:vAlign w:val="center"/>
+          </w:tcPr>
+          <w:p>
+            <w:pPr>
+              <w:jc w:val="left"/>
+            </w:pPr>
+            <w:r>
+              <w:rPr>
+                <w:b w:val="false"/>
+                <w:bCs w:val="false"/>
+                <w:color w:val="000000"/>
+                <w:sz w:val="20"/>
+                <w:szCs w:val="20"/>
+              </w:rPr>
+              <w:t xml:space="preserve">Regla interpretable (umbral legal)</w:t>
+            </w:r>
+          </w:p>
+        </w:tc>
+        <w:tc>
+          <w:tcPr>
+            <w:tcW w:type="dxa" w:w="2200"/>
+            <w:tcMar>
+              <w:top w:type="dxa" w:w="60"/>
+              <w:left w:type="dxa" w:w="100"/>
+              <w:bottom w:type="dxa" w:w="60"/>
+              <w:right w:type="dxa" w:w="100"/>
+            </w:tcMar>
+            <w:vAlign w:val="center"/>
+          </w:tcPr>
+          <w:p>
+            <w:pPr>
+              <w:jc w:val="center"/>
+            </w:pPr>
+            <w:r>
+              <w:rPr>
+                <w:b w:val="false"/>
+                <w:bCs w:val="false"/>
+                <w:color w:val="000000"/>
+                <w:sz w:val="20"/>
+                <w:szCs w:val="20"/>
+              </w:rPr>
+              <w:t xml:space="preserve">7</w:t>
+            </w:r>
+          </w:p>
+        </w:tc>
+        <w:tc>
+          <w:tcPr>
+            <w:tcW w:type="dxa" w:w="2000"/>
+            <w:tcMar>
+              <w:top w:type="dxa" w:w="60"/>
+              <w:left w:type="dxa" w:w="100"/>
+              <w:bottom w:type="dxa" w:w="60"/>
+              <w:right w:type="dxa" w:w="100"/>
+            </w:tcMar>
+            <w:vAlign w:val="center"/>
+          </w:tcPr>
+          <w:p>
+            <w:pPr>
+              <w:jc w:val="center"/>
+            </w:pPr>
+            <w:r>
+              <w:rPr>
+                <w:b w:val="false"/>
+                <w:bCs w:val="false"/>
+                <w:color w:val="000000"/>
+                <w:sz w:val="20"/>
+                <w:szCs w:val="20"/>
+              </w:rPr>
+              <w:t xml:space="preserve">7</w:t>
+            </w:r>
+          </w:p>
+        </w:tc>
+        <w:tc>
+          <w:tcPr>
+            <w:tcW w:type="dxa" w:w="1600"/>
+            <w:tcMar>
+              <w:top w:type="dxa" w:w="60"/>
+              <w:left w:type="dxa" w:w="100"/>
+              <w:bottom w:type="dxa" w:w="60"/>
+              <w:right w:type="dxa" w:w="100"/>
+            </w:tcMar>
+            <w:vAlign w:val="center"/>
+          </w:tcPr>
+          <w:p>
+            <w:pPr>
+              <w:jc w:val="center"/>
+            </w:pPr>
+            <w:r>
+              <w:rPr>
+                <w:b w:val="false"/>
+                <w:bCs w:val="false"/>
+                <w:color w:val="000000"/>
+                <w:sz w:val="20"/>
+                <w:szCs w:val="20"/>
+              </w:rPr>
+              <w:t xml:space="preserve">100.0%</w:t>
+            </w:r>
+          </w:p>
+        </w:tc>
+      </w:tr>
+    </w:tbl>
+    <w:p>
+      <w:pPr>
+        <w:spacing w:after="160"/>
+      </w:pPr>
+      <w:r>
+        <w:rPr>
+          <w:sz w:val="4"/>
+          <w:szCs w:val="4"/>
+        </w:rPr>
+        <w:t xml:space="preserve"/>
+      </w:r>
+    </w:p>
+    <w:p>
+      <w:pPr>
+        <w:spacing w:after="160"/>
+      </w:pPr>
+      <w:r>
+        <w:rPr>
+          <w:sz w:val="22"/>
+          <w:szCs w:val="22"/>
+        </w:rPr>
+        <w:t xml:space="preserve">Este resultado refuerza el hallazgo central del prototipo (Sección 4): KMeans en Spark tuvo un desempeño incluso menor que Isolation Forest en scikit-learn (0/8 vs. 3/8) para detectar fraccionamiento sin contexto normativo, mientras que la regla interpretable mantuvo 100% de precisión de forma idéntica en ambas plataformas. La elección del algoritmo de "caja negra" importa menos que traducir correctamente el umbral legal a una regla computable.</w:t>
+      </w:r>
+    </w:p>
+    <w:p>
+      <w:pPr>
+        <w:pStyle w:val="Heading2"/>
+        <w:spacing w:after="100" w:before="200"/>
+      </w:pPr>
+      <w:r>
+        <w:t xml:space="preserve">8.3. Lo que sigue siendo trabajo pendiente</w:t>
       </w:r>
     </w:p>
     <w:p>
@@ -6643,7 +7071,7 @@
           <w:sz w:val="22"/>
           <w:szCs w:val="22"/>
         </w:rPr>
-        <w:t xml:space="preserve">Conectar la ingesta real a las capas Plata/Oro del Lakehouse (reemplazando el generador sintético).</w:t>
+        <w:t xml:space="preserve">Ejecución sobre un clúster YARN real, no en modo local[*] sobre una sola máquina.</w:t>
       </w:r>
     </w:p>
     <w:p>
@@ -6660,7 +7088,7 @@
           <w:sz w:val="22"/>
           <w:szCs w:val="22"/>
         </w:rPr>
-        <w:t xml:space="preserve">Migrar el feature engineering de pandas a Spark DataFrames / Spark SQL.</w:t>
+        <w:t xml:space="preserve">Lectura desde el Lakehouse (capas Bronce/Plata/Oro) en vez de un CSV local.</w:t>
       </w:r>
     </w:p>
     <w:p>
@@ -6677,7 +7105,7 @@
           <w:sz w:val="22"/>
           <w:szCs w:val="22"/>
         </w:rPr>
-        <w:t xml:space="preserve">Orquestar el pipeline con Airflow (ya disponible en la plataforma de la CGR según el Anexo 2).</w:t>
+        <w:t xml:space="preserve">Validación cruzada rigurosa vía pyspark.ml.tuning.CrossValidator (aquí se evaluó sobre el conjunto completo de entrenamiento, no con un esquema k-fold estratificado nativo de Spark).</w:t>
       </w:r>
     </w:p>
     <w:p>
@@ -6694,7 +7122,28 @@
           <w:sz w:val="22"/>
           <w:szCs w:val="22"/>
         </w:rPr>
-        <w:t xml:space="preserve">Añadir el módulo de análisis de grafos (proveedor-funcionario) con GraphX.</w:t>
+        <w:t xml:space="preserve">Orquestación con Airflow, integración SSRS/Power BI y despliegue en ambientes de certificación — ver limitaciones.</w:t>
+      </w:r>
+    </w:p>
+    <w:p>
+      <w:pPr>
+        <w:pStyle w:val="Heading1"/>
+        <w:spacing w:after="150" w:before="300"/>
+      </w:pPr>
+      <w:r>
+        <w:t xml:space="preserve">9. Ruta de Escalamiento Restante</w:t>
+      </w:r>
+    </w:p>
+    <w:p>
+      <w:pPr>
+        <w:spacing w:after="160"/>
+      </w:pPr>
+      <w:r>
+        <w:rPr>
+          <w:sz w:val="22"/>
+          <w:szCs w:val="22"/>
+        </w:rPr>
+        <w:t xml:space="preserve">Con la validación de la Sección 8, el trabajo pendiente para producción se reduce a infraestructura y gobernanza de datos, no a portar la lógica de modelado — eso ya se ejecutó en Spark MLlib real:</w:t>
       </w:r>
     </w:p>
     <w:p>
@@ -6711,28 +7160,96 @@
           <w:sz w:val="22"/>
           <w:szCs w:val="22"/>
         </w:rPr>
-        <w:t xml:space="preserve">Publicar resultados hacia SQL Server / SSRS para consumo desde Power BI, tal como especifica la arquitectura institucional.</w:t>
-      </w:r>
-    </w:p>
-    <w:p>
-      <w:pPr>
-        <w:pStyle w:val="Heading1"/>
-        <w:spacing w:after="150" w:before="300"/>
-      </w:pPr>
-      <w:r>
-        <w:t xml:space="preserve">9. Conclusión</w:t>
-      </w:r>
-    </w:p>
-    <w:p>
-      <w:pPr>
-        <w:spacing w:after="160"/>
+        <w:t xml:space="preserve">Conectar la ingesta real a las capas Plata/Oro del Lakehouse (reemplazando el CSV local por lectura del Delta Lake sobre Hadoop, según el Anexo 2 del TDR).</w:t>
+      </w:r>
+    </w:p>
+    <w:p>
+      <w:pPr>
+        <w:pStyle w:val="ListParagraph"/>
+        <w:numPr>
+          <w:ilvl w:val="0"/>
+          <w:numId w:val="1"/>
+        </w:numPr>
+        <w:spacing w:after="80"/>
       </w:pPr>
       <w:r>
         <w:rPr>
           <w:sz w:val="22"/>
           <w:szCs w:val="22"/>
         </w:rPr>
-        <w:t xml:space="preserve">Este prototipo demuestra en código abierto y en un plazo muy corto que los tres casos de uso priorizados del TDR —favoritismo, fraccionamiento y vínculos proveedor-funcionario— son técnicamente alcanzables sin necesidad de comprometer de inmediato una consultoría individual de 180 días y S/. 72,000. El código fuente completo, comentado y versionado está disponible públicamente en el repositorio indicado en la portada, cumpliendo con el espíritu del ítem 6 del checklist de aceptación del Anexo 3 ("código versionado en Git institucional").</w:t>
+        <w:t xml:space="preserve">Orquestar el pipeline con Airflow (ya disponible en la plataforma de la CGR según el Anexo 2).</w:t>
+      </w:r>
+    </w:p>
+    <w:p>
+      <w:pPr>
+        <w:pStyle w:val="ListParagraph"/>
+        <w:numPr>
+          <w:ilvl w:val="0"/>
+          <w:numId w:val="1"/>
+        </w:numPr>
+        <w:spacing w:after="80"/>
+      </w:pPr>
+      <w:r>
+        <w:rPr>
+          <w:sz w:val="22"/>
+          <w:szCs w:val="22"/>
+        </w:rPr>
+        <w:t xml:space="preserve">Ejecutar sobre un clúster YARN real, no en modo local[*].</w:t>
+      </w:r>
+    </w:p>
+    <w:p>
+      <w:pPr>
+        <w:pStyle w:val="ListParagraph"/>
+        <w:numPr>
+          <w:ilvl w:val="0"/>
+          <w:numId w:val="1"/>
+        </w:numPr>
+        <w:spacing w:after="80"/>
+      </w:pPr>
+      <w:r>
+        <w:rPr>
+          <w:sz w:val="22"/>
+          <w:szCs w:val="22"/>
+        </w:rPr>
+        <w:t xml:space="preserve">Añadir el módulo de análisis de grafos (proveedor-funcionario) con GraphX, en vez de networkx (usado en la Sección 5 por rapidez de desarrollo).</w:t>
+      </w:r>
+    </w:p>
+    <w:p>
+      <w:pPr>
+        <w:pStyle w:val="ListParagraph"/>
+        <w:numPr>
+          <w:ilvl w:val="0"/>
+          <w:numId w:val="1"/>
+        </w:numPr>
+        <w:spacing w:after="80"/>
+      </w:pPr>
+      <w:r>
+        <w:rPr>
+          <w:sz w:val="22"/>
+          <w:szCs w:val="22"/>
+        </w:rPr>
+        <w:t xml:space="preserve">Publicar resultados hacia SQL Server / SSRS para consumo desde Power BI, tal como especifica la arquitectura institucional.</w:t>
+      </w:r>
+    </w:p>
+    <w:p>
+      <w:pPr>
+        <w:pStyle w:val="Heading1"/>
+        <w:spacing w:after="150" w:before="300"/>
+      </w:pPr>
+      <w:r>
+        <w:t xml:space="preserve">10. Conclusión</w:t>
+      </w:r>
+    </w:p>
+    <w:p>
+      <w:pPr>
+        <w:spacing w:after="160"/>
+      </w:pPr>
+      <w:r>
+        <w:rPr>
+          <w:sz w:val="22"/>
+          <w:szCs w:val="22"/>
+        </w:rPr>
+        <w:t xml:space="preserve">Este prototipo demuestra en código abierto y en un plazo muy corto que los tres casos de uso priorizados del TDR —favoritismo, fraccionamiento y vínculos proveedor-funcionario— son técnicamente alcanzables sin necesidad de comprometer de inmediato una consultoría individual de 180 días y S/. 72,000, y que la lógica de modelado ya fue validada tanto en scikit-learn como en Apache Spark MLlib real (Sección 8), no solo de forma teórica. El código fuente completo, comentado y versionado está disponible públicamente en el repositorio indicado en la portada, cumpliendo con el espíritu del ítem 6 del checklist de aceptación del Anexo 3 ("código versionado en Git institucional").</w:t>
       </w:r>
     </w:p>
     <w:sectPr>

</xml_diff>

<commit_message>
Cierre de brecha 2/3: orquestación real con Apache Airflow (DAG de 9 tareas, 9/9 success en 38.5s) + simulación de capas Bronce/Plata/Oro del Lakehouse (Anexo 2)
</commit_message>
<xml_diff>
--- a/reporte/Reporte_Tecnico_Prototipo_CGR_1.8.2.docx
+++ b/reporte/Reporte_Tecnico_Prototipo_CGR_1.8.2.docx
@@ -6605,7 +6605,24 @@
           <w:sz w:val="22"/>
           <w:szCs w:val="22"/>
         </w:rPr>
-        <w:t xml:space="preserve">No cubre la integración con SSRS/Power BI, el pipeline de orquestación (Airflow/DAGs) ni el proceso de certificación institucional descritos en el TDR.</w:t>
+        <w:t xml:space="preserve">No cubre la integración con SSRS/Power BI ni el proceso de certificación institucional descritos en el TDR.</w:t>
+      </w:r>
+    </w:p>
+    <w:p>
+      <w:pPr>
+        <w:pStyle w:val="ListParagraph"/>
+        <w:numPr>
+          <w:ilvl w:val="0"/>
+          <w:numId w:val="1"/>
+        </w:numPr>
+        <w:spacing w:after="80"/>
+      </w:pPr>
+      <w:r>
+        <w:rPr>
+          <w:sz w:val="22"/>
+          <w:szCs w:val="22"/>
+        </w:rPr>
+        <w:t xml:space="preserve">El DAG de Airflow (Sección 9) usa BashOperator invocando procesos Python locales; en producción las tareas de entrenamiento usarían SparkSubmitOperator sobre el clúster YARN de la CGR.</w:t>
       </w:r>
     </w:p>
     <w:p>
@@ -7131,7 +7148,7 @@
         <w:spacing w:after="150" w:before="300"/>
       </w:pPr>
       <w:r>
-        <w:t xml:space="preserve">9. Ruta de Escalamiento Restante</w:t>
+        <w:t xml:space="preserve">9. Orquestación con Apache Airflow (Ejecutado)</w:t>
       </w:r>
     </w:p>
     <w:p>
@@ -7143,7 +7160,977 @@
           <w:sz w:val="22"/>
           <w:szCs w:val="22"/>
         </w:rPr>
-        <w:t xml:space="preserve">Con la validación de la Sección 8, el trabajo pendiente para producción se reduce a infraestructura y gobernanza de datos, no a portar la lógica de modelado — eso ya se ejecutó en Spark MLlib real:</w:t>
+        <w:t xml:space="preserve">Cubre el numeral 6 del TDR ("Orquestación de Procesos ETL (DAGs): Diseñar, desarrollar y probar los Directed Acyclic Graphs (DAGs)"). Se instaló Apache Airflow 3.3.0 en un entorno aislado, se construyó un DAG con las 9 etapas del pipeline respetando el linaje real de los datos, y se ejecutó de punta a punta con el comando `airflow dags test` — no es un diagrama teórico, es una corrida real sobre el motor de ejecución de Airflow.</w:t>
+      </w:r>
+    </w:p>
+    <w:p>
+      <w:pPr>
+        <w:spacing w:after="100"/>
+        <w:jc w:val="center"/>
+      </w:pPr>
+      <w:r>
+        <w:drawing>
+          <wp:inline distT="0" distB="0" distL="0" distR="0">
+            <wp:extent cx="5334000" cy="1238250"/>
+            <wp:effectExtent t="0" r="0" b="0" l="0"/>
+            <wp:docPr id="1" name="" descr="" title=""/>
+            <wp:cNvGraphicFramePr>
+              <a:graphicFrameLocks xmlns:a="http://schemas.openxmlformats.org/drawingml/2006/main" noChangeAspect="1"/>
+            </wp:cNvGraphicFramePr>
+            <a:graphic xmlns:a="http://schemas.openxmlformats.org/drawingml/2006/main">
+              <a:graphicData uri="http://schemas.openxmlformats.org/drawingml/2006/picture">
+                <pic:pic xmlns:pic="http://schemas.openxmlformats.org/drawingml/2006/picture">
+                  <pic:nvPicPr>
+                    <pic:cNvPr id="0" name="" descr=""/>
+                    <pic:cNvPicPr>
+                      <a:picLocks noChangeAspect="1" noChangeArrowheads="1"/>
+                    </pic:cNvPicPr>
+                  </pic:nvPicPr>
+                  <pic:blipFill>
+                    <a:blip r:embed="rId16" cstate="none"/>
+                    <a:srcRect/>
+                    <a:stretch>
+                      <a:fillRect/>
+                    </a:stretch>
+                  </pic:blipFill>
+                  <pic:spPr bwMode="auto">
+                    <a:xfrm>
+                      <a:off x="0" y="0"/>
+                      <a:ext cx="5334000" cy="1238250"/>
+                    </a:xfrm>
+                    <a:prstGeom prst="rect">
+                      <a:avLst/>
+                    </a:prstGeom>
+                  </pic:spPr>
+                </pic:pic>
+              </a:graphicData>
+            </a:graphic>
+          </wp:inline>
+        </w:drawing>
+      </w:r>
+    </w:p>
+    <w:p>
+      <w:pPr>
+        <w:spacing w:after="200" w:before="60"/>
+        <w:jc w:val="center"/>
+      </w:pPr>
+      <w:r>
+        <w:rPr>
+          <w:i/>
+          <w:iCs/>
+          <w:color w:val="666666"/>
+          <w:sz w:val="18"/>
+          <w:szCs w:val="18"/>
+        </w:rPr>
+        <w:t xml:space="preserve">Figura 9. Grafo del DAG modulo_analisis_datos_1_8_2 — 9 tareas con 3 ramas paralelas tras la publicación de la capa Plata.</w:t>
+      </w:r>
+    </w:p>
+    <w:p>
+      <w:pPr>
+        <w:spacing w:after="160"/>
+      </w:pPr>
+      <w:r>
+        <w:rPr>
+          <w:sz w:val="22"/>
+          <w:szCs w:val="22"/>
+        </w:rPr>
+        <w:t xml:space="preserve">El DAG respeta el linaje real: genera los datos → los publica en la capa Bronce (ingesta cruda) → limpieza y feature engineering → publica en la capa Plata (refinado) → entrena ambos modelos y analiza vínculos en paralelo → publica resultados en la capa Oro (nivel de negocio) → genera la documentación final. Las capas Bronce/Plata/Oro se simulan como carpetas locales (`lakehouse/`), organizadas según la arquitectura del Anexo 2 del TDR — en producción serían tablas Delta Lake sobre Hadoop, no carpetas de archivos.</w:t>
+      </w:r>
+    </w:p>
+    <w:tbl>
+      <w:tblPr>
+        <w:tblW w:type="dxa" w:w="8800"/>
+        <w:tblBorders>
+          <w:top w:val="single" w:color="auto" w:sz="4"/>
+          <w:left w:val="single" w:color="auto" w:sz="4"/>
+          <w:bottom w:val="single" w:color="auto" w:sz="4"/>
+          <w:right w:val="single" w:color="auto" w:sz="4"/>
+          <w:insideH w:val="single" w:color="auto" w:sz="4"/>
+          <w:insideV w:val="single" w:color="auto" w:sz="4"/>
+        </w:tblBorders>
+      </w:tblPr>
+      <w:tblGrid>
+        <w:gridCol w:w="5200"/>
+        <w:gridCol w:w="1800"/>
+        <w:gridCol w:w="1800"/>
+      </w:tblGrid>
+      <w:tr>
+        <w:tc>
+          <w:tcPr>
+            <w:tcW w:type="dxa" w:w="5200"/>
+            <w:shd w:fill="1F4E79" w:val="clear"/>
+            <w:tcMar>
+              <w:top w:type="dxa" w:w="60"/>
+              <w:left w:type="dxa" w:w="100"/>
+              <w:bottom w:type="dxa" w:w="60"/>
+              <w:right w:type="dxa" w:w="100"/>
+            </w:tcMar>
+            <w:vAlign w:val="center"/>
+          </w:tcPr>
+          <w:p>
+            <w:pPr>
+              <w:jc w:val="left"/>
+            </w:pPr>
+            <w:r>
+              <w:rPr>
+                <w:b/>
+                <w:bCs/>
+                <w:color w:val="FFFFFF"/>
+                <w:sz w:val="20"/>
+                <w:szCs w:val="20"/>
+              </w:rPr>
+              <w:t xml:space="preserve">Tarea</w:t>
+            </w:r>
+          </w:p>
+        </w:tc>
+        <w:tc>
+          <w:tcPr>
+            <w:tcW w:type="dxa" w:w="1800"/>
+            <w:shd w:fill="1F4E79" w:val="clear"/>
+            <w:tcMar>
+              <w:top w:type="dxa" w:w="60"/>
+              <w:left w:type="dxa" w:w="100"/>
+              <w:bottom w:type="dxa" w:w="60"/>
+              <w:right w:type="dxa" w:w="100"/>
+            </w:tcMar>
+            <w:vAlign w:val="center"/>
+          </w:tcPr>
+          <w:p>
+            <w:pPr>
+              <w:jc w:val="left"/>
+            </w:pPr>
+            <w:r>
+              <w:rPr>
+                <w:b/>
+                <w:bCs/>
+                <w:color w:val="FFFFFF"/>
+                <w:sz w:val="20"/>
+                <w:szCs w:val="20"/>
+              </w:rPr>
+              <w:t xml:space="preserve">Estado</w:t>
+            </w:r>
+          </w:p>
+        </w:tc>
+        <w:tc>
+          <w:tcPr>
+            <w:tcW w:type="dxa" w:w="1800"/>
+            <w:shd w:fill="1F4E79" w:val="clear"/>
+            <w:tcMar>
+              <w:top w:type="dxa" w:w="60"/>
+              <w:left w:type="dxa" w:w="100"/>
+              <w:bottom w:type="dxa" w:w="60"/>
+              <w:right w:type="dxa" w:w="100"/>
+            </w:tcMar>
+            <w:vAlign w:val="center"/>
+          </w:tcPr>
+          <w:p>
+            <w:pPr>
+              <w:jc w:val="left"/>
+            </w:pPr>
+            <w:r>
+              <w:rPr>
+                <w:b/>
+                <w:bCs/>
+                <w:color w:val="FFFFFF"/>
+                <w:sz w:val="20"/>
+                <w:szCs w:val="20"/>
+              </w:rPr>
+              <w:t xml:space="preserve">Duración</w:t>
+            </w:r>
+          </w:p>
+        </w:tc>
+      </w:tr>
+      <w:tr>
+        <w:tc>
+          <w:tcPr>
+            <w:tcW w:type="dxa" w:w="5200"/>
+            <w:tcMar>
+              <w:top w:type="dxa" w:w="60"/>
+              <w:left w:type="dxa" w:w="100"/>
+              <w:bottom w:type="dxa" w:w="60"/>
+              <w:right w:type="dxa" w:w="100"/>
+            </w:tcMar>
+            <w:vAlign w:val="center"/>
+          </w:tcPr>
+          <w:p>
+            <w:pPr>
+              <w:jc w:val="left"/>
+            </w:pPr>
+            <w:r>
+              <w:rPr>
+                <w:b w:val="false"/>
+                <w:bCs w:val="false"/>
+                <w:color w:val="000000"/>
+                <w:sz w:val="20"/>
+                <w:szCs w:val="20"/>
+              </w:rPr>
+              <w:t xml:space="preserve">generar_datos</w:t>
+            </w:r>
+          </w:p>
+        </w:tc>
+        <w:tc>
+          <w:tcPr>
+            <w:tcW w:type="dxa" w:w="1800"/>
+            <w:tcMar>
+              <w:top w:type="dxa" w:w="60"/>
+              <w:left w:type="dxa" w:w="100"/>
+              <w:bottom w:type="dxa" w:w="60"/>
+              <w:right w:type="dxa" w:w="100"/>
+            </w:tcMar>
+            <w:vAlign w:val="center"/>
+          </w:tcPr>
+          <w:p>
+            <w:pPr>
+              <w:jc w:val="center"/>
+            </w:pPr>
+            <w:r>
+              <w:rPr>
+                <w:b w:val="false"/>
+                <w:bCs w:val="false"/>
+                <w:color w:val="000000"/>
+                <w:sz w:val="20"/>
+                <w:szCs w:val="20"/>
+              </w:rPr>
+              <w:t xml:space="preserve">success</w:t>
+            </w:r>
+          </w:p>
+        </w:tc>
+        <w:tc>
+          <w:tcPr>
+            <w:tcW w:type="dxa" w:w="1800"/>
+            <w:tcMar>
+              <w:top w:type="dxa" w:w="60"/>
+              <w:left w:type="dxa" w:w="100"/>
+              <w:bottom w:type="dxa" w:w="60"/>
+              <w:right w:type="dxa" w:w="100"/>
+            </w:tcMar>
+            <w:vAlign w:val="center"/>
+          </w:tcPr>
+          <w:p>
+            <w:pPr>
+              <w:jc w:val="center"/>
+            </w:pPr>
+            <w:r>
+              <w:rPr>
+                <w:b w:val="false"/>
+                <w:bCs w:val="false"/>
+                <w:color w:val="000000"/>
+                <w:sz w:val="20"/>
+                <w:szCs w:val="20"/>
+              </w:rPr>
+              <w:t xml:space="preserve">12.6 s</w:t>
+            </w:r>
+          </w:p>
+        </w:tc>
+      </w:tr>
+      <w:tr>
+        <w:tc>
+          <w:tcPr>
+            <w:tcW w:type="dxa" w:w="5200"/>
+            <w:tcMar>
+              <w:top w:type="dxa" w:w="60"/>
+              <w:left w:type="dxa" w:w="100"/>
+              <w:bottom w:type="dxa" w:w="60"/>
+              <w:right w:type="dxa" w:w="100"/>
+            </w:tcMar>
+            <w:vAlign w:val="center"/>
+          </w:tcPr>
+          <w:p>
+            <w:pPr>
+              <w:jc w:val="left"/>
+            </w:pPr>
+            <w:r>
+              <w:rPr>
+                <w:b w:val="false"/>
+                <w:bCs w:val="false"/>
+                <w:color w:val="000000"/>
+                <w:sz w:val="20"/>
+                <w:szCs w:val="20"/>
+              </w:rPr>
+              <w:t xml:space="preserve">cargar_capa_bronce</w:t>
+            </w:r>
+          </w:p>
+        </w:tc>
+        <w:tc>
+          <w:tcPr>
+            <w:tcW w:type="dxa" w:w="1800"/>
+            <w:tcMar>
+              <w:top w:type="dxa" w:w="60"/>
+              <w:left w:type="dxa" w:w="100"/>
+              <w:bottom w:type="dxa" w:w="60"/>
+              <w:right w:type="dxa" w:w="100"/>
+            </w:tcMar>
+            <w:vAlign w:val="center"/>
+          </w:tcPr>
+          <w:p>
+            <w:pPr>
+              <w:jc w:val="center"/>
+            </w:pPr>
+            <w:r>
+              <w:rPr>
+                <w:b w:val="false"/>
+                <w:bCs w:val="false"/>
+                <w:color w:val="000000"/>
+                <w:sz w:val="20"/>
+                <w:szCs w:val="20"/>
+              </w:rPr>
+              <w:t xml:space="preserve">success</w:t>
+            </w:r>
+          </w:p>
+        </w:tc>
+        <w:tc>
+          <w:tcPr>
+            <w:tcW w:type="dxa" w:w="1800"/>
+            <w:tcMar>
+              <w:top w:type="dxa" w:w="60"/>
+              <w:left w:type="dxa" w:w="100"/>
+              <w:bottom w:type="dxa" w:w="60"/>
+              <w:right w:type="dxa" w:w="100"/>
+            </w:tcMar>
+            <w:vAlign w:val="center"/>
+          </w:tcPr>
+          <w:p>
+            <w:pPr>
+              <w:jc w:val="center"/>
+            </w:pPr>
+            <w:r>
+              <w:rPr>
+                <w:b w:val="false"/>
+                <w:bCs w:val="false"/>
+                <w:color w:val="000000"/>
+                <w:sz w:val="20"/>
+                <w:szCs w:val="20"/>
+              </w:rPr>
+              <w:t xml:space="preserve">0.1 s</w:t>
+            </w:r>
+          </w:p>
+        </w:tc>
+      </w:tr>
+      <w:tr>
+        <w:tc>
+          <w:tcPr>
+            <w:tcW w:type="dxa" w:w="5200"/>
+            <w:tcMar>
+              <w:top w:type="dxa" w:w="60"/>
+              <w:left w:type="dxa" w:w="100"/>
+              <w:bottom w:type="dxa" w:w="60"/>
+              <w:right w:type="dxa" w:w="100"/>
+            </w:tcMar>
+            <w:vAlign w:val="center"/>
+          </w:tcPr>
+          <w:p>
+            <w:pPr>
+              <w:jc w:val="left"/>
+            </w:pPr>
+            <w:r>
+              <w:rPr>
+                <w:b w:val="false"/>
+                <w:bCs w:val="false"/>
+                <w:color w:val="000000"/>
+                <w:sz w:val="20"/>
+                <w:szCs w:val="20"/>
+              </w:rPr>
+              <w:t xml:space="preserve">preprocesamiento_y_features</w:t>
+            </w:r>
+          </w:p>
+        </w:tc>
+        <w:tc>
+          <w:tcPr>
+            <w:tcW w:type="dxa" w:w="1800"/>
+            <w:tcMar>
+              <w:top w:type="dxa" w:w="60"/>
+              <w:left w:type="dxa" w:w="100"/>
+              <w:bottom w:type="dxa" w:w="60"/>
+              <w:right w:type="dxa" w:w="100"/>
+            </w:tcMar>
+            <w:vAlign w:val="center"/>
+          </w:tcPr>
+          <w:p>
+            <w:pPr>
+              <w:jc w:val="center"/>
+            </w:pPr>
+            <w:r>
+              <w:rPr>
+                <w:b w:val="false"/>
+                <w:bCs w:val="false"/>
+                <w:color w:val="000000"/>
+                <w:sz w:val="20"/>
+                <w:szCs w:val="20"/>
+              </w:rPr>
+              <w:t xml:space="preserve">success</w:t>
+            </w:r>
+          </w:p>
+        </w:tc>
+        <w:tc>
+          <w:tcPr>
+            <w:tcW w:type="dxa" w:w="1800"/>
+            <w:tcMar>
+              <w:top w:type="dxa" w:w="60"/>
+              <w:left w:type="dxa" w:w="100"/>
+              <w:bottom w:type="dxa" w:w="60"/>
+              <w:right w:type="dxa" w:w="100"/>
+            </w:tcMar>
+            <w:vAlign w:val="center"/>
+          </w:tcPr>
+          <w:p>
+            <w:pPr>
+              <w:jc w:val="center"/>
+            </w:pPr>
+            <w:r>
+              <w:rPr>
+                <w:b w:val="false"/>
+                <w:bCs w:val="false"/>
+                <w:color w:val="000000"/>
+                <w:sz w:val="20"/>
+                <w:szCs w:val="20"/>
+              </w:rPr>
+              <w:t xml:space="preserve">2.8 s</w:t>
+            </w:r>
+          </w:p>
+        </w:tc>
+      </w:tr>
+      <w:tr>
+        <w:tc>
+          <w:tcPr>
+            <w:tcW w:type="dxa" w:w="5200"/>
+            <w:tcMar>
+              <w:top w:type="dxa" w:w="60"/>
+              <w:left w:type="dxa" w:w="100"/>
+              <w:bottom w:type="dxa" w:w="60"/>
+              <w:right w:type="dxa" w:w="100"/>
+            </w:tcMar>
+            <w:vAlign w:val="center"/>
+          </w:tcPr>
+          <w:p>
+            <w:pPr>
+              <w:jc w:val="left"/>
+            </w:pPr>
+            <w:r>
+              <w:rPr>
+                <w:b w:val="false"/>
+                <w:bCs w:val="false"/>
+                <w:color w:val="000000"/>
+                <w:sz w:val="20"/>
+                <w:szCs w:val="20"/>
+              </w:rPr>
+              <w:t xml:space="preserve">publicar_capa_plata</w:t>
+            </w:r>
+          </w:p>
+        </w:tc>
+        <w:tc>
+          <w:tcPr>
+            <w:tcW w:type="dxa" w:w="1800"/>
+            <w:tcMar>
+              <w:top w:type="dxa" w:w="60"/>
+              <w:left w:type="dxa" w:w="100"/>
+              <w:bottom w:type="dxa" w:w="60"/>
+              <w:right w:type="dxa" w:w="100"/>
+            </w:tcMar>
+            <w:vAlign w:val="center"/>
+          </w:tcPr>
+          <w:p>
+            <w:pPr>
+              <w:jc w:val="center"/>
+            </w:pPr>
+            <w:r>
+              <w:rPr>
+                <w:b w:val="false"/>
+                <w:bCs w:val="false"/>
+                <w:color w:val="000000"/>
+                <w:sz w:val="20"/>
+                <w:szCs w:val="20"/>
+              </w:rPr>
+              <w:t xml:space="preserve">success</w:t>
+            </w:r>
+          </w:p>
+        </w:tc>
+        <w:tc>
+          <w:tcPr>
+            <w:tcW w:type="dxa" w:w="1800"/>
+            <w:tcMar>
+              <w:top w:type="dxa" w:w="60"/>
+              <w:left w:type="dxa" w:w="100"/>
+              <w:bottom w:type="dxa" w:w="60"/>
+              <w:right w:type="dxa" w:w="100"/>
+            </w:tcMar>
+            <w:vAlign w:val="center"/>
+          </w:tcPr>
+          <w:p>
+            <w:pPr>
+              <w:jc w:val="center"/>
+            </w:pPr>
+            <w:r>
+              <w:rPr>
+                <w:b w:val="false"/>
+                <w:bCs w:val="false"/>
+                <w:color w:val="000000"/>
+                <w:sz w:val="20"/>
+                <w:szCs w:val="20"/>
+              </w:rPr>
+              <w:t xml:space="preserve">0.1 s</w:t>
+            </w:r>
+          </w:p>
+        </w:tc>
+      </w:tr>
+      <w:tr>
+        <w:tc>
+          <w:tcPr>
+            <w:tcW w:type="dxa" w:w="5200"/>
+            <w:tcMar>
+              <w:top w:type="dxa" w:w="60"/>
+              <w:left w:type="dxa" w:w="100"/>
+              <w:bottom w:type="dxa" w:w="60"/>
+              <w:right w:type="dxa" w:w="100"/>
+            </w:tcMar>
+            <w:vAlign w:val="center"/>
+          </w:tcPr>
+          <w:p>
+            <w:pPr>
+              <w:jc w:val="left"/>
+            </w:pPr>
+            <w:r>
+              <w:rPr>
+                <w:b w:val="false"/>
+                <w:bCs w:val="false"/>
+                <w:color w:val="000000"/>
+                <w:sz w:val="20"/>
+                <w:szCs w:val="20"/>
+              </w:rPr>
+              <w:t xml:space="preserve">entrenar_modelo_favoritismo</w:t>
+            </w:r>
+          </w:p>
+        </w:tc>
+        <w:tc>
+          <w:tcPr>
+            <w:tcW w:type="dxa" w:w="1800"/>
+            <w:tcMar>
+              <w:top w:type="dxa" w:w="60"/>
+              <w:left w:type="dxa" w:w="100"/>
+              <w:bottom w:type="dxa" w:w="60"/>
+              <w:right w:type="dxa" w:w="100"/>
+            </w:tcMar>
+            <w:vAlign w:val="center"/>
+          </w:tcPr>
+          <w:p>
+            <w:pPr>
+              <w:jc w:val="center"/>
+            </w:pPr>
+            <w:r>
+              <w:rPr>
+                <w:b w:val="false"/>
+                <w:bCs w:val="false"/>
+                <w:color w:val="000000"/>
+                <w:sz w:val="20"/>
+                <w:szCs w:val="20"/>
+              </w:rPr>
+              <w:t xml:space="preserve">success</w:t>
+            </w:r>
+          </w:p>
+        </w:tc>
+        <w:tc>
+          <w:tcPr>
+            <w:tcW w:type="dxa" w:w="1800"/>
+            <w:tcMar>
+              <w:top w:type="dxa" w:w="60"/>
+              <w:left w:type="dxa" w:w="100"/>
+              <w:bottom w:type="dxa" w:w="60"/>
+              <w:right w:type="dxa" w:w="100"/>
+            </w:tcMar>
+            <w:vAlign w:val="center"/>
+          </w:tcPr>
+          <w:p>
+            <w:pPr>
+              <w:jc w:val="center"/>
+            </w:pPr>
+            <w:r>
+              <w:rPr>
+                <w:b w:val="false"/>
+                <w:bCs w:val="false"/>
+                <w:color w:val="000000"/>
+                <w:sz w:val="20"/>
+                <w:szCs w:val="20"/>
+              </w:rPr>
+              <w:t xml:space="preserve">16.3 s</w:t>
+            </w:r>
+          </w:p>
+        </w:tc>
+      </w:tr>
+      <w:tr>
+        <w:tc>
+          <w:tcPr>
+            <w:tcW w:type="dxa" w:w="5200"/>
+            <w:tcMar>
+              <w:top w:type="dxa" w:w="60"/>
+              <w:left w:type="dxa" w:w="100"/>
+              <w:bottom w:type="dxa" w:w="60"/>
+              <w:right w:type="dxa" w:w="100"/>
+            </w:tcMar>
+            <w:vAlign w:val="center"/>
+          </w:tcPr>
+          <w:p>
+            <w:pPr>
+              <w:jc w:val="left"/>
+            </w:pPr>
+            <w:r>
+              <w:rPr>
+                <w:b w:val="false"/>
+                <w:bCs w:val="false"/>
+                <w:color w:val="000000"/>
+                <w:sz w:val="20"/>
+                <w:szCs w:val="20"/>
+              </w:rPr>
+              <w:t xml:space="preserve">entrenar_modelo_fraccionamiento</w:t>
+            </w:r>
+          </w:p>
+        </w:tc>
+        <w:tc>
+          <w:tcPr>
+            <w:tcW w:type="dxa" w:w="1800"/>
+            <w:tcMar>
+              <w:top w:type="dxa" w:w="60"/>
+              <w:left w:type="dxa" w:w="100"/>
+              <w:bottom w:type="dxa" w:w="60"/>
+              <w:right w:type="dxa" w:w="100"/>
+            </w:tcMar>
+            <w:vAlign w:val="center"/>
+          </w:tcPr>
+          <w:p>
+            <w:pPr>
+              <w:jc w:val="center"/>
+            </w:pPr>
+            <w:r>
+              <w:rPr>
+                <w:b w:val="false"/>
+                <w:bCs w:val="false"/>
+                <w:color w:val="000000"/>
+                <w:sz w:val="20"/>
+                <w:szCs w:val="20"/>
+              </w:rPr>
+              <w:t xml:space="preserve">success</w:t>
+            </w:r>
+          </w:p>
+        </w:tc>
+        <w:tc>
+          <w:tcPr>
+            <w:tcW w:type="dxa" w:w="1800"/>
+            <w:tcMar>
+              <w:top w:type="dxa" w:w="60"/>
+              <w:left w:type="dxa" w:w="100"/>
+              <w:bottom w:type="dxa" w:w="60"/>
+              <w:right w:type="dxa" w:w="100"/>
+            </w:tcMar>
+            <w:vAlign w:val="center"/>
+          </w:tcPr>
+          <w:p>
+            <w:pPr>
+              <w:jc w:val="center"/>
+            </w:pPr>
+            <w:r>
+              <w:rPr>
+                <w:b w:val="false"/>
+                <w:bCs w:val="false"/>
+                <w:color w:val="000000"/>
+                <w:sz w:val="20"/>
+                <w:szCs w:val="20"/>
+              </w:rPr>
+              <w:t xml:space="preserve">2.9 s</w:t>
+            </w:r>
+          </w:p>
+        </w:tc>
+      </w:tr>
+      <w:tr>
+        <w:tc>
+          <w:tcPr>
+            <w:tcW w:type="dxa" w:w="5200"/>
+            <w:tcMar>
+              <w:top w:type="dxa" w:w="60"/>
+              <w:left w:type="dxa" w:w="100"/>
+              <w:bottom w:type="dxa" w:w="60"/>
+              <w:right w:type="dxa" w:w="100"/>
+            </w:tcMar>
+            <w:vAlign w:val="center"/>
+          </w:tcPr>
+          <w:p>
+            <w:pPr>
+              <w:jc w:val="left"/>
+            </w:pPr>
+            <w:r>
+              <w:rPr>
+                <w:b w:val="false"/>
+                <w:bCs w:val="false"/>
+                <w:color w:val="000000"/>
+                <w:sz w:val="20"/>
+                <w:szCs w:val="20"/>
+              </w:rPr>
+              <w:t xml:space="preserve">analizar_vinculos_proveedor_funcionario</w:t>
+            </w:r>
+          </w:p>
+        </w:tc>
+        <w:tc>
+          <w:tcPr>
+            <w:tcW w:type="dxa" w:w="1800"/>
+            <w:tcMar>
+              <w:top w:type="dxa" w:w="60"/>
+              <w:left w:type="dxa" w:w="100"/>
+              <w:bottom w:type="dxa" w:w="60"/>
+              <w:right w:type="dxa" w:w="100"/>
+            </w:tcMar>
+            <w:vAlign w:val="center"/>
+          </w:tcPr>
+          <w:p>
+            <w:pPr>
+              <w:jc w:val="center"/>
+            </w:pPr>
+            <w:r>
+              <w:rPr>
+                <w:b w:val="false"/>
+                <w:bCs w:val="false"/>
+                <w:color w:val="000000"/>
+                <w:sz w:val="20"/>
+                <w:szCs w:val="20"/>
+              </w:rPr>
+              <w:t xml:space="preserve">success</w:t>
+            </w:r>
+          </w:p>
+        </w:tc>
+        <w:tc>
+          <w:tcPr>
+            <w:tcW w:type="dxa" w:w="1800"/>
+            <w:tcMar>
+              <w:top w:type="dxa" w:w="60"/>
+              <w:left w:type="dxa" w:w="100"/>
+              <w:bottom w:type="dxa" w:w="60"/>
+              <w:right w:type="dxa" w:w="100"/>
+            </w:tcMar>
+            <w:vAlign w:val="center"/>
+          </w:tcPr>
+          <w:p>
+            <w:pPr>
+              <w:jc w:val="center"/>
+            </w:pPr>
+            <w:r>
+              <w:rPr>
+                <w:b w:val="false"/>
+                <w:bCs w:val="false"/>
+                <w:color w:val="000000"/>
+                <w:sz w:val="20"/>
+                <w:szCs w:val="20"/>
+              </w:rPr>
+              <w:t xml:space="preserve">1.6 s</w:t>
+            </w:r>
+          </w:p>
+        </w:tc>
+      </w:tr>
+      <w:tr>
+        <w:tc>
+          <w:tcPr>
+            <w:tcW w:type="dxa" w:w="5200"/>
+            <w:tcMar>
+              <w:top w:type="dxa" w:w="60"/>
+              <w:left w:type="dxa" w:w="100"/>
+              <w:bottom w:type="dxa" w:w="60"/>
+              <w:right w:type="dxa" w:w="100"/>
+            </w:tcMar>
+            <w:vAlign w:val="center"/>
+          </w:tcPr>
+          <w:p>
+            <w:pPr>
+              <w:jc w:val="left"/>
+            </w:pPr>
+            <w:r>
+              <w:rPr>
+                <w:b w:val="false"/>
+                <w:bCs w:val="false"/>
+                <w:color w:val="000000"/>
+                <w:sz w:val="20"/>
+                <w:szCs w:val="20"/>
+              </w:rPr>
+              <w:t xml:space="preserve">publicar_capa_oro</w:t>
+            </w:r>
+          </w:p>
+        </w:tc>
+        <w:tc>
+          <w:tcPr>
+            <w:tcW w:type="dxa" w:w="1800"/>
+            <w:tcMar>
+              <w:top w:type="dxa" w:w="60"/>
+              <w:left w:type="dxa" w:w="100"/>
+              <w:bottom w:type="dxa" w:w="60"/>
+              <w:right w:type="dxa" w:w="100"/>
+            </w:tcMar>
+            <w:vAlign w:val="center"/>
+          </w:tcPr>
+          <w:p>
+            <w:pPr>
+              <w:jc w:val="center"/>
+            </w:pPr>
+            <w:r>
+              <w:rPr>
+                <w:b w:val="false"/>
+                <w:bCs w:val="false"/>
+                <w:color w:val="000000"/>
+                <w:sz w:val="20"/>
+                <w:szCs w:val="20"/>
+              </w:rPr>
+              <w:t xml:space="preserve">success</w:t>
+            </w:r>
+          </w:p>
+        </w:tc>
+        <w:tc>
+          <w:tcPr>
+            <w:tcW w:type="dxa" w:w="1800"/>
+            <w:tcMar>
+              <w:top w:type="dxa" w:w="60"/>
+              <w:left w:type="dxa" w:w="100"/>
+              <w:bottom w:type="dxa" w:w="60"/>
+              <w:right w:type="dxa" w:w="100"/>
+            </w:tcMar>
+            <w:vAlign w:val="center"/>
+          </w:tcPr>
+          <w:p>
+            <w:pPr>
+              <w:jc w:val="center"/>
+            </w:pPr>
+            <w:r>
+              <w:rPr>
+                <w:b w:val="false"/>
+                <w:bCs w:val="false"/>
+                <w:color w:val="000000"/>
+                <w:sz w:val="20"/>
+                <w:szCs w:val="20"/>
+              </w:rPr>
+              <w:t xml:space="preserve">0.1 s</w:t>
+            </w:r>
+          </w:p>
+        </w:tc>
+      </w:tr>
+      <w:tr>
+        <w:tc>
+          <w:tcPr>
+            <w:tcW w:type="dxa" w:w="5200"/>
+            <w:tcMar>
+              <w:top w:type="dxa" w:w="60"/>
+              <w:left w:type="dxa" w:w="100"/>
+              <w:bottom w:type="dxa" w:w="60"/>
+              <w:right w:type="dxa" w:w="100"/>
+            </w:tcMar>
+            <w:vAlign w:val="center"/>
+          </w:tcPr>
+          <w:p>
+            <w:pPr>
+              <w:jc w:val="left"/>
+            </w:pPr>
+            <w:r>
+              <w:rPr>
+                <w:b w:val="false"/>
+                <w:bCs w:val="false"/>
+                <w:color w:val="000000"/>
+                <w:sz w:val="20"/>
+                <w:szCs w:val="20"/>
+              </w:rPr>
+              <w:t xml:space="preserve">generar_diccionario_y_diagrama</w:t>
+            </w:r>
+          </w:p>
+        </w:tc>
+        <w:tc>
+          <w:tcPr>
+            <w:tcW w:type="dxa" w:w="1800"/>
+            <w:tcMar>
+              <w:top w:type="dxa" w:w="60"/>
+              <w:left w:type="dxa" w:w="100"/>
+              <w:bottom w:type="dxa" w:w="60"/>
+              <w:right w:type="dxa" w:w="100"/>
+            </w:tcMar>
+            <w:vAlign w:val="center"/>
+          </w:tcPr>
+          <w:p>
+            <w:pPr>
+              <w:jc w:val="center"/>
+            </w:pPr>
+            <w:r>
+              <w:rPr>
+                <w:b w:val="false"/>
+                <w:bCs w:val="false"/>
+                <w:color w:val="000000"/>
+                <w:sz w:val="20"/>
+                <w:szCs w:val="20"/>
+              </w:rPr>
+              <w:t xml:space="preserve">success</w:t>
+            </w:r>
+          </w:p>
+        </w:tc>
+        <w:tc>
+          <w:tcPr>
+            <w:tcW w:type="dxa" w:w="1800"/>
+            <w:tcMar>
+              <w:top w:type="dxa" w:w="60"/>
+              <w:left w:type="dxa" w:w="100"/>
+              <w:bottom w:type="dxa" w:w="60"/>
+              <w:right w:type="dxa" w:w="100"/>
+            </w:tcMar>
+            <w:vAlign w:val="center"/>
+          </w:tcPr>
+          <w:p>
+            <w:pPr>
+              <w:jc w:val="center"/>
+            </w:pPr>
+            <w:r>
+              <w:rPr>
+                <w:b w:val="false"/>
+                <w:bCs w:val="false"/>
+                <w:color w:val="000000"/>
+                <w:sz w:val="20"/>
+                <w:szCs w:val="20"/>
+              </w:rPr>
+              <w:t xml:space="preserve">0.6 s</w:t>
+            </w:r>
+          </w:p>
+        </w:tc>
+      </w:tr>
+    </w:tbl>
+    <w:p>
+      <w:pPr>
+        <w:spacing w:after="160"/>
+      </w:pPr>
+      <w:r>
+        <w:rPr>
+          <w:sz w:val="4"/>
+          <w:szCs w:val="4"/>
+        </w:rPr>
+        <w:t xml:space="preserve"/>
+      </w:r>
+    </w:p>
+    <w:p>
+      <w:pPr>
+        <w:spacing w:after="160"/>
+      </w:pPr>
+      <w:r>
+        <w:rPr>
+          <w:sz w:val="22"/>
+          <w:szCs w:val="22"/>
+        </w:rPr>
+        <w:t xml:space="preserve">Resultado: 9/9 tareas completadas con estado "success", corrida completa en 38.5 segundos. En producción, las tareas de entrenamiento (hoy procesos Python locales invocados vía BashOperator) se reemplazarían por SparkSubmitOperator apuntando al clúster YARN de la CGR — el DAG y su lógica de dependencias no cambian, solo el operador que ejecuta cada tarea.</w:t>
+      </w:r>
+    </w:p>
+    <w:p>
+      <w:pPr>
+        <w:pStyle w:val="Heading1"/>
+        <w:spacing w:after="150" w:before="300"/>
+      </w:pPr>
+      <w:r>
+        <w:t xml:space="preserve">10. Ruta de Escalamiento Restante</w:t>
+      </w:r>
+    </w:p>
+    <w:p>
+      <w:pPr>
+        <w:spacing w:after="160"/>
+      </w:pPr>
+      <w:r>
+        <w:rPr>
+          <w:sz w:val="22"/>
+          <w:szCs w:val="22"/>
+        </w:rPr>
+        <w:t xml:space="preserve">Con las validaciones de las Secciones 8 y 9, el trabajo pendiente para producción se reduce casi exclusivamente a infraestructura y gobernanza de datos:</w:t>
       </w:r>
     </w:p>
     <w:p>
@@ -7160,7 +8147,7 @@
           <w:sz w:val="22"/>
           <w:szCs w:val="22"/>
         </w:rPr>
-        <w:t xml:space="preserve">Conectar la ingesta real a las capas Plata/Oro del Lakehouse (reemplazando el CSV local por lectura del Delta Lake sobre Hadoop, según el Anexo 2 del TDR).</w:t>
+        <w:t xml:space="preserve">Conectar la ingesta real a las capas Plata/Oro del Lakehouse (reemplazando las carpetas locales por lectura/escritura del Delta Lake sobre Hadoop, según el Anexo 2 del TDR).</w:t>
       </w:r>
     </w:p>
     <w:p>
@@ -7177,7 +8164,7 @@
           <w:sz w:val="22"/>
           <w:szCs w:val="22"/>
         </w:rPr>
-        <w:t xml:space="preserve">Orquestar el pipeline con Airflow (ya disponible en la plataforma de la CGR según el Anexo 2).</w:t>
+        <w:t xml:space="preserve">Desplegar el DAG en el Airflow productivo de la CGR (ya disponible según el Anexo 2), reemplazando BashOperator por SparkSubmitOperator para las tareas de entrenamiento.</w:t>
       </w:r>
     </w:p>
     <w:p>
@@ -7194,7 +8181,7 @@
           <w:sz w:val="22"/>
           <w:szCs w:val="22"/>
         </w:rPr>
-        <w:t xml:space="preserve">Ejecutar sobre un clúster YARN real, no en modo local[*].</w:t>
+        <w:t xml:space="preserve">Ejecutar Spark sobre un clúster YARN real, no en modo local[*].</w:t>
       </w:r>
     </w:p>
     <w:p>
@@ -7237,7 +8224,7 @@
         <w:spacing w:after="150" w:before="300"/>
       </w:pPr>
       <w:r>
-        <w:t xml:space="preserve">10. Conclusión</w:t>
+        <w:t xml:space="preserve">11. Conclusión</w:t>
       </w:r>
     </w:p>
     <w:p>
@@ -7249,7 +8236,7 @@
           <w:sz w:val="22"/>
           <w:szCs w:val="22"/>
         </w:rPr>
-        <w:t xml:space="preserve">Este prototipo demuestra en código abierto y en un plazo muy corto que los tres casos de uso priorizados del TDR —favoritismo, fraccionamiento y vínculos proveedor-funcionario— son técnicamente alcanzables sin necesidad de comprometer de inmediato una consultoría individual de 180 días y S/. 72,000, y que la lógica de modelado ya fue validada tanto en scikit-learn como en Apache Spark MLlib real (Sección 8), no solo de forma teórica. El código fuente completo, comentado y versionado está disponible públicamente en el repositorio indicado en la portada, cumpliendo con el espíritu del ítem 6 del checklist de aceptación del Anexo 3 ("código versionado en Git institucional").</w:t>
+        <w:t xml:space="preserve">Este prototipo demuestra en código abierto y en un plazo muy corto que los tres casos de uso priorizados del TDR —favoritismo, fraccionamiento y vínculos proveedor-funcionario— son técnicamente alcanzables sin necesidad de comprometer de inmediato una consultoría individual de 180 días y S/. 72,000, y que la lógica de modelado ya fue validada tanto en scikit-learn como en Apache Spark MLlib real (Sección 8), orquestada de punta a punta con Apache Airflow real (Sección 9), no solo de forma teórica. El código fuente completo, comentado y versionado está disponible públicamente en el repositorio indicado en la portada, cumpliendo con el espíritu del ítem 6 del checklist de aceptación del Anexo 3 ("código versionado en Git institucional").</w:t>
       </w:r>
     </w:p>
     <w:sectPr>

</xml_diff>

<commit_message>
Cierre de brecha 3/3: búsqueda sistemática de hiperparámetros (GridSearchCV en sklearn + CrossValidator en Spark), confirmación cruzada entre plataformas y hallazgo de que el techo de Isolation Forest es estructural
</commit_message>
<xml_diff>
--- a/reporte/Reporte_Tecnico_Prototipo_CGR_1.8.2.docx
+++ b/reporte/Reporte_Tecnico_Prototipo_CGR_1.8.2.docx
@@ -7122,23 +7122,6 @@
           <w:sz w:val="22"/>
           <w:szCs w:val="22"/>
         </w:rPr>
-        <w:t xml:space="preserve">Validación cruzada rigurosa vía pyspark.ml.tuning.CrossValidator (aquí se evaluó sobre el conjunto completo de entrenamiento, no con un esquema k-fold estratificado nativo de Spark).</w:t>
-      </w:r>
-    </w:p>
-    <w:p>
-      <w:pPr>
-        <w:pStyle w:val="ListParagraph"/>
-        <w:numPr>
-          <w:ilvl w:val="0"/>
-          <w:numId w:val="1"/>
-        </w:numPr>
-        <w:spacing w:after="80"/>
-      </w:pPr>
-      <w:r>
-        <w:rPr>
-          <w:sz w:val="22"/>
-          <w:szCs w:val="22"/>
-        </w:rPr>
         <w:t xml:space="preserve">Orquestación con Airflow, integración SSRS/Power BI y despliegue en ambientes de certificación — ver limitaciones.</w:t>
       </w:r>
     </w:p>
@@ -8118,7 +8101,82 @@
         <w:spacing w:after="150" w:before="300"/>
       </w:pPr>
       <w:r>
-        <w:t xml:space="preserve">10. Ruta de Escalamiento Restante</w:t>
+        <w:t xml:space="preserve">10. Búsqueda Sistemática de Hiperparámetros (Ejecutado)</w:t>
+      </w:r>
+    </w:p>
+    <w:p>
+      <w:pPr>
+        <w:spacing w:after="160"/>
+      </w:pPr>
+      <w:r>
+        <w:rPr>
+          <w:sz w:val="22"/>
+          <w:szCs w:val="22"/>
+        </w:rPr>
+        <w:t xml:space="preserve">Cierra la brecha señalada frente al numeral 4.2.5 del TDR ("optimizar hiperparámetros para maximizar la precisión, recall, F1-score u otras métricas relevantes"). El prototipo original usaba valores razonables elegidos a mano; se reemplazaron por búsquedas en grilla con validación cruzada, ejecutadas tanto en scikit-learn como en Spark MLlib, de forma independiente.</w:t>
+      </w:r>
+    </w:p>
+    <w:p>
+      <w:pPr>
+        <w:pStyle w:val="Heading2"/>
+        <w:spacing w:after="100" w:before="200"/>
+      </w:pPr>
+      <w:r>
+        <w:t xml:space="preserve">10.1. Favoritismo — GridSearchCV (scikit-learn) y CrossValidator (Spark MLlib)</w:t>
+      </w:r>
+    </w:p>
+    <w:p>
+      <w:pPr>
+        <w:spacing w:after="160"/>
+      </w:pPr>
+      <w:r>
+        <w:rPr>
+          <w:sz w:val="22"/>
+          <w:szCs w:val="22"/>
+        </w:rPr>
+        <w:t xml:space="preserve">60 combinaciones de hiperparámetros (n° de árboles, profundidad máxima, mínimo de muestras por hoja) evaluadas con validación cruzada estratificada de 3 particiones, usando AUC-PR como métrica (más informativa que accuracy con 0.25% de clase positiva). Las 60 combinaciones alcanzaron el mismo AUC-PR máximo (1.00) — resultado esperable en datos sintéticos con separación clara. Se seleccionó la configuración más liviana entre las empatadas (100 árboles, profundidad 3), que entrena un 65% más rápido que la configuración original (300 árboles, profundidad 6) sin pérdida de desempeño.</w:t>
+      </w:r>
+    </w:p>
+    <w:p>
+      <w:pPr>
+        <w:spacing w:after="160"/>
+      </w:pPr>
+      <w:r>
+        <w:rPr>
+          <w:sz w:val="22"/>
+          <w:szCs w:val="22"/>
+        </w:rPr>
+        <w:t xml:space="preserve">De forma independiente, se ejecutó la misma búsqueda con pyspark.ml.tuning.CrossValidator y ParamGridBuilder (4 combinaciones × 3 folds = 12 ajustes de modelo sobre Spark MLlib real): el mejor modelo encontrado por Spark usó exactamente los mismos hiperparámetros (100 árboles, profundidad 3) que scikit-learn — una confirmación cruzada entre ambas plataformas, no solo dentro de una.</w:t>
+      </w:r>
+    </w:p>
+    <w:p>
+      <w:pPr>
+        <w:pStyle w:val="Heading2"/>
+        <w:spacing w:after="100" w:before="200"/>
+      </w:pPr>
+      <w:r>
+        <w:t xml:space="preserve">10.2. Fraccionamiento — hallazgo: el techo es del algoritmo, no de la configuración</w:t>
+      </w:r>
+    </w:p>
+    <w:p>
+      <w:pPr>
+        <w:spacing w:after="160"/>
+      </w:pPr>
+      <w:r>
+        <w:rPr>
+          <w:sz w:val="22"/>
+          <w:szCs w:val="22"/>
+        </w:rPr>
+        <w:t xml:space="preserve">Para Isolation Forest (no supervisado) se implementó una búsqueda manual de 36 combinaciones (n° de estimadores, fracción de muestras, tasa de contaminación), usando como métrica cuántos de los 8 casos sembrados caen en el top-8 del ranking de anomalía. Resultado: el recall se estancó en 3/8 (37.5%) para toda combinación con max_samples=1.0, sin importar el resto de parámetros — evidencia de que la limitación es estructural del algoritmo sobre estas variables, no una configuración subóptima. Este hallazgo refuerza, con evidencia adicional, la conclusión central del prototipo (Sección 4): ningún ajuste de hiperparámetros iguala a la regla interpretable basada en el umbral legal (100% de precisión). Se mantuvo la configuración más liviana entre las empatadas (100 estimadores en vez de 300).</w:t>
+      </w:r>
+    </w:p>
+    <w:p>
+      <w:pPr>
+        <w:pStyle w:val="Heading1"/>
+        <w:spacing w:after="150" w:before="300"/>
+      </w:pPr>
+      <w:r>
+        <w:t xml:space="preserve">11. Ruta de Escalamiento Restante</w:t>
       </w:r>
     </w:p>
     <w:p>
@@ -8224,7 +8282,7 @@
         <w:spacing w:after="150" w:before="300"/>
       </w:pPr>
       <w:r>
-        <w:t xml:space="preserve">11. Conclusión</w:t>
+        <w:t xml:space="preserve">12. Conclusión</w:t>
       </w:r>
     </w:p>
     <w:p>
@@ -8236,7 +8294,7 @@
           <w:sz w:val="22"/>
           <w:szCs w:val="22"/>
         </w:rPr>
-        <w:t xml:space="preserve">Este prototipo demuestra en código abierto y en un plazo muy corto que los tres casos de uso priorizados del TDR —favoritismo, fraccionamiento y vínculos proveedor-funcionario— son técnicamente alcanzables sin necesidad de comprometer de inmediato una consultoría individual de 180 días y S/. 72,000, y que la lógica de modelado ya fue validada tanto en scikit-learn como en Apache Spark MLlib real (Sección 8), orquestada de punta a punta con Apache Airflow real (Sección 9), no solo de forma teórica. El código fuente completo, comentado y versionado está disponible públicamente en el repositorio indicado en la portada, cumpliendo con el espíritu del ítem 6 del checklist de aceptación del Anexo 3 ("código versionado en Git institucional").</w:t>
+        <w:t xml:space="preserve">Este prototipo demuestra en código abierto y en un plazo muy corto que los tres casos de uso priorizados del TDR —favoritismo, fraccionamiento y vínculos proveedor-funcionario— son técnicamente alcanzables sin necesidad de comprometer de inmediato una consultoría individual de 180 días y S/. 72,000. La lógica de modelado fue validada en scikit-learn y en Apache Spark MLlib real (Sección 8), orquestada de punta a punta con Apache Airflow real (Sección 9), y optimizada mediante búsqueda sistemática de hiperparámetros en ambas plataformas (Sección 10) — no solo de forma teórica en ningún punto del pipeline. El código fuente completo, comentado y versionado está disponible públicamente en el repositorio indicado en la portada, cumpliendo con el espíritu del ítem 6 del checklist de aceptación del Anexo 3 ("código versionado en Git institucional").</w:t>
       </w:r>
     </w:p>
     <w:sectPr>

</xml_diff>

<commit_message>
Pendiente 2/3 cerrado: integración SSRS - esquema T-SQL, publicación de resultados (SQLite como stand-in documentado) y reporte .rdl válido listo para desplegar
</commit_message>
<xml_diff>
--- a/reporte/Reporte_Tecnico_Prototipo_CGR_1.8.2.docx
+++ b/reporte/Reporte_Tecnico_Prototipo_CGR_1.8.2.docx
@@ -8176,7 +8176,363 @@
         <w:spacing w:after="150" w:before="300"/>
       </w:pPr>
       <w:r>
-        <w:t xml:space="preserve">11. Ruta de Escalamiento Restante</w:t>
+        <w:t xml:space="preserve">11. Estándares Institucionales de Extracción SQL (Ejecutado)</w:t>
+      </w:r>
+    </w:p>
+    <w:p>
+      <w:pPr>
+        <w:spacing w:after="160"/>
+      </w:pPr>
+      <w:r>
+        <w:rPr>
+          <w:sz w:val="22"/>
+          <w:szCs w:val="22"/>
+        </w:rPr>
+        <w:t xml:space="preserve">Cubre el ítem 3 del checklist del Anexo 3: "Cumplimiento de Reglas Técnicas de la CGR (uso de LEFT JOIN, lógica de 'cortocircuito' y prohibición de Full Table Scans en tablas de hechos)". En un ecosistema Hadoop/Spark, prohibir el Full Table Scan no se resuelve con índices tradicionales, sino con particionamiento físico: se reescribió la tabla de hechos (contratos) como Parquet particionado por año-mes (42 particiones), lo que permite que Spark descarte particiones completas sin leerlas cuando la consulta filtra por esa columna.</w:t>
+      </w:r>
+    </w:p>
+    <w:tbl>
+      <w:tblPr>
+        <w:tblW w:type="dxa" w:w="8400"/>
+        <w:tblBorders>
+          <w:top w:val="single" w:color="auto" w:sz="4"/>
+          <w:left w:val="single" w:color="auto" w:sz="4"/>
+          <w:bottom w:val="single" w:color="auto" w:sz="4"/>
+          <w:right w:val="single" w:color="auto" w:sz="4"/>
+          <w:insideH w:val="single" w:color="auto" w:sz="4"/>
+          <w:insideV w:val="single" w:color="auto" w:sz="4"/>
+        </w:tblBorders>
+      </w:tblPr>
+      <w:tblGrid>
+        <w:gridCol w:w="5800"/>
+        <w:gridCol w:w="2600"/>
+      </w:tblGrid>
+      <w:tr>
+        <w:tc>
+          <w:tcPr>
+            <w:tcW w:type="dxa" w:w="5800"/>
+            <w:shd w:fill="1F4E79" w:val="clear"/>
+            <w:tcMar>
+              <w:top w:type="dxa" w:w="60"/>
+              <w:left w:type="dxa" w:w="100"/>
+              <w:bottom w:type="dxa" w:w="60"/>
+              <w:right w:type="dxa" w:w="100"/>
+            </w:tcMar>
+            <w:vAlign w:val="center"/>
+          </w:tcPr>
+          <w:p>
+            <w:pPr>
+              <w:jc w:val="left"/>
+            </w:pPr>
+            <w:r>
+              <w:rPr>
+                <w:b/>
+                <w:bCs/>
+                <w:color w:val="FFFFFF"/>
+                <w:sz w:val="20"/>
+                <w:szCs w:val="20"/>
+              </w:rPr>
+              <w:t xml:space="preserve">Verificación</w:t>
+            </w:r>
+          </w:p>
+        </w:tc>
+        <w:tc>
+          <w:tcPr>
+            <w:tcW w:type="dxa" w:w="2600"/>
+            <w:shd w:fill="1F4E79" w:val="clear"/>
+            <w:tcMar>
+              <w:top w:type="dxa" w:w="60"/>
+              <w:left w:type="dxa" w:w="100"/>
+              <w:bottom w:type="dxa" w:w="60"/>
+              <w:right w:type="dxa" w:w="100"/>
+            </w:tcMar>
+            <w:vAlign w:val="center"/>
+          </w:tcPr>
+          <w:p>
+            <w:pPr>
+              <w:jc w:val="left"/>
+            </w:pPr>
+            <w:r>
+              <w:rPr>
+                <w:b/>
+                <w:bCs/>
+                <w:color w:val="FFFFFF"/>
+                <w:sz w:val="20"/>
+                <w:szCs w:val="20"/>
+              </w:rPr>
+              <w:t xml:space="preserve">Resultado</w:t>
+            </w:r>
+          </w:p>
+        </w:tc>
+      </w:tr>
+      <w:tr>
+        <w:tc>
+          <w:tcPr>
+            <w:tcW w:type="dxa" w:w="5800"/>
+            <w:tcMar>
+              <w:top w:type="dxa" w:w="60"/>
+              <w:left w:type="dxa" w:w="100"/>
+              <w:bottom w:type="dxa" w:w="60"/>
+              <w:right w:type="dxa" w:w="100"/>
+            </w:tcMar>
+            <w:vAlign w:val="center"/>
+          </w:tcPr>
+          <w:p>
+            <w:pPr>
+              <w:jc w:val="left"/>
+            </w:pPr>
+            <w:r>
+              <w:rPr>
+                <w:b w:val="false"/>
+                <w:bCs w:val="false"/>
+                <w:color w:val="000000"/>
+                <w:sz w:val="20"/>
+                <w:szCs w:val="20"/>
+              </w:rPr>
+              <w:t xml:space="preserve">Particiones totales de la tabla de hechos</w:t>
+            </w:r>
+          </w:p>
+        </w:tc>
+        <w:tc>
+          <w:tcPr>
+            <w:tcW w:type="dxa" w:w="2600"/>
+            <w:tcMar>
+              <w:top w:type="dxa" w:w="60"/>
+              <w:left w:type="dxa" w:w="100"/>
+              <w:bottom w:type="dxa" w:w="60"/>
+              <w:right w:type="dxa" w:w="100"/>
+            </w:tcMar>
+            <w:vAlign w:val="center"/>
+          </w:tcPr>
+          <w:p>
+            <w:pPr>
+              <w:jc w:val="center"/>
+            </w:pPr>
+            <w:r>
+              <w:rPr>
+                <w:b w:val="false"/>
+                <w:bCs w:val="false"/>
+                <w:color w:val="000000"/>
+                <w:sz w:val="20"/>
+                <w:szCs w:val="20"/>
+              </w:rPr>
+              <w:t xml:space="preserve">42</w:t>
+            </w:r>
+          </w:p>
+        </w:tc>
+      </w:tr>
+      <w:tr>
+        <w:tc>
+          <w:tcPr>
+            <w:tcW w:type="dxa" w:w="5800"/>
+            <w:tcMar>
+              <w:top w:type="dxa" w:w="60"/>
+              <w:left w:type="dxa" w:w="100"/>
+              <w:bottom w:type="dxa" w:w="60"/>
+              <w:right w:type="dxa" w:w="100"/>
+            </w:tcMar>
+            <w:vAlign w:val="center"/>
+          </w:tcPr>
+          <w:p>
+            <w:pPr>
+              <w:jc w:val="left"/>
+            </w:pPr>
+            <w:r>
+              <w:rPr>
+                <w:b w:val="false"/>
+                <w:bCs w:val="false"/>
+                <w:color w:val="000000"/>
+                <w:sz w:val="20"/>
+                <w:szCs w:val="20"/>
+              </w:rPr>
+              <w:t xml:space="preserve">Particiones leídas al filtrar por año-mes reciente</w:t>
+            </w:r>
+          </w:p>
+        </w:tc>
+        <w:tc>
+          <w:tcPr>
+            <w:tcW w:type="dxa" w:w="2600"/>
+            <w:tcMar>
+              <w:top w:type="dxa" w:w="60"/>
+              <w:left w:type="dxa" w:w="100"/>
+              <w:bottom w:type="dxa" w:w="60"/>
+              <w:right w:type="dxa" w:w="100"/>
+            </w:tcMar>
+            <w:vAlign w:val="center"/>
+          </w:tcPr>
+          <w:p>
+            <w:pPr>
+              <w:jc w:val="center"/>
+            </w:pPr>
+            <w:r>
+              <w:rPr>
+                <w:b w:val="false"/>
+                <w:bCs w:val="false"/>
+                <w:color w:val="000000"/>
+                <w:sz w:val="20"/>
+                <w:szCs w:val="20"/>
+              </w:rPr>
+              <w:t xml:space="preserve">6 de 42 (14%)</w:t>
+            </w:r>
+          </w:p>
+        </w:tc>
+      </w:tr>
+      <w:tr>
+        <w:tc>
+          <w:tcPr>
+            <w:tcW w:type="dxa" w:w="5800"/>
+            <w:tcMar>
+              <w:top w:type="dxa" w:w="60"/>
+              <w:left w:type="dxa" w:w="100"/>
+              <w:bottom w:type="dxa" w:w="60"/>
+              <w:right w:type="dxa" w:w="100"/>
+            </w:tcMar>
+            <w:vAlign w:val="center"/>
+          </w:tcPr>
+          <w:p>
+            <w:pPr>
+              <w:jc w:val="left"/>
+            </w:pPr>
+            <w:r>
+              <w:rPr>
+                <w:b w:val="false"/>
+                <w:bCs w:val="false"/>
+                <w:color w:val="000000"/>
+                <w:sz w:val="20"/>
+                <w:szCs w:val="20"/>
+              </w:rPr>
+              <w:t xml:space="preserve">Poda de particiones confirmada en el plan físico de Spark</w:t>
+            </w:r>
+          </w:p>
+        </w:tc>
+        <w:tc>
+          <w:tcPr>
+            <w:tcW w:type="dxa" w:w="2600"/>
+            <w:tcMar>
+              <w:top w:type="dxa" w:w="60"/>
+              <w:left w:type="dxa" w:w="100"/>
+              <w:bottom w:type="dxa" w:w="60"/>
+              <w:right w:type="dxa" w:w="100"/>
+            </w:tcMar>
+            <w:vAlign w:val="center"/>
+          </w:tcPr>
+          <w:p>
+            <w:pPr>
+              <w:jc w:val="center"/>
+            </w:pPr>
+            <w:r>
+              <w:rPr>
+                <w:b w:val="false"/>
+                <w:bCs w:val="false"/>
+                <w:color w:val="000000"/>
+                <w:sz w:val="20"/>
+                <w:szCs w:val="20"/>
+              </w:rPr>
+              <w:t xml:space="preserve">Sí</w:t>
+            </w:r>
+          </w:p>
+        </w:tc>
+      </w:tr>
+      <w:tr>
+        <w:tc>
+          <w:tcPr>
+            <w:tcW w:type="dxa" w:w="5800"/>
+            <w:tcMar>
+              <w:top w:type="dxa" w:w="60"/>
+              <w:left w:type="dxa" w:w="100"/>
+              <w:bottom w:type="dxa" w:w="60"/>
+              <w:right w:type="dxa" w:w="100"/>
+            </w:tcMar>
+            <w:vAlign w:val="center"/>
+          </w:tcPr>
+          <w:p>
+            <w:pPr>
+              <w:jc w:val="left"/>
+            </w:pPr>
+            <w:r>
+              <w:rPr>
+                <w:b w:val="false"/>
+                <w:bCs w:val="false"/>
+                <w:color w:val="000000"/>
+                <w:sz w:val="20"/>
+                <w:szCs w:val="20"/>
+              </w:rPr>
+              <w:t xml:space="preserve">LEFT JOIN vs. INNER JOIN (prueba dirigida con huérfano forzado)</w:t>
+            </w:r>
+          </w:p>
+        </w:tc>
+        <w:tc>
+          <w:tcPr>
+            <w:tcW w:type="dxa" w:w="2600"/>
+            <w:tcMar>
+              <w:top w:type="dxa" w:w="60"/>
+              <w:left w:type="dxa" w:w="100"/>
+              <w:bottom w:type="dxa" w:w="60"/>
+              <w:right w:type="dxa" w:w="100"/>
+            </w:tcMar>
+            <w:vAlign w:val="center"/>
+          </w:tcPr>
+          <w:p>
+            <w:pPr>
+              <w:jc w:val="center"/>
+            </w:pPr>
+            <w:r>
+              <w:rPr>
+                <w:b w:val="false"/>
+                <w:bCs w:val="false"/>
+                <w:color w:val="000000"/>
+                <w:sz w:val="20"/>
+                <w:szCs w:val="20"/>
+              </w:rPr>
+              <w:t xml:space="preserve">1 fila vs. 0 filas</w:t>
+            </w:r>
+          </w:p>
+        </w:tc>
+      </w:tr>
+    </w:tbl>
+    <w:p>
+      <w:pPr>
+        <w:spacing w:after="160"/>
+      </w:pPr>
+      <w:r>
+        <w:rPr>
+          <w:sz w:val="4"/>
+          <w:szCs w:val="4"/>
+        </w:rPr>
+        <w:t xml:space="preserve"/>
+      </w:r>
+    </w:p>
+    <w:p>
+      <w:pPr>
+        <w:spacing w:after="160"/>
+      </w:pPr>
+      <w:r>
+        <w:rPr>
+          <w:sz w:val="22"/>
+          <w:szCs w:val="22"/>
+        </w:rPr>
+        <w:t xml:space="preserve">La prueba de LEFT JOIN se hizo de forma honesta: sobre los datos reales del prototipo, LEFT JOIN e INNER JOIN devuelven el mismo resultado porque la integridad referencial es perfecta por diseño (no hay huérfanos orgánicos que mostrar). Se construyó entonces una prueba dirigida — un contrato con un id_funcionario inexistente en la tabla dimensión — que confirma el comportamiento esperado: LEFT JOIN conserva el contrato (con el campo NULL), INNER JOIN lo descarta silenciosamente. Ese descarte silencioso es exactamente el riesgo de auditoría que motiva la regla del checklist.</w:t>
+      </w:r>
+    </w:p>
+    <w:p>
+      <w:pPr>
+        <w:spacing w:after="160"/>
+      </w:pPr>
+      <w:r>
+        <w:rPr>
+          <w:sz w:val="22"/>
+          <w:szCs w:val="22"/>
+        </w:rPr>
+        <w:t xml:space="preserve">La "lógica de cortocircuito" se aplicó ordenando el WHERE con el filtro más selectivo y barato primero (igualdad sobre id_entidad) antes que el filtro de rango sobre monto, siguiendo el mismo principio que la poda de particiones: descartar lo más posible, lo antes posible.</w:t>
+      </w:r>
+    </w:p>
+    <w:p>
+      <w:pPr>
+        <w:pStyle w:val="Heading1"/>
+        <w:spacing w:after="150" w:before="300"/>
+      </w:pPr>
+      <w:r>
+        <w:t xml:space="preserve">12. Ruta de Escalamiento Restante</w:t>
       </w:r>
     </w:p>
     <w:p>
@@ -8282,7 +8638,7 @@
         <w:spacing w:after="150" w:before="300"/>
       </w:pPr>
       <w:r>
-        <w:t xml:space="preserve">12. Conclusión</w:t>
+        <w:t xml:space="preserve">13. Conclusión</w:t>
       </w:r>
     </w:p>
     <w:p>

</xml_diff>

<commit_message>
Reporte: nuevas secciones documentando estándares SQL institucionales (11) e integración SSRS (12)
</commit_message>
<xml_diff>
--- a/reporte/Reporte_Tecnico_Prototipo_CGR_1.8.2.docx
+++ b/reporte/Reporte_Tecnico_Prototipo_CGR_1.8.2.docx
@@ -8532,7 +8532,7 @@
         <w:spacing w:after="150" w:before="300"/>
       </w:pPr>
       <w:r>
-        <w:t xml:space="preserve">12. Ruta de Escalamiento Restante</w:t>
+        <w:t xml:space="preserve">12. Integración SSRS (Ejecutado)</w:t>
       </w:r>
     </w:p>
     <w:p>
@@ -8544,7 +8544,7 @@
           <w:sz w:val="22"/>
           <w:szCs w:val="22"/>
         </w:rPr>
-        <w:t xml:space="preserve">Con las validaciones de las Secciones 8 y 9, el trabajo pendiente para producción se reduce casi exclusivamente a infraestructura y gobernanza de datos:</w:t>
+        <w:t xml:space="preserve">Cubre el ítem 7 del checklist del Anexo 3: "Integración para Ecosistema SSRS (SQL Server Reporting Services): Resultados del modelo (predicciones y puntajes de riesgo)". No hay acceso a un SQL Server real desde este entorno de prueba de concepto; se construyeron los dos artefactos que sí son portables sin esa infraestructura:</w:t>
       </w:r>
     </w:p>
     <w:p>
@@ -8561,7 +8561,7 @@
           <w:sz w:val="22"/>
           <w:szCs w:val="22"/>
         </w:rPr>
-        <w:t xml:space="preserve">Conectar la ingesta real a las capas Plata/Oro del Lakehouse (reemplazando las carpetas locales por lectura/escritura del Delta Lake sobre Hadoop, según el Anexo 2 del TDR).</w:t>
+        <w:t xml:space="preserve">Esquema T-SQL válido (ssrs/schema_sql_server.sql) con las tres tablas de resultados, tipos de datos e índices, listo para ejecutarse en el SQL Server institucional descrito en el Anexo 2.</w:t>
       </w:r>
     </w:p>
     <w:p>
@@ -8578,7 +8578,7 @@
           <w:sz w:val="22"/>
           <w:szCs w:val="22"/>
         </w:rPr>
-        <w:t xml:space="preserve">Desplegar el DAG en el Airflow productivo de la CGR (ya disponible según el Anexo 2), reemplazando BashOperator por SparkSubmitOperator para las tareas de entrenamiento.</w:t>
+        <w:t xml:space="preserve">Publicación real de los 5,523 registros de resultados (2,354 de favoritismo + 149 de fraccionamiento + 3,020 de vínculos) sobre ese mismo esquema, usando SQLite como stand-in local documentado — cambiar el driver de conexión (sqlite3 → pyodbc/pymssql) es el único paso para apuntar a un SQL Server real.</w:t>
       </w:r>
     </w:p>
     <w:p>
@@ -8595,7 +8595,40 @@
           <w:sz w:val="22"/>
           <w:szCs w:val="22"/>
         </w:rPr>
-        <w:t xml:space="preserve">Ejecutar Spark sobre un clúster YARN real, no en modo local[*].</w:t>
+        <w:t xml:space="preserve">Un archivo .rdl (Report Definition Language) real y válido — el formato nativo de SSRS — con un dataset parametrizado y una tabla de riesgo, verificado como XML bien formado bajo el namespace oficial de SSRS 2016. No se ejecuta aquí (requiere un servidor SSRS real), pero es el entregable listo para desplegar, no una simulación de su contenido.</w:t>
+      </w:r>
+    </w:p>
+    <w:p>
+      <w:pPr>
+        <w:spacing w:after="160"/>
+      </w:pPr>
+      <w:r>
+        <w:rPr>
+          <w:sz w:val="22"/>
+          <w:szCs w:val="22"/>
+        </w:rPr>
+        <w:t xml:space="preserve">La consulta de prueba (equivalente al Dataset compartido que usaría el .rdl, filtrando por score_riesgo ≥ 0.5) devolvió exactamente los 6 proveedores de mayor riesgo — los mismos que aparecen en el ranking de la Sección 3.</w:t>
+      </w:r>
+    </w:p>
+    <w:p>
+      <w:pPr>
+        <w:pStyle w:val="Heading1"/>
+        <w:spacing w:after="150" w:before="300"/>
+      </w:pPr>
+      <w:r>
+        <w:t xml:space="preserve">13. Ruta de Escalamiento Restante</w:t>
+      </w:r>
+    </w:p>
+    <w:p>
+      <w:pPr>
+        <w:spacing w:after="160"/>
+      </w:pPr>
+      <w:r>
+        <w:rPr>
+          <w:sz w:val="22"/>
+          <w:szCs w:val="22"/>
+        </w:rPr>
+        <w:t xml:space="preserve">Con las validaciones de las Secciones 8 y 9, el trabajo pendiente para producción se reduce casi exclusivamente a infraestructura y gobernanza de datos:</w:t>
       </w:r>
     </w:p>
     <w:p>
@@ -8612,7 +8645,7 @@
           <w:sz w:val="22"/>
           <w:szCs w:val="22"/>
         </w:rPr>
-        <w:t xml:space="preserve">Añadir el módulo de análisis de grafos (proveedor-funcionario) con GraphX, en vez de networkx (usado en la Sección 5 por rapidez de desarrollo).</w:t>
+        <w:t xml:space="preserve">Conectar la ingesta real a las capas Plata/Oro del Lakehouse (reemplazando las carpetas locales por lectura/escritura del Delta Lake sobre Hadoop, según el Anexo 2 del TDR).</w:t>
       </w:r>
     </w:p>
     <w:p>
@@ -8629,28 +8662,79 @@
           <w:sz w:val="22"/>
           <w:szCs w:val="22"/>
         </w:rPr>
-        <w:t xml:space="preserve">Publicar resultados hacia SQL Server / SSRS para consumo desde Power BI, tal como especifica la arquitectura institucional.</w:t>
-      </w:r>
-    </w:p>
-    <w:p>
-      <w:pPr>
-        <w:pStyle w:val="Heading1"/>
-        <w:spacing w:after="150" w:before="300"/>
-      </w:pPr>
-      <w:r>
-        <w:t xml:space="preserve">13. Conclusión</w:t>
-      </w:r>
-    </w:p>
-    <w:p>
-      <w:pPr>
-        <w:spacing w:after="160"/>
+        <w:t xml:space="preserve">Desplegar el DAG en el Airflow productivo de la CGR (ya disponible según el Anexo 2), reemplazando BashOperator por SparkSubmitOperator para las tareas de entrenamiento.</w:t>
+      </w:r>
+    </w:p>
+    <w:p>
+      <w:pPr>
+        <w:pStyle w:val="ListParagraph"/>
+        <w:numPr>
+          <w:ilvl w:val="0"/>
+          <w:numId w:val="1"/>
+        </w:numPr>
+        <w:spacing w:after="80"/>
       </w:pPr>
       <w:r>
         <w:rPr>
           <w:sz w:val="22"/>
           <w:szCs w:val="22"/>
         </w:rPr>
-        <w:t xml:space="preserve">Este prototipo demuestra en código abierto y en un plazo muy corto que los tres casos de uso priorizados del TDR —favoritismo, fraccionamiento y vínculos proveedor-funcionario— son técnicamente alcanzables sin necesidad de comprometer de inmediato una consultoría individual de 180 días y S/. 72,000. La lógica de modelado fue validada en scikit-learn y en Apache Spark MLlib real (Sección 8), orquestada de punta a punta con Apache Airflow real (Sección 9), y optimizada mediante búsqueda sistemática de hiperparámetros en ambas plataformas (Sección 10) — no solo de forma teórica en ningún punto del pipeline. El código fuente completo, comentado y versionado está disponible públicamente en el repositorio indicado en la portada, cumpliendo con el espíritu del ítem 6 del checklist de aceptación del Anexo 3 ("código versionado en Git institucional").</w:t>
+        <w:t xml:space="preserve">Ejecutar Spark sobre un clúster YARN real, no en modo local[*].</w:t>
+      </w:r>
+    </w:p>
+    <w:p>
+      <w:pPr>
+        <w:pStyle w:val="ListParagraph"/>
+        <w:numPr>
+          <w:ilvl w:val="0"/>
+          <w:numId w:val="1"/>
+        </w:numPr>
+        <w:spacing w:after="80"/>
+      </w:pPr>
+      <w:r>
+        <w:rPr>
+          <w:sz w:val="22"/>
+          <w:szCs w:val="22"/>
+        </w:rPr>
+        <w:t xml:space="preserve">Añadir el módulo de análisis de grafos (proveedor-funcionario) con GraphX, en vez de networkx (usado en la Sección 5 por rapidez de desarrollo).</w:t>
+      </w:r>
+    </w:p>
+    <w:p>
+      <w:pPr>
+        <w:pStyle w:val="ListParagraph"/>
+        <w:numPr>
+          <w:ilvl w:val="0"/>
+          <w:numId w:val="1"/>
+        </w:numPr>
+        <w:spacing w:after="80"/>
+      </w:pPr>
+      <w:r>
+        <w:rPr>
+          <w:sz w:val="22"/>
+          <w:szCs w:val="22"/>
+        </w:rPr>
+        <w:t xml:space="preserve">Reemplazar el SQLite stand-in por una conexión real a SQL Server (pyodbc/pymssql) y desplegar el .rdl en un servidor SSRS real.</w:t>
+      </w:r>
+    </w:p>
+    <w:p>
+      <w:pPr>
+        <w:pStyle w:val="Heading1"/>
+        <w:spacing w:after="150" w:before="300"/>
+      </w:pPr>
+      <w:r>
+        <w:t xml:space="preserve">14. Conclusión</w:t>
+      </w:r>
+    </w:p>
+    <w:p>
+      <w:pPr>
+        <w:spacing w:after="160"/>
+      </w:pPr>
+      <w:r>
+        <w:rPr>
+          <w:sz w:val="22"/>
+          <w:szCs w:val="22"/>
+        </w:rPr>
+        <w:t xml:space="preserve">Este prototipo demuestra en código abierto y en un plazo muy corto que los tres casos de uso priorizados del TDR —favoritismo, fraccionamiento y vínculos proveedor-funcionario— son técnicamente alcanzables sin necesidad de comprometer de inmediato una consultoría individual de 180 días y S/. 72,000. La lógica de modelado fue validada en scikit-learn y en Apache Spark MLlib real (Sección 8), orquestada de punta a punta con Apache Airflow real (Sección 9), optimizada mediante búsqueda sistemática de hiperparámetros en ambas plataformas (Sección 10), extraída siguiendo los estándares SQL institucionales de la CGR (Sección 11), y publicada en un esquema listo para SSRS con un reporte .rdl real (Sección 12) — no solo de forma teórica en ningún punto del pipeline. El código fuente completo, comentado y versionado está disponible públicamente en el repositorio indicado en la portada, cumpliendo con el espíritu del ítem 6 del checklist de aceptación del Anexo 3 ("código versionado en Git institucional").</w:t>
       </w:r>
     </w:p>
     <w:sectPr>

</xml_diff>

<commit_message>
Reporte: sección final 13 documentando autoevaluación/autoentrenamiento - las 3 brechas del TDR cerrables desde este entorno están completas
</commit_message>
<xml_diff>
--- a/reporte/Reporte_Tecnico_Prototipo_CGR_1.8.2.docx
+++ b/reporte/Reporte_Tecnico_Prototipo_CGR_1.8.2.docx
@@ -8616,7 +8616,503 @@
         <w:spacing w:after="150" w:before="300"/>
       </w:pPr>
       <w:r>
-        <w:t xml:space="preserve">13. Ruta de Escalamiento Restante</w:t>
+        <w:t xml:space="preserve">13. Autoevaluación y Autoentrenamiento (Ejecutado)</w:t>
+      </w:r>
+    </w:p>
+    <w:p>
+      <w:pPr>
+        <w:spacing w:after="160"/>
+      </w:pPr>
+      <w:r>
+        <w:rPr>
+          <w:sz w:val="22"/>
+          <w:szCs w:val="22"/>
+        </w:rPr>
+        <w:t xml:space="preserve">Cierra el último pendiente identificado, cubriendo el objetivo específico 3.2.c del TDR: "Incorporar mecanismos de autoevaluación y, cuando sea pertinente, de autoentrenamiento para permitir la actualización continua de los modelos... asegurando que los algoritmos se mantengan precisos, pertinentes y adaptados a la evolución de los patrones de contratación."</w:t>
+      </w:r>
+    </w:p>
+    <w:p>
+      <w:pPr>
+        <w:spacing w:after="160"/>
+      </w:pPr>
+      <w:r>
+        <w:rPr>
+          <w:sz w:val="22"/>
+          <w:szCs w:val="22"/>
+        </w:rPr>
+        <w:t xml:space="preserve">El mecanismo combina dos señales independientes — cualquiera dispara reentrenamiento: (1) deriva de datos, medida con Population Stability Index (PSI) sobre variables clave, comparando la distribución de entrenamiento contra la de los contratos más recientes; y (2) degradación de desempeño, midiendo si el modelo actual sigue detectando casos de favoritismo ya confirmados por auditores (la retroalimentación humana que menciona el TDR).</w:t>
+      </w:r>
+    </w:p>
+    <w:p>
+      <w:pPr>
+        <w:spacing w:after="160"/>
+      </w:pPr>
+      <w:r>
+        <w:rPr>
+          <w:sz w:val="22"/>
+          <w:szCs w:val="22"/>
+        </w:rPr>
+        <w:t xml:space="preserve">Se validó con dos escenarios simulados de "próximo trimestre": uno con la misma distribución de entrenamiento (no debería disparar nada) y otro con una deriva real (salto de modalidades competitivas a no competitivas, y dos casos de favoritismo con un perfil distinto al aprendido — pocos contratos de monto muy alto, en vez de muchos contratos pequeños).</w:t>
+      </w:r>
+    </w:p>
+    <w:p>
+      <w:pPr>
+        <w:spacing w:after="100"/>
+        <w:jc w:val="center"/>
+      </w:pPr>
+      <w:r>
+        <w:drawing>
+          <wp:inline distT="0" distB="0" distL="0" distR="0">
+            <wp:extent cx="4000500" cy="619125"/>
+            <wp:effectExtent t="0" r="0" b="0" l="0"/>
+            <wp:docPr id="1" name="" descr="" title=""/>
+            <wp:cNvGraphicFramePr>
+              <a:graphicFrameLocks xmlns:a="http://schemas.openxmlformats.org/drawingml/2006/main" noChangeAspect="1"/>
+            </wp:cNvGraphicFramePr>
+            <a:graphic xmlns:a="http://schemas.openxmlformats.org/drawingml/2006/main">
+              <a:graphicData uri="http://schemas.openxmlformats.org/drawingml/2006/picture">
+                <pic:pic xmlns:pic="http://schemas.openxmlformats.org/drawingml/2006/picture">
+                  <pic:nvPicPr>
+                    <pic:cNvPr id="0" name="" descr=""/>
+                    <pic:cNvPicPr>
+                      <a:picLocks noChangeAspect="1" noChangeArrowheads="1"/>
+                    </pic:cNvPicPr>
+                  </pic:nvPicPr>
+                  <pic:blipFill>
+                    <a:blip r:embed="rId17" cstate="none"/>
+                    <a:srcRect/>
+                    <a:stretch>
+                      <a:fillRect/>
+                    </a:stretch>
+                  </pic:blipFill>
+                  <pic:spPr bwMode="auto">
+                    <a:xfrm>
+                      <a:off x="0" y="0"/>
+                      <a:ext cx="4000500" cy="619125"/>
+                    </a:xfrm>
+                    <a:prstGeom prst="rect">
+                      <a:avLst/>
+                    </a:prstGeom>
+                  </pic:spPr>
+                </pic:pic>
+              </a:graphicData>
+            </a:graphic>
+          </wp:inline>
+        </w:drawing>
+      </w:r>
+    </w:p>
+    <w:p>
+      <w:pPr>
+        <w:spacing w:after="200" w:before="60"/>
+        <w:jc w:val="center"/>
+      </w:pPr>
+      <w:r>
+        <w:rPr>
+          <w:i/>
+          <w:iCs/>
+          <w:color w:val="666666"/>
+          <w:sz w:val="18"/>
+          <w:szCs w:val="18"/>
+        </w:rPr>
+        <w:t xml:space="preserve">Figura 10. DAG de monitoreo (schedule mensual) — genera el lote más reciente y evalúa si corresponde reentrenar.</w:t>
+      </w:r>
+    </w:p>
+    <w:tbl>
+      <w:tblPr>
+        <w:tblW w:type="dxa" w:w="8800"/>
+        <w:tblBorders>
+          <w:top w:val="single" w:color="auto" w:sz="4"/>
+          <w:left w:val="single" w:color="auto" w:sz="4"/>
+          <w:bottom w:val="single" w:color="auto" w:sz="4"/>
+          <w:right w:val="single" w:color="auto" w:sz="4"/>
+          <w:insideH w:val="single" w:color="auto" w:sz="4"/>
+          <w:insideV w:val="single" w:color="auto" w:sz="4"/>
+        </w:tblBorders>
+      </w:tblPr>
+      <w:tblGrid>
+        <w:gridCol w:w="2600"/>
+        <w:gridCol w:w="1800"/>
+        <w:gridCol w:w="2400"/>
+        <w:gridCol w:w="2000"/>
+      </w:tblGrid>
+      <w:tr>
+        <w:tc>
+          <w:tcPr>
+            <w:tcW w:type="dxa" w:w="2600"/>
+            <w:shd w:fill="1F4E79" w:val="clear"/>
+            <w:tcMar>
+              <w:top w:type="dxa" w:w="60"/>
+              <w:left w:type="dxa" w:w="100"/>
+              <w:bottom w:type="dxa" w:w="60"/>
+              <w:right w:type="dxa" w:w="100"/>
+            </w:tcMar>
+            <w:vAlign w:val="center"/>
+          </w:tcPr>
+          <w:p>
+            <w:pPr>
+              <w:jc w:val="left"/>
+            </w:pPr>
+            <w:r>
+              <w:rPr>
+                <w:b/>
+                <w:bCs/>
+                <w:color w:val="FFFFFF"/>
+                <w:sz w:val="20"/>
+                <w:szCs w:val="20"/>
+              </w:rPr>
+              <w:t xml:space="preserve">Escenario</w:t>
+            </w:r>
+          </w:p>
+        </w:tc>
+        <w:tc>
+          <w:tcPr>
+            <w:tcW w:type="dxa" w:w="1800"/>
+            <w:shd w:fill="1F4E79" w:val="clear"/>
+            <w:tcMar>
+              <w:top w:type="dxa" w:w="60"/>
+              <w:left w:type="dxa" w:w="100"/>
+              <w:bottom w:type="dxa" w:w="60"/>
+              <w:right w:type="dxa" w:w="100"/>
+            </w:tcMar>
+            <w:vAlign w:val="center"/>
+          </w:tcPr>
+          <w:p>
+            <w:pPr>
+              <w:jc w:val="left"/>
+            </w:pPr>
+            <w:r>
+              <w:rPr>
+                <w:b/>
+                <w:bCs/>
+                <w:color w:val="FFFFFF"/>
+                <w:sz w:val="20"/>
+                <w:szCs w:val="20"/>
+              </w:rPr>
+              <w:t xml:space="preserve">PSI máximo</w:t>
+            </w:r>
+          </w:p>
+        </w:tc>
+        <w:tc>
+          <w:tcPr>
+            <w:tcW w:type="dxa" w:w="2400"/>
+            <w:shd w:fill="1F4E79" w:val="clear"/>
+            <w:tcMar>
+              <w:top w:type="dxa" w:w="60"/>
+              <w:left w:type="dxa" w:w="100"/>
+              <w:bottom w:type="dxa" w:w="60"/>
+              <w:right w:type="dxa" w:w="100"/>
+            </w:tcMar>
+            <w:vAlign w:val="center"/>
+          </w:tcPr>
+          <w:p>
+            <w:pPr>
+              <w:jc w:val="left"/>
+            </w:pPr>
+            <w:r>
+              <w:rPr>
+                <w:b/>
+                <w:bCs/>
+                <w:color w:val="FFFFFF"/>
+                <w:sz w:val="20"/>
+                <w:szCs w:val="20"/>
+              </w:rPr>
+              <w:t xml:space="preserve">Recall sobre casos nuevos</w:t>
+            </w:r>
+          </w:p>
+        </w:tc>
+        <w:tc>
+          <w:tcPr>
+            <w:tcW w:type="dxa" w:w="2000"/>
+            <w:shd w:fill="1F4E79" w:val="clear"/>
+            <w:tcMar>
+              <w:top w:type="dxa" w:w="60"/>
+              <w:left w:type="dxa" w:w="100"/>
+              <w:bottom w:type="dxa" w:w="60"/>
+              <w:right w:type="dxa" w:w="100"/>
+            </w:tcMar>
+            <w:vAlign w:val="center"/>
+          </w:tcPr>
+          <w:p>
+            <w:pPr>
+              <w:jc w:val="left"/>
+            </w:pPr>
+            <w:r>
+              <w:rPr>
+                <w:b/>
+                <w:bCs/>
+                <w:color w:val="FFFFFF"/>
+                <w:sz w:val="20"/>
+                <w:szCs w:val="20"/>
+              </w:rPr>
+              <w:t xml:space="preserve">¿Disparó reentrenamiento?</w:t>
+            </w:r>
+          </w:p>
+        </w:tc>
+      </w:tr>
+      <w:tr>
+        <w:tc>
+          <w:tcPr>
+            <w:tcW w:type="dxa" w:w="2600"/>
+            <w:tcMar>
+              <w:top w:type="dxa" w:w="60"/>
+              <w:left w:type="dxa" w:w="100"/>
+              <w:bottom w:type="dxa" w:w="60"/>
+              <w:right w:type="dxa" w:w="100"/>
+            </w:tcMar>
+            <w:vAlign w:val="center"/>
+          </w:tcPr>
+          <w:p>
+            <w:pPr>
+              <w:jc w:val="left"/>
+            </w:pPr>
+            <w:r>
+              <w:rPr>
+                <w:b w:val="false"/>
+                <w:bCs w:val="false"/>
+                <w:color w:val="000000"/>
+                <w:sz w:val="20"/>
+                <w:szCs w:val="20"/>
+              </w:rPr>
+              <w:t xml:space="preserve">Normal (sin deriva)</w:t>
+            </w:r>
+          </w:p>
+        </w:tc>
+        <w:tc>
+          <w:tcPr>
+            <w:tcW w:type="dxa" w:w="1800"/>
+            <w:tcMar>
+              <w:top w:type="dxa" w:w="60"/>
+              <w:left w:type="dxa" w:w="100"/>
+              <w:bottom w:type="dxa" w:w="60"/>
+              <w:right w:type="dxa" w:w="100"/>
+            </w:tcMar>
+            <w:vAlign w:val="center"/>
+          </w:tcPr>
+          <w:p>
+            <w:pPr>
+              <w:jc w:val="center"/>
+            </w:pPr>
+            <w:r>
+              <w:rPr>
+                <w:b w:val="false"/>
+                <w:bCs w:val="false"/>
+                <w:color w:val="000000"/>
+                <w:sz w:val="20"/>
+                <w:szCs w:val="20"/>
+              </w:rPr>
+              <w:t xml:space="preserve">0.186</w:t>
+            </w:r>
+          </w:p>
+        </w:tc>
+        <w:tc>
+          <w:tcPr>
+            <w:tcW w:type="dxa" w:w="2400"/>
+            <w:tcMar>
+              <w:top w:type="dxa" w:w="60"/>
+              <w:left w:type="dxa" w:w="100"/>
+              <w:bottom w:type="dxa" w:w="60"/>
+              <w:right w:type="dxa" w:w="100"/>
+            </w:tcMar>
+            <w:vAlign w:val="center"/>
+          </w:tcPr>
+          <w:p>
+            <w:pPr>
+              <w:jc w:val="center"/>
+            </w:pPr>
+            <w:r>
+              <w:rPr>
+                <w:b w:val="false"/>
+                <w:bCs w:val="false"/>
+                <w:color w:val="000000"/>
+                <w:sz w:val="20"/>
+                <w:szCs w:val="20"/>
+              </w:rPr>
+              <w:t xml:space="preserve">—</w:t>
+            </w:r>
+          </w:p>
+        </w:tc>
+        <w:tc>
+          <w:tcPr>
+            <w:tcW w:type="dxa" w:w="2000"/>
+            <w:tcMar>
+              <w:top w:type="dxa" w:w="60"/>
+              <w:left w:type="dxa" w:w="100"/>
+              <w:bottom w:type="dxa" w:w="60"/>
+              <w:right w:type="dxa" w:w="100"/>
+            </w:tcMar>
+            <w:vAlign w:val="center"/>
+          </w:tcPr>
+          <w:p>
+            <w:pPr>
+              <w:jc w:val="center"/>
+            </w:pPr>
+            <w:r>
+              <w:rPr>
+                <w:b w:val="false"/>
+                <w:bCs w:val="false"/>
+                <w:color w:val="000000"/>
+                <w:sz w:val="20"/>
+                <w:szCs w:val="20"/>
+              </w:rPr>
+              <w:t xml:space="preserve">No</w:t>
+            </w:r>
+          </w:p>
+        </w:tc>
+      </w:tr>
+      <w:tr>
+        <w:tc>
+          <w:tcPr>
+            <w:tcW w:type="dxa" w:w="2600"/>
+            <w:tcMar>
+              <w:top w:type="dxa" w:w="60"/>
+              <w:left w:type="dxa" w:w="100"/>
+              <w:bottom w:type="dxa" w:w="60"/>
+              <w:right w:type="dxa" w:w="100"/>
+            </w:tcMar>
+            <w:vAlign w:val="center"/>
+          </w:tcPr>
+          <w:p>
+            <w:pPr>
+              <w:jc w:val="left"/>
+            </w:pPr>
+            <w:r>
+              <w:rPr>
+                <w:b w:val="false"/>
+                <w:bCs w:val="false"/>
+                <w:color w:val="000000"/>
+                <w:sz w:val="20"/>
+                <w:szCs w:val="20"/>
+              </w:rPr>
+              <w:t xml:space="preserve">Con deriva</w:t>
+            </w:r>
+          </w:p>
+        </w:tc>
+        <w:tc>
+          <w:tcPr>
+            <w:tcW w:type="dxa" w:w="1800"/>
+            <w:tcMar>
+              <w:top w:type="dxa" w:w="60"/>
+              <w:left w:type="dxa" w:w="100"/>
+              <w:bottom w:type="dxa" w:w="60"/>
+              <w:right w:type="dxa" w:w="100"/>
+            </w:tcMar>
+            <w:vAlign w:val="center"/>
+          </w:tcPr>
+          <w:p>
+            <w:pPr>
+              <w:jc w:val="center"/>
+            </w:pPr>
+            <w:r>
+              <w:rPr>
+                <w:b w:val="false"/>
+                <w:bCs w:val="false"/>
+                <w:color w:val="000000"/>
+                <w:sz w:val="20"/>
+                <w:szCs w:val="20"/>
+              </w:rPr>
+              <w:t xml:space="preserve">1.608</w:t>
+            </w:r>
+          </w:p>
+        </w:tc>
+        <w:tc>
+          <w:tcPr>
+            <w:tcW w:type="dxa" w:w="2400"/>
+            <w:tcMar>
+              <w:top w:type="dxa" w:w="60"/>
+              <w:left w:type="dxa" w:w="100"/>
+              <w:bottom w:type="dxa" w:w="60"/>
+              <w:right w:type="dxa" w:w="100"/>
+            </w:tcMar>
+            <w:vAlign w:val="center"/>
+          </w:tcPr>
+          <w:p>
+            <w:pPr>
+              <w:jc w:val="center"/>
+            </w:pPr>
+            <w:r>
+              <w:rPr>
+                <w:b w:val="false"/>
+                <w:bCs w:val="false"/>
+                <w:color w:val="000000"/>
+                <w:sz w:val="20"/>
+                <w:szCs w:val="20"/>
+              </w:rPr>
+              <w:t xml:space="preserve">1.00</w:t>
+            </w:r>
+          </w:p>
+        </w:tc>
+        <w:tc>
+          <w:tcPr>
+            <w:tcW w:type="dxa" w:w="2000"/>
+            <w:tcMar>
+              <w:top w:type="dxa" w:w="60"/>
+              <w:left w:type="dxa" w:w="100"/>
+              <w:bottom w:type="dxa" w:w="60"/>
+              <w:right w:type="dxa" w:w="100"/>
+            </w:tcMar>
+            <w:vAlign w:val="center"/>
+          </w:tcPr>
+          <w:p>
+            <w:pPr>
+              <w:jc w:val="center"/>
+            </w:pPr>
+            <w:r>
+              <w:rPr>
+                <w:b w:val="false"/>
+                <w:bCs w:val="false"/>
+                <w:color w:val="000000"/>
+                <w:sz w:val="20"/>
+                <w:szCs w:val="20"/>
+              </w:rPr>
+              <w:t xml:space="preserve">Sí</w:t>
+            </w:r>
+          </w:p>
+        </w:tc>
+      </w:tr>
+    </w:tbl>
+    <w:p>
+      <w:pPr>
+        <w:spacing w:after="160"/>
+      </w:pPr>
+      <w:r>
+        <w:rPr>
+          <w:sz w:val="4"/>
+          <w:szCs w:val="4"/>
+        </w:rPr>
+        <w:t xml:space="preserve"/>
+      </w:r>
+    </w:p>
+    <w:p>
+      <w:pPr>
+        <w:spacing w:after="160"/>
+      </w:pPr>
+      <w:r>
+        <w:rPr>
+          <w:sz w:val="22"/>
+          <w:szCs w:val="22"/>
+        </w:rPr>
+        <w:t xml:space="preserve">Hallazgo relevante: en el escenario con deriva, el modelo actual todavía detectaba correctamente los 2 casos nuevos (recall = 1.00) — si la decisión dependiera solo de desempeño, no se habría disparado ninguna alerta. Fue la señal de PSI (1.608, muy por encima del umbral de 0.25) la que detectó que la población de contratos había cambiado, independientemente de que el modelo, por ahora, siguiera acertando. Esa es exactamente la razón de tener ambas señales: el desempeño puede verse bien por casualidad mientras el terreno ya cambió debajo del modelo.</w:t>
+      </w:r>
+    </w:p>
+    <w:p>
+      <w:pPr>
+        <w:spacing w:after="160"/>
+      </w:pPr>
+      <w:r>
+        <w:rPr>
+          <w:sz w:val="22"/>
+          <w:szCs w:val="22"/>
+        </w:rPr>
+        <w:t xml:space="preserve">El DAG completo (generación del lote → autoevaluación → reentrenamiento condicional) corrió de punta a punta con Apache Airflow real (`airflow dags test`), en 12.2 segundos, con estado "success" — igual que el DAG principal de la Sección 9. Cada decisión queda registrada en outputs/log_reentrenamiento.csv con marca de tiempo, señales evaluadas y motivo, para que ningún reentrenamiento ocurra de forma silenciosa o no auditable.</w:t>
+      </w:r>
+    </w:p>
+    <w:p>
+      <w:pPr>
+        <w:pStyle w:val="Heading1"/>
+        <w:spacing w:after="150" w:before="300"/>
+      </w:pPr>
+      <w:r>
+        <w:t xml:space="preserve">14. Ruta de Escalamiento Restante</w:t>
       </w:r>
     </w:p>
     <w:p>
@@ -8722,7 +9218,7 @@
         <w:spacing w:after="150" w:before="300"/>
       </w:pPr>
       <w:r>
-        <w:t xml:space="preserve">14. Conclusión</w:t>
+        <w:t xml:space="preserve">15. Conclusión</w:t>
       </w:r>
     </w:p>
     <w:p>
@@ -8734,7 +9230,7 @@
           <w:sz w:val="22"/>
           <w:szCs w:val="22"/>
         </w:rPr>
-        <w:t xml:space="preserve">Este prototipo demuestra en código abierto y en un plazo muy corto que los tres casos de uso priorizados del TDR —favoritismo, fraccionamiento y vínculos proveedor-funcionario— son técnicamente alcanzables sin necesidad de comprometer de inmediato una consultoría individual de 180 días y S/. 72,000. La lógica de modelado fue validada en scikit-learn y en Apache Spark MLlib real (Sección 8), orquestada de punta a punta con Apache Airflow real (Sección 9), optimizada mediante búsqueda sistemática de hiperparámetros en ambas plataformas (Sección 10), extraída siguiendo los estándares SQL institucionales de la CGR (Sección 11), y publicada en un esquema listo para SSRS con un reporte .rdl real (Sección 12) — no solo de forma teórica en ningún punto del pipeline. El código fuente completo, comentado y versionado está disponible públicamente en el repositorio indicado en la portada, cumpliendo con el espíritu del ítem 6 del checklist de aceptación del Anexo 3 ("código versionado en Git institucional").</w:t>
+        <w:t xml:space="preserve">Este prototipo demuestra en código abierto y en un plazo muy corto que los tres casos de uso priorizados del TDR —favoritismo, fraccionamiento y vínculos proveedor-funcionario— son técnicamente alcanzables sin necesidad de comprometer de inmediato una consultoría individual de 180 días y S/. 72,000. Cada pieza de la arquitectura fue validada con ejecución real, no solo de forma teórica: modelado en scikit-learn y Apache Spark MLlib (Sección 8), orquestación con Apache Airflow (Sección 9), optimización sistemática de hiperparámetros en ambas plataformas (Sección 10), extracción bajo los estándares SQL institucionales de la CGR (Sección 11), publicación lista para SSRS (Sección 12), y un mecanismo de autoevaluación y autoentrenamiento que distingue correctamente cuándo el modelo necesita actualizarse (Sección 13). El código fuente completo, comentado y versionado está disponible públicamente en el repositorio indicado en la portada, cumpliendo con el espíritu del ítem 6 del checklist de aceptación del Anexo 3 ("código versionado en Git institucional").</w:t>
       </w:r>
     </w:p>
     <w:sectPr>

</xml_diff>

<commit_message>
Documentar intento verificado de GraphFrames (bloqueado por Maven/incompatibilidad Scala) - networkx confirmado como única opción funcional, no simplificación
</commit_message>
<xml_diff>
--- a/reporte/Reporte_Tecnico_Prototipo_CGR_1.8.2.docx
+++ b/reporte/Reporte_Tecnico_Prototipo_CGR_1.8.2.docx
@@ -9210,6 +9210,23 @@
           <w:szCs w:val="22"/>
         </w:rPr>
         <w:t xml:space="preserve">Reemplazar el SQLite stand-in por una conexión real a SQL Server (pyodbc/pymssql) y desplegar el .rdl en un servidor SSRS real.</w:t>
+      </w:r>
+    </w:p>
+    <w:p>
+      <w:pPr>
+        <w:pStyle w:val="ListParagraph"/>
+        <w:numPr>
+          <w:ilvl w:val="0"/>
+          <w:numId w:val="1"/>
+        </w:numPr>
+        <w:spacing w:after="80"/>
+      </w:pPr>
+      <w:r>
+        <w:rPr>
+          <w:sz w:val="22"/>
+          <w:szCs w:val="22"/>
+        </w:rPr>
+        <w:t xml:space="preserve">GraphX/GraphFrames para el módulo de vínculos: se intentó explícitamente (dos rutas distintas — resolución vía Maven en tiempo de ejecución, y un .jar empaquetado en PyPI) y ambas fallaron por falta de acceso a Maven Central desde este entorno y por incompatibilidad binaria (Scala 2.11 vs. 2.13 de Spark 4.2). networkx (Sección 5) no es una simplificación de conveniencia; es la única opción funcional verificada aquí.</w:t>
       </w:r>
     </w:p>
     <w:p>

</xml_diff>

<commit_message>
Reporte: Anexo A conciso documentando la prueba con datos reales de SEACE (fuera del alcance del TDR, incluido a modo de registro)
</commit_message>
<xml_diff>
--- a/reporte/Reporte_Tecnico_Prototipo_CGR_1.8.2.docx
+++ b/reporte/Reporte_Tecnico_Prototipo_CGR_1.8.2.docx
@@ -9104,6 +9104,543 @@
           <w:szCs w:val="22"/>
         </w:rPr>
         <w:t xml:space="preserve">El DAG completo (generación del lote → autoevaluación → reentrenamiento condicional) corrió de punta a punta con Apache Airflow real (`airflow dags test`), en 12.2 segundos, con estado "success" — igual que el DAG principal de la Sección 9. Cada decisión queda registrada en outputs/log_reentrenamiento.csv con marca de tiempo, señales evaluadas y motivo, para que ningún reentrenamiento ocurra de forma silenciosa o no auditable.</w:t>
+      </w:r>
+    </w:p>
+    <w:p>
+      <w:pPr>
+        <w:pStyle w:val="Heading1"/>
+        <w:spacing w:after="150" w:before="300"/>
+      </w:pPr>
+      <w:r>
+        <w:t xml:space="preserve">Anexo A. Prueba con Datos Reales de SEACE (fuera del alcance del TDR)</w:t>
+      </w:r>
+    </w:p>
+    <w:p>
+      <w:pPr>
+        <w:spacing w:after="160"/>
+      </w:pPr>
+      <w:r>
+        <w:rPr>
+          <w:sz w:val="22"/>
+          <w:szCs w:val="22"/>
+        </w:rPr>
+        <w:t xml:space="preserve">El TDR no exige esta prueba — todo el análisis anterior usa datos sintéticos, que es lo que el alcance requiere. Se incluye este anexo porque, adicionalmente, se obtuvo acceso a datos verdaderos de contrataciones públicas (no de la CGR, sino del portal de datos abiertos de la OECE, estándar OCDS, licencia CC BY 4.0) y se corrió el pipeline sobre ellos, para dejar registro de qué tan bien se comporta la metodología fuera de un entorno sintético controlado.</w:t>
+      </w:r>
+    </w:p>
+    <w:tbl>
+      <w:tblPr>
+        <w:tblW w:type="dxa" w:w="8800"/>
+        <w:tblBorders>
+          <w:top w:val="single" w:color="auto" w:sz="4"/>
+          <w:left w:val="single" w:color="auto" w:sz="4"/>
+          <w:bottom w:val="single" w:color="auto" w:sz="4"/>
+          <w:right w:val="single" w:color="auto" w:sz="4"/>
+          <w:insideH w:val="single" w:color="auto" w:sz="4"/>
+          <w:insideV w:val="single" w:color="auto" w:sz="4"/>
+        </w:tblBorders>
+      </w:tblPr>
+      <w:tblGrid>
+        <w:gridCol w:w="4200"/>
+        <w:gridCol w:w="4600"/>
+      </w:tblGrid>
+      <w:tr>
+        <w:tc>
+          <w:tcPr>
+            <w:tcW w:type="dxa" w:w="4200"/>
+            <w:shd w:fill="1F4E79" w:val="clear"/>
+            <w:tcMar>
+              <w:top w:type="dxa" w:w="60"/>
+              <w:left w:type="dxa" w:w="100"/>
+              <w:bottom w:type="dxa" w:w="60"/>
+              <w:right w:type="dxa" w:w="100"/>
+            </w:tcMar>
+            <w:vAlign w:val="center"/>
+          </w:tcPr>
+          <w:p>
+            <w:pPr>
+              <w:jc w:val="left"/>
+            </w:pPr>
+            <w:r>
+              <w:rPr>
+                <w:b/>
+                <w:bCs/>
+                <w:color w:val="FFFFFF"/>
+                <w:sz w:val="20"/>
+                <w:szCs w:val="20"/>
+              </w:rPr>
+              <w:t xml:space="preserve">Dato</w:t>
+            </w:r>
+          </w:p>
+        </w:tc>
+        <w:tc>
+          <w:tcPr>
+            <w:tcW w:type="dxa" w:w="4600"/>
+            <w:shd w:fill="1F4E79" w:val="clear"/>
+            <w:tcMar>
+              <w:top w:type="dxa" w:w="60"/>
+              <w:left w:type="dxa" w:w="100"/>
+              <w:bottom w:type="dxa" w:w="60"/>
+              <w:right w:type="dxa" w:w="100"/>
+            </w:tcMar>
+            <w:vAlign w:val="center"/>
+          </w:tcPr>
+          <w:p>
+            <w:pPr>
+              <w:jc w:val="left"/>
+            </w:pPr>
+            <w:r>
+              <w:rPr>
+                <w:b/>
+                <w:bCs/>
+                <w:color w:val="FFFFFF"/>
+                <w:sz w:val="20"/>
+                <w:szCs w:val="20"/>
+              </w:rPr>
+              <w:t xml:space="preserve">Valor</w:t>
+            </w:r>
+          </w:p>
+        </w:tc>
+      </w:tr>
+      <w:tr>
+        <w:tc>
+          <w:tcPr>
+            <w:tcW w:type="dxa" w:w="4200"/>
+            <w:tcMar>
+              <w:top w:type="dxa" w:w="60"/>
+              <w:left w:type="dxa" w:w="100"/>
+              <w:bottom w:type="dxa" w:w="60"/>
+              <w:right w:type="dxa" w:w="100"/>
+            </w:tcMar>
+            <w:vAlign w:val="center"/>
+          </w:tcPr>
+          <w:p>
+            <w:pPr>
+              <w:jc w:val="left"/>
+            </w:pPr>
+            <w:r>
+              <w:rPr>
+                <w:b w:val="false"/>
+                <w:bCs w:val="false"/>
+                <w:color w:val="000000"/>
+                <w:sz w:val="20"/>
+                <w:szCs w:val="20"/>
+              </w:rPr>
+              <w:t xml:space="preserve">Fuente</w:t>
+            </w:r>
+          </w:p>
+        </w:tc>
+        <w:tc>
+          <w:tcPr>
+            <w:tcW w:type="dxa" w:w="4600"/>
+            <w:tcMar>
+              <w:top w:type="dxa" w:w="60"/>
+              <w:left w:type="dxa" w:w="100"/>
+              <w:bottom w:type="dxa" w:w="60"/>
+              <w:right w:type="dxa" w:w="100"/>
+            </w:tcMar>
+            <w:vAlign w:val="center"/>
+          </w:tcPr>
+          <w:p>
+            <w:pPr>
+              <w:jc w:val="center"/>
+            </w:pPr>
+            <w:r>
+              <w:rPr>
+                <w:b w:val="false"/>
+                <w:bCs w:val="false"/>
+                <w:color w:val="000000"/>
+                <w:sz w:val="20"/>
+                <w:szCs w:val="20"/>
+              </w:rPr>
+              <w:t xml:space="preserve">data.open-contracting.org — OECE Perú, año 2022</w:t>
+            </w:r>
+          </w:p>
+        </w:tc>
+      </w:tr>
+      <w:tr>
+        <w:tc>
+          <w:tcPr>
+            <w:tcW w:type="dxa" w:w="4200"/>
+            <w:tcMar>
+              <w:top w:type="dxa" w:w="60"/>
+              <w:left w:type="dxa" w:w="100"/>
+              <w:bottom w:type="dxa" w:w="60"/>
+              <w:right w:type="dxa" w:w="100"/>
+            </w:tcMar>
+            <w:vAlign w:val="center"/>
+          </w:tcPr>
+          <w:p>
+            <w:pPr>
+              <w:jc w:val="left"/>
+            </w:pPr>
+            <w:r>
+              <w:rPr>
+                <w:b w:val="false"/>
+                <w:bCs w:val="false"/>
+                <w:color w:val="000000"/>
+                <w:sz w:val="20"/>
+                <w:szCs w:val="20"/>
+              </w:rPr>
+              <w:t xml:space="preserve">Contratos reales procesados</w:t>
+            </w:r>
+          </w:p>
+        </w:tc>
+        <w:tc>
+          <w:tcPr>
+            <w:tcW w:type="dxa" w:w="4600"/>
+            <w:tcMar>
+              <w:top w:type="dxa" w:w="60"/>
+              <w:left w:type="dxa" w:w="100"/>
+              <w:bottom w:type="dxa" w:w="60"/>
+              <w:right w:type="dxa" w:w="100"/>
+            </w:tcMar>
+            <w:vAlign w:val="center"/>
+          </w:tcPr>
+          <w:p>
+            <w:pPr>
+              <w:jc w:val="center"/>
+            </w:pPr>
+            <w:r>
+              <w:rPr>
+                <w:b w:val="false"/>
+                <w:bCs w:val="false"/>
+                <w:color w:val="000000"/>
+                <w:sz w:val="20"/>
+                <w:szCs w:val="20"/>
+              </w:rPr>
+              <w:t xml:space="preserve">47,442</w:t>
+            </w:r>
+          </w:p>
+        </w:tc>
+      </w:tr>
+      <w:tr>
+        <w:tc>
+          <w:tcPr>
+            <w:tcW w:type="dxa" w:w="4200"/>
+            <w:tcMar>
+              <w:top w:type="dxa" w:w="60"/>
+              <w:left w:type="dxa" w:w="100"/>
+              <w:bottom w:type="dxa" w:w="60"/>
+              <w:right w:type="dxa" w:w="100"/>
+            </w:tcMar>
+            <w:vAlign w:val="center"/>
+          </w:tcPr>
+          <w:p>
+            <w:pPr>
+              <w:jc w:val="left"/>
+            </w:pPr>
+            <w:r>
+              <w:rPr>
+                <w:b w:val="false"/>
+                <w:bCs w:val="false"/>
+                <w:color w:val="000000"/>
+                <w:sz w:val="20"/>
+                <w:szCs w:val="20"/>
+              </w:rPr>
+              <w:t xml:space="preserve">Proveedores reales (RUC)</w:t>
+            </w:r>
+          </w:p>
+        </w:tc>
+        <w:tc>
+          <w:tcPr>
+            <w:tcW w:type="dxa" w:w="4600"/>
+            <w:tcMar>
+              <w:top w:type="dxa" w:w="60"/>
+              <w:left w:type="dxa" w:w="100"/>
+              <w:bottom w:type="dxa" w:w="60"/>
+              <w:right w:type="dxa" w:w="100"/>
+            </w:tcMar>
+            <w:vAlign w:val="center"/>
+          </w:tcPr>
+          <w:p>
+            <w:pPr>
+              <w:jc w:val="center"/>
+            </w:pPr>
+            <w:r>
+              <w:rPr>
+                <w:b w:val="false"/>
+                <w:bCs w:val="false"/>
+                <w:color w:val="000000"/>
+                <w:sz w:val="20"/>
+                <w:szCs w:val="20"/>
+              </w:rPr>
+              <w:t xml:space="preserve">25,535</w:t>
+            </w:r>
+          </w:p>
+        </w:tc>
+      </w:tr>
+      <w:tr>
+        <w:tc>
+          <w:tcPr>
+            <w:tcW w:type="dxa" w:w="4200"/>
+            <w:tcMar>
+              <w:top w:type="dxa" w:w="60"/>
+              <w:left w:type="dxa" w:w="100"/>
+              <w:bottom w:type="dxa" w:w="60"/>
+              <w:right w:type="dxa" w:w="100"/>
+            </w:tcMar>
+            <w:vAlign w:val="center"/>
+          </w:tcPr>
+          <w:p>
+            <w:pPr>
+              <w:jc w:val="left"/>
+            </w:pPr>
+            <w:r>
+              <w:rPr>
+                <w:b w:val="false"/>
+                <w:bCs w:val="false"/>
+                <w:color w:val="000000"/>
+                <w:sz w:val="20"/>
+                <w:szCs w:val="20"/>
+              </w:rPr>
+              <w:t xml:space="preserve">Entidades compradoras reales</w:t>
+            </w:r>
+          </w:p>
+        </w:tc>
+        <w:tc>
+          <w:tcPr>
+            <w:tcW w:type="dxa" w:w="4600"/>
+            <w:tcMar>
+              <w:top w:type="dxa" w:w="60"/>
+              <w:left w:type="dxa" w:w="100"/>
+              <w:bottom w:type="dxa" w:w="60"/>
+              <w:right w:type="dxa" w:w="100"/>
+            </w:tcMar>
+            <w:vAlign w:val="center"/>
+          </w:tcPr>
+          <w:p>
+            <w:pPr>
+              <w:jc w:val="center"/>
+            </w:pPr>
+            <w:r>
+              <w:rPr>
+                <w:b w:val="false"/>
+                <w:bCs w:val="false"/>
+                <w:color w:val="000000"/>
+                <w:sz w:val="20"/>
+                <w:szCs w:val="20"/>
+              </w:rPr>
+              <w:t xml:space="preserve">2,732</w:t>
+            </w:r>
+          </w:p>
+        </w:tc>
+      </w:tr>
+      <w:tr>
+        <w:tc>
+          <w:tcPr>
+            <w:tcW w:type="dxa" w:w="4200"/>
+            <w:tcMar>
+              <w:top w:type="dxa" w:w="60"/>
+              <w:left w:type="dxa" w:w="100"/>
+              <w:bottom w:type="dxa" w:w="60"/>
+              <w:right w:type="dxa" w:w="100"/>
+            </w:tcMar>
+            <w:vAlign w:val="center"/>
+          </w:tcPr>
+          <w:p>
+            <w:pPr>
+              <w:jc w:val="left"/>
+            </w:pPr>
+            <w:r>
+              <w:rPr>
+                <w:b w:val="false"/>
+                <w:bCs w:val="false"/>
+                <w:color w:val="000000"/>
+                <w:sz w:val="20"/>
+                <w:szCs w:val="20"/>
+              </w:rPr>
+              <w:t xml:space="preserve">Monto total analizado</w:t>
+            </w:r>
+          </w:p>
+        </w:tc>
+        <w:tc>
+          <w:tcPr>
+            <w:tcW w:type="dxa" w:w="4600"/>
+            <w:tcMar>
+              <w:top w:type="dxa" w:w="60"/>
+              <w:left w:type="dxa" w:w="100"/>
+              <w:bottom w:type="dxa" w:w="60"/>
+              <w:right w:type="dxa" w:w="100"/>
+            </w:tcMar>
+            <w:vAlign w:val="center"/>
+          </w:tcPr>
+          <w:p>
+            <w:pPr>
+              <w:jc w:val="center"/>
+            </w:pPr>
+            <w:r>
+              <w:rPr>
+                <w:b w:val="false"/>
+                <w:bCs w:val="false"/>
+                <w:color w:val="000000"/>
+                <w:sz w:val="20"/>
+                <w:szCs w:val="20"/>
+              </w:rPr>
+              <w:t xml:space="preserve">S/. 32,241 millones</w:t>
+            </w:r>
+          </w:p>
+        </w:tc>
+      </w:tr>
+    </w:tbl>
+    <w:p>
+      <w:pPr>
+        <w:spacing w:after="160"/>
+      </w:pPr>
+      <w:r>
+        <w:rPr>
+          <w:sz w:val="4"/>
+          <w:szCs w:val="4"/>
+        </w:rPr>
+        <w:t xml:space="preserve"/>
+      </w:r>
+    </w:p>
+    <w:p>
+      <w:pPr>
+        <w:pStyle w:val="Heading2"/>
+        <w:spacing w:after="100" w:before="200"/>
+      </w:pPr>
+      <w:r>
+        <w:t xml:space="preserve">Adaptaciones metodológicas honestas</w:t>
+      </w:r>
+    </w:p>
+    <w:p>
+      <w:pPr>
+        <w:pStyle w:val="ListParagraph"/>
+        <w:numPr>
+          <w:ilvl w:val="0"/>
+          <w:numId w:val="1"/>
+        </w:numPr>
+        <w:spacing w:after="80"/>
+      </w:pPr>
+      <w:r>
+        <w:rPr>
+          <w:sz w:val="22"/>
+          <w:szCs w:val="22"/>
+        </w:rPr>
+        <w:t xml:space="preserve">Sin ground truth: a diferencia del dataset sintético, no existe una etiqueta real de "esto fue favoritismo". El modelo de favoritismo pasó de ser un clasificador supervisado a un score de riesgo no supervisado (Isolation Forest) — una lista de candidatos para revisión humana, no una predicción validada.</w:t>
+      </w:r>
+    </w:p>
+    <w:p>
+      <w:pPr>
+        <w:pStyle w:val="ListParagraph"/>
+        <w:numPr>
+          <w:ilvl w:val="0"/>
+          <w:numId w:val="1"/>
+        </w:numPr>
+        <w:spacing w:after="80"/>
+      </w:pPr>
+      <w:r>
+        <w:rPr>
+          <w:sz w:val="22"/>
+          <w:szCs w:val="22"/>
+        </w:rPr>
+        <w:t xml:space="preserve">Fraccionamiento se aplicó sin cambios (la regla del umbral legal no depende de etiquetas).</w:t>
+      </w:r>
+    </w:p>
+    <w:p>
+      <w:pPr>
+        <w:pStyle w:val="ListParagraph"/>
+        <w:numPr>
+          <w:ilvl w:val="0"/>
+          <w:numId w:val="1"/>
+        </w:numPr>
+        <w:spacing w:after="80"/>
+      </w:pPr>
+      <w:r>
+        <w:rPr>
+          <w:sz w:val="22"/>
+          <w:szCs w:val="22"/>
+        </w:rPr>
+        <w:t xml:space="preserve">Vínculos se adaptó a nivel proveedor-entidad (no proveedor-funcionario): SEACE abierto registra organizaciones, no funcionarios públicos individuales.</w:t>
+      </w:r>
+    </w:p>
+    <w:p>
+      <w:pPr>
+        <w:pStyle w:val="Heading2"/>
+        <w:spacing w:after="100" w:before="200"/>
+      </w:pPr>
+      <w:r>
+        <w:t xml:space="preserve">Hallazgos honestos (incluye un error propio, corregido)</w:t>
+      </w:r>
+    </w:p>
+    <w:p>
+      <w:pPr>
+        <w:pStyle w:val="ListParagraph"/>
+        <w:numPr>
+          <w:ilvl w:val="0"/>
+          <w:numId w:val="1"/>
+        </w:numPr>
+        <w:spacing w:after="80"/>
+      </w:pPr>
+      <w:r>
+        <w:rPr>
+          <w:sz w:val="22"/>
+          <w:szCs w:val="22"/>
+        </w:rPr>
+        <w:t xml:space="preserve">Se detectó y corrigió un artefacto real: contratos con consorcios de varias empresas se estaban contando una vez por cada integrante, inflando artificialmente las métricas de concentración. Se corrigió representando cada consorcio como una sola entidad compuesta.</w:t>
+      </w:r>
+    </w:p>
+    <w:p>
+      <w:pPr>
+        <w:pStyle w:val="ListParagraph"/>
+        <w:numPr>
+          <w:ilvl w:val="0"/>
+          <w:numId w:val="1"/>
+        </w:numPr>
+        <w:spacing w:after="80"/>
+      </w:pPr>
+      <w:r>
+        <w:rPr>
+          <w:sz w:val="22"/>
+          <w:szCs w:val="22"/>
+        </w:rPr>
+        <w:t xml:space="preserve">Se encontró un falso positivo genuino: un programa de investigación científica paga a evaluadores individuales por lotes (montos de S/. 600-2,600), lo que el detector de consorcios confundía con concentración sospechosa. Se dejó anotado explícitamente en vez de ocultarlo.</w:t>
+      </w:r>
+    </w:p>
+    <w:p>
+      <w:pPr>
+        <w:pStyle w:val="ListParagraph"/>
+        <w:numPr>
+          <w:ilvl w:val="0"/>
+          <w:numId w:val="1"/>
+        </w:numPr>
+        <w:spacing w:after="80"/>
+      </w:pPr>
+      <w:r>
+        <w:rPr>
+          <w:sz w:val="22"/>
+          <w:szCs w:val="22"/>
+        </w:rPr>
+        <w:t xml:space="preserve">Los patrones de mayor score de riesgo corresponden a consorcios de gran magnitud (decenas de millones de soles) en entidades grandes de infraestructura y salud — consorcios son legales, pero la concentración amerita revisión de auditor, que es exactamente el uso previsto por el TDR.</w:t>
+      </w:r>
+    </w:p>
+    <w:p>
+      <w:pPr>
+        <w:pStyle w:val="ListParagraph"/>
+        <w:numPr>
+          <w:ilvl w:val="0"/>
+          <w:numId w:val="1"/>
+        </w:numPr>
+        <w:spacing w:after="80"/>
+      </w:pPr>
+      <w:r>
+        <w:rPr>
+          <w:sz w:val="22"/>
+          <w:szCs w:val="22"/>
+        </w:rPr>
+        <w:t xml:space="preserve">El chequeo de vínculos por teléfono compartido dio 0 coincidencias sobre 35,832 pares proveedor-entidad reales — un resultado negativo genuino (no hay evidencia de esa señal específica en este año), no una falla del código.</w:t>
+      </w:r>
+    </w:p>
+    <w:p>
+      <w:pPr>
+        <w:spacing w:after="160"/>
+      </w:pPr>
+      <w:r>
+        <w:rPr>
+          <w:sz w:val="22"/>
+          <w:szCs w:val="22"/>
+        </w:rPr>
+        <w:t xml:space="preserve">Código y resultados completos en el repositorio (src/cargar_datos_reales_seace.py, src/modelo_real.py, outputs/*_REAL.csv). Los datos crudos no se versionan por tamaño (~245 MB); el repositorio documenta cómo reproducirlos desde la fuente pública original.</w:t>
       </w:r>
     </w:p>
     <w:p>

</xml_diff>

<commit_message>
Reporte: Anexo B con la comparación completa contra el Anexo 2 del TDR (18 componentes verificados) y evidencia de Streaming, HMS y R
</commit_message>
<xml_diff>
--- a/reporte/Reporte_Tecnico_Prototipo_CGR_1.8.2.docx
+++ b/reporte/Reporte_Tecnico_Prototipo_CGR_1.8.2.docx
@@ -9641,6 +9641,1139 @@
           <w:szCs w:val="22"/>
         </w:rPr>
         <w:t xml:space="preserve">Código y resultados completos en el repositorio (src/cargar_datos_reales_seace.py, src/modelo_real.py, outputs/*_REAL.csv). Los datos crudos no se versionan por tamaño (~245 MB); el repositorio documenta cómo reproducirlos desde la fuente pública original.</w:t>
+      </w:r>
+    </w:p>
+    <w:p>
+      <w:pPr>
+        <w:pStyle w:val="Heading1"/>
+        <w:spacing w:after="150" w:before="300"/>
+      </w:pPr>
+      <w:r>
+        <w:t xml:space="preserve">Anexo B. Verificación de Componentes de la Plataforma (Anexo 2 del TDR)</w:t>
+      </w:r>
+    </w:p>
+    <w:p>
+      <w:pPr>
+        <w:spacing w:after="160"/>
+      </w:pPr>
+      <w:r>
+        <w:rPr>
+          <w:sz w:val="22"/>
+          <w:szCs w:val="22"/>
+        </w:rPr>
+        <w:t xml:space="preserve">El Anexo 2 del TDR ("Arquitectura de la Plataforma de Minería de Datos") especifica los componentes esperados: ingesta Batch/CDC-CDF/Streaming, Delta Lake con capas Bronce/Plata/Oro, HMS sobre MySQL, lenguajes soportados (Python, SQL, Scala, R, Java), Spark (SQL/Streaming/MLlib/GraphX) sobre Hadoop YARN, Airflow, y salida hacia SQL Server/SSRS/Power BI. Se verificó, componente por componente, cuáles corren realmente en este entorno de prueba de concepto.</w:t>
+      </w:r>
+    </w:p>
+    <w:tbl>
+      <w:tblPr>
+        <w:tblW w:type="dxa" w:w="8800"/>
+        <w:tblBorders>
+          <w:top w:val="single" w:color="auto" w:sz="4"/>
+          <w:left w:val="single" w:color="auto" w:sz="4"/>
+          <w:bottom w:val="single" w:color="auto" w:sz="4"/>
+          <w:right w:val="single" w:color="auto" w:sz="4"/>
+          <w:insideH w:val="single" w:color="auto" w:sz="4"/>
+          <w:insideV w:val="single" w:color="auto" w:sz="4"/>
+        </w:tblBorders>
+      </w:tblPr>
+      <w:tblGrid>
+        <w:gridCol w:w="5200"/>
+        <w:gridCol w:w="3600"/>
+      </w:tblGrid>
+      <w:tr>
+        <w:tc>
+          <w:tcPr>
+            <w:tcW w:type="dxa" w:w="5200"/>
+            <w:shd w:fill="1F4E79" w:val="clear"/>
+            <w:tcMar>
+              <w:top w:type="dxa" w:w="60"/>
+              <w:left w:type="dxa" w:w="100"/>
+              <w:bottom w:type="dxa" w:w="60"/>
+              <w:right w:type="dxa" w:w="100"/>
+            </w:tcMar>
+            <w:vAlign w:val="center"/>
+          </w:tcPr>
+          <w:p>
+            <w:pPr>
+              <w:jc w:val="left"/>
+            </w:pPr>
+            <w:r>
+              <w:rPr>
+                <w:b/>
+                <w:bCs/>
+                <w:color w:val="FFFFFF"/>
+                <w:sz w:val="20"/>
+                <w:szCs w:val="20"/>
+              </w:rPr>
+              <w:t xml:space="preserve">Componente</w:t>
+            </w:r>
+          </w:p>
+        </w:tc>
+        <w:tc>
+          <w:tcPr>
+            <w:tcW w:type="dxa" w:w="3600"/>
+            <w:shd w:fill="1F4E79" w:val="clear"/>
+            <w:tcMar>
+              <w:top w:type="dxa" w:w="60"/>
+              <w:left w:type="dxa" w:w="100"/>
+              <w:bottom w:type="dxa" w:w="60"/>
+              <w:right w:type="dxa" w:w="100"/>
+            </w:tcMar>
+            <w:vAlign w:val="center"/>
+          </w:tcPr>
+          <w:p>
+            <w:pPr>
+              <w:jc w:val="left"/>
+            </w:pPr>
+            <w:r>
+              <w:rPr>
+                <w:b/>
+                <w:bCs/>
+                <w:color w:val="FFFFFF"/>
+                <w:sz w:val="20"/>
+                <w:szCs w:val="20"/>
+              </w:rPr>
+              <w:t xml:space="preserve">Estado</w:t>
+            </w:r>
+          </w:p>
+        </w:tc>
+      </w:tr>
+      <w:tr>
+        <w:tc>
+          <w:tcPr>
+            <w:tcW w:type="dxa" w:w="5200"/>
+            <w:tcMar>
+              <w:top w:type="dxa" w:w="60"/>
+              <w:left w:type="dxa" w:w="100"/>
+              <w:bottom w:type="dxa" w:w="60"/>
+              <w:right w:type="dxa" w:w="100"/>
+            </w:tcMar>
+            <w:vAlign w:val="center"/>
+          </w:tcPr>
+          <w:p>
+            <w:pPr>
+              <w:jc w:val="left"/>
+            </w:pPr>
+            <w:r>
+              <w:rPr>
+                <w:b w:val="false"/>
+                <w:bCs w:val="false"/>
+                <w:color w:val="000000"/>
+                <w:sz w:val="20"/>
+                <w:szCs w:val="20"/>
+              </w:rPr>
+              <w:t xml:space="preserve">Ingesta Batch</w:t>
+            </w:r>
+          </w:p>
+        </w:tc>
+        <w:tc>
+          <w:tcPr>
+            <w:tcW w:type="dxa" w:w="3600"/>
+            <w:tcMar>
+              <w:top w:type="dxa" w:w="60"/>
+              <w:left w:type="dxa" w:w="100"/>
+              <w:bottom w:type="dxa" w:w="60"/>
+              <w:right w:type="dxa" w:w="100"/>
+            </w:tcMar>
+            <w:vAlign w:val="center"/>
+          </w:tcPr>
+          <w:p>
+            <w:pPr>
+              <w:jc w:val="center"/>
+            </w:pPr>
+            <w:r>
+              <w:rPr>
+                <w:b w:val="false"/>
+                <w:bCs w:val="false"/>
+                <w:color w:val="000000"/>
+                <w:sz w:val="20"/>
+                <w:szCs w:val="20"/>
+              </w:rPr>
+              <w:t xml:space="preserve">Completo</w:t>
+            </w:r>
+          </w:p>
+        </w:tc>
+      </w:tr>
+      <w:tr>
+        <w:tc>
+          <w:tcPr>
+            <w:tcW w:type="dxa" w:w="5200"/>
+            <w:tcMar>
+              <w:top w:type="dxa" w:w="60"/>
+              <w:left w:type="dxa" w:w="100"/>
+              <w:bottom w:type="dxa" w:w="60"/>
+              <w:right w:type="dxa" w:w="100"/>
+            </w:tcMar>
+            <w:vAlign w:val="center"/>
+          </w:tcPr>
+          <w:p>
+            <w:pPr>
+              <w:jc w:val="left"/>
+            </w:pPr>
+            <w:r>
+              <w:rPr>
+                <w:b w:val="false"/>
+                <w:bCs w:val="false"/>
+                <w:color w:val="000000"/>
+                <w:sz w:val="20"/>
+                <w:szCs w:val="20"/>
+              </w:rPr>
+              <w:t xml:space="preserve">Ingesta Streaming</w:t>
+            </w:r>
+          </w:p>
+        </w:tc>
+        <w:tc>
+          <w:tcPr>
+            <w:tcW w:type="dxa" w:w="3600"/>
+            <w:tcMar>
+              <w:top w:type="dxa" w:w="60"/>
+              <w:left w:type="dxa" w:w="100"/>
+              <w:bottom w:type="dxa" w:w="60"/>
+              <w:right w:type="dxa" w:w="100"/>
+            </w:tcMar>
+            <w:vAlign w:val="center"/>
+          </w:tcPr>
+          <w:p>
+            <w:pPr>
+              <w:jc w:val="center"/>
+            </w:pPr>
+            <w:r>
+              <w:rPr>
+                <w:b w:val="false"/>
+                <w:bCs w:val="false"/>
+                <w:color w:val="000000"/>
+                <w:sz w:val="20"/>
+                <w:szCs w:val="20"/>
+              </w:rPr>
+              <w:t xml:space="preserve">Completo (verificado abajo)</w:t>
+            </w:r>
+          </w:p>
+        </w:tc>
+      </w:tr>
+      <w:tr>
+        <w:tc>
+          <w:tcPr>
+            <w:tcW w:type="dxa" w:w="5200"/>
+            <w:tcMar>
+              <w:top w:type="dxa" w:w="60"/>
+              <w:left w:type="dxa" w:w="100"/>
+              <w:bottom w:type="dxa" w:w="60"/>
+              <w:right w:type="dxa" w:w="100"/>
+            </w:tcMar>
+            <w:vAlign w:val="center"/>
+          </w:tcPr>
+          <w:p>
+            <w:pPr>
+              <w:jc w:val="left"/>
+            </w:pPr>
+            <w:r>
+              <w:rPr>
+                <w:b w:val="false"/>
+                <w:bCs w:val="false"/>
+                <w:color w:val="000000"/>
+                <w:sz w:val="20"/>
+                <w:szCs w:val="20"/>
+              </w:rPr>
+              <w:t xml:space="preserve">Ingesta CDC/CDF</w:t>
+            </w:r>
+          </w:p>
+        </w:tc>
+        <w:tc>
+          <w:tcPr>
+            <w:tcW w:type="dxa" w:w="3600"/>
+            <w:tcMar>
+              <w:top w:type="dxa" w:w="60"/>
+              <w:left w:type="dxa" w:w="100"/>
+              <w:bottom w:type="dxa" w:w="60"/>
+              <w:right w:type="dxa" w:w="100"/>
+            </w:tcMar>
+            <w:vAlign w:val="center"/>
+          </w:tcPr>
+          <w:p>
+            <w:pPr>
+              <w:jc w:val="center"/>
+            </w:pPr>
+            <w:r>
+              <w:rPr>
+                <w:b w:val="false"/>
+                <w:bCs w:val="false"/>
+                <w:color w:val="000000"/>
+                <w:sz w:val="20"/>
+                <w:szCs w:val="20"/>
+              </w:rPr>
+              <w:t xml:space="preserve">Bloqueado (depende de Delta Lake)</w:t>
+            </w:r>
+          </w:p>
+        </w:tc>
+      </w:tr>
+      <w:tr>
+        <w:tc>
+          <w:tcPr>
+            <w:tcW w:type="dxa" w:w="5200"/>
+            <w:tcMar>
+              <w:top w:type="dxa" w:w="60"/>
+              <w:left w:type="dxa" w:w="100"/>
+              <w:bottom w:type="dxa" w:w="60"/>
+              <w:right w:type="dxa" w:w="100"/>
+            </w:tcMar>
+            <w:vAlign w:val="center"/>
+          </w:tcPr>
+          <w:p>
+            <w:pPr>
+              <w:jc w:val="left"/>
+            </w:pPr>
+            <w:r>
+              <w:rPr>
+                <w:b w:val="false"/>
+                <w:bCs w:val="false"/>
+                <w:color w:val="000000"/>
+                <w:sz w:val="20"/>
+                <w:szCs w:val="20"/>
+              </w:rPr>
+              <w:t xml:space="preserve">Capas Bronce/Plata/Oro</w:t>
+            </w:r>
+          </w:p>
+        </w:tc>
+        <w:tc>
+          <w:tcPr>
+            <w:tcW w:type="dxa" w:w="3600"/>
+            <w:tcMar>
+              <w:top w:type="dxa" w:w="60"/>
+              <w:left w:type="dxa" w:w="100"/>
+              <w:bottom w:type="dxa" w:w="60"/>
+              <w:right w:type="dxa" w:w="100"/>
+            </w:tcMar>
+            <w:vAlign w:val="center"/>
+          </w:tcPr>
+          <w:p>
+            <w:pPr>
+              <w:jc w:val="center"/>
+            </w:pPr>
+            <w:r>
+              <w:rPr>
+                <w:b w:val="false"/>
+                <w:bCs w:val="false"/>
+                <w:color w:val="000000"/>
+                <w:sz w:val="20"/>
+                <w:szCs w:val="20"/>
+              </w:rPr>
+              <w:t xml:space="preserve">Completo (como Parquet, no Delta Lake)</w:t>
+            </w:r>
+          </w:p>
+        </w:tc>
+      </w:tr>
+      <w:tr>
+        <w:tc>
+          <w:tcPr>
+            <w:tcW w:type="dxa" w:w="5200"/>
+            <w:tcMar>
+              <w:top w:type="dxa" w:w="60"/>
+              <w:left w:type="dxa" w:w="100"/>
+              <w:bottom w:type="dxa" w:w="60"/>
+              <w:right w:type="dxa" w:w="100"/>
+            </w:tcMar>
+            <w:vAlign w:val="center"/>
+          </w:tcPr>
+          <w:p>
+            <w:pPr>
+              <w:jc w:val="left"/>
+            </w:pPr>
+            <w:r>
+              <w:rPr>
+                <w:b w:val="false"/>
+                <w:bCs w:val="false"/>
+                <w:color w:val="000000"/>
+                <w:sz w:val="20"/>
+                <w:szCs w:val="20"/>
+              </w:rPr>
+              <w:t xml:space="preserve">Delta Lake (formato nativo)</w:t>
+            </w:r>
+          </w:p>
+        </w:tc>
+        <w:tc>
+          <w:tcPr>
+            <w:tcW w:type="dxa" w:w="3600"/>
+            <w:tcMar>
+              <w:top w:type="dxa" w:w="60"/>
+              <w:left w:type="dxa" w:w="100"/>
+              <w:bottom w:type="dxa" w:w="60"/>
+              <w:right w:type="dxa" w:w="100"/>
+            </w:tcMar>
+            <w:vAlign w:val="center"/>
+          </w:tcPr>
+          <w:p>
+            <w:pPr>
+              <w:jc w:val="center"/>
+            </w:pPr>
+            <w:r>
+              <w:rPr>
+                <w:b w:val="false"/>
+                <w:bCs w:val="false"/>
+                <w:color w:val="000000"/>
+                <w:sz w:val="20"/>
+                <w:szCs w:val="20"/>
+              </w:rPr>
+              <w:t xml:space="preserve">Bloqueado — requiere Maven</w:t>
+            </w:r>
+          </w:p>
+        </w:tc>
+      </w:tr>
+      <w:tr>
+        <w:tc>
+          <w:tcPr>
+            <w:tcW w:type="dxa" w:w="5200"/>
+            <w:tcMar>
+              <w:top w:type="dxa" w:w="60"/>
+              <w:left w:type="dxa" w:w="100"/>
+              <w:bottom w:type="dxa" w:w="60"/>
+              <w:right w:type="dxa" w:w="100"/>
+            </w:tcMar>
+            <w:vAlign w:val="center"/>
+          </w:tcPr>
+          <w:p>
+            <w:pPr>
+              <w:jc w:val="left"/>
+            </w:pPr>
+            <w:r>
+              <w:rPr>
+                <w:b w:val="false"/>
+                <w:bCs w:val="false"/>
+                <w:color w:val="000000"/>
+                <w:sz w:val="20"/>
+                <w:szCs w:val="20"/>
+              </w:rPr>
+              <w:t xml:space="preserve">HMS (Hive Metastore)</w:t>
+            </w:r>
+          </w:p>
+        </w:tc>
+        <w:tc>
+          <w:tcPr>
+            <w:tcW w:type="dxa" w:w="3600"/>
+            <w:tcMar>
+              <w:top w:type="dxa" w:w="60"/>
+              <w:left w:type="dxa" w:w="100"/>
+              <w:bottom w:type="dxa" w:w="60"/>
+              <w:right w:type="dxa" w:w="100"/>
+            </w:tcMar>
+            <w:vAlign w:val="center"/>
+          </w:tcPr>
+          <w:p>
+            <w:pPr>
+              <w:jc w:val="center"/>
+            </w:pPr>
+            <w:r>
+              <w:rPr>
+                <w:b w:val="false"/>
+                <w:bCs w:val="false"/>
+                <w:color w:val="000000"/>
+                <w:sz w:val="20"/>
+                <w:szCs w:val="20"/>
+              </w:rPr>
+              <w:t xml:space="preserve">Completo (verificado abajo)</w:t>
+            </w:r>
+          </w:p>
+        </w:tc>
+      </w:tr>
+      <w:tr>
+        <w:tc>
+          <w:tcPr>
+            <w:tcW w:type="dxa" w:w="5200"/>
+            <w:tcMar>
+              <w:top w:type="dxa" w:w="60"/>
+              <w:left w:type="dxa" w:w="100"/>
+              <w:bottom w:type="dxa" w:w="60"/>
+              <w:right w:type="dxa" w:w="100"/>
+            </w:tcMar>
+            <w:vAlign w:val="center"/>
+          </w:tcPr>
+          <w:p>
+            <w:pPr>
+              <w:jc w:val="left"/>
+            </w:pPr>
+            <w:r>
+              <w:rPr>
+                <w:b w:val="false"/>
+                <w:bCs w:val="false"/>
+                <w:color w:val="000000"/>
+                <w:sz w:val="20"/>
+                <w:szCs w:val="20"/>
+              </w:rPr>
+              <w:t xml:space="preserve">Parquet</w:t>
+            </w:r>
+          </w:p>
+        </w:tc>
+        <w:tc>
+          <w:tcPr>
+            <w:tcW w:type="dxa" w:w="3600"/>
+            <w:tcMar>
+              <w:top w:type="dxa" w:w="60"/>
+              <w:left w:type="dxa" w:w="100"/>
+              <w:bottom w:type="dxa" w:w="60"/>
+              <w:right w:type="dxa" w:w="100"/>
+            </w:tcMar>
+            <w:vAlign w:val="center"/>
+          </w:tcPr>
+          <w:p>
+            <w:pPr>
+              <w:jc w:val="center"/>
+            </w:pPr>
+            <w:r>
+              <w:rPr>
+                <w:b w:val="false"/>
+                <w:bCs w:val="false"/>
+                <w:color w:val="000000"/>
+                <w:sz w:val="20"/>
+                <w:szCs w:val="20"/>
+              </w:rPr>
+              <w:t xml:space="preserve">Completo</w:t>
+            </w:r>
+          </w:p>
+        </w:tc>
+      </w:tr>
+      <w:tr>
+        <w:tc>
+          <w:tcPr>
+            <w:tcW w:type="dxa" w:w="5200"/>
+            <w:tcMar>
+              <w:top w:type="dxa" w:w="60"/>
+              <w:left w:type="dxa" w:w="100"/>
+              <w:bottom w:type="dxa" w:w="60"/>
+              <w:right w:type="dxa" w:w="100"/>
+            </w:tcMar>
+            <w:vAlign w:val="center"/>
+          </w:tcPr>
+          <w:p>
+            <w:pPr>
+              <w:jc w:val="left"/>
+            </w:pPr>
+            <w:r>
+              <w:rPr>
+                <w:b w:val="false"/>
+                <w:bCs w:val="false"/>
+                <w:color w:val="000000"/>
+                <w:sz w:val="20"/>
+                <w:szCs w:val="20"/>
+              </w:rPr>
+              <w:t xml:space="preserve">Python / SQL / Scala / R / Java</w:t>
+            </w:r>
+          </w:p>
+        </w:tc>
+        <w:tc>
+          <w:tcPr>
+            <w:tcW w:type="dxa" w:w="3600"/>
+            <w:tcMar>
+              <w:top w:type="dxa" w:w="60"/>
+              <w:left w:type="dxa" w:w="100"/>
+              <w:bottom w:type="dxa" w:w="60"/>
+              <w:right w:type="dxa" w:w="100"/>
+            </w:tcMar>
+            <w:vAlign w:val="center"/>
+          </w:tcPr>
+          <w:p>
+            <w:pPr>
+              <w:jc w:val="center"/>
+            </w:pPr>
+            <w:r>
+              <w:rPr>
+                <w:b w:val="false"/>
+                <w:bCs w:val="false"/>
+                <w:color w:val="000000"/>
+                <w:sz w:val="20"/>
+                <w:szCs w:val="20"/>
+              </w:rPr>
+              <w:t xml:space="preserve">Completo — los 5 verificados</w:t>
+            </w:r>
+          </w:p>
+        </w:tc>
+      </w:tr>
+      <w:tr>
+        <w:tc>
+          <w:tcPr>
+            <w:tcW w:type="dxa" w:w="5200"/>
+            <w:tcMar>
+              <w:top w:type="dxa" w:w="60"/>
+              <w:left w:type="dxa" w:w="100"/>
+              <w:bottom w:type="dxa" w:w="60"/>
+              <w:right w:type="dxa" w:w="100"/>
+            </w:tcMar>
+            <w:vAlign w:val="center"/>
+          </w:tcPr>
+          <w:p>
+            <w:pPr>
+              <w:jc w:val="left"/>
+            </w:pPr>
+            <w:r>
+              <w:rPr>
+                <w:b w:val="false"/>
+                <w:bCs w:val="false"/>
+                <w:color w:val="000000"/>
+                <w:sz w:val="20"/>
+                <w:szCs w:val="20"/>
+              </w:rPr>
+              <w:t xml:space="preserve">Spark MLlib</w:t>
+            </w:r>
+          </w:p>
+        </w:tc>
+        <w:tc>
+          <w:tcPr>
+            <w:tcW w:type="dxa" w:w="3600"/>
+            <w:tcMar>
+              <w:top w:type="dxa" w:w="60"/>
+              <w:left w:type="dxa" w:w="100"/>
+              <w:bottom w:type="dxa" w:w="60"/>
+              <w:right w:type="dxa" w:w="100"/>
+            </w:tcMar>
+            <w:vAlign w:val="center"/>
+          </w:tcPr>
+          <w:p>
+            <w:pPr>
+              <w:jc w:val="center"/>
+            </w:pPr>
+            <w:r>
+              <w:rPr>
+                <w:b w:val="false"/>
+                <w:bCs w:val="false"/>
+                <w:color w:val="000000"/>
+                <w:sz w:val="20"/>
+                <w:szCs w:val="20"/>
+              </w:rPr>
+              <w:t xml:space="preserve">Completo</w:t>
+            </w:r>
+          </w:p>
+        </w:tc>
+      </w:tr>
+      <w:tr>
+        <w:tc>
+          <w:tcPr>
+            <w:tcW w:type="dxa" w:w="5200"/>
+            <w:tcMar>
+              <w:top w:type="dxa" w:w="60"/>
+              <w:left w:type="dxa" w:w="100"/>
+              <w:bottom w:type="dxa" w:w="60"/>
+              <w:right w:type="dxa" w:w="100"/>
+            </w:tcMar>
+            <w:vAlign w:val="center"/>
+          </w:tcPr>
+          <w:p>
+            <w:pPr>
+              <w:jc w:val="left"/>
+            </w:pPr>
+            <w:r>
+              <w:rPr>
+                <w:b w:val="false"/>
+                <w:bCs w:val="false"/>
+                <w:color w:val="000000"/>
+                <w:sz w:val="20"/>
+                <w:szCs w:val="20"/>
+              </w:rPr>
+              <w:t xml:space="preserve">Spark GraphX</w:t>
+            </w:r>
+          </w:p>
+        </w:tc>
+        <w:tc>
+          <w:tcPr>
+            <w:tcW w:type="dxa" w:w="3600"/>
+            <w:tcMar>
+              <w:top w:type="dxa" w:w="60"/>
+              <w:left w:type="dxa" w:w="100"/>
+              <w:bottom w:type="dxa" w:w="60"/>
+              <w:right w:type="dxa" w:w="100"/>
+            </w:tcMar>
+            <w:vAlign w:val="center"/>
+          </w:tcPr>
+          <w:p>
+            <w:pPr>
+              <w:jc w:val="center"/>
+            </w:pPr>
+            <w:r>
+              <w:rPr>
+                <w:b w:val="false"/>
+                <w:bCs w:val="false"/>
+                <w:color w:val="000000"/>
+                <w:sz w:val="20"/>
+                <w:szCs w:val="20"/>
+              </w:rPr>
+              <w:t xml:space="preserve">Bloqueado — requiere Maven</w:t>
+            </w:r>
+          </w:p>
+        </w:tc>
+      </w:tr>
+      <w:tr>
+        <w:tc>
+          <w:tcPr>
+            <w:tcW w:type="dxa" w:w="5200"/>
+            <w:tcMar>
+              <w:top w:type="dxa" w:w="60"/>
+              <w:left w:type="dxa" w:w="100"/>
+              <w:bottom w:type="dxa" w:w="60"/>
+              <w:right w:type="dxa" w:w="100"/>
+            </w:tcMar>
+            <w:vAlign w:val="center"/>
+          </w:tcPr>
+          <w:p>
+            <w:pPr>
+              <w:jc w:val="left"/>
+            </w:pPr>
+            <w:r>
+              <w:rPr>
+                <w:b w:val="false"/>
+                <w:bCs w:val="false"/>
+                <w:color w:val="000000"/>
+                <w:sz w:val="20"/>
+                <w:szCs w:val="20"/>
+              </w:rPr>
+              <w:t xml:space="preserve">Hadoop YARN / HDFS</w:t>
+            </w:r>
+          </w:p>
+        </w:tc>
+        <w:tc>
+          <w:tcPr>
+            <w:tcW w:type="dxa" w:w="3600"/>
+            <w:tcMar>
+              <w:top w:type="dxa" w:w="60"/>
+              <w:left w:type="dxa" w:w="100"/>
+              <w:bottom w:type="dxa" w:w="60"/>
+              <w:right w:type="dxa" w:w="100"/>
+            </w:tcMar>
+            <w:vAlign w:val="center"/>
+          </w:tcPr>
+          <w:p>
+            <w:pPr>
+              <w:jc w:val="center"/>
+            </w:pPr>
+            <w:r>
+              <w:rPr>
+                <w:b w:val="false"/>
+                <w:bCs w:val="false"/>
+                <w:color w:val="000000"/>
+                <w:sz w:val="20"/>
+                <w:szCs w:val="20"/>
+              </w:rPr>
+              <w:t xml:space="preserve">Bloqueado — sin paquete disponible en este entorno</w:t>
+            </w:r>
+          </w:p>
+        </w:tc>
+      </w:tr>
+      <w:tr>
+        <w:tc>
+          <w:tcPr>
+            <w:tcW w:type="dxa" w:w="5200"/>
+            <w:tcMar>
+              <w:top w:type="dxa" w:w="60"/>
+              <w:left w:type="dxa" w:w="100"/>
+              <w:bottom w:type="dxa" w:w="60"/>
+              <w:right w:type="dxa" w:w="100"/>
+            </w:tcMar>
+            <w:vAlign w:val="center"/>
+          </w:tcPr>
+          <w:p>
+            <w:pPr>
+              <w:jc w:val="left"/>
+            </w:pPr>
+            <w:r>
+              <w:rPr>
+                <w:b w:val="false"/>
+                <w:bCs w:val="false"/>
+                <w:color w:val="000000"/>
+                <w:sz w:val="20"/>
+                <w:szCs w:val="20"/>
+              </w:rPr>
+              <w:t xml:space="preserve">Apache Airflow</w:t>
+            </w:r>
+          </w:p>
+        </w:tc>
+        <w:tc>
+          <w:tcPr>
+            <w:tcW w:type="dxa" w:w="3600"/>
+            <w:tcMar>
+              <w:top w:type="dxa" w:w="60"/>
+              <w:left w:type="dxa" w:w="100"/>
+              <w:bottom w:type="dxa" w:w="60"/>
+              <w:right w:type="dxa" w:w="100"/>
+            </w:tcMar>
+            <w:vAlign w:val="center"/>
+          </w:tcPr>
+          <w:p>
+            <w:pPr>
+              <w:jc w:val="center"/>
+            </w:pPr>
+            <w:r>
+              <w:rPr>
+                <w:b w:val="false"/>
+                <w:bCs w:val="false"/>
+                <w:color w:val="000000"/>
+                <w:sz w:val="20"/>
+                <w:szCs w:val="20"/>
+              </w:rPr>
+              <w:t xml:space="preserve">Completo</w:t>
+            </w:r>
+          </w:p>
+        </w:tc>
+      </w:tr>
+      <w:tr>
+        <w:tc>
+          <w:tcPr>
+            <w:tcW w:type="dxa" w:w="5200"/>
+            <w:tcMar>
+              <w:top w:type="dxa" w:w="60"/>
+              <w:left w:type="dxa" w:w="100"/>
+              <w:bottom w:type="dxa" w:w="60"/>
+              <w:right w:type="dxa" w:w="100"/>
+            </w:tcMar>
+            <w:vAlign w:val="center"/>
+          </w:tcPr>
+          <w:p>
+            <w:pPr>
+              <w:jc w:val="left"/>
+            </w:pPr>
+            <w:r>
+              <w:rPr>
+                <w:b w:val="false"/>
+                <w:bCs w:val="false"/>
+                <w:color w:val="000000"/>
+                <w:sz w:val="20"/>
+                <w:szCs w:val="20"/>
+              </w:rPr>
+              <w:t xml:space="preserve">SQL Server / SSRS</w:t>
+            </w:r>
+          </w:p>
+        </w:tc>
+        <w:tc>
+          <w:tcPr>
+            <w:tcW w:type="dxa" w:w="3600"/>
+            <w:tcMar>
+              <w:top w:type="dxa" w:w="60"/>
+              <w:left w:type="dxa" w:w="100"/>
+              <w:bottom w:type="dxa" w:w="60"/>
+              <w:right w:type="dxa" w:w="100"/>
+            </w:tcMar>
+            <w:vAlign w:val="center"/>
+          </w:tcPr>
+          <w:p>
+            <w:pPr>
+              <w:jc w:val="center"/>
+            </w:pPr>
+            <w:r>
+              <w:rPr>
+                <w:b w:val="false"/>
+                <w:bCs w:val="false"/>
+                <w:color w:val="000000"/>
+                <w:sz w:val="20"/>
+                <w:szCs w:val="20"/>
+              </w:rPr>
+              <w:t xml:space="preserve">Parcial — esquema real, SQLite como stand-in</w:t>
+            </w:r>
+          </w:p>
+        </w:tc>
+      </w:tr>
+      <w:tr>
+        <w:tc>
+          <w:tcPr>
+            <w:tcW w:type="dxa" w:w="5200"/>
+            <w:tcMar>
+              <w:top w:type="dxa" w:w="60"/>
+              <w:left w:type="dxa" w:w="100"/>
+              <w:bottom w:type="dxa" w:w="60"/>
+              <w:right w:type="dxa" w:w="100"/>
+            </w:tcMar>
+            <w:vAlign w:val="center"/>
+          </w:tcPr>
+          <w:p>
+            <w:pPr>
+              <w:jc w:val="left"/>
+            </w:pPr>
+            <w:r>
+              <w:rPr>
+                <w:b w:val="false"/>
+                <w:bCs w:val="false"/>
+                <w:color w:val="000000"/>
+                <w:sz w:val="20"/>
+                <w:szCs w:val="20"/>
+              </w:rPr>
+              <w:t xml:space="preserve">Modelo Tabular (SSAS)</w:t>
+            </w:r>
+          </w:p>
+        </w:tc>
+        <w:tc>
+          <w:tcPr>
+            <w:tcW w:type="dxa" w:w="3600"/>
+            <w:tcMar>
+              <w:top w:type="dxa" w:w="60"/>
+              <w:left w:type="dxa" w:w="100"/>
+              <w:bottom w:type="dxa" w:w="60"/>
+              <w:right w:type="dxa" w:w="100"/>
+            </w:tcMar>
+            <w:vAlign w:val="center"/>
+          </w:tcPr>
+          <w:p>
+            <w:pPr>
+              <w:jc w:val="center"/>
+            </w:pPr>
+            <w:r>
+              <w:rPr>
+                <w:b w:val="false"/>
+                <w:bCs w:val="false"/>
+                <w:color w:val="000000"/>
+                <w:sz w:val="20"/>
+                <w:szCs w:val="20"/>
+              </w:rPr>
+              <w:t xml:space="preserve">Fuera de alcance — solo Windows Server</w:t>
+            </w:r>
+          </w:p>
+        </w:tc>
+      </w:tr>
+      <w:tr>
+        <w:tc>
+          <w:tcPr>
+            <w:tcW w:type="dxa" w:w="5200"/>
+            <w:tcMar>
+              <w:top w:type="dxa" w:w="60"/>
+              <w:left w:type="dxa" w:w="100"/>
+              <w:bottom w:type="dxa" w:w="60"/>
+              <w:right w:type="dxa" w:w="100"/>
+            </w:tcMar>
+            <w:vAlign w:val="center"/>
+          </w:tcPr>
+          <w:p>
+            <w:pPr>
+              <w:jc w:val="left"/>
+            </w:pPr>
+            <w:r>
+              <w:rPr>
+                <w:b w:val="false"/>
+                <w:bCs w:val="false"/>
+                <w:color w:val="000000"/>
+                <w:sz w:val="20"/>
+                <w:szCs w:val="20"/>
+              </w:rPr>
+              <w:t xml:space="preserve">Power BI</w:t>
+            </w:r>
+          </w:p>
+        </w:tc>
+        <w:tc>
+          <w:tcPr>
+            <w:tcW w:type="dxa" w:w="3600"/>
+            <w:tcMar>
+              <w:top w:type="dxa" w:w="60"/>
+              <w:left w:type="dxa" w:w="100"/>
+              <w:bottom w:type="dxa" w:w="60"/>
+              <w:right w:type="dxa" w:w="100"/>
+            </w:tcMar>
+            <w:vAlign w:val="center"/>
+          </w:tcPr>
+          <w:p>
+            <w:pPr>
+              <w:jc w:val="center"/>
+            </w:pPr>
+            <w:r>
+              <w:rPr>
+                <w:b w:val="false"/>
+                <w:bCs w:val="false"/>
+                <w:color w:val="000000"/>
+                <w:sz w:val="20"/>
+                <w:szCs w:val="20"/>
+              </w:rPr>
+              <w:t xml:space="preserve">Fuera de alcance — requiere licencia/cuenta</w:t>
+            </w:r>
+          </w:p>
+        </w:tc>
+      </w:tr>
+    </w:tbl>
+    <w:p>
+      <w:pPr>
+        <w:spacing w:after="160"/>
+      </w:pPr>
+      <w:r>
+        <w:rPr>
+          <w:sz w:val="4"/>
+          <w:szCs w:val="4"/>
+        </w:rPr>
+        <w:t xml:space="preserve"/>
+      </w:r>
+    </w:p>
+    <w:p>
+      <w:pPr>
+        <w:pStyle w:val="Heading2"/>
+        <w:spacing w:after="100" w:before="200"/>
+      </w:pPr>
+      <w:r>
+        <w:t xml:space="preserve">Tres tipos de bloqueo, no uno solo</w:t>
+      </w:r>
+    </w:p>
+    <w:p>
+      <w:pPr>
+        <w:pStyle w:val="ListParagraph"/>
+        <w:numPr>
+          <w:ilvl w:val="0"/>
+          <w:numId w:val="1"/>
+        </w:numPr>
+        <w:spacing w:after="80"/>
+      </w:pPr>
+      <w:r>
+        <w:rPr>
+          <w:sz w:val="22"/>
+          <w:szCs w:val="22"/>
+        </w:rPr>
+        <w:t xml:space="preserve">Red del entorno de prueba: Hadoop/YARN, HDFS, GraphX y Delta Lake requieren descargar un .jar o tarball desde Maven Central o Apache, dominios fuera de la lista de salida permitida aquí. Con acceso a internet sin restricciones (ej. un servidor de la CGR), esto no es un límite técnico real.</w:t>
+      </w:r>
+    </w:p>
+    <w:p>
+      <w:pPr>
+        <w:pStyle w:val="ListParagraph"/>
+        <w:numPr>
+          <w:ilvl w:val="0"/>
+          <w:numId w:val="1"/>
+        </w:numPr>
+        <w:spacing w:after="80"/>
+      </w:pPr>
+      <w:r>
+        <w:rPr>
+          <w:sz w:val="22"/>
+          <w:szCs w:val="22"/>
+        </w:rPr>
+        <w:t xml:space="preserve">Sistema operativo: SSAS es tecnología exclusiva de Windows Server; no existe equivalente en Linux.</w:t>
+      </w:r>
+    </w:p>
+    <w:p>
+      <w:pPr>
+        <w:pStyle w:val="ListParagraph"/>
+        <w:numPr>
+          <w:ilvl w:val="0"/>
+          <w:numId w:val="1"/>
+        </w:numPr>
+        <w:spacing w:after="80"/>
+      </w:pPr>
+      <w:r>
+        <w:rPr>
+          <w:sz w:val="22"/>
+          <w:szCs w:val="22"/>
+        </w:rPr>
+        <w:t xml:space="preserve">Licencia/cuenta: Power BI y un SQL Server real requieren una cuenta o licencia — no hay forma de "instalarlos gratis" en ningún entorno. Quedan fuera de alcance por decisión, no por límite técnico.</w:t>
+      </w:r>
+    </w:p>
+    <w:p>
+      <w:pPr>
+        <w:pStyle w:val="Heading2"/>
+        <w:spacing w:after="100" w:before="200"/>
+      </w:pPr>
+      <w:r>
+        <w:t xml:space="preserve">Evidencia: Streaming</w:t>
+      </w:r>
+    </w:p>
+    <w:p>
+      <w:pPr>
+        <w:spacing w:after="160"/>
+      </w:pPr>
+      <w:r>
+        <w:rPr>
+          <w:sz w:val="22"/>
+          <w:szCs w:val="22"/>
+        </w:rPr>
+        <w:t xml:space="preserve">Se construyó un stream de Spark Structured Streaming que vigila una carpeta y procesa cada archivo nuevo que llega — simulando la publicación incremental de contratos a lo largo del día, no una carga única. Resultado real: 3 micro-batches procesados de forma incremental; la entidad E01 acumuló correctamente 3 contratos por S/. 296,000 a medida que llegaban, sin reprocesar desde cero.</w:t>
+      </w:r>
+    </w:p>
+    <w:p>
+      <w:pPr>
+        <w:pStyle w:val="Heading2"/>
+        <w:spacing w:after="100" w:before="200"/>
+      </w:pPr>
+      <w:r>
+        <w:t xml:space="preserve">Evidencia: HMS (Hive Metastore)</w:t>
+      </w:r>
+    </w:p>
+    <w:p>
+      <w:pPr>
+        <w:spacing w:after="160"/>
+      </w:pPr>
+      <w:r>
+        <w:rPr>
+          <w:sz w:val="22"/>
+          <w:szCs w:val="22"/>
+        </w:rPr>
+        <w:t xml:space="preserve">Se registraron 4 tablas reales del prototipo (incluyendo los 47,442 contratos reales de SEACE del Anexo A) en un catálogo Hive Metastore, consultables por nombre vía SQL puro sin conocer la ruta física del archivo — el propósito real de un metastore. El backend es Derby local, no MySQL como especifica el Anexo 2, pero es un cambio de una línea de configuración, no de arquitectura.</w:t>
+      </w:r>
+    </w:p>
+    <w:p>
+      <w:pPr>
+        <w:pStyle w:val="Heading2"/>
+        <w:spacing w:after="100" w:before="200"/>
+      </w:pPr>
+      <w:r>
+        <w:t xml:space="preserve">Evidencia: R</w:t>
+      </w:r>
+    </w:p>
+    <w:p>
+      <w:pPr>
+        <w:spacing w:after="160"/>
+      </w:pPr>
+      <w:r>
+        <w:rPr>
+          <w:sz w:val="22"/>
+          <w:szCs w:val="22"/>
+        </w:rPr>
+        <w:t xml:space="preserve">Se ejecutó una prueba t de Welch en R sobre la variable de mayor importancia del modelo de favoritismo (concentracion_objeto, ver Sección 3), comparando el grupo con favoritismo real contra el resto. Resultado: diferencia altamente significativa (p = 3.58×10⁻⁸), confirmando con una prueba estadística formal lo que el Random Forest ya señalaba por importancia de variable.</w:t>
+      </w:r>
+    </w:p>
+    <w:p>
+      <w:pPr>
+        <w:spacing w:after="100"/>
+        <w:jc w:val="center"/>
+      </w:pPr>
+      <w:r>
+        <w:drawing>
+          <wp:inline distT="0" distB="0" distL="0" distR="0">
+            <wp:extent cx="4381500" cy="2914650"/>
+            <wp:effectExtent t="0" r="0" b="0" l="0"/>
+            <wp:docPr id="1" name="" descr="" title=""/>
+            <wp:cNvGraphicFramePr>
+              <a:graphicFrameLocks xmlns:a="http://schemas.openxmlformats.org/drawingml/2006/main" noChangeAspect="1"/>
+            </wp:cNvGraphicFramePr>
+            <a:graphic xmlns:a="http://schemas.openxmlformats.org/drawingml/2006/main">
+              <a:graphicData uri="http://schemas.openxmlformats.org/drawingml/2006/picture">
+                <pic:pic xmlns:pic="http://schemas.openxmlformats.org/drawingml/2006/picture">
+                  <pic:nvPicPr>
+                    <pic:cNvPr id="0" name="" descr=""/>
+                    <pic:cNvPicPr>
+                      <a:picLocks noChangeAspect="1" noChangeArrowheads="1"/>
+                    </pic:cNvPicPr>
+                  </pic:nvPicPr>
+                  <pic:blipFill>
+                    <a:blip r:embed="rId18" cstate="none"/>
+                    <a:srcRect/>
+                    <a:stretch>
+                      <a:fillRect/>
+                    </a:stretch>
+                  </pic:blipFill>
+                  <pic:spPr bwMode="auto">
+                    <a:xfrm>
+                      <a:off x="0" y="0"/>
+                      <a:ext cx="4381500" cy="2914650"/>
+                    </a:xfrm>
+                    <a:prstGeom prst="rect">
+                      <a:avLst/>
+                    </a:prstGeom>
+                  </pic:spPr>
+                </pic:pic>
+              </a:graphicData>
+            </a:graphic>
+          </wp:inline>
+        </w:drawing>
+      </w:r>
+    </w:p>
+    <w:p>
+      <w:pPr>
+        <w:spacing w:after="200" w:before="60"/>
+        <w:jc w:val="center"/>
+      </w:pPr>
+      <w:r>
+        <w:rPr>
+          <w:i/>
+          <w:iCs/>
+          <w:color w:val="666666"/>
+          <w:sz w:val="18"/>
+          <w:szCs w:val="18"/>
+        </w:rPr>
+        <w:t xml:space="preserve">Figura 11. Separación entre grupos (R) — evidencia visual de la misma señal que detecta el modelo.</w:t>
       </w:r>
     </w:p>
     <w:p>

</xml_diff>

<commit_message>
Reporte: GraphFrames real cerrado en todas las secciones (5.1 nueva, Anexo B, Ruta de Escalamiento) - gracias a los jars descargados por el usuario desde Maven Central
</commit_message>
<xml_diff>
--- a/reporte/Reporte_Tecnico_Prototipo_CGR_1.8.2.docx
+++ b/reporte/Reporte_Tecnico_Prototipo_CGR_1.8.2.docx
@@ -3925,6 +3925,90 @@
     </w:p>
     <w:p>
       <w:pPr>
+        <w:pStyle w:val="Heading2"/>
+        <w:spacing w:after="100" w:before="200"/>
+      </w:pPr>
+      <w:r>
+        <w:t xml:space="preserve">5.1. Validación con Spark GraphFrames real (no solo networkx)</w:t>
+      </w:r>
+    </w:p>
+    <w:p>
+      <w:pPr>
+        <w:spacing w:after="160"/>
+      </w:pPr>
+      <w:r>
+        <w:rPr>
+          <w:sz w:val="22"/>
+          <w:szCs w:val="22"/>
+        </w:rPr>
+        <w:t xml:space="preserve">El análisis anterior se construyó con networkx porque GraphFrames no lograba resolverse sin acceso a Maven Central desde este entorno (ver Anexo B). Se obtuvieron los .jar exactos — io.graphframes:graphframes-spark4_2.13:0.10.0, compilados específicamente para Spark 4.x con Scala 2.13 — desde una máquina con internet sin restricciones, y se cargaron manualmente vía spark.jars. El resultado corre sobre Spark GraphFrames real, no una simulación:</w:t>
+      </w:r>
+    </w:p>
+    <w:p>
+      <w:pPr>
+        <w:pStyle w:val="ListParagraph"/>
+        <w:numPr>
+          <w:ilvl w:val="0"/>
+          <w:numId w:val="1"/>
+        </w:numPr>
+        <w:spacing w:after="80"/>
+      </w:pPr>
+      <w:r>
+        <w:rPr>
+          <w:sz w:val="22"/>
+          <w:szCs w:val="22"/>
+        </w:rPr>
+        <w:t xml:space="preserve">Los mismos 5 de 5 vínculos sospechosos sembrados fueron detectados — confirmación cruzada entre networkx y GraphFrames.</w:t>
+      </w:r>
+    </w:p>
+    <w:p>
+      <w:pPr>
+        <w:pStyle w:val="ListParagraph"/>
+        <w:numPr>
+          <w:ilvl w:val="0"/>
+          <w:numId w:val="1"/>
+        </w:numPr>
+        <w:spacing w:after="80"/>
+      </w:pPr>
+      <w:r>
+        <w:rPr>
+          <w:sz w:val="22"/>
+          <w:szCs w:val="22"/>
+        </w:rPr>
+        <w:t xml:space="preserve">PageRank identificó a los funcionarios más centrales de la red de contratación (no solo el que más contratos tiene, sino su posición relativa dentro de la red completa) — exactamente la mejora que la nota anterior señalaba como pendiente.</w:t>
+      </w:r>
+    </w:p>
+    <w:p>
+      <w:pPr>
+        <w:pStyle w:val="ListParagraph"/>
+        <w:numPr>
+          <w:ilvl w:val="0"/>
+          <w:numId w:val="1"/>
+        </w:numPr>
+        <w:spacing w:after="80"/>
+      </w:pPr>
+      <w:r>
+        <w:rPr>
+          <w:sz w:val="22"/>
+          <w:szCs w:val="22"/>
+        </w:rPr>
+        <w:t xml:space="preserve">Connected Components agrupó los 280 nodos (proveedores + funcionarios) en un solo componente conectado — en una red real con más entidades, esta técnica permitiría aislar comunidades de contratación independientes entre sí.</w:t>
+      </w:r>
+    </w:p>
+    <w:p>
+      <w:pPr>
+        <w:spacing w:after="160"/>
+      </w:pPr>
+      <w:r>
+        <w:rPr>
+          <w:sz w:val="22"/>
+          <w:szCs w:val="22"/>
+        </w:rPr>
+        <w:t xml:space="preserve">Código en src/spark/vinculos_graphframes.py; resultados en outputs/vinculos_graphframes_*.csv.</w:t>
+      </w:r>
+    </w:p>
+    <w:p>
+      <w:pPr>
         <w:pStyle w:val="Heading1"/>
         <w:spacing w:after="150" w:before="300"/>
       </w:pPr>
@@ -10293,7 +10377,7 @@
                 <w:sz w:val="20"/>
                 <w:szCs w:val="20"/>
               </w:rPr>
-              <w:t xml:space="preserve">Bloqueado — requiere Maven</w:t>
+              <w:t xml:space="preserve">Completo (ver Sección 5 — GraphFrames real)</w:t>
             </w:r>
           </w:p>
         </w:tc>
@@ -10614,7 +10698,7 @@
           <w:sz w:val="22"/>
           <w:szCs w:val="22"/>
         </w:rPr>
-        <w:t xml:space="preserve">Red del entorno de prueba: Hadoop/YARN, HDFS, GraphX y Delta Lake requieren descargar un .jar o tarball desde Maven Central o Apache, dominios fuera de la lista de salida permitida aquí. Con acceso a internet sin restricciones (ej. un servidor de la CGR), esto no es un límite técnico real.</w:t>
+        <w:t xml:space="preserve">Red del entorno de prueba: Hadoop/YARN, HDFS y Delta Lake requieren descargar un .jar o tarball desde Maven Central o Apache, dominios fuera de la lista de salida permitida aquí. GraphX/GraphFrames tenía el mismo bloqueo, pero se resolvió (ver Sección 5) descargando los .jar correctos fuera de este entorno y cargándolos manualmente — la misma solución aplicaría a Delta Lake si se repite el proceso.</w:t>
       </w:r>
     </w:p>
     <w:p>
@@ -10862,7 +10946,7 @@
           <w:sz w:val="22"/>
           <w:szCs w:val="22"/>
         </w:rPr>
-        <w:t xml:space="preserve">Añadir el módulo de análisis de grafos (proveedor-funcionario) con GraphX, en vez de networkx (usado en la Sección 5 por rapidez de desarrollo).</w:t>
+        <w:t xml:space="preserve">Reemplazar el SQLite stand-in por una conexión real a SQL Server (pyodbc/pymssql) y desplegar el .rdl en un servidor SSRS real.</w:t>
       </w:r>
     </w:p>
     <w:p>
@@ -10879,24 +10963,7 @@
           <w:sz w:val="22"/>
           <w:szCs w:val="22"/>
         </w:rPr>
-        <w:t xml:space="preserve">Reemplazar el SQLite stand-in por una conexión real a SQL Server (pyodbc/pymssql) y desplegar el .rdl en un servidor SSRS real.</w:t>
-      </w:r>
-    </w:p>
-    <w:p>
-      <w:pPr>
-        <w:pStyle w:val="ListParagraph"/>
-        <w:numPr>
-          <w:ilvl w:val="0"/>
-          <w:numId w:val="1"/>
-        </w:numPr>
-        <w:spacing w:after="80"/>
-      </w:pPr>
-      <w:r>
-        <w:rPr>
-          <w:sz w:val="22"/>
-          <w:szCs w:val="22"/>
-        </w:rPr>
-        <w:t xml:space="preserve">GraphX/GraphFrames para el módulo de vínculos: se intentó explícitamente (dos rutas distintas — resolución vía Maven en tiempo de ejecución, y un .jar empaquetado en PyPI) y ambas fallaron por falta de acceso a Maven Central desde este entorno y por incompatibilidad binaria (Scala 2.11 vs. 2.13 de Spark 4.2). networkx (Sección 5) no es una simplificación de conveniencia; es la única opción funcional verificada aquí.</w:t>
+        <w:t xml:space="preserve">GraphX/GraphFrames para el módulo de vínculos: se intentó dos veces y falló por falta de acceso a Maven Central desde este entorno. Se resolvió obteniendo los .jar correctos (io.graphframes:graphframes-spark4_2.13:0.10.0) desde una máquina con internet sin restricciones y cargándolos manualmente — ver Sección 5. La red de este entorno sigue siendo la limitación real; se puede resolver caso por caso, no de forma automática.</w:t>
       </w:r>
     </w:p>
     <w:p>

</xml_diff>

<commit_message>
Reporte: Delta Lake real documentado en todas las secciones (Anexo B, evidencia con ACID/time travel/CDC-CDF, Ruta de Escalamiento actualizada)
</commit_message>
<xml_diff>
--- a/reporte/Reporte_Tecnico_Prototipo_CGR_1.8.2.docx
+++ b/reporte/Reporte_Tecnico_Prototipo_CGR_1.8.2.docx
@@ -9985,7 +9985,7 @@
                 <w:sz w:val="20"/>
                 <w:szCs w:val="20"/>
               </w:rPr>
-              <w:t xml:space="preserve">Bloqueado (depende de Delta Lake)</w:t>
+              <w:t xml:space="preserve">Completo (ver evidencia abajo)</w:t>
             </w:r>
           </w:p>
         </w:tc>
@@ -10041,7 +10041,7 @@
                 <w:sz w:val="20"/>
                 <w:szCs w:val="20"/>
               </w:rPr>
-              <w:t xml:space="preserve">Completo (como Parquet, no Delta Lake)</w:t>
+              <w:t xml:space="preserve">Completo (Delta Lake real disponible, ver evidencia)</w:t>
             </w:r>
           </w:p>
         </w:tc>
@@ -10097,7 +10097,7 @@
                 <w:sz w:val="20"/>
                 <w:szCs w:val="20"/>
               </w:rPr>
-              <w:t xml:space="preserve">Bloqueado — requiere Maven</w:t>
+              <w:t xml:space="preserve">Completo (ver evidencia abajo)</w:t>
             </w:r>
           </w:p>
         </w:tc>
@@ -10698,7 +10698,7 @@
           <w:sz w:val="22"/>
           <w:szCs w:val="22"/>
         </w:rPr>
-        <w:t xml:space="preserve">Red del entorno de prueba: Hadoop/YARN, HDFS y Delta Lake requieren descargar un .jar o tarball desde Maven Central o Apache, dominios fuera de la lista de salida permitida aquí. GraphX/GraphFrames tenía el mismo bloqueo, pero se resolvió (ver Sección 5) descargando los .jar correctos fuera de este entorno y cargándolos manualmente — la misma solución aplicaría a Delta Lake si se repite el proceso.</w:t>
+        <w:t xml:space="preserve">Red del entorno de prueba: Hadoop/YARN y HDFS requieren descargar un tarball desde Apache, dominio fuera de la lista de salida permitida aquí. GraphX/GraphFrames y Delta Lake tenían el mismo bloqueo, pero ambos se resolvieron (ver Sección 5 y evidencia abajo) descargando los .jar correctos fuera de este entorno y cargándolos manualmente.</w:t>
       </w:r>
     </w:p>
     <w:p>
@@ -10862,6 +10862,350 @@
     </w:p>
     <w:p>
       <w:pPr>
+        <w:pStyle w:val="Heading2"/>
+        <w:spacing w:after="100" w:before="200"/>
+      </w:pPr>
+      <w:r>
+        <w:t xml:space="preserve">Evidencia: Delta Lake (ACID, historial de versiones, time travel, CDC/CDF)</w:t>
+      </w:r>
+    </w:p>
+    <w:p>
+      <w:pPr>
+        <w:spacing w:after="160"/>
+      </w:pPr>
+      <w:r>
+        <w:rPr>
+          <w:sz w:val="22"/>
+          <w:szCs w:val="22"/>
+        </w:rPr>
+        <w:t xml:space="preserve">Con los .jar correctos (io.delta:delta-spark_4.1_2.13:4.3.0 — nótese el sufijo de versión de Spark, obligatorio desde Delta Lake 4.1), la capa Bronce se reescribió como una tabla Delta Lake real, no Parquet plano. Se simuló el escenario más relevante para un auditor: una corrección de monto sobre un contrato ya existente.</w:t>
+      </w:r>
+    </w:p>
+    <w:tbl>
+      <w:tblPr>
+        <w:tblW w:type="dxa" w:w="8800"/>
+        <w:tblBorders>
+          <w:top w:val="single" w:color="auto" w:sz="4"/>
+          <w:left w:val="single" w:color="auto" w:sz="4"/>
+          <w:bottom w:val="single" w:color="auto" w:sz="4"/>
+          <w:right w:val="single" w:color="auto" w:sz="4"/>
+          <w:insideH w:val="single" w:color="auto" w:sz="4"/>
+          <w:insideV w:val="single" w:color="auto" w:sz="4"/>
+        </w:tblBorders>
+      </w:tblPr>
+      <w:tblGrid>
+        <w:gridCol w:w="3600"/>
+        <w:gridCol w:w="5200"/>
+      </w:tblGrid>
+      <w:tr>
+        <w:tc>
+          <w:tcPr>
+            <w:tcW w:type="dxa" w:w="3600"/>
+            <w:shd w:fill="1F4E79" w:val="clear"/>
+            <w:tcMar>
+              <w:top w:type="dxa" w:w="60"/>
+              <w:left w:type="dxa" w:w="100"/>
+              <w:bottom w:type="dxa" w:w="60"/>
+              <w:right w:type="dxa" w:w="100"/>
+            </w:tcMar>
+            <w:vAlign w:val="center"/>
+          </w:tcPr>
+          <w:p>
+            <w:pPr>
+              <w:jc w:val="left"/>
+            </w:pPr>
+            <w:r>
+              <w:rPr>
+                <w:b/>
+                <w:bCs/>
+                <w:color w:val="FFFFFF"/>
+                <w:sz w:val="20"/>
+                <w:szCs w:val="20"/>
+              </w:rPr>
+              <w:t xml:space="preserve">Capacidad verificada</w:t>
+            </w:r>
+          </w:p>
+        </w:tc>
+        <w:tc>
+          <w:tcPr>
+            <w:tcW w:type="dxa" w:w="5200"/>
+            <w:shd w:fill="1F4E79" w:val="clear"/>
+            <w:tcMar>
+              <w:top w:type="dxa" w:w="60"/>
+              <w:left w:type="dxa" w:w="100"/>
+              <w:bottom w:type="dxa" w:w="60"/>
+              <w:right w:type="dxa" w:w="100"/>
+            </w:tcMar>
+            <w:vAlign w:val="center"/>
+          </w:tcPr>
+          <w:p>
+            <w:pPr>
+              <w:jc w:val="left"/>
+            </w:pPr>
+            <w:r>
+              <w:rPr>
+                <w:b/>
+                <w:bCs/>
+                <w:color w:val="FFFFFF"/>
+                <w:sz w:val="20"/>
+                <w:szCs w:val="20"/>
+              </w:rPr>
+              <w:t xml:space="preserve">Resultado</w:t>
+            </w:r>
+          </w:p>
+        </w:tc>
+      </w:tr>
+      <w:tr>
+        <w:tc>
+          <w:tcPr>
+            <w:tcW w:type="dxa" w:w="3600"/>
+            <w:tcMar>
+              <w:top w:type="dxa" w:w="60"/>
+              <w:left w:type="dxa" w:w="100"/>
+              <w:bottom w:type="dxa" w:w="60"/>
+              <w:right w:type="dxa" w:w="100"/>
+            </w:tcMar>
+            <w:vAlign w:val="center"/>
+          </w:tcPr>
+          <w:p>
+            <w:pPr>
+              <w:jc w:val="left"/>
+            </w:pPr>
+            <w:r>
+              <w:rPr>
+                <w:b w:val="false"/>
+                <w:bCs w:val="false"/>
+                <w:color w:val="000000"/>
+                <w:sz w:val="20"/>
+                <w:szCs w:val="20"/>
+              </w:rPr>
+              <w:t xml:space="preserve">UPDATE transaccional (ACID)</w:t>
+            </w:r>
+          </w:p>
+        </w:tc>
+        <w:tc>
+          <w:tcPr>
+            <w:tcW w:type="dxa" w:w="5200"/>
+            <w:tcMar>
+              <w:top w:type="dxa" w:w="60"/>
+              <w:left w:type="dxa" w:w="100"/>
+              <w:bottom w:type="dxa" w:w="60"/>
+              <w:right w:type="dxa" w:w="100"/>
+            </w:tcMar>
+            <w:vAlign w:val="center"/>
+          </w:tcPr>
+          <w:p>
+            <w:pPr>
+              <w:jc w:val="center"/>
+            </w:pPr>
+            <w:r>
+              <w:rPr>
+                <w:b w:val="false"/>
+                <w:bCs w:val="false"/>
+                <w:color w:val="000000"/>
+                <w:sz w:val="20"/>
+                <w:szCs w:val="20"/>
+              </w:rPr>
+              <w:t xml:space="preserve">Aplicado correctamente, nueva versión creada automáticamente</w:t>
+            </w:r>
+          </w:p>
+        </w:tc>
+      </w:tr>
+      <w:tr>
+        <w:tc>
+          <w:tcPr>
+            <w:tcW w:type="dxa" w:w="3600"/>
+            <w:tcMar>
+              <w:top w:type="dxa" w:w="60"/>
+              <w:left w:type="dxa" w:w="100"/>
+              <w:bottom w:type="dxa" w:w="60"/>
+              <w:right w:type="dxa" w:w="100"/>
+            </w:tcMar>
+            <w:vAlign w:val="center"/>
+          </w:tcPr>
+          <w:p>
+            <w:pPr>
+              <w:jc w:val="left"/>
+            </w:pPr>
+            <w:r>
+              <w:rPr>
+                <w:b w:val="false"/>
+                <w:bCs w:val="false"/>
+                <w:color w:val="000000"/>
+                <w:sz w:val="20"/>
+                <w:szCs w:val="20"/>
+              </w:rPr>
+              <w:t xml:space="preserve">DESCRIBE HISTORY</w:t>
+            </w:r>
+          </w:p>
+        </w:tc>
+        <w:tc>
+          <w:tcPr>
+            <w:tcW w:type="dxa" w:w="5200"/>
+            <w:tcMar>
+              <w:top w:type="dxa" w:w="60"/>
+              <w:left w:type="dxa" w:w="100"/>
+              <w:bottom w:type="dxa" w:w="60"/>
+              <w:right w:type="dxa" w:w="100"/>
+            </w:tcMar>
+            <w:vAlign w:val="center"/>
+          </w:tcPr>
+          <w:p>
+            <w:pPr>
+              <w:jc w:val="center"/>
+            </w:pPr>
+            <w:r>
+              <w:rPr>
+                <w:b w:val="false"/>
+                <w:bCs w:val="false"/>
+                <w:color w:val="000000"/>
+                <w:sz w:val="20"/>
+                <w:szCs w:val="20"/>
+              </w:rPr>
+              <w:t xml:space="preserve">2 versiones registradas: WRITE (v0) y UPDATE (v1), con predicado exacto</w:t>
+            </w:r>
+          </w:p>
+        </w:tc>
+      </w:tr>
+      <w:tr>
+        <w:tc>
+          <w:tcPr>
+            <w:tcW w:type="dxa" w:w="3600"/>
+            <w:tcMar>
+              <w:top w:type="dxa" w:w="60"/>
+              <w:left w:type="dxa" w:w="100"/>
+              <w:bottom w:type="dxa" w:w="60"/>
+              <w:right w:type="dxa" w:w="100"/>
+            </w:tcMar>
+            <w:vAlign w:val="center"/>
+          </w:tcPr>
+          <w:p>
+            <w:pPr>
+              <w:jc w:val="left"/>
+            </w:pPr>
+            <w:r>
+              <w:rPr>
+                <w:b w:val="false"/>
+                <w:bCs w:val="false"/>
+                <w:color w:val="000000"/>
+                <w:sz w:val="20"/>
+                <w:szCs w:val="20"/>
+              </w:rPr>
+              <w:t xml:space="preserve">Time travel (versionAsOf 0)</w:t>
+            </w:r>
+          </w:p>
+        </w:tc>
+        <w:tc>
+          <w:tcPr>
+            <w:tcW w:type="dxa" w:w="5200"/>
+            <w:tcMar>
+              <w:top w:type="dxa" w:w="60"/>
+              <w:left w:type="dxa" w:w="100"/>
+              <w:bottom w:type="dxa" w:w="60"/>
+              <w:right w:type="dxa" w:w="100"/>
+            </w:tcMar>
+            <w:vAlign w:val="center"/>
+          </w:tcPr>
+          <w:p>
+            <w:pPr>
+              <w:jc w:val="center"/>
+            </w:pPr>
+            <w:r>
+              <w:rPr>
+                <w:b w:val="false"/>
+                <w:bCs w:val="false"/>
+                <w:color w:val="000000"/>
+                <w:sz w:val="20"/>
+                <w:szCs w:val="20"/>
+              </w:rPr>
+              <w:t xml:space="preserve">Monto original (S/. 51,428.87) recuperado exacto, tras la corrección a S/. 69,428.97</w:t>
+            </w:r>
+          </w:p>
+        </w:tc>
+      </w:tr>
+      <w:tr>
+        <w:tc>
+          <w:tcPr>
+            <w:tcW w:type="dxa" w:w="3600"/>
+            <w:tcMar>
+              <w:top w:type="dxa" w:w="60"/>
+              <w:left w:type="dxa" w:w="100"/>
+              <w:bottom w:type="dxa" w:w="60"/>
+              <w:right w:type="dxa" w:w="100"/>
+            </w:tcMar>
+            <w:vAlign w:val="center"/>
+          </w:tcPr>
+          <w:p>
+            <w:pPr>
+              <w:jc w:val="left"/>
+            </w:pPr>
+            <w:r>
+              <w:rPr>
+                <w:b w:val="false"/>
+                <w:bCs w:val="false"/>
+                <w:color w:val="000000"/>
+                <w:sz w:val="20"/>
+                <w:szCs w:val="20"/>
+              </w:rPr>
+              <w:t xml:space="preserve">Change Data Feed (CDC/CDF)</w:t>
+            </w:r>
+          </w:p>
+        </w:tc>
+        <w:tc>
+          <w:tcPr>
+            <w:tcW w:type="dxa" w:w="5200"/>
+            <w:tcMar>
+              <w:top w:type="dxa" w:w="60"/>
+              <w:left w:type="dxa" w:w="100"/>
+              <w:bottom w:type="dxa" w:w="60"/>
+              <w:right w:type="dxa" w:w="100"/>
+            </w:tcMar>
+            <w:vAlign w:val="center"/>
+          </w:tcPr>
+          <w:p>
+            <w:pPr>
+              <w:jc w:val="center"/>
+            </w:pPr>
+            <w:r>
+              <w:rPr>
+                <w:b w:val="false"/>
+                <w:bCs w:val="false"/>
+                <w:color w:val="000000"/>
+                <w:sz w:val="20"/>
+                <w:szCs w:val="20"/>
+              </w:rPr>
+              <w:t xml:space="preserve">Preimage y postimage capturados fila por fila (update_preimage / update_postimage)</w:t>
+            </w:r>
+          </w:p>
+        </w:tc>
+      </w:tr>
+    </w:tbl>
+    <w:p>
+      <w:pPr>
+        <w:spacing w:after="160"/>
+      </w:pPr>
+      <w:r>
+        <w:rPr>
+          <w:sz w:val="4"/>
+          <w:szCs w:val="4"/>
+        </w:rPr>
+        <w:t xml:space="preserve"/>
+      </w:r>
+    </w:p>
+    <w:p>
+      <w:pPr>
+        <w:spacing w:after="160"/>
+      </w:pPr>
+      <w:r>
+        <w:rPr>
+          <w:sz w:val="22"/>
+          <w:szCs w:val="22"/>
+        </w:rPr>
+        <w:t xml:space="preserve">Esto es lo que un CSV sobrescrito, o incluso Parquet plano, no puede ofrecer: la versión anterior de un dato sigue existiendo y es consultable sin backups manuales — si un funcionario corrige (o manipula) un monto después de que un auditor ya lo revisó, Delta Lake conserva evidencia exacta de cuál era el valor antes. Código en src/spark/lakehouse_delta.py.</w:t>
+      </w:r>
+    </w:p>
+    <w:p>
+      <w:pPr>
         <w:pStyle w:val="Heading1"/>
         <w:spacing w:after="150" w:before="300"/>
       </w:pPr>
@@ -10895,7 +11239,7 @@
           <w:sz w:val="22"/>
           <w:szCs w:val="22"/>
         </w:rPr>
-        <w:t xml:space="preserve">Conectar la ingesta real a las capas Plata/Oro del Lakehouse (reemplazando las carpetas locales por lectura/escritura del Delta Lake sobre Hadoop, según el Anexo 2 del TDR).</w:t>
+        <w:t xml:space="preserve">Conectar la ingesta real a las capas Plata/Oro del Lakehouse (reemplazando las carpetas locales por lectura/escritura del Delta Lake real sobre Hadoop HDFS, según el Anexo 2 del TDR — la lógica de Delta Lake ya está verificada, falta el HDFS productivo detrás).</w:t>
       </w:r>
     </w:p>
     <w:p>

</xml_diff>

<commit_message>
Reporte final: Hadoop YARN/HDFS documentado como fuera de alcance por naturaleza (requiere múltiples máquinas físicas en red, no un bloqueo de librería) - se investigó minicluster oficial pero requiere un segundo jar de 40-70MB; se explica por qué esto cierra el prototipo
</commit_message>
<xml_diff>
--- a/reporte/Reporte_Tecnico_Prototipo_CGR_1.8.2.docx
+++ b/reporte/Reporte_Tecnico_Prototipo_CGR_1.8.2.docx
@@ -10433,7 +10433,7 @@
                 <w:sz w:val="20"/>
                 <w:szCs w:val="20"/>
               </w:rPr>
-              <w:t xml:space="preserve">Bloqueado — sin paquete disponible en este entorno</w:t>
+              <w:t xml:space="preserve">Fuera de alcance por naturaleza (ver explicación abajo, no un bloqueo de librería)</w:t>
             </w:r>
           </w:p>
         </w:tc>
@@ -10698,7 +10698,24 @@
           <w:sz w:val="22"/>
           <w:szCs w:val="22"/>
         </w:rPr>
-        <w:t xml:space="preserve">Red del entorno de prueba: Hadoop/YARN y HDFS requieren descargar un tarball desde Apache, dominio fuera de la lista de salida permitida aquí. GraphX/GraphFrames y Delta Lake tenían el mismo bloqueo, pero ambos se resolvieron (ver Sección 5 y evidencia abajo) descargando los .jar correctos fuera de este entorno y cargándolos manualmente.</w:t>
+        <w:t xml:space="preserve">Red del entorno de prueba: GraphX/GraphFrames y Delta Lake requerían descargar un .jar desde Maven Central, dominio fuera de la lista de salida permitida aquí — y ambos se resolvieron (ver Sección 5 y evidencia abajo) descargando los .jar correctos fuera de este entorno y cargándolos manualmente.</w:t>
+      </w:r>
+    </w:p>
+    <w:p>
+      <w:pPr>
+        <w:pStyle w:val="ListParagraph"/>
+        <w:numPr>
+          <w:ilvl w:val="0"/>
+          <w:numId w:val="1"/>
+        </w:numPr>
+        <w:spacing w:after="80"/>
+      </w:pPr>
+      <w:r>
+        <w:rPr>
+          <w:sz w:val="22"/>
+          <w:szCs w:val="22"/>
+        </w:rPr>
+        <w:t xml:space="preserve">Hadoop YARN/HDFS es un caso distinto y no simulable con el mismo truco — ver explicación dedicada más abajo.</w:t>
       </w:r>
     </w:p>
     <w:p>
@@ -11206,6 +11223,51 @@
     </w:p>
     <w:p>
       <w:pPr>
+        <w:pStyle w:val="Heading2"/>
+        <w:spacing w:after="100" w:before="200"/>
+      </w:pPr>
+      <w:r>
+        <w:t xml:space="preserve">Por qué Hadoop YARN/HDFS es un caso distinto (no un bloqueo de librería)</w:t>
+      </w:r>
+    </w:p>
+    <w:p>
+      <w:pPr>
+        <w:spacing w:after="160"/>
+      </w:pPr>
+      <w:r>
+        <w:rPr>
+          <w:sz w:val="22"/>
+          <w:szCs w:val="22"/>
+        </w:rPr>
+        <w:t xml:space="preserve">A diferencia de GraphFrames y Delta Lake, que fallaban por no poder descargar un .jar específico — un problema de red, resuelto obteniendo el archivo correcto por fuera — Hadoop YARN y HDFS no son primariamente una librería que falte, sino una arquitectura que requiere múltiples máquinas físicas distintas conectadas en red. Se investigó explícitamente una alternativa liviana (org.apache.hadoop:hadoop-client-minicluster, 27.1 MB, la utilidad interna que el propio equipo de Hadoop usa para sus pruebas automatizadas) y se obtuvo el archivo, pero requiere además hadoop-client-runtime — un segundo .jar que empaqueta todas las dependencias de Hadoop (netty, guava, jetty, protobuf) y normalmente pesa 40-70 MB, de nuevo por encima del límite de archivo de este entorno.</w:t>
+      </w:r>
+    </w:p>
+    <w:p>
+      <w:pPr>
+        <w:spacing w:after="160"/>
+      </w:pPr>
+      <w:r>
+        <w:rPr>
+          <w:sz w:val="22"/>
+          <w:szCs w:val="22"/>
+        </w:rPr>
+        <w:t xml:space="preserve">Más importante que el límite de tamaño: HDFS reparte y replica bloques de datos entre nodos distintos para tolerar la caída de una máquina, y YARN reparte CPU/memoria entre esos mismos nodos. Ambos beneficios dependen, por diseño, de que existan varias máquinas físicas separadas — algo que este entorno de prueba de concepto (un único contenedor) no tiene y no puede simular con más código. Incluso si se lograra instalar MiniDFSCluster/MiniYARNCluster, esas clases están explícitamente diseñadas por Apache para pruebas unitarias, no para demostrar distribución real — no habrían probado nada que Spark en modo local[*] no demuestre ya. Esta es la única pieza del Anexo 2 que queda genuinamente fuera de alcance de este entorno, y solo se puede cerrar con acceso a los servidores reales de la CGR.</w:t>
+      </w:r>
+    </w:p>
+    <w:p>
+      <w:pPr>
+        <w:spacing w:after="160"/>
+      </w:pPr>
+      <w:r>
+        <w:rPr>
+          <w:sz w:val="22"/>
+          <w:szCs w:val="22"/>
+        </w:rPr>
+        <w:t xml:space="preserve">Lo que sí cubre el mismo rol funcional dentro de este prototipo: Spark real (Sección 8) es el motor de cómputo que correría sobre YARN; Delta Lake real (evidencia arriba) es el motor de almacenamiento que correría sobre HDFS; y el particionamiento con poda de particiones (Sección 11) es la técnica que evita leer todo el disco, sea ese disco local o HDFS.</w:t>
+      </w:r>
+    </w:p>
+    <w:p>
+      <w:pPr>
         <w:pStyle w:val="Heading1"/>
         <w:spacing w:after="150" w:before="300"/>
       </w:pPr>
@@ -11291,23 +11353,6 @@
           <w:szCs w:val="22"/>
         </w:rPr>
         <w:t xml:space="preserve">Reemplazar el SQLite stand-in por una conexión real a SQL Server (pyodbc/pymssql) y desplegar el .rdl en un servidor SSRS real.</w:t>
-      </w:r>
-    </w:p>
-    <w:p>
-      <w:pPr>
-        <w:pStyle w:val="ListParagraph"/>
-        <w:numPr>
-          <w:ilvl w:val="0"/>
-          <w:numId w:val="1"/>
-        </w:numPr>
-        <w:spacing w:after="80"/>
-      </w:pPr>
-      <w:r>
-        <w:rPr>
-          <w:sz w:val="22"/>
-          <w:szCs w:val="22"/>
-        </w:rPr>
-        <w:t xml:space="preserve">GraphX/GraphFrames para el módulo de vínculos: se intentó dos veces y falló por falta de acceso a Maven Central desde este entorno. Se resolvió obteniendo los .jar correctos (io.graphframes:graphframes-spark4_2.13:0.10.0) desde una máquina con internet sin restricciones y cargándolos manualmente — ver Sección 5. La red de este entorno sigue siendo la limitación real; se puede resolver caso por caso, no de forma automática.</w:t>
       </w:r>
     </w:p>
     <w:p>

</xml_diff>

<commit_message>
Reencuadrar el framing del proyecto: quitar todas las referencias a 'ahorro de S/. 72,000 y 180 días' y reemplazar por 'contribución de licencia abierta al control gubernamental y a la lucha anticorrupción' (README, reporte técnico, 7 productos formales)
</commit_message>
<xml_diff>
--- a/reporte/Reporte_Tecnico_Prototipo_CGR_1.8.2.docx
+++ b/reporte/Reporte_Tecnico_Prototipo_CGR_1.8.2.docx
@@ -159,7 +159,7 @@
           <w:sz w:val="22"/>
           <w:szCs w:val="22"/>
         </w:rPr>
-        <w:t xml:space="preserve">Este documento presenta un prototipo funcional del módulo de análisis de datos descrito en los Términos de Referencia (TDR) para la contratación de un Consultor Científico de Datos del Proyecto Interno 1.8.2 de la Contraloría General de la República (CGR). El objetivo es demostrar, con código abierto y en un plazo de desarrollo muy reducido, que es técnicamente viable construir los componentes centrales solicitados en el TDR — detección de favoritismo y de fraccionamiento en contrataciones públicas — antes de comprometer una consultoría individual de S/. 72,000 por 180 días calendario.</w:t>
+        <w:t xml:space="preserve">Este documento presenta un prototipo funcional del módulo de análisis de datos descrito en los Términos de Referencia (TDR) para la contratación de un Consultor Científico de Datos del Proyecto Interno 1.8.2 de la Contraloría General de la República (CGR). El objetivo es demostrar, con código abierto y en un plazo de desarrollo muy reducido, que es técnicamente viable construir los componentes centrales solicitados en el TDR — detección de favoritismo y de fraccionamiento en contrataciones públicas — como una contribución de licencia abierta al control gubernamental y a la lucha anticorrupción.</w:t>
       </w:r>
     </w:p>
     <w:p>
@@ -11373,7 +11373,7 @@
           <w:sz w:val="22"/>
           <w:szCs w:val="22"/>
         </w:rPr>
-        <w:t xml:space="preserve">Este prototipo demuestra en código abierto y en un plazo muy corto que los tres casos de uso priorizados del TDR —favoritismo, fraccionamiento y vínculos proveedor-funcionario— son técnicamente alcanzables sin necesidad de comprometer de inmediato una consultoría individual de 180 días y S/. 72,000. Cada pieza de la arquitectura fue validada con ejecución real, no solo de forma teórica: modelado en scikit-learn y Apache Spark MLlib (Sección 8), orquestación con Apache Airflow (Sección 9), optimización sistemática de hiperparámetros en ambas plataformas (Sección 10), extracción bajo los estándares SQL institucionales de la CGR (Sección 11), publicación lista para SSRS (Sección 12), y un mecanismo de autoevaluación y autoentrenamiento que distingue correctamente cuándo el modelo necesita actualizarse (Sección 13). El código fuente completo, comentado y versionado está disponible públicamente en el repositorio indicado en la portada, cumpliendo con el espíritu del ítem 6 del checklist de aceptación del Anexo 3 ("código versionado en Git institucional").</w:t>
+        <w:t xml:space="preserve">Este prototipo demuestra en código abierto y en un plazo muy corto que los tres casos de uso priorizados del TDR —favoritismo, fraccionamiento y vínculos proveedor-funcionario— son técnicamente alcanzables con herramientas de licencia abierta, construidas como una contribución al control gubernamental y a la lucha anticorrupción. Cada pieza de la arquitectura fue validada con ejecución real, no solo de forma teórica: modelado en scikit-learn y Apache Spark MLlib (Sección 8), orquestación con Apache Airflow (Sección 9), optimización sistemática de hiperparámetros en ambas plataformas (Sección 10), extracción bajo los estándares SQL institucionales de la CGR (Sección 11), publicación lista para SSRS (Sección 12), y un mecanismo de autoevaluación y autoentrenamiento que distingue correctamente cuándo el modelo necesita actualizarse (Sección 13). El código fuente completo, comentado y versionado está disponible públicamente en el repositorio indicado en la portada, cumpliendo con el espíritu del ítem 6 del checklist de aceptación del Anexo 3 ("código versionado en Git institucional").</w:t>
       </w:r>
     </w:p>
     <w:sectPr>

</xml_diff>

<commit_message>
Corrección 1/10 (revisión técnica externa): disclaimer explícito de 'prototipo independiente, no implementación oficial ni aprobada por la CGR' en README, portadas de los 8 docx, y owner del DAG de Airflow (ya no sugiere una cuenta institucional real)
</commit_message>
<xml_diff>
--- a/reporte/Reporte_Tecnico_Prototipo_CGR_1.8.2.docx
+++ b/reporte/Reporte_Tecnico_Prototipo_CGR_1.8.2.docx
@@ -63,6 +63,22 @@
           <w:szCs w:val="22"/>
         </w:rPr>
         <w:t xml:space="preserve">Documento técnico elaborado como prueba de concepto (proof of concept)</w:t>
+      </w:r>
+    </w:p>
+    <w:p>
+      <w:pPr>
+        <w:spacing w:after="100" w:before="100"/>
+        <w:jc w:val="center"/>
+      </w:pPr>
+      <w:r>
+        <w:rPr>
+          <w:b/>
+          <w:bCs/>
+          <w:color w:val="C0392B"/>
+          <w:sz w:val="20"/>
+          <w:szCs w:val="20"/>
+        </w:rPr>
+        <w:t xml:space="preserve">Prototipo independiente — no constituye una implementación oficial ni cuenta con aprobación institucional de la CGR</w:t>
       </w:r>
     </w:p>
     <w:p>

</xml_diff>

<commit_message>
Corrección 3/10 (revisión técnica externa): corregir sobreclaim sobre Hadoop - Apache SÍ documenta modo pseudo-distribuido en una sola máquina; la limitación real fue tamaño de archivo (jar de 40-70MB, tarball de 554MB), no imposibilidad técnica
</commit_message>
<xml_diff>
--- a/reporte/Reporte_Tecnico_Prototipo_CGR_1.8.2.docx
+++ b/reporte/Reporte_Tecnico_Prototipo_CGR_1.8.2.docx
@@ -10449,7 +10449,7 @@
                 <w:sz w:val="20"/>
                 <w:szCs w:val="20"/>
               </w:rPr>
-              <w:t xml:space="preserve">Fuera de alcance por naturaleza (ver explicación abajo, no un bloqueo de librería)</w:t>
+              <w:t xml:space="preserve">Pendiente por límite de tamaño de archivo, no por imposibilidad técnica (ver explicación abajo)</w:t>
             </w:r>
           </w:p>
         </w:tc>
@@ -10731,7 +10731,7 @@
           <w:sz w:val="22"/>
           <w:szCs w:val="22"/>
         </w:rPr>
-        <w:t xml:space="preserve">Hadoop YARN/HDFS es un caso distinto y no simulable con el mismo truco — ver explicación dedicada más abajo.</w:t>
+        <w:t xml:space="preserve">Hadoop YARN/HDFS quedó pendiente por límites de tamaño de archivo (no por imposibilidad técnica de correr en una sola máquina — Apache documenta modo pseudo-distribuido) — ver explicación dedicada más abajo.</w:t>
       </w:r>
     </w:p>
     <w:p>
@@ -11255,7 +11255,7 @@
           <w:sz w:val="22"/>
           <w:szCs w:val="22"/>
         </w:rPr>
-        <w:t xml:space="preserve">A diferencia de GraphFrames y Delta Lake, que fallaban por no poder descargar un .jar específico — un problema de red, resuelto obteniendo el archivo correcto por fuera — Hadoop YARN y HDFS no son primariamente una librería que falte, sino una arquitectura que requiere múltiples máquinas físicas distintas conectadas en red. Se investigó explícitamente una alternativa liviana (org.apache.hadoop:hadoop-client-minicluster, 27.1 MB, la utilidad interna que el propio equipo de Hadoop usa para sus pruebas automatizadas) y se obtuvo el archivo, pero requiere además hadoop-client-runtime — un segundo .jar que empaqueta todas las dependencias de Hadoop (netty, guava, jetty, protobuf) y normalmente pesa 40-70 MB, de nuevo por encima del límite de archivo de este entorno.</w:t>
+        <w:t xml:space="preserve">A diferencia de GraphFrames y Delta Lake, que fallaban por no poder descargar un .jar específico — un problema de red, resuelto obteniendo el archivo correcto por fuera — Hadoop YARN y HDFS no se completaron por una combinación de restricciones de tamaño de archivo, no por imposibilidad técnica de correr en una sola máquina. Aclaración importante: Apache documenta explícitamente un modo "pseudo-distribuido" (single-node) en el que HDFS y YARN corren sobre una sola máquina — esto es técnicamente viable y no requiere múltiples servidores físicos. Se investigó una alternativa liviana (org.apache.hadoop:hadoop-client-minicluster, 27.1 MB, la utilidad interna que el propio equipo de Hadoop usa para sus pruebas automatizadas) y se obtuvo el archivo, pero requiere además hadoop-client-runtime — un segundo .jar que empaqueta todas las dependencias de Hadoop (netty, guava, jetty, protobuf) y normalmente pesa 40-70 MB, de nuevo por encima del límite de archivo de este entorno. El tarball binario completo (que sí incluye los scripts para correr en modo pseudo-distribuido real, no solo las clases de prueba MiniDFSCluster/MiniYARNCluster) pesa 554 MB, igualmente inalcanzable aquí.</w:t>
       </w:r>
     </w:p>
     <w:p>
@@ -11267,7 +11267,7 @@
           <w:sz w:val="22"/>
           <w:szCs w:val="22"/>
         </w:rPr>
-        <w:t xml:space="preserve">Más importante que el límite de tamaño: HDFS reparte y replica bloques de datos entre nodos distintos para tolerar la caída de una máquina, y YARN reparte CPU/memoria entre esos mismos nodos. Ambos beneficios dependen, por diseño, de que existan varias máquinas físicas separadas — algo que este entorno de prueba de concepto (un único contenedor) no tiene y no puede simular con más código. Incluso si se lograra instalar MiniDFSCluster/MiniYARNCluster, esas clases están explícitamente diseñadas por Apache para pruebas unitarias, no para demostrar distribución real — no habrían probado nada que Spark en modo local[*] no demuestre ya. Esta es la única pieza del Anexo 2 que queda genuinamente fuera de alcance de este entorno, y solo se puede cerrar con acceso a los servidores reales de la CGR.</w:t>
+        <w:t xml:space="preserve">Lo que sí es una limitación real de fondo, independiente del tamaño de archivo: el beneficio característico de HDFS/YARN en producción — tolerancia a fallos vía replicación de bloques entre máquinas físicas distintas, y reparto de CPU/memoria entre esos mismos nodos — depende, por diseño, de que existan varias máquinas separadas. Un modo pseudo-distribuido de un solo nodo (que no se llegó a completar aquí) demostraría que los procesos de HDFS/YARN corren y se comunican correctamente, pero no demostraría ese beneficio de tolerancia a fallos ni de reparto real de carga entre máquinas — para eso sí hacen falta servidores físicos distintos, como los de la CGR. Esta es la pieza del Anexo 2 que queda pendiente de este entorno: no por ser técnicamente imposible en una sola máquina, sino porque no se logró descargar el paquete completo dentro del límite de tamaño de archivo disponible aquí.</w:t>
       </w:r>
     </w:p>
     <w:p>

</xml_diff>

<commit_message>
Corrección 5/10 (revisión técnica externa): agregar contexto explícito al '100% de precisión' de la regla de fraccionamiento - es una prueba funcional (sanity check) sobre casos sembrados con el patrón exacto que la regla busca, no evidencia de desempeño predictivo externo
</commit_message>
<xml_diff>
--- a/reporte/Reporte_Tecnico_Prototipo_CGR_1.8.2.docx
+++ b/reporte/Reporte_Tecnico_Prototipo_CGR_1.8.2.docx
@@ -209,6 +209,18 @@
           <w:szCs w:val="22"/>
         </w:rPr>
         <w:t xml:space="preserve">El modelo de favoritismo (Random Forest) ubicó los 6 casos reales sembrados en las primeras 6 posiciones de un ranking de 2,354 pares proveedor-entidad. El modelo de fraccionamiento, combinando una regla interpretable basada en el umbral legal de Adjudicación Simplificada con detección de anomalías, alcanzó 100% de precisión (7 de 7 casos marcados fueron fraccionamiento real) sobre 8 casos sembrados en 149 grupos proveedor-entidad-objeto.</w:t>
+      </w:r>
+    </w:p>
+    <w:p>
+      <w:pPr>
+        <w:spacing w:after="160"/>
+      </w:pPr>
+      <w:r>
+        <w:rPr>
+          <w:sz w:val="22"/>
+          <w:szCs w:val="22"/>
+        </w:rPr>
+        <w:t xml:space="preserve">Nota de interpretación importante: el generador sintético siembra los casos de fraccionamiento exactamente con el patrón que la regla busca (mismo proveedor-entidad-objeto, 3 a 6 compras en pocos días, montos justo bajo el umbral legal). Que la regla los encuentre con 100% de precisión confirma que la implementación funciona como fue diseñada — una prueba funcional (sanity check) válida y necesaria — pero no es evidencia de desempeño predictivo sobre datos externos no sembrados. La Sección 4 detalla esta distinción con mayor profundidad.</w:t>
       </w:r>
     </w:p>
     <w:p>
@@ -2378,6 +2390,18 @@
           <w:szCs w:val="22"/>
         </w:rPr>
         <w:t xml:space="preserve">Hallazgo relevante: el modelo puramente estadístico, sin contexto normativo, detecta solo una fracción de los casos reales. Al incorporar la regla de negocio derivada directamente de la Ley de Contrataciones del Estado (umbral de Adjudicación Simplificada), la precisión sube a 100%. Esto confirma que el valor de este módulo no está solo en el algoritmo, sino en traducir correctamente la normativa de contrataciones públicas a reglas computables — un trabajo de dominio que un consultor conocedor del marco legal peruano puede hacer sin necesitar infraestructura de big data desde el primer día.</w:t>
+      </w:r>
+    </w:p>
+    <w:p>
+      <w:pPr>
+        <w:spacing w:after="160"/>
+      </w:pPr>
+      <w:r>
+        <w:rPr>
+          <w:sz w:val="22"/>
+          <w:szCs w:val="22"/>
+        </w:rPr>
+        <w:t xml:space="preserve">Precisión metodológica sobre el 100%: los 8 casos sembrados fueron construidos deliberadamente con el patrón exacto que la regla busca (mismo proveedor-entidad-objeto, 3-6 compras en una ventana de pocos días, montos justo bajo el umbral). Este resultado valida que la regla está correctamente implementada — que hace lo que se diseñó para hacer — no que vaya a alcanzar 100% de precisión sobre datos reales no sembrados, donde el fraccionamiento real puede presentarse con patrones más sutiles o distintos (ver el Anexo A, donde sobre datos reales sin etiquetas la regla se usa como señal de riesgo para revisión de auditor, no como determinación automática).</w:t>
       </w:r>
     </w:p>
     <w:p>

</xml_diff>

<commit_message>
Corrección 6/10 (revisión técnica externa): eliminar fuga de información en IsolationForest - contamination ya no se deriva de la prevalencia real de la etiqueta sintética conocida (n_reales/len(df)), ahora usa 'auto' (recomendado por sklearn cuando la tasa real es desconocida); verificado que el ranking no cambia (sigue 3/8), pero el corte binario sí cambió (Combinado pasó de 2/2 a 7/7, corregido en el reporte)
</commit_message>
<xml_diff>
--- a/reporte/Reporte_Tecnico_Prototipo_CGR_1.8.2.docx
+++ b/reporte/Reporte_Tecnico_Prototipo_CGR_1.8.2.docx
@@ -2308,7 +2308,7 @@
                 <w:sz w:val="20"/>
                 <w:szCs w:val="20"/>
               </w:rPr>
-              <w:t xml:space="preserve">2</w:t>
+              <w:t xml:space="preserve">7</w:t>
             </w:r>
           </w:p>
         </w:tc>
@@ -2335,7 +2335,7 @@
                 <w:sz w:val="20"/>
                 <w:szCs w:val="20"/>
               </w:rPr>
-              <w:t xml:space="preserve">2</w:t>
+              <w:t xml:space="preserve">7</w:t>
             </w:r>
           </w:p>
         </w:tc>

</xml_diff>

<commit_message>
Corrección 7/10 (revisión técnica externa): umbral de fraccionamiento parametrizado por año y tipo de contratación (bienes/servicios vs. obras), no un valor fijo S/.400K - nuevo módulo umbrales_normativos.py con fuentes citadas (Ley 31365/2022, Ley 31953/2024); recalculado en cascada en sklearn, Spark y datos reales; hiperparámetros de Isolation Forest reajustados (max_samples=0.8 supera a 1.0 con las nuevas features); regla interpretable pasó de 7/7 a 8/8
</commit_message>
<xml_diff>
--- a/reporte/Reporte_Tecnico_Prototipo_CGR_1.8.2.docx
+++ b/reporte/Reporte_Tecnico_Prototipo_CGR_1.8.2.docx
@@ -208,7 +208,7 @@
           <w:sz w:val="22"/>
           <w:szCs w:val="22"/>
         </w:rPr>
-        <w:t xml:space="preserve">El modelo de favoritismo (Random Forest) ubicó los 6 casos reales sembrados en las primeras 6 posiciones de un ranking de 2,354 pares proveedor-entidad. El modelo de fraccionamiento, combinando una regla interpretable basada en el umbral legal de Adjudicación Simplificada con detección de anomalías, alcanzó 100% de precisión (7 de 7 casos marcados fueron fraccionamiento real) sobre 8 casos sembrados en 149 grupos proveedor-entidad-objeto.</w:t>
+        <w:t xml:space="preserve">El modelo de favoritismo (Random Forest) ubicó los 6 casos reales sembrados en las primeras 6 posiciones de un ranking de 2,354 pares proveedor-entidad. El modelo de fraccionamiento, combinando una regla interpretable basada en el umbral legal de Adjudicación Simplificada con detección de anomalías, alcanzó 100% de precisión (8 de 8 casos marcados fueron fraccionamiento real) sobre 8 casos sembrados en 149 grupos proveedor-entidad-objeto.</w:t>
       </w:r>
     </w:p>
     <w:p>
@@ -2198,7 +2198,7 @@
                 <w:sz w:val="20"/>
                 <w:szCs w:val="20"/>
               </w:rPr>
-              <w:t xml:space="preserve">7</w:t>
+              <w:t xml:space="preserve">8</w:t>
             </w:r>
           </w:p>
         </w:tc>
@@ -2225,7 +2225,7 @@
                 <w:sz w:val="20"/>
                 <w:szCs w:val="20"/>
               </w:rPr>
-              <w:t xml:space="preserve">7</w:t>
+              <w:t xml:space="preserve">8</w:t>
             </w:r>
           </w:p>
         </w:tc>
@@ -2308,7 +2308,7 @@
                 <w:sz w:val="20"/>
                 <w:szCs w:val="20"/>
               </w:rPr>
-              <w:t xml:space="preserve">7</w:t>
+              <w:t xml:space="preserve">8</w:t>
             </w:r>
           </w:p>
         </w:tc>
@@ -2335,7 +2335,7 @@
                 <w:sz w:val="20"/>
                 <w:szCs w:val="20"/>
               </w:rPr>
-              <w:t xml:space="preserve">7</w:t>
+              <w:t xml:space="preserve">8</w:t>
             </w:r>
           </w:p>
         </w:tc>
@@ -3208,6 +3208,143 @@
                 <w:sz w:val="20"/>
                 <w:szCs w:val="20"/>
               </w:rPr>
+              <w:t xml:space="preserve">P0200</w:t>
+            </w:r>
+          </w:p>
+        </w:tc>
+        <w:tc>
+          <w:tcPr>
+            <w:tcW w:type="dxa" w:w="1400"/>
+            <w:tcMar>
+              <w:top w:type="dxa" w:w="60"/>
+              <w:left w:type="dxa" w:w="100"/>
+              <w:bottom w:type="dxa" w:w="60"/>
+              <w:right w:type="dxa" w:w="100"/>
+            </w:tcMar>
+            <w:vAlign w:val="center"/>
+          </w:tcPr>
+          <w:p>
+            <w:pPr>
+              <w:jc w:val="center"/>
+            </w:pPr>
+            <w:r>
+              <w:rPr>
+                <w:b w:val="false"/>
+                <w:bCs w:val="false"/>
+                <w:color w:val="000000"/>
+                <w:sz w:val="20"/>
+                <w:szCs w:val="20"/>
+              </w:rPr>
+              <w:t xml:space="preserve">E08</w:t>
+            </w:r>
+          </w:p>
+        </w:tc>
+        <w:tc>
+          <w:tcPr>
+            <w:tcW w:type="dxa" w:w="3400"/>
+            <w:tcMar>
+              <w:top w:type="dxa" w:w="60"/>
+              <w:left w:type="dxa" w:w="100"/>
+              <w:bottom w:type="dxa" w:w="60"/>
+              <w:right w:type="dxa" w:w="100"/>
+            </w:tcMar>
+            <w:vAlign w:val="center"/>
+          </w:tcPr>
+          <w:p>
+            <w:pPr>
+              <w:jc w:val="center"/>
+            </w:pPr>
+            <w:r>
+              <w:rPr>
+                <w:b w:val="false"/>
+                <w:bCs w:val="false"/>
+                <w:color w:val="000000"/>
+                <w:sz w:val="20"/>
+                <w:szCs w:val="20"/>
+              </w:rPr>
+              <w:t xml:space="preserve">Servicio de limpieza y vigilancia</w:t>
+            </w:r>
+          </w:p>
+        </w:tc>
+        <w:tc>
+          <w:tcPr>
+            <w:tcW w:type="dxa" w:w="2000"/>
+            <w:tcMar>
+              <w:top w:type="dxa" w:w="60"/>
+              <w:left w:type="dxa" w:w="100"/>
+              <w:bottom w:type="dxa" w:w="60"/>
+              <w:right w:type="dxa" w:w="100"/>
+            </w:tcMar>
+            <w:vAlign w:val="center"/>
+          </w:tcPr>
+          <w:p>
+            <w:pPr>
+              <w:jc w:val="center"/>
+            </w:pPr>
+            <w:r>
+              <w:rPr>
+                <w:b w:val="false"/>
+                <w:bCs w:val="false"/>
+                <w:color w:val="000000"/>
+                <w:sz w:val="20"/>
+                <w:szCs w:val="20"/>
+              </w:rPr>
+              <w:t xml:space="preserve">3</w:t>
+            </w:r>
+          </w:p>
+        </w:tc>
+        <w:tc>
+          <w:tcPr>
+            <w:tcW w:type="dxa" w:w="1400"/>
+            <w:tcMar>
+              <w:top w:type="dxa" w:w="60"/>
+              <w:left w:type="dxa" w:w="100"/>
+              <w:bottom w:type="dxa" w:w="60"/>
+              <w:right w:type="dxa" w:w="100"/>
+            </w:tcMar>
+            <w:vAlign w:val="center"/>
+          </w:tcPr>
+          <w:p>
+            <w:pPr>
+              <w:jc w:val="center"/>
+            </w:pPr>
+            <w:r>
+              <w:rPr>
+                <w:b w:val="false"/>
+                <w:bCs w:val="false"/>
+                <w:color w:val="000000"/>
+                <w:sz w:val="20"/>
+                <w:szCs w:val="20"/>
+              </w:rPr>
+              <w:t xml:space="preserve">100%</w:t>
+            </w:r>
+          </w:p>
+        </w:tc>
+      </w:tr>
+      <w:tr>
+        <w:tc>
+          <w:tcPr>
+            <w:tcW w:type="dxa" w:w="1600"/>
+            <w:tcMar>
+              <w:top w:type="dxa" w:w="60"/>
+              <w:left w:type="dxa" w:w="100"/>
+              <w:bottom w:type="dxa" w:w="60"/>
+              <w:right w:type="dxa" w:w="100"/>
+            </w:tcMar>
+            <w:vAlign w:val="center"/>
+          </w:tcPr>
+          <w:p>
+            <w:pPr>
+              <w:jc w:val="left"/>
+            </w:pPr>
+            <w:r>
+              <w:rPr>
+                <w:b w:val="false"/>
+                <w:bCs w:val="false"/>
+                <w:color w:val="000000"/>
+                <w:sz w:val="20"/>
+                <w:szCs w:val="20"/>
+              </w:rPr>
               <w:t xml:space="preserve">P0098</w:t>
             </w:r>
           </w:p>
@@ -7105,7 +7242,7 @@
                 <w:sz w:val="20"/>
                 <w:szCs w:val="20"/>
               </w:rPr>
-              <w:t xml:space="preserve">7</w:t>
+              <w:t xml:space="preserve">8</w:t>
             </w:r>
           </w:p>
         </w:tc>
@@ -7132,7 +7269,7 @@
                 <w:sz w:val="20"/>
                 <w:szCs w:val="20"/>
               </w:rPr>
-              <w:t xml:space="preserve">7</w:t>
+              <w:t xml:space="preserve">8</w:t>
             </w:r>
           </w:p>
         </w:tc>
@@ -8279,7 +8416,7 @@
         <w:spacing w:after="100" w:before="200"/>
       </w:pPr>
       <w:r>
-        <w:t xml:space="preserve">10.2. Fraccionamiento — hallazgo: el techo es del algoritmo, no de la configuración</w:t>
+        <w:t xml:space="preserve">10.2. Fraccionamiento — hallazgo: la regla sigue ganando, pero sí hay un mejor ajuste del modelo estadístico</w:t>
       </w:r>
     </w:p>
     <w:p>
@@ -8291,7 +8428,7 @@
           <w:sz w:val="22"/>
           <w:szCs w:val="22"/>
         </w:rPr>
-        <w:t xml:space="preserve">Para Isolation Forest (no supervisado) se implementó una búsqueda manual de 36 combinaciones (n° de estimadores, fracción de muestras, tasa de contaminación), usando como métrica cuántos de los 8 casos sembrados caen en el top-8 del ranking de anomalía. Resultado: el recall se estancó en 3/8 (37.5%) para toda combinación con max_samples=1.0, sin importar el resto de parámetros — evidencia de que la limitación es estructural del algoritmo sobre estas variables, no una configuración subóptima. Este hallazgo refuerza, con evidencia adicional, la conclusión central del prototipo (Sección 4): ningún ajuste de hiperparámetros iguala a la regla interpretable basada en el umbral legal (100% de precisión). Se mantuvo la configuración más liviana entre las empatadas (100 estimadores en vez de 300).</w:t>
+        <w:t xml:space="preserve">Para Isolation Forest (no supervisado) se implementó una búsqueda en grilla de 36 combinaciones (n° de estimadores, fracción de muestras, tasa de contaminación), usando como métrica cuántos de los 8 casos sembrados caen en el top-8 del ranking de anomalía. Resultado: max_samples=0.8 alcanza 3/8 (37.5%), mejor que max_samples=1.0 (2/8, 25.0%) — a diferencia de una versión anterior de esta búsqueda, aquí sí hay un hiperparámetro con efecto real, y el modelo de producción se ajustó en consecuencia (ver src/modelo_fraccionamiento.py). Aun con ese ajuste, Isolation Forest se queda en 3/8 frente al 8/8 de la regla interpretable basada en el umbral legal — el hallazgo central del prototipo se mantiene: ningún ajuste de hiperparámetros iguala a la regla.</w:t>
       </w:r>
     </w:p>
     <w:p>

</xml_diff>

<commit_message>
Corrección 8/10 (revisión técnica externa): matizar la afirmación de 'historial inmutable' de Delta Lake - VACUUM elimina archivos de versiones antiguas según política de retención configurable (7 días por defecto); agregada nota sobre configurar retención acorde a necesidades de auditoría
</commit_message>
<xml_diff>
--- a/reporte/Reporte_Tecnico_Prototipo_CGR_1.8.2.docx
+++ b/reporte/Reporte_Tecnico_Prototipo_CGR_1.8.2.docx
@@ -11396,6 +11396,18 @@
           <w:szCs w:val="22"/>
         </w:rPr>
         <w:t xml:space="preserve">Esto es lo que un CSV sobrescrito, o incluso Parquet plano, no puede ofrecer: la versión anterior de un dato sigue existiendo y es consultable sin backups manuales — si un funcionario corrige (o manipula) un monto después de que un auditor ya lo revisó, Delta Lake conserva evidencia exacta de cuál era el valor antes. Código en src/spark/lakehouse_delta.py.</w:t>
+      </w:r>
+    </w:p>
+    <w:p>
+      <w:pPr>
+        <w:spacing w:after="160"/>
+      </w:pPr>
+      <w:r>
+        <w:rPr>
+          <w:sz w:val="22"/>
+          <w:szCs w:val="22"/>
+        </w:rPr>
+        <w:t xml:space="preserve">Precisión importante: este historial NO es inmutable de forma permanente. El comando VACUUM elimina físicamente los archivos de versiones antiguas ya no referenciadas, según una política de retención configurable (por defecto, 7 días). Pasado ese período y tras ejecutar VACUUM, el time travel a esas versiones deja de funcionar. Para uso de auditoría, la política de retención debe configurarse explícitamente acorde al período que la CGR necesite conservar evidencia — potencialmente años, no el valor por defecto — y VACUUM no debe ejecutarse sin ese criterio en mente.</w:t>
       </w:r>
     </w:p>
     <w:p>

</xml_diff>